<commit_message>
Add about.html page and update Table 1 - MuhammadAhmad-n17
</commit_message>
<xml_diff>
--- a/Assignment_04_Spring2026.docx
+++ b/Assignment_04_Spring2026.docx
@@ -348,7 +348,47 @@
           <w:sz w:val="24"/>
           <w:szCs w:val="24"/>
         </w:rPr>
-        <w:t xml:space="preserve"> (can be six members but in that case TL has to create an additional page for that member and then assign all tasks accordingly)</w:t>
+        <w:t xml:space="preserve"> (can be six members but in that </w:t>
+      </w:r>
+      <w:proofErr w:type="gramStart"/>
+      <w:r>
+        <w:rPr>
+          <w:rFonts w:ascii="Arial" w:eastAsia="Arial" w:hAnsi="Arial" w:cs="Arial"/>
+          <w:color w:val="000000"/>
+          <w:sz w:val="24"/>
+          <w:szCs w:val="24"/>
+        </w:rPr>
+        <w:t>case</w:t>
+      </w:r>
+      <w:proofErr w:type="gramEnd"/>
+      <w:r>
+        <w:rPr>
+          <w:rFonts w:ascii="Arial" w:eastAsia="Arial" w:hAnsi="Arial" w:cs="Arial"/>
+          <w:color w:val="000000"/>
+          <w:sz w:val="24"/>
+          <w:szCs w:val="24"/>
+        </w:rPr>
+        <w:t xml:space="preserve"> TL </w:t>
+      </w:r>
+      <w:proofErr w:type="gramStart"/>
+      <w:r>
+        <w:rPr>
+          <w:rFonts w:ascii="Arial" w:eastAsia="Arial" w:hAnsi="Arial" w:cs="Arial"/>
+          <w:color w:val="000000"/>
+          <w:sz w:val="24"/>
+          <w:szCs w:val="24"/>
+        </w:rPr>
+        <w:t>has to</w:t>
+      </w:r>
+      <w:proofErr w:type="gramEnd"/>
+      <w:r>
+        <w:rPr>
+          <w:rFonts w:ascii="Arial" w:eastAsia="Arial" w:hAnsi="Arial" w:cs="Arial"/>
+          <w:color w:val="000000"/>
+          <w:sz w:val="24"/>
+          <w:szCs w:val="24"/>
+        </w:rPr>
+        <w:t xml:space="preserve"> create an additional page for that member and then assign all tasks accordingly)</w:t>
       </w:r>
     </w:p>
     <w:p>
@@ -440,7 +480,47 @@
           <w:sz w:val="24"/>
           <w:szCs w:val="24"/>
         </w:rPr>
-        <w:t>Secrets Ownership: All GitHub secrets (DOCKERHUB_USERNAME, DOCKERHUB_TOKEN, RENDER_DEPLOY_HOOK_URL) must be created by the Team Lead using the TL's own Docker Hub and Render credentials. No team member other than the TL should create or modify secrets.</w:t>
+        <w:t xml:space="preserve">Secrets Ownership: All GitHub secrets (DOCKERHUB_USERNAME, DOCKERHUB_TOKEN, RENDER_DEPLOY_HOOK_URL) must be created by the Team Lead using </w:t>
+      </w:r>
+      <w:proofErr w:type="gramStart"/>
+      <w:r>
+        <w:rPr>
+          <w:rFonts w:ascii="Arial" w:eastAsia="Arial" w:hAnsi="Arial" w:cs="Arial"/>
+          <w:color w:val="000000"/>
+          <w:sz w:val="24"/>
+          <w:szCs w:val="24"/>
+        </w:rPr>
+        <w:t>the TL's</w:t>
+      </w:r>
+      <w:proofErr w:type="gramEnd"/>
+      <w:r>
+        <w:rPr>
+          <w:rFonts w:ascii="Arial" w:eastAsia="Arial" w:hAnsi="Arial" w:cs="Arial"/>
+          <w:color w:val="000000"/>
+          <w:sz w:val="24"/>
+          <w:szCs w:val="24"/>
+        </w:rPr>
+        <w:t xml:space="preserve"> own Docker Hub and Render credentials. No team member other than </w:t>
+      </w:r>
+      <w:proofErr w:type="gramStart"/>
+      <w:r>
+        <w:rPr>
+          <w:rFonts w:ascii="Arial" w:eastAsia="Arial" w:hAnsi="Arial" w:cs="Arial"/>
+          <w:color w:val="000000"/>
+          <w:sz w:val="24"/>
+          <w:szCs w:val="24"/>
+        </w:rPr>
+        <w:t>the TL</w:t>
+      </w:r>
+      <w:proofErr w:type="gramEnd"/>
+      <w:r>
+        <w:rPr>
+          <w:rFonts w:ascii="Arial" w:eastAsia="Arial" w:hAnsi="Arial" w:cs="Arial"/>
+          <w:color w:val="000000"/>
+          <w:sz w:val="24"/>
+          <w:szCs w:val="24"/>
+        </w:rPr>
+        <w:t xml:space="preserve"> should create or modify secrets.</w:t>
       </w:r>
     </w:p>
     <w:p>
@@ -463,7 +543,27 @@
           <w:sz w:val="24"/>
           <w:szCs w:val="24"/>
         </w:rPr>
-        <w:t>All deployments MUST be triggered via the GitHub Actions CD pipeline. Manual deployment on Render is NOT allowed after the initial service setup.</w:t>
+        <w:t xml:space="preserve">All deployments MUST be triggered via the GitHub Actions CD pipeline. Manual deployment </w:t>
+      </w:r>
+      <w:proofErr w:type="gramStart"/>
+      <w:r>
+        <w:rPr>
+          <w:rFonts w:ascii="Arial" w:eastAsia="Arial" w:hAnsi="Arial" w:cs="Arial"/>
+          <w:color w:val="000000"/>
+          <w:sz w:val="24"/>
+          <w:szCs w:val="24"/>
+        </w:rPr>
+        <w:t>on</w:t>
+      </w:r>
+      <w:proofErr w:type="gramEnd"/>
+      <w:r>
+        <w:rPr>
+          <w:rFonts w:ascii="Arial" w:eastAsia="Arial" w:hAnsi="Arial" w:cs="Arial"/>
+          <w:color w:val="000000"/>
+          <w:sz w:val="24"/>
+          <w:szCs w:val="24"/>
+        </w:rPr>
+        <w:t xml:space="preserve"> Render is NOT allowed after the initial service setup.</w:t>
       </w:r>
     </w:p>
     <w:p>
@@ -592,8 +692,9 @@
           <w:sz w:val="18"/>
           <w:szCs w:val="18"/>
         </w:rPr>
-        <w:t xml:space="preserve">Table 1: Group Details </w:t>
-      </w:r>
+        <w:t xml:space="preserve">Table 1: Group </w:t>
+      </w:r>
+      <w:proofErr w:type="gramStart"/>
       <w:r>
         <w:rPr>
           <w:rFonts w:ascii="Arial" w:eastAsia="Arial" w:hAnsi="Arial" w:cs="Arial"/>
@@ -603,7 +704,7 @@
           <w:sz w:val="18"/>
           <w:szCs w:val="18"/>
         </w:rPr>
-        <w:t>,</w:t>
+        <w:t xml:space="preserve">Details </w:t>
       </w:r>
       <w:r>
         <w:rPr>
@@ -614,7 +715,67 @@
           <w:sz w:val="18"/>
           <w:szCs w:val="18"/>
         </w:rPr>
-        <w:t xml:space="preserve"> Each student must fill their own row (including Assigned Page) in the versioned copy inside the repo</w:t>
+        <w:t>,</w:t>
+      </w:r>
+      <w:proofErr w:type="gramEnd"/>
+      <w:r>
+        <w:rPr>
+          <w:rFonts w:ascii="Arial" w:eastAsia="Arial" w:hAnsi="Arial" w:cs="Arial"/>
+          <w:b/>
+          <w:bCs/>
+          <w:color w:val="444444"/>
+          <w:sz w:val="18"/>
+          <w:szCs w:val="18"/>
+        </w:rPr>
+        <w:t xml:space="preserve"> </w:t>
+      </w:r>
+      <w:proofErr w:type="gramStart"/>
+      <w:r>
+        <w:rPr>
+          <w:rFonts w:ascii="Arial" w:eastAsia="Arial" w:hAnsi="Arial" w:cs="Arial"/>
+          <w:b/>
+          <w:bCs/>
+          <w:color w:val="444444"/>
+          <w:sz w:val="18"/>
+          <w:szCs w:val="18"/>
+        </w:rPr>
+        <w:t>Each</w:t>
+      </w:r>
+      <w:proofErr w:type="gramEnd"/>
+      <w:r>
+        <w:rPr>
+          <w:rFonts w:ascii="Arial" w:eastAsia="Arial" w:hAnsi="Arial" w:cs="Arial"/>
+          <w:b/>
+          <w:bCs/>
+          <w:color w:val="444444"/>
+          <w:sz w:val="18"/>
+          <w:szCs w:val="18"/>
+        </w:rPr>
+        <w:t xml:space="preserve"> student must fill their own row (including Assigned Page) in the </w:t>
+      </w:r>
+      <w:proofErr w:type="gramStart"/>
+      <w:r>
+        <w:rPr>
+          <w:rFonts w:ascii="Arial" w:eastAsia="Arial" w:hAnsi="Arial" w:cs="Arial"/>
+          <w:b/>
+          <w:bCs/>
+          <w:color w:val="444444"/>
+          <w:sz w:val="18"/>
+          <w:szCs w:val="18"/>
+        </w:rPr>
+        <w:t>versioned</w:t>
+      </w:r>
+      <w:proofErr w:type="gramEnd"/>
+      <w:r>
+        <w:rPr>
+          <w:rFonts w:ascii="Arial" w:eastAsia="Arial" w:hAnsi="Arial" w:cs="Arial"/>
+          <w:b/>
+          <w:bCs/>
+          <w:color w:val="444444"/>
+          <w:sz w:val="18"/>
+          <w:szCs w:val="18"/>
+        </w:rPr>
+        <w:t xml:space="preserve"> copy inside the repo</w:t>
       </w:r>
     </w:p>
     <w:tbl>
@@ -635,21 +796,15 @@
         <w:tblLook w:val="0000" w:firstRow="0" w:lastRow="0" w:firstColumn="0" w:lastColumn="0" w:noHBand="0" w:noVBand="0"/>
       </w:tblPr>
       <w:tblGrid>
-        <w:gridCol w:w="471"/>
-        <w:gridCol w:w="1424"/>
-        <w:gridCol w:w="1349"/>
-        <w:gridCol w:w="1561"/>
-        <w:gridCol w:w="1306"/>
-        <w:gridCol w:w="1596"/>
-        <w:gridCol w:w="1653"/>
+        <w:gridCol w:w="468"/>
+        <w:gridCol w:w="1231"/>
+        <w:gridCol w:w="1876"/>
+        <w:gridCol w:w="1540"/>
+        <w:gridCol w:w="1128"/>
+        <w:gridCol w:w="2477"/>
+        <w:gridCol w:w="1344"/>
       </w:tblGrid>
       <w:tr>
-        <w:tblPrEx>
-          <w:tblCellMar>
-            <w:top w:w="0" w:type="dxa"/>
-            <w:bottom w:w="0" w:type="dxa"/>
-          </w:tblCellMar>
-        </w:tblPrEx>
         <w:trPr>
           <w:tblHeader/>
         </w:trPr>
@@ -879,12 +1034,6 @@
         </w:tc>
       </w:tr>
       <w:tr>
-        <w:tblPrEx>
-          <w:tblCellMar>
-            <w:top w:w="0" w:type="dxa"/>
-            <w:bottom w:w="0" w:type="dxa"/>
-          </w:tblCellMar>
-        </w:tblPrEx>
         <w:tc>
           <w:tcPr>
             <w:tcW w:w="440" w:type="dxa"/>
@@ -1037,12 +1186,6 @@
         </w:tc>
       </w:tr>
       <w:tr>
-        <w:tblPrEx>
-          <w:tblCellMar>
-            <w:top w:w="0" w:type="dxa"/>
-            <w:bottom w:w="0" w:type="dxa"/>
-          </w:tblCellMar>
-        </w:tblPrEx>
         <w:tc>
           <w:tcPr>
             <w:tcW w:w="440" w:type="dxa"/>
@@ -1195,12 +1338,6 @@
         </w:tc>
       </w:tr>
       <w:tr>
-        <w:tblPrEx>
-          <w:tblCellMar>
-            <w:top w:w="0" w:type="dxa"/>
-            <w:bottom w:w="0" w:type="dxa"/>
-          </w:tblCellMar>
-        </w:tblPrEx>
         <w:tc>
           <w:tcPr>
             <w:tcW w:w="440" w:type="dxa"/>
@@ -1353,12 +1490,6 @@
         </w:tc>
       </w:tr>
       <w:tr>
-        <w:tblPrEx>
-          <w:tblCellMar>
-            <w:top w:w="0" w:type="dxa"/>
-            <w:bottom w:w="0" w:type="dxa"/>
-          </w:tblCellMar>
-        </w:tblPrEx>
         <w:tc>
           <w:tcPr>
             <w:tcW w:w="440" w:type="dxa"/>
@@ -1511,12 +1642,6 @@
         </w:tc>
       </w:tr>
       <w:tr>
-        <w:tblPrEx>
-          <w:tblCellMar>
-            <w:top w:w="0" w:type="dxa"/>
-            <w:bottom w:w="0" w:type="dxa"/>
-          </w:tblCellMar>
-        </w:tblPrEx>
         <w:tc>
           <w:tcPr>
             <w:tcW w:w="440" w:type="dxa"/>
@@ -1565,7 +1690,11 @@
             </w:tcMar>
             <w:vAlign w:val="center"/>
           </w:tcPr>
-          <w:p/>
+          <w:p>
+            <w:r>
+              <w:t>Muhammad Ahmad</w:t>
+            </w:r>
+          </w:p>
         </w:tc>
         <w:tc>
           <w:tcPr>
@@ -1585,7 +1714,11 @@
             </w:tcMar>
             <w:vAlign w:val="center"/>
           </w:tcPr>
-          <w:p/>
+          <w:p>
+            <w:r>
+              <w:t>MuhammadAhmad-n17</w:t>
+            </w:r>
+          </w:p>
         </w:tc>
         <w:tc>
           <w:tcPr>
@@ -1605,7 +1738,11 @@
             </w:tcMar>
             <w:vAlign w:val="center"/>
           </w:tcPr>
-          <w:p/>
+          <w:p>
+            <w:r>
+              <w:t>Member</w:t>
+            </w:r>
+          </w:p>
         </w:tc>
         <w:tc>
           <w:tcPr>
@@ -1625,7 +1762,11 @@
             </w:tcMar>
             <w:vAlign w:val="center"/>
           </w:tcPr>
-          <w:p/>
+          <w:p>
+            <w:r>
+              <w:t>about.html</w:t>
+            </w:r>
+          </w:p>
         </w:tc>
         <w:tc>
           <w:tcPr>
@@ -1645,7 +1786,11 @@
             </w:tcMar>
             <w:vAlign w:val="center"/>
           </w:tcPr>
-          <w:p/>
+          <w:p>
+            <w:r>
+              <w:t>feature/MuhammadAhmad-n17/about</w:t>
+            </w:r>
+          </w:p>
         </w:tc>
         <w:tc>
           <w:tcPr>
@@ -1665,7 +1810,11 @@
             </w:tcMar>
             <w:vAlign w:val="center"/>
           </w:tcPr>
-          <w:p/>
+          <w:p>
+            <w:r>
+              <w:t>Yes</w:t>
+            </w:r>
+          </w:p>
         </w:tc>
       </w:tr>
     </w:tbl>
@@ -1727,7 +1876,23 @@
           <w:rFonts w:ascii="Arial" w:eastAsia="Arial" w:hAnsi="Arial" w:cs="Arial"/>
           <w:color w:val="555555"/>
         </w:rPr>
-        <w:t>[Paste Your Render Live URL Here]</w:t>
+        <w:t xml:space="preserve">[Paste </w:t>
+      </w:r>
+      <w:proofErr w:type="gramStart"/>
+      <w:r>
+        <w:rPr>
+          <w:rFonts w:ascii="Arial" w:eastAsia="Arial" w:hAnsi="Arial" w:cs="Arial"/>
+          <w:color w:val="555555"/>
+        </w:rPr>
+        <w:t>Your Render</w:t>
+      </w:r>
+      <w:proofErr w:type="gramEnd"/>
+      <w:r>
+        <w:rPr>
+          <w:rFonts w:ascii="Arial" w:eastAsia="Arial" w:hAnsi="Arial" w:cs="Arial"/>
+          <w:color w:val="555555"/>
+        </w:rPr>
+        <w:t xml:space="preserve"> Live URL Here]</w:t>
       </w:r>
     </w:p>
     <w:p>
@@ -1831,12 +1996,6 @@
         <w:gridCol w:w="4860"/>
       </w:tblGrid>
       <w:tr>
-        <w:tblPrEx>
-          <w:tblCellMar>
-            <w:top w:w="0" w:type="dxa"/>
-            <w:bottom w:w="0" w:type="dxa"/>
-          </w:tblCellMar>
-        </w:tblPrEx>
         <w:trPr>
           <w:tblHeader/>
         </w:trPr>
@@ -1970,12 +2129,6 @@
         </w:tc>
       </w:tr>
       <w:tr>
-        <w:tblPrEx>
-          <w:tblCellMar>
-            <w:top w:w="0" w:type="dxa"/>
-            <w:bottom w:w="0" w:type="dxa"/>
-          </w:tblCellMar>
-        </w:tblPrEx>
         <w:tc>
           <w:tcPr>
             <w:tcW w:w="500" w:type="dxa"/>
@@ -2102,12 +2255,6 @@
         </w:tc>
       </w:tr>
       <w:tr>
-        <w:tblPrEx>
-          <w:tblCellMar>
-            <w:top w:w="0" w:type="dxa"/>
-            <w:bottom w:w="0" w:type="dxa"/>
-          </w:tblCellMar>
-        </w:tblPrEx>
         <w:tc>
           <w:tcPr>
             <w:tcW w:w="500" w:type="dxa"/>
@@ -2228,7 +2375,17 @@
                 <w:sz w:val="18"/>
                 <w:szCs w:val="18"/>
               </w:rPr>
-              <w:t xml:space="preserve">An HTML form allowing the user to enter a new task </w:t>
+              <w:t xml:space="preserve">An HTML form allowing the user to enter a new </w:t>
+            </w:r>
+            <w:proofErr w:type="gramStart"/>
+            <w:r>
+              <w:rPr>
+                <w:rFonts w:ascii="Arial" w:eastAsia="Arial" w:hAnsi="Arial" w:cs="Arial"/>
+                <w:color w:val="000000"/>
+                <w:sz w:val="18"/>
+                <w:szCs w:val="18"/>
+              </w:rPr>
+              <w:t xml:space="preserve">task </w:t>
             </w:r>
             <w:r>
               <w:rPr>
@@ -2239,6 +2396,7 @@
               </w:rPr>
               <w:t>,</w:t>
             </w:r>
+            <w:proofErr w:type="gramEnd"/>
             <w:r>
               <w:rPr>
                 <w:rFonts w:ascii="Arial" w:eastAsia="Arial" w:hAnsi="Arial" w:cs="Arial"/>
@@ -2252,12 +2410,6 @@
         </w:tc>
       </w:tr>
       <w:tr>
-        <w:tblPrEx>
-          <w:tblCellMar>
-            <w:top w:w="0" w:type="dxa"/>
-            <w:bottom w:w="0" w:type="dxa"/>
-          </w:tblCellMar>
-        </w:tblPrEx>
         <w:tc>
           <w:tcPr>
             <w:tcW w:w="500" w:type="dxa"/>
@@ -2384,12 +2536,6 @@
         </w:tc>
       </w:tr>
       <w:tr>
-        <w:tblPrEx>
-          <w:tblCellMar>
-            <w:top w:w="0" w:type="dxa"/>
-            <w:bottom w:w="0" w:type="dxa"/>
-          </w:tblCellMar>
-        </w:tblPrEx>
         <w:tc>
           <w:tcPr>
             <w:tcW w:w="500" w:type="dxa"/>
@@ -2516,12 +2662,6 @@
         </w:tc>
       </w:tr>
       <w:tr>
-        <w:tblPrEx>
-          <w:tblCellMar>
-            <w:top w:w="0" w:type="dxa"/>
-            <w:bottom w:w="0" w:type="dxa"/>
-          </w:tblCellMar>
-        </w:tblPrEx>
         <w:tc>
           <w:tcPr>
             <w:tcW w:w="500" w:type="dxa"/>
@@ -2550,6 +2690,7 @@
                 <w:sz w:val="18"/>
                 <w:szCs w:val="18"/>
               </w:rPr>
+              <w:lastRenderedPageBreak/>
               <w:t>5</w:t>
             </w:r>
           </w:p>
@@ -2665,7 +2806,6 @@
           <w:bCs/>
           <w:color w:val="000000"/>
         </w:rPr>
-        <w:lastRenderedPageBreak/>
         <w:t>Each member's individual workflow:</w:t>
       </w:r>
     </w:p>
@@ -2697,7 +2837,23 @@
           <w:rFonts w:ascii="Arial" w:eastAsia="Arial" w:hAnsi="Arial" w:cs="Arial"/>
           <w:color w:val="000000"/>
         </w:rPr>
-        <w:t xml:space="preserve"> using the naming convention: feature/&lt;member-github-username&gt;/&lt;page-name&gt;  (e.g., feature/ali-hassan/add-task).</w:t>
+        <w:t xml:space="preserve"> using the naming convention: feature/&lt;member-github-username&gt;/&lt;page-name</w:t>
+      </w:r>
+      <w:proofErr w:type="gramStart"/>
+      <w:r>
+        <w:rPr>
+          <w:rFonts w:ascii="Arial" w:eastAsia="Arial" w:hAnsi="Arial" w:cs="Arial"/>
+          <w:color w:val="000000"/>
+        </w:rPr>
+        <w:t>&gt;  (</w:t>
+      </w:r>
+      <w:proofErr w:type="gramEnd"/>
+      <w:r>
+        <w:rPr>
+          <w:rFonts w:ascii="Arial" w:eastAsia="Arial" w:hAnsi="Arial" w:cs="Arial"/>
+          <w:color w:val="000000"/>
+        </w:rPr>
+        <w:t>e.g., feature/ali-hassan/add-task).</w:t>
       </w:r>
     </w:p>
     <w:p>
@@ -2779,7 +2935,23 @@
           <w:rFonts w:ascii="Arial" w:eastAsia="Arial" w:hAnsi="Arial" w:cs="Arial"/>
           <w:color w:val="000000"/>
         </w:rPr>
-        <w:t xml:space="preserve">Once CI passes and the PR is reviewed and approved, the Team Lead merges the PR. The merge generates a push event on </w:t>
+        <w:t xml:space="preserve">Once CI passes and the PR is reviewed and approved, the Team Lead </w:t>
+      </w:r>
+      <w:proofErr w:type="gramStart"/>
+      <w:r>
+        <w:rPr>
+          <w:rFonts w:ascii="Arial" w:eastAsia="Arial" w:hAnsi="Arial" w:cs="Arial"/>
+          <w:color w:val="000000"/>
+        </w:rPr>
+        <w:t>merges</w:t>
+      </w:r>
+      <w:proofErr w:type="gramEnd"/>
+      <w:r>
+        <w:rPr>
+          <w:rFonts w:ascii="Arial" w:eastAsia="Arial" w:hAnsi="Arial" w:cs="Arial"/>
+          <w:color w:val="000000"/>
+        </w:rPr>
+        <w:t xml:space="preserve"> the PR. The merge generates a push event on </w:t>
       </w:r>
       <w:r>
         <w:rPr>
@@ -2862,7 +3034,23 @@
           <w:rFonts w:ascii="Arial" w:eastAsia="Arial" w:hAnsi="Arial" w:cs="Arial"/>
           <w:color w:val="000000"/>
         </w:rPr>
-        <w:t>The Team Lead must complete the following setup steps before the team starts working:</w:t>
+        <w:t xml:space="preserve">The Team Lead must complete the </w:t>
+      </w:r>
+      <w:proofErr w:type="gramStart"/>
+      <w:r>
+        <w:rPr>
+          <w:rFonts w:ascii="Arial" w:eastAsia="Arial" w:hAnsi="Arial" w:cs="Arial"/>
+          <w:color w:val="000000"/>
+        </w:rPr>
+        <w:t>following setup</w:t>
+      </w:r>
+      <w:proofErr w:type="gramEnd"/>
+      <w:r>
+        <w:rPr>
+          <w:rFonts w:ascii="Arial" w:eastAsia="Arial" w:hAnsi="Arial" w:cs="Arial"/>
+          <w:color w:val="000000"/>
+        </w:rPr>
+        <w:t xml:space="preserve"> steps before the team starts working:</w:t>
       </w:r>
     </w:p>
     <w:p>
@@ -2958,7 +3146,23 @@
           <w:rFonts w:ascii="Arial" w:eastAsia="Arial" w:hAnsi="Arial" w:cs="Arial"/>
           <w:color w:val="000000"/>
         </w:rPr>
-        <w:t>Team Lead: Sign up on Render (render.com), create a new Web Service connected to the Docker Hub image repository, and copy the deploy hook URL from the Render service settings. This URL will be stored as the RENDER_DEPLOY_HOOK_URL secret.</w:t>
+        <w:t xml:space="preserve">Team Lead: Sign up </w:t>
+      </w:r>
+      <w:proofErr w:type="gramStart"/>
+      <w:r>
+        <w:rPr>
+          <w:rFonts w:ascii="Arial" w:eastAsia="Arial" w:hAnsi="Arial" w:cs="Arial"/>
+          <w:color w:val="000000"/>
+        </w:rPr>
+        <w:t>on</w:t>
+      </w:r>
+      <w:proofErr w:type="gramEnd"/>
+      <w:r>
+        <w:rPr>
+          <w:rFonts w:ascii="Arial" w:eastAsia="Arial" w:hAnsi="Arial" w:cs="Arial"/>
+          <w:color w:val="000000"/>
+        </w:rPr>
+        <w:t xml:space="preserve"> Render (render.com), create a new Web Service connected to the Docker Hub image repository, and copy the deploy hook URL from the Render service settings. This URL will be stored as the RENDER_DEPLOY_HOOK_URL secret.</w:t>
       </w:r>
     </w:p>
     <w:p>
@@ -3037,12 +3241,6 @@
         <w:gridCol w:w="6160"/>
       </w:tblGrid>
       <w:tr>
-        <w:tblPrEx>
-          <w:tblCellMar>
-            <w:top w:w="0" w:type="dxa"/>
-            <w:bottom w:w="0" w:type="dxa"/>
-          </w:tblCellMar>
-        </w:tblPrEx>
         <w:trPr>
           <w:tblHeader/>
         </w:trPr>
@@ -3112,12 +3310,6 @@
         </w:tc>
       </w:tr>
       <w:tr>
-        <w:tblPrEx>
-          <w:tblCellMar>
-            <w:top w:w="0" w:type="dxa"/>
-            <w:bottom w:w="0" w:type="dxa"/>
-          </w:tblCellMar>
-        </w:tblPrEx>
         <w:tc>
           <w:tcPr>
             <w:tcW w:w="3200" w:type="dxa"/>
@@ -3176,7 +3368,17 @@
                 <w:sz w:val="18"/>
                 <w:szCs w:val="18"/>
               </w:rPr>
-              <w:t xml:space="preserve">Home / Dashboard page </w:t>
+              <w:t xml:space="preserve">Home / Dashboard </w:t>
+            </w:r>
+            <w:proofErr w:type="gramStart"/>
+            <w:r>
+              <w:rPr>
+                <w:rFonts w:ascii="Arial" w:eastAsia="Arial" w:hAnsi="Arial" w:cs="Arial"/>
+                <w:color w:val="000000"/>
+                <w:sz w:val="18"/>
+                <w:szCs w:val="18"/>
+              </w:rPr>
+              <w:t xml:space="preserve">page </w:t>
             </w:r>
             <w:r>
               <w:rPr>
@@ -3187,6 +3389,7 @@
               </w:rPr>
               <w:t>,</w:t>
             </w:r>
+            <w:proofErr w:type="gramEnd"/>
             <w:r>
               <w:rPr>
                 <w:rFonts w:ascii="Arial" w:eastAsia="Arial" w:hAnsi="Arial" w:cs="Arial"/>
@@ -3200,12 +3403,6 @@
         </w:tc>
       </w:tr>
       <w:tr>
-        <w:tblPrEx>
-          <w:tblCellMar>
-            <w:top w:w="0" w:type="dxa"/>
-            <w:bottom w:w="0" w:type="dxa"/>
-          </w:tblCellMar>
-        </w:tblPrEx>
         <w:tc>
           <w:tcPr>
             <w:tcW w:w="3200" w:type="dxa"/>
@@ -3264,7 +3461,17 @@
                 <w:sz w:val="18"/>
                 <w:szCs w:val="18"/>
               </w:rPr>
-              <w:t xml:space="preserve">Add Task page </w:t>
+              <w:t xml:space="preserve">Add Task </w:t>
+            </w:r>
+            <w:proofErr w:type="gramStart"/>
+            <w:r>
+              <w:rPr>
+                <w:rFonts w:ascii="Arial" w:eastAsia="Arial" w:hAnsi="Arial" w:cs="Arial"/>
+                <w:color w:val="000000"/>
+                <w:sz w:val="18"/>
+                <w:szCs w:val="18"/>
+              </w:rPr>
+              <w:t xml:space="preserve">page </w:t>
             </w:r>
             <w:r>
               <w:rPr>
@@ -3275,6 +3482,7 @@
               </w:rPr>
               <w:t>,</w:t>
             </w:r>
+            <w:proofErr w:type="gramEnd"/>
             <w:r>
               <w:rPr>
                 <w:rFonts w:ascii="Arial" w:eastAsia="Arial" w:hAnsi="Arial" w:cs="Arial"/>
@@ -3288,12 +3496,6 @@
         </w:tc>
       </w:tr>
       <w:tr>
-        <w:tblPrEx>
-          <w:tblCellMar>
-            <w:top w:w="0" w:type="dxa"/>
-            <w:bottom w:w="0" w:type="dxa"/>
-          </w:tblCellMar>
-        </w:tblPrEx>
         <w:tc>
           <w:tcPr>
             <w:tcW w:w="3200" w:type="dxa"/>
@@ -3352,7 +3554,17 @@
                 <w:sz w:val="18"/>
                 <w:szCs w:val="18"/>
               </w:rPr>
-              <w:t xml:space="preserve">Task List page </w:t>
+              <w:t xml:space="preserve">Task List </w:t>
+            </w:r>
+            <w:proofErr w:type="gramStart"/>
+            <w:r>
+              <w:rPr>
+                <w:rFonts w:ascii="Arial" w:eastAsia="Arial" w:hAnsi="Arial" w:cs="Arial"/>
+                <w:color w:val="000000"/>
+                <w:sz w:val="18"/>
+                <w:szCs w:val="18"/>
+              </w:rPr>
+              <w:t xml:space="preserve">page </w:t>
             </w:r>
             <w:r>
               <w:rPr>
@@ -3363,6 +3575,7 @@
               </w:rPr>
               <w:t>,</w:t>
             </w:r>
+            <w:proofErr w:type="gramEnd"/>
             <w:r>
               <w:rPr>
                 <w:rFonts w:ascii="Arial" w:eastAsia="Arial" w:hAnsi="Arial" w:cs="Arial"/>
@@ -3376,12 +3589,6 @@
         </w:tc>
       </w:tr>
       <w:tr>
-        <w:tblPrEx>
-          <w:tblCellMar>
-            <w:top w:w="0" w:type="dxa"/>
-            <w:bottom w:w="0" w:type="dxa"/>
-          </w:tblCellMar>
-        </w:tblPrEx>
         <w:tc>
           <w:tcPr>
             <w:tcW w:w="3200" w:type="dxa"/>
@@ -3440,7 +3647,17 @@
                 <w:sz w:val="18"/>
                 <w:szCs w:val="18"/>
               </w:rPr>
-              <w:t xml:space="preserve">Task Detail page </w:t>
+              <w:t xml:space="preserve">Task Detail </w:t>
+            </w:r>
+            <w:proofErr w:type="gramStart"/>
+            <w:r>
+              <w:rPr>
+                <w:rFonts w:ascii="Arial" w:eastAsia="Arial" w:hAnsi="Arial" w:cs="Arial"/>
+                <w:color w:val="000000"/>
+                <w:sz w:val="18"/>
+                <w:szCs w:val="18"/>
+              </w:rPr>
+              <w:t xml:space="preserve">page </w:t>
             </w:r>
             <w:r>
               <w:rPr>
@@ -3451,6 +3668,7 @@
               </w:rPr>
               <w:t>,</w:t>
             </w:r>
+            <w:proofErr w:type="gramEnd"/>
             <w:r>
               <w:rPr>
                 <w:rFonts w:ascii="Arial" w:eastAsia="Arial" w:hAnsi="Arial" w:cs="Arial"/>
@@ -3464,12 +3682,6 @@
         </w:tc>
       </w:tr>
       <w:tr>
-        <w:tblPrEx>
-          <w:tblCellMar>
-            <w:top w:w="0" w:type="dxa"/>
-            <w:bottom w:w="0" w:type="dxa"/>
-          </w:tblCellMar>
-        </w:tblPrEx>
         <w:tc>
           <w:tcPr>
             <w:tcW w:w="3200" w:type="dxa"/>
@@ -3528,7 +3740,17 @@
                 <w:sz w:val="18"/>
                 <w:szCs w:val="18"/>
               </w:rPr>
-              <w:t xml:space="preserve">About / Help page </w:t>
+              <w:t xml:space="preserve">About / Help </w:t>
+            </w:r>
+            <w:proofErr w:type="gramStart"/>
+            <w:r>
+              <w:rPr>
+                <w:rFonts w:ascii="Arial" w:eastAsia="Arial" w:hAnsi="Arial" w:cs="Arial"/>
+                <w:color w:val="000000"/>
+                <w:sz w:val="18"/>
+                <w:szCs w:val="18"/>
+              </w:rPr>
+              <w:t xml:space="preserve">page </w:t>
             </w:r>
             <w:r>
               <w:rPr>
@@ -3539,6 +3761,7 @@
               </w:rPr>
               <w:t>,</w:t>
             </w:r>
+            <w:proofErr w:type="gramEnd"/>
             <w:r>
               <w:rPr>
                 <w:rFonts w:ascii="Arial" w:eastAsia="Arial" w:hAnsi="Arial" w:cs="Arial"/>
@@ -3552,12 +3775,6 @@
         </w:tc>
       </w:tr>
       <w:tr>
-        <w:tblPrEx>
-          <w:tblCellMar>
-            <w:top w:w="0" w:type="dxa"/>
-            <w:bottom w:w="0" w:type="dxa"/>
-          </w:tblCellMar>
-        </w:tblPrEx>
         <w:tc>
           <w:tcPr>
             <w:tcW w:w="3200" w:type="dxa"/>
@@ -3616,7 +3833,17 @@
                 <w:sz w:val="18"/>
                 <w:szCs w:val="18"/>
               </w:rPr>
-              <w:t xml:space="preserve">Shared stylesheet </w:t>
+              <w:t xml:space="preserve">Shared </w:t>
+            </w:r>
+            <w:proofErr w:type="gramStart"/>
+            <w:r>
+              <w:rPr>
+                <w:rFonts w:ascii="Arial" w:eastAsia="Arial" w:hAnsi="Arial" w:cs="Arial"/>
+                <w:color w:val="000000"/>
+                <w:sz w:val="18"/>
+                <w:szCs w:val="18"/>
+              </w:rPr>
+              <w:t xml:space="preserve">stylesheet </w:t>
             </w:r>
             <w:r>
               <w:rPr>
@@ -3627,6 +3854,7 @@
               </w:rPr>
               <w:t>,</w:t>
             </w:r>
+            <w:proofErr w:type="gramEnd"/>
             <w:r>
               <w:rPr>
                 <w:rFonts w:ascii="Arial" w:eastAsia="Arial" w:hAnsi="Arial" w:cs="Arial"/>
@@ -3640,12 +3868,6 @@
         </w:tc>
       </w:tr>
       <w:tr>
-        <w:tblPrEx>
-          <w:tblCellMar>
-            <w:top w:w="0" w:type="dxa"/>
-            <w:bottom w:w="0" w:type="dxa"/>
-          </w:tblCellMar>
-        </w:tblPrEx>
         <w:tc>
           <w:tcPr>
             <w:tcW w:w="3200" w:type="dxa"/>
@@ -3710,12 +3932,6 @@
         </w:tc>
       </w:tr>
       <w:tr>
-        <w:tblPrEx>
-          <w:tblCellMar>
-            <w:top w:w="0" w:type="dxa"/>
-            <w:bottom w:w="0" w:type="dxa"/>
-          </w:tblCellMar>
-        </w:tblPrEx>
         <w:tc>
           <w:tcPr>
             <w:tcW w:w="3200" w:type="dxa"/>
@@ -3789,12 +4005,6 @@
         </w:tc>
       </w:tr>
       <w:tr>
-        <w:tblPrEx>
-          <w:tblCellMar>
-            <w:top w:w="0" w:type="dxa"/>
-            <w:bottom w:w="0" w:type="dxa"/>
-          </w:tblCellMar>
-        </w:tblPrEx>
         <w:tc>
           <w:tcPr>
             <w:tcW w:w="3200" w:type="dxa"/>
@@ -3868,12 +4078,6 @@
         </w:tc>
       </w:tr>
       <w:tr>
-        <w:tblPrEx>
-          <w:tblCellMar>
-            <w:top w:w="0" w:type="dxa"/>
-            <w:bottom w:w="0" w:type="dxa"/>
-          </w:tblCellMar>
-        </w:tblPrEx>
         <w:tc>
           <w:tcPr>
             <w:tcW w:w="3200" w:type="dxa"/>
@@ -3902,6 +4106,7 @@
                 <w:sz w:val="18"/>
                 <w:szCs w:val="18"/>
               </w:rPr>
+              <w:lastRenderedPageBreak/>
               <w:t>Assignment_04_Spring2026.docx</w:t>
             </w:r>
           </w:p>
@@ -3972,8 +4177,31 @@
           <w:rFonts w:ascii="Arial" w:eastAsia="Arial" w:hAnsi="Arial" w:cs="Arial"/>
           <w:color w:val="000000"/>
         </w:rPr>
-        <w:lastRenderedPageBreak/>
-        <w:t xml:space="preserve">The Team Lead (TL) is responsible for creating all secrets listed below. The TL is the repository admin and the credentials in use </w:t>
+        <w:t xml:space="preserve">The Team Lead (TL) is responsible for creating all secrets listed below. </w:t>
+      </w:r>
+      <w:proofErr w:type="gramStart"/>
+      <w:r>
+        <w:rPr>
+          <w:rFonts w:ascii="Arial" w:eastAsia="Arial" w:hAnsi="Arial" w:cs="Arial"/>
+          <w:color w:val="000000"/>
+        </w:rPr>
+        <w:t>The TL</w:t>
+      </w:r>
+      <w:proofErr w:type="gramEnd"/>
+      <w:r>
+        <w:rPr>
+          <w:rFonts w:ascii="Arial" w:eastAsia="Arial" w:hAnsi="Arial" w:cs="Arial"/>
+          <w:color w:val="000000"/>
+        </w:rPr>
+        <w:t xml:space="preserve"> is the repository admin and the credentials in </w:t>
+      </w:r>
+      <w:proofErr w:type="gramStart"/>
+      <w:r>
+        <w:rPr>
+          <w:rFonts w:ascii="Arial" w:eastAsia="Arial" w:hAnsi="Arial" w:cs="Arial"/>
+          <w:color w:val="000000"/>
+        </w:rPr>
+        <w:t xml:space="preserve">use </w:t>
       </w:r>
       <w:r>
         <w:rPr>
@@ -3982,12 +4210,21 @@
         </w:rPr>
         <w:t>,</w:t>
       </w:r>
-      <w:r>
-        <w:rPr>
-          <w:rFonts w:ascii="Arial" w:eastAsia="Arial" w:hAnsi="Arial" w:cs="Arial"/>
-          <w:color w:val="000000"/>
-        </w:rPr>
-        <w:t xml:space="preserve"> Docker Hub and Render </w:t>
+      <w:proofErr w:type="gramEnd"/>
+      <w:r>
+        <w:rPr>
+          <w:rFonts w:ascii="Arial" w:eastAsia="Arial" w:hAnsi="Arial" w:cs="Arial"/>
+          <w:color w:val="000000"/>
+        </w:rPr>
+        <w:t xml:space="preserve"> Docker Hub and </w:t>
+      </w:r>
+      <w:proofErr w:type="gramStart"/>
+      <w:r>
+        <w:rPr>
+          <w:rFonts w:ascii="Arial" w:eastAsia="Arial" w:hAnsi="Arial" w:cs="Arial"/>
+          <w:color w:val="000000"/>
+        </w:rPr>
+        <w:t xml:space="preserve">Render </w:t>
       </w:r>
       <w:r>
         <w:rPr>
@@ -3996,6 +4233,7 @@
         </w:rPr>
         <w:t>,</w:t>
       </w:r>
+      <w:proofErr w:type="gramEnd"/>
       <w:r>
         <w:rPr>
           <w:rFonts w:ascii="Arial" w:eastAsia="Arial" w:hAnsi="Arial" w:cs="Arial"/>
@@ -4120,12 +4358,6 @@
         <w:gridCol w:w="4420"/>
       </w:tblGrid>
       <w:tr>
-        <w:tblPrEx>
-          <w:tblCellMar>
-            <w:top w:w="0" w:type="dxa"/>
-            <w:bottom w:w="0" w:type="dxa"/>
-          </w:tblCellMar>
-        </w:tblPrEx>
         <w:trPr>
           <w:tblHeader/>
         </w:trPr>
@@ -4227,12 +4459,6 @@
         </w:tc>
       </w:tr>
       <w:tr>
-        <w:tblPrEx>
-          <w:tblCellMar>
-            <w:top w:w="0" w:type="dxa"/>
-            <w:bottom w:w="0" w:type="dxa"/>
-          </w:tblCellMar>
-        </w:tblPrEx>
         <w:trPr>
           <w:trHeight w:val="427"/>
         </w:trPr>
@@ -4336,12 +4562,6 @@
         </w:tc>
       </w:tr>
       <w:tr>
-        <w:tblPrEx>
-          <w:tblCellMar>
-            <w:top w:w="0" w:type="dxa"/>
-            <w:bottom w:w="0" w:type="dxa"/>
-          </w:tblCellMar>
-        </w:tblPrEx>
         <w:tc>
           <w:tcPr>
             <w:tcW w:w="2000" w:type="dxa"/>
@@ -4430,7 +4650,17 @@
                 <w:sz w:val="18"/>
                 <w:szCs w:val="18"/>
               </w:rPr>
-              <w:t xml:space="preserve">Team Lead's Docker Hub Personal Access Token (PAT) </w:t>
+              <w:t>Team Lead's Docker Hub Personal Access Token (PAT</w:t>
+            </w:r>
+            <w:proofErr w:type="gramStart"/>
+            <w:r>
+              <w:rPr>
+                <w:rFonts w:ascii="Arial" w:eastAsia="Arial" w:hAnsi="Arial" w:cs="Arial"/>
+                <w:color w:val="000000"/>
+                <w:sz w:val="18"/>
+                <w:szCs w:val="18"/>
+              </w:rPr>
+              <w:t xml:space="preserve">) </w:t>
             </w:r>
             <w:r>
               <w:rPr>
@@ -4441,6 +4671,7 @@
               </w:rPr>
               <w:t>,</w:t>
             </w:r>
+            <w:proofErr w:type="gramEnd"/>
             <w:r>
               <w:rPr>
                 <w:rFonts w:ascii="Arial" w:eastAsia="Arial" w:hAnsi="Arial" w:cs="Arial"/>
@@ -4454,12 +4685,6 @@
         </w:tc>
       </w:tr>
       <w:tr>
-        <w:tblPrEx>
-          <w:tblCellMar>
-            <w:top w:w="0" w:type="dxa"/>
-            <w:bottom w:w="0" w:type="dxa"/>
-          </w:tblCellMar>
-        </w:tblPrEx>
         <w:tc>
           <w:tcPr>
             <w:tcW w:w="2000" w:type="dxa"/>
@@ -4571,7 +4796,27 @@
           <w:sz w:val="18"/>
           <w:szCs w:val="18"/>
         </w:rPr>
-        <w:t xml:space="preserve">All three secrets must be created by the Team Lead, as the TL is the repository admin and the credentials belong to them. DOCKERHUB_USERNAME and DOCKERHUB_TOKEN must be the Team Lead's own Docker Hub credentials, added as repository-level secrets (Settings → Secrets and variables → Actions → Repository secrets). RENDER_DEPLOY_HOOK_URL is obtained from the Render web service set up by the Team Lead and must be added as an environment-level secret inside the </w:t>
+        <w:t xml:space="preserve">All three secrets must be created by the Team Lead, as </w:t>
+      </w:r>
+      <w:proofErr w:type="gramStart"/>
+      <w:r>
+        <w:rPr>
+          <w:rFonts w:ascii="Arial" w:eastAsia="Arial" w:hAnsi="Arial" w:cs="Arial"/>
+          <w:color w:val="555555"/>
+          <w:sz w:val="18"/>
+          <w:szCs w:val="18"/>
+        </w:rPr>
+        <w:t>the TL</w:t>
+      </w:r>
+      <w:proofErr w:type="gramEnd"/>
+      <w:r>
+        <w:rPr>
+          <w:rFonts w:ascii="Arial" w:eastAsia="Arial" w:hAnsi="Arial" w:cs="Arial"/>
+          <w:color w:val="555555"/>
+          <w:sz w:val="18"/>
+          <w:szCs w:val="18"/>
+        </w:rPr>
+        <w:t xml:space="preserve"> is the repository admin and the credentials belong to them. DOCKERHUB_USERNAME and DOCKERHUB_TOKEN must be the Team Lead's own Docker Hub credentials, added as repository-level secrets (Settings → Secrets and variables → Actions → Repository secrets). RENDER_DEPLOY_HOOK_URL is obtained from the Render web service set up by the Team Lead and must be added as an environment-level secret inside the </w:t>
       </w:r>
       <w:r>
         <w:rPr>
@@ -4613,7 +4858,31 @@
           <w:sz w:val="28"/>
           <w:szCs w:val="28"/>
         </w:rPr>
-        <w:t>CI PIPELINE REQUIREMENTS  (.github/workflows/ci.yml)</w:t>
+        <w:t xml:space="preserve">CI PIPELINE </w:t>
+      </w:r>
+      <w:proofErr w:type="gramStart"/>
+      <w:r>
+        <w:rPr>
+          <w:rFonts w:ascii="Arial" w:eastAsia="Arial" w:hAnsi="Arial" w:cs="Arial"/>
+          <w:b/>
+          <w:bCs/>
+          <w:color w:val="1F3864"/>
+          <w:sz w:val="28"/>
+          <w:szCs w:val="28"/>
+        </w:rPr>
+        <w:t>REQUIREMENTS  (</w:t>
+      </w:r>
+      <w:proofErr w:type="gramEnd"/>
+      <w:r>
+        <w:rPr>
+          <w:rFonts w:ascii="Arial" w:eastAsia="Arial" w:hAnsi="Arial" w:cs="Arial"/>
+          <w:b/>
+          <w:bCs/>
+          <w:color w:val="1F3864"/>
+          <w:sz w:val="28"/>
+          <w:szCs w:val="28"/>
+        </w:rPr>
+        <w:t>.github/workflows/ci.yml)</w:t>
       </w:r>
     </w:p>
     <w:p>
@@ -4732,7 +5001,15 @@
           <w:rFonts w:ascii="Arial" w:eastAsia="Arial" w:hAnsi="Arial" w:cs="Arial"/>
           <w:color w:val="000000"/>
         </w:rPr>
-        <w:t xml:space="preserve">Step 4 – Tag Image: Tag the image using a meaningful strategy </w:t>
+        <w:t xml:space="preserve">Step 4 – Tag Image: Tag the image using a meaningful </w:t>
+      </w:r>
+      <w:proofErr w:type="gramStart"/>
+      <w:r>
+        <w:rPr>
+          <w:rFonts w:ascii="Arial" w:eastAsia="Arial" w:hAnsi="Arial" w:cs="Arial"/>
+          <w:color w:val="000000"/>
+        </w:rPr>
+        <w:t xml:space="preserve">strategy </w:t>
       </w:r>
       <w:r>
         <w:rPr>
@@ -4741,6 +5018,7 @@
         </w:rPr>
         <w:t>,</w:t>
       </w:r>
+      <w:proofErr w:type="gramEnd"/>
       <w:r>
         <w:rPr>
           <w:rFonts w:ascii="Arial" w:eastAsia="Arial" w:hAnsi="Arial" w:cs="Arial"/>
@@ -4815,6 +5093,7 @@
           <w:rFonts w:ascii="Arial" w:eastAsia="Arial" w:hAnsi="Arial" w:cs="Arial"/>
           <w:color w:val="000000"/>
         </w:rPr>
+        <w:lastRenderedPageBreak/>
         <w:t xml:space="preserve">The CI status check must appear as a required check in the Branch Protection Rules on </w:t>
       </w:r>
       <w:r>
@@ -4853,7 +5132,31 @@
           <w:sz w:val="28"/>
           <w:szCs w:val="28"/>
         </w:rPr>
-        <w:t>CD PIPELINE REQUIREMENTS  (.github/workflows/cd.yml)</w:t>
+        <w:t xml:space="preserve">CD PIPELINE </w:t>
+      </w:r>
+      <w:proofErr w:type="gramStart"/>
+      <w:r>
+        <w:rPr>
+          <w:rFonts w:ascii="Arial" w:eastAsia="Arial" w:hAnsi="Arial" w:cs="Arial"/>
+          <w:b/>
+          <w:bCs/>
+          <w:color w:val="1F3864"/>
+          <w:sz w:val="28"/>
+          <w:szCs w:val="28"/>
+        </w:rPr>
+        <w:t>REQUIREMENTS  (</w:t>
+      </w:r>
+      <w:proofErr w:type="gramEnd"/>
+      <w:r>
+        <w:rPr>
+          <w:rFonts w:ascii="Arial" w:eastAsia="Arial" w:hAnsi="Arial" w:cs="Arial"/>
+          <w:b/>
+          <w:bCs/>
+          <w:color w:val="1F3864"/>
+          <w:sz w:val="28"/>
+          <w:szCs w:val="28"/>
+        </w:rPr>
+        <w:t>.github/workflows/cd.yml)</w:t>
       </w:r>
     </w:p>
     <w:p>
@@ -4973,7 +5276,23 @@
           <w:rFonts w:ascii="Arial" w:eastAsia="Arial" w:hAnsi="Arial" w:cs="Arial"/>
           <w:color w:val="000000"/>
         </w:rPr>
-        <w:t>Step 3 – Deploy: Send an HTTP POST request to the Render deploy hook URL using curl:</w:t>
+        <w:t xml:space="preserve">Step 3 – Deploy: Send an HTTP POST request to the Render </w:t>
+      </w:r>
+      <w:proofErr w:type="gramStart"/>
+      <w:r>
+        <w:rPr>
+          <w:rFonts w:ascii="Arial" w:eastAsia="Arial" w:hAnsi="Arial" w:cs="Arial"/>
+          <w:color w:val="000000"/>
+        </w:rPr>
+        <w:t>deploy</w:t>
+      </w:r>
+      <w:proofErr w:type="gramEnd"/>
+      <w:r>
+        <w:rPr>
+          <w:rFonts w:ascii="Arial" w:eastAsia="Arial" w:hAnsi="Arial" w:cs="Arial"/>
+          <w:color w:val="000000"/>
+        </w:rPr>
+        <w:t xml:space="preserve"> hook URL using curl:</w:t>
       </w:r>
     </w:p>
     <w:p>
@@ -4991,7 +5310,43 @@
           <w:sz w:val="19"/>
           <w:szCs w:val="19"/>
         </w:rPr>
-        <w:t>curl -X POST ${{ secrets.RENDER_DEPLOY_HOOK_URL }}</w:t>
+        <w:t>curl -X POST $</w:t>
+      </w:r>
+      <w:proofErr w:type="gramStart"/>
+      <w:r>
+        <w:rPr>
+          <w:rFonts w:ascii="Arial" w:eastAsia="Arial" w:hAnsi="Arial" w:cs="Arial"/>
+          <w:sz w:val="19"/>
+          <w:szCs w:val="19"/>
+        </w:rPr>
+        <w:t>{{ secrets</w:t>
+      </w:r>
+      <w:proofErr w:type="gramEnd"/>
+      <w:r>
+        <w:rPr>
+          <w:rFonts w:ascii="Arial" w:eastAsia="Arial" w:hAnsi="Arial" w:cs="Arial"/>
+          <w:sz w:val="19"/>
+          <w:szCs w:val="19"/>
+        </w:rPr>
+        <w:t>.RENDER_DEPLOY_HOOK_</w:t>
+      </w:r>
+      <w:proofErr w:type="gramStart"/>
+      <w:r>
+        <w:rPr>
+          <w:rFonts w:ascii="Arial" w:eastAsia="Arial" w:hAnsi="Arial" w:cs="Arial"/>
+          <w:sz w:val="19"/>
+          <w:szCs w:val="19"/>
+        </w:rPr>
+        <w:t>URL }</w:t>
+      </w:r>
+      <w:proofErr w:type="gramEnd"/>
+      <w:r>
+        <w:rPr>
+          <w:rFonts w:ascii="Arial" w:eastAsia="Arial" w:hAnsi="Arial" w:cs="Arial"/>
+          <w:sz w:val="19"/>
+          <w:szCs w:val="19"/>
+        </w:rPr>
+        <w:t>}</w:t>
       </w:r>
     </w:p>
     <w:p>
@@ -5043,7 +5398,23 @@
           <w:rFonts w:ascii="Arial" w:eastAsia="Arial" w:hAnsi="Arial" w:cs="Arial"/>
           <w:color w:val="000000"/>
         </w:rPr>
-        <w:t>The CD workflow file must declare runs-on: ubuntu-latest.</w:t>
+        <w:t xml:space="preserve">The CD workflow file must </w:t>
+      </w:r>
+      <w:proofErr w:type="gramStart"/>
+      <w:r>
+        <w:rPr>
+          <w:rFonts w:ascii="Arial" w:eastAsia="Arial" w:hAnsi="Arial" w:cs="Arial"/>
+          <w:color w:val="000000"/>
+        </w:rPr>
+        <w:t>declare</w:t>
+      </w:r>
+      <w:proofErr w:type="gramEnd"/>
+      <w:r>
+        <w:rPr>
+          <w:rFonts w:ascii="Arial" w:eastAsia="Arial" w:hAnsi="Arial" w:cs="Arial"/>
+          <w:color w:val="000000"/>
+        </w:rPr>
+        <w:t xml:space="preserve"> runs-on: ubuntu-latest.</w:t>
       </w:r>
     </w:p>
     <w:p>
@@ -5060,7 +5431,15 @@
           <w:rFonts w:ascii="Arial" w:eastAsia="Arial" w:hAnsi="Arial" w:cs="Arial"/>
           <w:color w:val="000000"/>
         </w:rPr>
-        <w:t xml:space="preserve">The job must NOT contain any Docker build or push steps </w:t>
+        <w:t xml:space="preserve">The job must NOT contain any Docker build or push </w:t>
+      </w:r>
+      <w:proofErr w:type="gramStart"/>
+      <w:r>
+        <w:rPr>
+          <w:rFonts w:ascii="Arial" w:eastAsia="Arial" w:hAnsi="Arial" w:cs="Arial"/>
+          <w:color w:val="000000"/>
+        </w:rPr>
+        <w:t xml:space="preserve">steps </w:t>
       </w:r>
       <w:r>
         <w:rPr>
@@ -5069,6 +5448,7 @@
         </w:rPr>
         <w:t>,</w:t>
       </w:r>
+      <w:proofErr w:type="gramEnd"/>
       <w:r>
         <w:rPr>
           <w:rFonts w:ascii="Arial" w:eastAsia="Arial" w:hAnsi="Arial" w:cs="Arial"/>
@@ -5141,12 +5521,6 @@
         <w:gridCol w:w="4380"/>
       </w:tblGrid>
       <w:tr>
-        <w:tblPrEx>
-          <w:tblCellMar>
-            <w:top w:w="0" w:type="dxa"/>
-            <w:bottom w:w="0" w:type="dxa"/>
-          </w:tblCellMar>
-        </w:tblPrEx>
         <w:trPr>
           <w:tblHeader/>
         </w:trPr>
@@ -5248,12 +5622,6 @@
         </w:tc>
       </w:tr>
       <w:tr>
-        <w:tblPrEx>
-          <w:tblCellMar>
-            <w:top w:w="0" w:type="dxa"/>
-            <w:bottom w:w="0" w:type="dxa"/>
-          </w:tblCellMar>
-        </w:tblPrEx>
         <w:tc>
           <w:tcPr>
             <w:tcW w:w="1600" w:type="dxa"/>
@@ -5366,12 +5734,6 @@
         </w:tc>
       </w:tr>
       <w:tr>
-        <w:tblPrEx>
-          <w:tblCellMar>
-            <w:top w:w="0" w:type="dxa"/>
-            <w:bottom w:w="0" w:type="dxa"/>
-          </w:tblCellMar>
-        </w:tblPrEx>
         <w:tc>
           <w:tcPr>
             <w:tcW w:w="1600" w:type="dxa"/>
@@ -5557,7 +5919,15 @@
           <w:rFonts w:ascii="Arial" w:eastAsia="Arial" w:hAnsi="Arial" w:cs="Arial"/>
           <w:color w:val="000000"/>
         </w:rPr>
-        <w:t xml:space="preserve">Team Lead: Set up the initial repository structure </w:t>
+        <w:t xml:space="preserve">Team Lead: Set up the initial repository </w:t>
+      </w:r>
+      <w:proofErr w:type="gramStart"/>
+      <w:r>
+        <w:rPr>
+          <w:rFonts w:ascii="Arial" w:eastAsia="Arial" w:hAnsi="Arial" w:cs="Arial"/>
+          <w:color w:val="000000"/>
+        </w:rPr>
+        <w:t xml:space="preserve">structure </w:t>
       </w:r>
       <w:r>
         <w:rPr>
@@ -5566,6 +5936,7 @@
         </w:rPr>
         <w:t>,</w:t>
       </w:r>
+      <w:proofErr w:type="gramEnd"/>
       <w:r>
         <w:rPr>
           <w:rFonts w:ascii="Arial" w:eastAsia="Arial" w:hAnsi="Arial" w:cs="Arial"/>
@@ -5602,7 +5973,15 @@
           <w:rFonts w:ascii="Arial" w:eastAsia="Arial" w:hAnsi="Arial" w:cs="Arial"/>
           <w:color w:val="000000"/>
         </w:rPr>
-        <w:t xml:space="preserve">Commit the Assignment 04 question paper (.docx) to the root of the repository. Every team member must fill in their details </w:t>
+        <w:t xml:space="preserve">Commit the Assignment 04 question paper (.docx) to the root of the repository. Every team member must fill in their </w:t>
+      </w:r>
+      <w:proofErr w:type="gramStart"/>
+      <w:r>
+        <w:rPr>
+          <w:rFonts w:ascii="Arial" w:eastAsia="Arial" w:hAnsi="Arial" w:cs="Arial"/>
+          <w:color w:val="000000"/>
+        </w:rPr>
+        <w:t xml:space="preserve">details </w:t>
       </w:r>
       <w:r>
         <w:rPr>
@@ -5611,12 +5990,21 @@
         </w:rPr>
         <w:t>,</w:t>
       </w:r>
-      <w:r>
-        <w:rPr>
-          <w:rFonts w:ascii="Arial" w:eastAsia="Arial" w:hAnsi="Arial" w:cs="Arial"/>
-          <w:color w:val="000000"/>
-        </w:rPr>
-        <w:t xml:space="preserve"> including their Assigned Page </w:t>
+      <w:proofErr w:type="gramEnd"/>
+      <w:r>
+        <w:rPr>
+          <w:rFonts w:ascii="Arial" w:eastAsia="Arial" w:hAnsi="Arial" w:cs="Arial"/>
+          <w:color w:val="000000"/>
+        </w:rPr>
+        <w:t xml:space="preserve"> including their Assigned </w:t>
+      </w:r>
+      <w:proofErr w:type="gramStart"/>
+      <w:r>
+        <w:rPr>
+          <w:rFonts w:ascii="Arial" w:eastAsia="Arial" w:hAnsi="Arial" w:cs="Arial"/>
+          <w:color w:val="000000"/>
+        </w:rPr>
+        <w:t xml:space="preserve">Page </w:t>
       </w:r>
       <w:r>
         <w:rPr>
@@ -5625,12 +6013,29 @@
         </w:rPr>
         <w:t>,</w:t>
       </w:r>
-      <w:r>
-        <w:rPr>
-          <w:rFonts w:ascii="Arial" w:eastAsia="Arial" w:hAnsi="Arial" w:cs="Arial"/>
-          <w:color w:val="000000"/>
-        </w:rPr>
-        <w:t xml:space="preserve"> in their row in Table 1 in the versioned document.</w:t>
+      <w:proofErr w:type="gramEnd"/>
+      <w:r>
+        <w:rPr>
+          <w:rFonts w:ascii="Arial" w:eastAsia="Arial" w:hAnsi="Arial" w:cs="Arial"/>
+          <w:color w:val="000000"/>
+        </w:rPr>
+        <w:t xml:space="preserve"> in their row in Table 1 in the </w:t>
+      </w:r>
+      <w:proofErr w:type="gramStart"/>
+      <w:r>
+        <w:rPr>
+          <w:rFonts w:ascii="Arial" w:eastAsia="Arial" w:hAnsi="Arial" w:cs="Arial"/>
+          <w:color w:val="000000"/>
+        </w:rPr>
+        <w:t>versioned</w:t>
+      </w:r>
+      <w:proofErr w:type="gramEnd"/>
+      <w:r>
+        <w:rPr>
+          <w:rFonts w:ascii="Arial" w:eastAsia="Arial" w:hAnsi="Arial" w:cs="Arial"/>
+          <w:color w:val="000000"/>
+        </w:rPr>
+        <w:t xml:space="preserve"> document.</w:t>
       </w:r>
     </w:p>
     <w:p>
@@ -5661,7 +6066,15 @@
           <w:rFonts w:ascii="Arial" w:eastAsia="Arial" w:hAnsi="Arial" w:cs="Arial"/>
           <w:color w:val="000000"/>
         </w:rPr>
-        <w:t xml:space="preserve"> and configure all three secrets </w:t>
+        <w:t xml:space="preserve"> and configure all three </w:t>
+      </w:r>
+      <w:proofErr w:type="gramStart"/>
+      <w:r>
+        <w:rPr>
+          <w:rFonts w:ascii="Arial" w:eastAsia="Arial" w:hAnsi="Arial" w:cs="Arial"/>
+          <w:color w:val="000000"/>
+        </w:rPr>
+        <w:t xml:space="preserve">secrets </w:t>
       </w:r>
       <w:r>
         <w:rPr>
@@ -5670,6 +6083,7 @@
         </w:rPr>
         <w:t>,</w:t>
       </w:r>
+      <w:proofErr w:type="gramEnd"/>
       <w:r>
         <w:rPr>
           <w:rFonts w:ascii="Arial" w:eastAsia="Arial" w:hAnsi="Arial" w:cs="Arial"/>
@@ -5737,7 +6151,15 @@
           <w:rFonts w:ascii="Arial" w:eastAsia="Arial" w:hAnsi="Arial" w:cs="Arial"/>
           <w:color w:val="000000"/>
         </w:rPr>
-        <w:t xml:space="preserve">Create the CI workflow at .github/workflows/ci.yml </w:t>
+        <w:t xml:space="preserve">Create the CI workflow at </w:t>
+      </w:r>
+      <w:proofErr w:type="gramStart"/>
+      <w:r>
+        <w:rPr>
+          <w:rFonts w:ascii="Arial" w:eastAsia="Arial" w:hAnsi="Arial" w:cs="Arial"/>
+          <w:color w:val="000000"/>
+        </w:rPr>
+        <w:t xml:space="preserve">.github/workflows/ci.yml </w:t>
       </w:r>
       <w:r>
         <w:rPr>
@@ -5746,6 +6168,7 @@
         </w:rPr>
         <w:t>,</w:t>
       </w:r>
+      <w:proofErr w:type="gramEnd"/>
       <w:r>
         <w:rPr>
           <w:rFonts w:ascii="Arial" w:eastAsia="Arial" w:hAnsi="Arial" w:cs="Arial"/>
@@ -5782,7 +6205,15 @@
           <w:rFonts w:ascii="Arial" w:eastAsia="Arial" w:hAnsi="Arial" w:cs="Arial"/>
           <w:color w:val="000000"/>
         </w:rPr>
-        <w:t xml:space="preserve">Create the CD workflow at .github/workflows/cd.yml </w:t>
+        <w:t xml:space="preserve">Create the CD workflow at </w:t>
+      </w:r>
+      <w:proofErr w:type="gramStart"/>
+      <w:r>
+        <w:rPr>
+          <w:rFonts w:ascii="Arial" w:eastAsia="Arial" w:hAnsi="Arial" w:cs="Arial"/>
+          <w:color w:val="000000"/>
+        </w:rPr>
+        <w:t xml:space="preserve">.github/workflows/cd.yml </w:t>
       </w:r>
       <w:r>
         <w:rPr>
@@ -5791,6 +6222,7 @@
         </w:rPr>
         <w:t>,</w:t>
       </w:r>
+      <w:proofErr w:type="gramEnd"/>
       <w:r>
         <w:rPr>
           <w:rFonts w:ascii="Arial" w:eastAsia="Arial" w:hAnsi="Arial" w:cs="Arial"/>
@@ -5863,6 +6295,7 @@
           <w:sz w:val="19"/>
           <w:szCs w:val="19"/>
         </w:rPr>
+        <w:lastRenderedPageBreak/>
         <w:t>Build the assigned HTML page with proper content and link it to style.css</w:t>
       </w:r>
     </w:p>
@@ -5907,15 +6340,16 @@
           <w:sz w:val="19"/>
           <w:szCs w:val="19"/>
         </w:rPr>
-        <w:t>“develop”</w:t>
-      </w:r>
+        <w:t>“develop</w:t>
+      </w:r>
+      <w:proofErr w:type="gramStart"/>
       <w:r>
         <w:rPr>
           <w:rFonts w:ascii="Arial" w:eastAsia="Arial" w:hAnsi="Arial" w:cs="Arial"/>
           <w:sz w:val="19"/>
           <w:szCs w:val="19"/>
         </w:rPr>
-        <w:t xml:space="preserve"> </w:t>
+        <w:t>”</w:t>
       </w:r>
       <w:r>
         <w:rPr>
@@ -5923,8 +6357,17 @@
           <w:sz w:val="19"/>
           <w:szCs w:val="19"/>
         </w:rPr>
+        <w:t xml:space="preserve"> </w:t>
+      </w:r>
+      <w:r>
+        <w:rPr>
+          <w:rFonts w:ascii="Arial" w:eastAsia="Arial" w:hAnsi="Arial" w:cs="Arial"/>
+          <w:sz w:val="19"/>
+          <w:szCs w:val="19"/>
+        </w:rPr>
         <w:t>,</w:t>
       </w:r>
+      <w:proofErr w:type="gramEnd"/>
       <w:r>
         <w:rPr>
           <w:rFonts w:ascii="Arial" w:eastAsia="Arial" w:hAnsi="Arial" w:cs="Arial"/>
@@ -5949,16 +6392,26 @@
           <w:sz w:val="19"/>
           <w:szCs w:val="19"/>
         </w:rPr>
-        <w:t xml:space="preserve">Request a review; after approval the Team Lead merges the PR </w:t>
-      </w:r>
+        <w:t xml:space="preserve">Request a review; after approval the Team Lead merges the </w:t>
+      </w:r>
+      <w:proofErr w:type="gramStart"/>
       <w:r>
         <w:rPr>
           <w:rFonts w:ascii="Arial" w:eastAsia="Arial" w:hAnsi="Arial" w:cs="Arial"/>
           <w:sz w:val="19"/>
           <w:szCs w:val="19"/>
         </w:rPr>
+        <w:t xml:space="preserve">PR </w:t>
+      </w:r>
+      <w:r>
+        <w:rPr>
+          <w:rFonts w:ascii="Arial" w:eastAsia="Arial" w:hAnsi="Arial" w:cs="Arial"/>
+          <w:sz w:val="19"/>
+          <w:szCs w:val="19"/>
+        </w:rPr>
         <w:t>,</w:t>
       </w:r>
+      <w:proofErr w:type="gramEnd"/>
       <w:r>
         <w:rPr>
           <w:rFonts w:ascii="Arial" w:eastAsia="Arial" w:hAnsi="Arial" w:cs="Arial"/>
@@ -5982,7 +6435,23 @@
           <w:rFonts w:ascii="Arial" w:eastAsia="Arial" w:hAnsi="Arial" w:cs="Arial"/>
           <w:color w:val="000000"/>
         </w:rPr>
-        <w:t>After all 5 PRs are merged, verify the live TaskFlow application on Render contains all five pages and navigation between them works correctly.</w:t>
+        <w:t xml:space="preserve">After </w:t>
+      </w:r>
+      <w:proofErr w:type="gramStart"/>
+      <w:r>
+        <w:rPr>
+          <w:rFonts w:ascii="Arial" w:eastAsia="Arial" w:hAnsi="Arial" w:cs="Arial"/>
+          <w:color w:val="000000"/>
+        </w:rPr>
+        <w:t>all</w:t>
+      </w:r>
+      <w:proofErr w:type="gramEnd"/>
+      <w:r>
+        <w:rPr>
+          <w:rFonts w:ascii="Arial" w:eastAsia="Arial" w:hAnsi="Arial" w:cs="Arial"/>
+          <w:color w:val="000000"/>
+        </w:rPr>
+        <w:t xml:space="preserve"> 5 PRs are merged, verify the live TaskFlow application on Render contains all five pages and navigation between them works correctly.</w:t>
       </w:r>
     </w:p>
     <w:p>
@@ -6066,12 +6535,6 @@
         <w:gridCol w:w="2150"/>
       </w:tblGrid>
       <w:tr>
-        <w:tblPrEx>
-          <w:tblCellMar>
-            <w:top w:w="0" w:type="dxa"/>
-            <w:bottom w:w="0" w:type="dxa"/>
-          </w:tblCellMar>
-        </w:tblPrEx>
         <w:trPr>
           <w:tblHeader/>
         </w:trPr>
@@ -6173,12 +6636,6 @@
         </w:tc>
       </w:tr>
       <w:tr>
-        <w:tblPrEx>
-          <w:tblCellMar>
-            <w:top w:w="0" w:type="dxa"/>
-            <w:bottom w:w="0" w:type="dxa"/>
-          </w:tblCellMar>
-        </w:tblPrEx>
         <w:tc>
           <w:tcPr>
             <w:tcW w:w="700" w:type="dxa"/>
@@ -6265,12 +6722,6 @@
         </w:tc>
       </w:tr>
       <w:tr>
-        <w:tblPrEx>
-          <w:tblCellMar>
-            <w:top w:w="0" w:type="dxa"/>
-            <w:bottom w:w="0" w:type="dxa"/>
-          </w:tblCellMar>
-        </w:tblPrEx>
         <w:tc>
           <w:tcPr>
             <w:tcW w:w="700" w:type="dxa"/>
@@ -6365,12 +6816,6 @@
         </w:tc>
       </w:tr>
       <w:tr>
-        <w:tblPrEx>
-          <w:tblCellMar>
-            <w:top w:w="0" w:type="dxa"/>
-            <w:bottom w:w="0" w:type="dxa"/>
-          </w:tblCellMar>
-        </w:tblPrEx>
         <w:tc>
           <w:tcPr>
             <w:tcW w:w="700" w:type="dxa"/>
@@ -6465,12 +6910,6 @@
         </w:tc>
       </w:tr>
       <w:tr>
-        <w:tblPrEx>
-          <w:tblCellMar>
-            <w:top w:w="0" w:type="dxa"/>
-            <w:bottom w:w="0" w:type="dxa"/>
-          </w:tblCellMar>
-        </w:tblPrEx>
         <w:tc>
           <w:tcPr>
             <w:tcW w:w="700" w:type="dxa"/>
@@ -6557,12 +6996,6 @@
         </w:tc>
       </w:tr>
       <w:tr>
-        <w:tblPrEx>
-          <w:tblCellMar>
-            <w:top w:w="0" w:type="dxa"/>
-            <w:bottom w:w="0" w:type="dxa"/>
-          </w:tblCellMar>
-        </w:tblPrEx>
         <w:tc>
           <w:tcPr>
             <w:tcW w:w="700" w:type="dxa"/>
@@ -6666,12 +7099,6 @@
         </w:tc>
       </w:tr>
       <w:tr>
-        <w:tblPrEx>
-          <w:tblCellMar>
-            <w:top w:w="0" w:type="dxa"/>
-            <w:bottom w:w="0" w:type="dxa"/>
-          </w:tblCellMar>
-        </w:tblPrEx>
         <w:tc>
           <w:tcPr>
             <w:tcW w:w="700" w:type="dxa"/>
@@ -6766,12 +7193,6 @@
         </w:tc>
       </w:tr>
       <w:tr>
-        <w:tblPrEx>
-          <w:tblCellMar>
-            <w:top w:w="0" w:type="dxa"/>
-            <w:bottom w:w="0" w:type="dxa"/>
-          </w:tblCellMar>
-        </w:tblPrEx>
         <w:tc>
           <w:tcPr>
             <w:tcW w:w="700" w:type="dxa"/>
@@ -6875,12 +7296,6 @@
         </w:tc>
       </w:tr>
       <w:tr>
-        <w:tblPrEx>
-          <w:tblCellMar>
-            <w:top w:w="0" w:type="dxa"/>
-            <w:bottom w:w="0" w:type="dxa"/>
-          </w:tblCellMar>
-        </w:tblPrEx>
         <w:tc>
           <w:tcPr>
             <w:tcW w:w="700" w:type="dxa"/>
@@ -6967,12 +7382,6 @@
         </w:tc>
       </w:tr>
       <w:tr>
-        <w:tblPrEx>
-          <w:tblCellMar>
-            <w:top w:w="0" w:type="dxa"/>
-            <w:bottom w:w="0" w:type="dxa"/>
-          </w:tblCellMar>
-        </w:tblPrEx>
         <w:tc>
           <w:tcPr>
             <w:tcW w:w="700" w:type="dxa"/>
@@ -7067,12 +7476,6 @@
         </w:tc>
       </w:tr>
       <w:tr>
-        <w:tblPrEx>
-          <w:tblCellMar>
-            <w:top w:w="0" w:type="dxa"/>
-            <w:bottom w:w="0" w:type="dxa"/>
-          </w:tblCellMar>
-        </w:tblPrEx>
         <w:tc>
           <w:tcPr>
             <w:tcW w:w="700" w:type="dxa"/>
@@ -7167,12 +7570,6 @@
         </w:tc>
       </w:tr>
       <w:tr>
-        <w:tblPrEx>
-          <w:tblCellMar>
-            <w:top w:w="0" w:type="dxa"/>
-            <w:bottom w:w="0" w:type="dxa"/>
-          </w:tblCellMar>
-        </w:tblPrEx>
         <w:tc>
           <w:tcPr>
             <w:tcW w:w="700" w:type="dxa"/>
@@ -7285,12 +7682,6 @@
         </w:tc>
       </w:tr>
       <w:tr>
-        <w:tblPrEx>
-          <w:tblCellMar>
-            <w:top w:w="0" w:type="dxa"/>
-            <w:bottom w:w="0" w:type="dxa"/>
-          </w:tblCellMar>
-        </w:tblPrEx>
         <w:tc>
           <w:tcPr>
             <w:tcW w:w="700" w:type="dxa"/>
@@ -7377,12 +7768,6 @@
         </w:tc>
       </w:tr>
       <w:tr>
-        <w:tblPrEx>
-          <w:tblCellMar>
-            <w:top w:w="0" w:type="dxa"/>
-            <w:bottom w:w="0" w:type="dxa"/>
-          </w:tblCellMar>
-        </w:tblPrEx>
         <w:tc>
           <w:tcPr>
             <w:tcW w:w="700" w:type="dxa"/>
@@ -7486,12 +7871,6 @@
         </w:tc>
       </w:tr>
       <w:tr>
-        <w:tblPrEx>
-          <w:tblCellMar>
-            <w:top w:w="0" w:type="dxa"/>
-            <w:bottom w:w="0" w:type="dxa"/>
-          </w:tblCellMar>
-        </w:tblPrEx>
         <w:tc>
           <w:tcPr>
             <w:tcW w:w="700" w:type="dxa"/>
@@ -7586,12 +7965,6 @@
         </w:tc>
       </w:tr>
       <w:tr>
-        <w:tblPrEx>
-          <w:tblCellMar>
-            <w:top w:w="0" w:type="dxa"/>
-            <w:bottom w:w="0" w:type="dxa"/>
-          </w:tblCellMar>
-        </w:tblPrEx>
         <w:tc>
           <w:tcPr>
             <w:tcW w:w="700" w:type="dxa"/>
@@ -7686,12 +8059,6 @@
         </w:tc>
       </w:tr>
       <w:tr>
-        <w:tblPrEx>
-          <w:tblCellMar>
-            <w:top w:w="0" w:type="dxa"/>
-            <w:bottom w:w="0" w:type="dxa"/>
-          </w:tblCellMar>
-        </w:tblPrEx>
         <w:tc>
           <w:tcPr>
             <w:tcW w:w="700" w:type="dxa"/>
@@ -7786,12 +8153,6 @@
         </w:tc>
       </w:tr>
       <w:tr>
-        <w:tblPrEx>
-          <w:tblCellMar>
-            <w:top w:w="0" w:type="dxa"/>
-            <w:bottom w:w="0" w:type="dxa"/>
-          </w:tblCellMar>
-        </w:tblPrEx>
         <w:tc>
           <w:tcPr>
             <w:tcW w:w="700" w:type="dxa"/>
@@ -7878,12 +8239,6 @@
         </w:tc>
       </w:tr>
       <w:tr>
-        <w:tblPrEx>
-          <w:tblCellMar>
-            <w:top w:w="0" w:type="dxa"/>
-            <w:bottom w:w="0" w:type="dxa"/>
-          </w:tblCellMar>
-        </w:tblPrEx>
         <w:tc>
           <w:tcPr>
             <w:tcW w:w="700" w:type="dxa"/>
@@ -7987,12 +8342,6 @@
         </w:tc>
       </w:tr>
       <w:tr>
-        <w:tblPrEx>
-          <w:tblCellMar>
-            <w:top w:w="0" w:type="dxa"/>
-            <w:bottom w:w="0" w:type="dxa"/>
-          </w:tblCellMar>
-        </w:tblPrEx>
         <w:tc>
           <w:tcPr>
             <w:tcW w:w="700" w:type="dxa"/>
@@ -8087,12 +8436,6 @@
         </w:tc>
       </w:tr>
       <w:tr>
-        <w:tblPrEx>
-          <w:tblCellMar>
-            <w:top w:w="0" w:type="dxa"/>
-            <w:bottom w:w="0" w:type="dxa"/>
-          </w:tblCellMar>
-        </w:tblPrEx>
         <w:tc>
           <w:tcPr>
             <w:tcW w:w="700" w:type="dxa"/>
@@ -8121,6 +8464,7 @@
                 <w:sz w:val="18"/>
                 <w:szCs w:val="18"/>
               </w:rPr>
+              <w:lastRenderedPageBreak/>
               <w:t>15</w:t>
             </w:r>
           </w:p>
@@ -8187,12 +8531,6 @@
         </w:tc>
       </w:tr>
       <w:tr>
-        <w:tblPrEx>
-          <w:tblCellMar>
-            <w:top w:w="0" w:type="dxa"/>
-            <w:bottom w:w="0" w:type="dxa"/>
-          </w:tblCellMar>
-        </w:tblPrEx>
         <w:tc>
           <w:tcPr>
             <w:tcW w:w="700" w:type="dxa"/>
@@ -8279,12 +8617,6 @@
         </w:tc>
       </w:tr>
       <w:tr>
-        <w:tblPrEx>
-          <w:tblCellMar>
-            <w:top w:w="0" w:type="dxa"/>
-            <w:bottom w:w="0" w:type="dxa"/>
-          </w:tblCellMar>
-        </w:tblPrEx>
         <w:tc>
           <w:tcPr>
             <w:tcW w:w="700" w:type="dxa"/>
@@ -8379,12 +8711,6 @@
         </w:tc>
       </w:tr>
       <w:tr>
-        <w:tblPrEx>
-          <w:tblCellMar>
-            <w:top w:w="0" w:type="dxa"/>
-            <w:bottom w:w="0" w:type="dxa"/>
-          </w:tblCellMar>
-        </w:tblPrEx>
         <w:tc>
           <w:tcPr>
             <w:tcW w:w="700" w:type="dxa"/>
@@ -8479,12 +8805,6 @@
         </w:tc>
       </w:tr>
       <w:tr>
-        <w:tblPrEx>
-          <w:tblCellMar>
-            <w:top w:w="0" w:type="dxa"/>
-            <w:bottom w:w="0" w:type="dxa"/>
-          </w:tblCellMar>
-        </w:tblPrEx>
         <w:tc>
           <w:tcPr>
             <w:tcW w:w="700" w:type="dxa"/>
@@ -8700,7 +9020,15 @@
           <w:rFonts w:ascii="Arial" w:eastAsia="Arial" w:hAnsi="Arial" w:cs="Arial"/>
           <w:color w:val="000000"/>
         </w:rPr>
-        <w:t xml:space="preserve">Screenshot 2: Each member's CI workflow run triggered by their individual PR </w:t>
+        <w:t xml:space="preserve">Screenshot 2: Each member's CI workflow run triggered by their individual </w:t>
+      </w:r>
+      <w:proofErr w:type="gramStart"/>
+      <w:r>
+        <w:rPr>
+          <w:rFonts w:ascii="Arial" w:eastAsia="Arial" w:hAnsi="Arial" w:cs="Arial"/>
+          <w:color w:val="000000"/>
+        </w:rPr>
+        <w:t xml:space="preserve">PR </w:t>
       </w:r>
       <w:r>
         <w:rPr>
@@ -8709,6 +9037,7 @@
         </w:rPr>
         <w:t>,</w:t>
       </w:r>
+      <w:proofErr w:type="gramEnd"/>
       <w:r>
         <w:rPr>
           <w:rFonts w:ascii="Arial" w:eastAsia="Arial" w:hAnsi="Arial" w:cs="Arial"/>
@@ -8755,7 +9084,15 @@
           <w:rFonts w:ascii="Arial" w:eastAsia="Arial" w:hAnsi="Arial" w:cs="Arial"/>
           <w:color w:val="000000"/>
         </w:rPr>
-        <w:t>“develop”</w:t>
+        <w:t>“develop</w:t>
+      </w:r>
+      <w:proofErr w:type="gramStart"/>
+      <w:r>
+        <w:rPr>
+          <w:rFonts w:ascii="Arial" w:eastAsia="Arial" w:hAnsi="Arial" w:cs="Arial"/>
+          <w:color w:val="000000"/>
+        </w:rPr>
+        <w:t>”</w:t>
       </w:r>
       <w:r>
         <w:rPr>
@@ -8771,6 +9108,7 @@
         </w:rPr>
         <w:t>,</w:t>
       </w:r>
+      <w:proofErr w:type="gramEnd"/>
       <w:r>
         <w:rPr>
           <w:rFonts w:ascii="Arial" w:eastAsia="Arial" w:hAnsi="Arial" w:cs="Arial"/>
@@ -8864,7 +9202,23 @@
           <w:rFonts w:ascii="Arial" w:eastAsia="Arial" w:hAnsi="Arial" w:cs="Arial"/>
           <w:color w:val="000000"/>
         </w:rPr>
-        <w:t>Paste your verification screenshots in the table below. Label each one clearly.</w:t>
+        <w:t xml:space="preserve">Paste your verification screenshots </w:t>
+      </w:r>
+      <w:proofErr w:type="gramStart"/>
+      <w:r>
+        <w:rPr>
+          <w:rFonts w:ascii="Arial" w:eastAsia="Arial" w:hAnsi="Arial" w:cs="Arial"/>
+          <w:color w:val="000000"/>
+        </w:rPr>
+        <w:t>in</w:t>
+      </w:r>
+      <w:proofErr w:type="gramEnd"/>
+      <w:r>
+        <w:rPr>
+          <w:rFonts w:ascii="Arial" w:eastAsia="Arial" w:hAnsi="Arial" w:cs="Arial"/>
+          <w:color w:val="000000"/>
+        </w:rPr>
+        <w:t xml:space="preserve"> the table below. Label each one clearly.</w:t>
       </w:r>
     </w:p>
     <w:tbl>
@@ -8889,12 +9243,6 @@
         <w:gridCol w:w="6160"/>
       </w:tblGrid>
       <w:tr>
-        <w:tblPrEx>
-          <w:tblCellMar>
-            <w:top w:w="0" w:type="dxa"/>
-            <w:bottom w:w="0" w:type="dxa"/>
-          </w:tblCellMar>
-        </w:tblPrEx>
         <w:tc>
           <w:tcPr>
             <w:tcW w:w="3200" w:type="dxa"/>
@@ -8961,12 +9309,6 @@
         </w:tc>
       </w:tr>
       <w:tr>
-        <w:tblPrEx>
-          <w:tblCellMar>
-            <w:top w:w="0" w:type="dxa"/>
-            <w:bottom w:w="0" w:type="dxa"/>
-          </w:tblCellMar>
-        </w:tblPrEx>
         <w:tc>
           <w:tcPr>
             <w:tcW w:w="3200" w:type="dxa"/>
@@ -9043,12 +9385,6 @@
         </w:tc>
       </w:tr>
       <w:tr>
-        <w:tblPrEx>
-          <w:tblCellMar>
-            <w:top w:w="0" w:type="dxa"/>
-            <w:bottom w:w="0" w:type="dxa"/>
-          </w:tblCellMar>
-        </w:tblPrEx>
         <w:tc>
           <w:tcPr>
             <w:tcW w:w="3200" w:type="dxa"/>
@@ -9103,12 +9439,6 @@
         </w:tc>
       </w:tr>
       <w:tr>
-        <w:tblPrEx>
-          <w:tblCellMar>
-            <w:top w:w="0" w:type="dxa"/>
-            <w:bottom w:w="0" w:type="dxa"/>
-          </w:tblCellMar>
-        </w:tblPrEx>
         <w:tc>
           <w:tcPr>
             <w:tcW w:w="3200" w:type="dxa"/>
@@ -9163,12 +9493,6 @@
         </w:tc>
       </w:tr>
       <w:tr>
-        <w:tblPrEx>
-          <w:tblCellMar>
-            <w:top w:w="0" w:type="dxa"/>
-            <w:bottom w:w="0" w:type="dxa"/>
-          </w:tblCellMar>
-        </w:tblPrEx>
         <w:tc>
           <w:tcPr>
             <w:tcW w:w="3200" w:type="dxa"/>
@@ -9234,12 +9558,6 @@
         </w:tc>
       </w:tr>
       <w:tr>
-        <w:tblPrEx>
-          <w:tblCellMar>
-            <w:top w:w="0" w:type="dxa"/>
-            <w:bottom w:w="0" w:type="dxa"/>
-          </w:tblCellMar>
-        </w:tblPrEx>
         <w:tc>
           <w:tcPr>
             <w:tcW w:w="3200" w:type="dxa"/>
@@ -9294,12 +9612,6 @@
         </w:tc>
       </w:tr>
       <w:tr>
-        <w:tblPrEx>
-          <w:tblCellMar>
-            <w:top w:w="0" w:type="dxa"/>
-            <w:bottom w:w="0" w:type="dxa"/>
-          </w:tblCellMar>
-        </w:tblPrEx>
         <w:tc>
           <w:tcPr>
             <w:tcW w:w="3200" w:type="dxa"/>
@@ -9375,6 +9687,7 @@
           <w:sz w:val="28"/>
           <w:szCs w:val="28"/>
         </w:rPr>
+        <w:lastRenderedPageBreak/>
         <w:t>TEAM REFLECTION</w:t>
       </w:r>
     </w:p>
@@ -9408,7 +9721,27 @@
           <w:bCs/>
           <w:color w:val="000000"/>
         </w:rPr>
-        <w:t>Member 1  (Name: _______________________________________________)</w:t>
+        <w:t xml:space="preserve">Member </w:t>
+      </w:r>
+      <w:proofErr w:type="gramStart"/>
+      <w:r>
+        <w:rPr>
+          <w:rFonts w:ascii="Arial" w:eastAsia="Arial" w:hAnsi="Arial" w:cs="Arial"/>
+          <w:b/>
+          <w:bCs/>
+          <w:color w:val="000000"/>
+        </w:rPr>
+        <w:t>1  (Name: _</w:t>
+      </w:r>
+      <w:proofErr w:type="gramEnd"/>
+      <w:r>
+        <w:rPr>
+          <w:rFonts w:ascii="Arial" w:eastAsia="Arial" w:hAnsi="Arial" w:cs="Arial"/>
+          <w:b/>
+          <w:bCs/>
+          <w:color w:val="000000"/>
+        </w:rPr>
+        <w:t>______________________________________________)</w:t>
       </w:r>
     </w:p>
     <w:tbl>
@@ -9432,12 +9765,6 @@
         <w:gridCol w:w="9360"/>
       </w:tblGrid>
       <w:tr>
-        <w:tblPrEx>
-          <w:tblCellMar>
-            <w:top w:w="0" w:type="dxa"/>
-            <w:bottom w:w="0" w:type="dxa"/>
-          </w:tblCellMar>
-        </w:tblPrEx>
         <w:tc>
           <w:tcPr>
             <w:tcW w:w="9360" w:type="dxa"/>
@@ -9460,12 +9787,6 @@
         </w:tc>
       </w:tr>
       <w:tr>
-        <w:tblPrEx>
-          <w:tblCellMar>
-            <w:top w:w="0" w:type="dxa"/>
-            <w:bottom w:w="0" w:type="dxa"/>
-          </w:tblCellMar>
-        </w:tblPrEx>
         <w:tc>
           <w:tcPr>
             <w:tcW w:w="9360" w:type="dxa"/>
@@ -9488,12 +9809,6 @@
         </w:tc>
       </w:tr>
       <w:tr>
-        <w:tblPrEx>
-          <w:tblCellMar>
-            <w:top w:w="0" w:type="dxa"/>
-            <w:bottom w:w="0" w:type="dxa"/>
-          </w:tblCellMar>
-        </w:tblPrEx>
         <w:tc>
           <w:tcPr>
             <w:tcW w:w="9360" w:type="dxa"/>
@@ -9533,7 +9848,27 @@
           <w:bCs/>
           <w:color w:val="000000"/>
         </w:rPr>
-        <w:t>Member 2  (Name: _______________________________________________)</w:t>
+        <w:t xml:space="preserve">Member </w:t>
+      </w:r>
+      <w:proofErr w:type="gramStart"/>
+      <w:r>
+        <w:rPr>
+          <w:rFonts w:ascii="Arial" w:eastAsia="Arial" w:hAnsi="Arial" w:cs="Arial"/>
+          <w:b/>
+          <w:bCs/>
+          <w:color w:val="000000"/>
+        </w:rPr>
+        <w:t>2  (</w:t>
+      </w:r>
+      <w:proofErr w:type="gramEnd"/>
+      <w:r>
+        <w:rPr>
+          <w:rFonts w:ascii="Arial" w:eastAsia="Arial" w:hAnsi="Arial" w:cs="Arial"/>
+          <w:b/>
+          <w:bCs/>
+          <w:color w:val="000000"/>
+        </w:rPr>
+        <w:t>Name: _______________________________________________)</w:t>
       </w:r>
     </w:p>
     <w:tbl>
@@ -9557,12 +9892,6 @@
         <w:gridCol w:w="9360"/>
       </w:tblGrid>
       <w:tr>
-        <w:tblPrEx>
-          <w:tblCellMar>
-            <w:top w:w="0" w:type="dxa"/>
-            <w:bottom w:w="0" w:type="dxa"/>
-          </w:tblCellMar>
-        </w:tblPrEx>
         <w:tc>
           <w:tcPr>
             <w:tcW w:w="9360" w:type="dxa"/>
@@ -9585,12 +9914,6 @@
         </w:tc>
       </w:tr>
       <w:tr>
-        <w:tblPrEx>
-          <w:tblCellMar>
-            <w:top w:w="0" w:type="dxa"/>
-            <w:bottom w:w="0" w:type="dxa"/>
-          </w:tblCellMar>
-        </w:tblPrEx>
         <w:tc>
           <w:tcPr>
             <w:tcW w:w="9360" w:type="dxa"/>
@@ -9613,12 +9936,6 @@
         </w:tc>
       </w:tr>
       <w:tr>
-        <w:tblPrEx>
-          <w:tblCellMar>
-            <w:top w:w="0" w:type="dxa"/>
-            <w:bottom w:w="0" w:type="dxa"/>
-          </w:tblCellMar>
-        </w:tblPrEx>
         <w:tc>
           <w:tcPr>
             <w:tcW w:w="9360" w:type="dxa"/>
@@ -9658,7 +9975,27 @@
           <w:bCs/>
           <w:color w:val="000000"/>
         </w:rPr>
-        <w:t>Member 3  (Name: _______________________________________________)</w:t>
+        <w:t xml:space="preserve">Member </w:t>
+      </w:r>
+      <w:proofErr w:type="gramStart"/>
+      <w:r>
+        <w:rPr>
+          <w:rFonts w:ascii="Arial" w:eastAsia="Arial" w:hAnsi="Arial" w:cs="Arial"/>
+          <w:b/>
+          <w:bCs/>
+          <w:color w:val="000000"/>
+        </w:rPr>
+        <w:t>3  (</w:t>
+      </w:r>
+      <w:proofErr w:type="gramEnd"/>
+      <w:r>
+        <w:rPr>
+          <w:rFonts w:ascii="Arial" w:eastAsia="Arial" w:hAnsi="Arial" w:cs="Arial"/>
+          <w:b/>
+          <w:bCs/>
+          <w:color w:val="000000"/>
+        </w:rPr>
+        <w:t>Name: _______________________________________________)</w:t>
       </w:r>
     </w:p>
     <w:tbl>
@@ -9682,12 +10019,6 @@
         <w:gridCol w:w="9360"/>
       </w:tblGrid>
       <w:tr>
-        <w:tblPrEx>
-          <w:tblCellMar>
-            <w:top w:w="0" w:type="dxa"/>
-            <w:bottom w:w="0" w:type="dxa"/>
-          </w:tblCellMar>
-        </w:tblPrEx>
         <w:tc>
           <w:tcPr>
             <w:tcW w:w="9360" w:type="dxa"/>
@@ -9710,12 +10041,6 @@
         </w:tc>
       </w:tr>
       <w:tr>
-        <w:tblPrEx>
-          <w:tblCellMar>
-            <w:top w:w="0" w:type="dxa"/>
-            <w:bottom w:w="0" w:type="dxa"/>
-          </w:tblCellMar>
-        </w:tblPrEx>
         <w:tc>
           <w:tcPr>
             <w:tcW w:w="9360" w:type="dxa"/>
@@ -9738,12 +10063,6 @@
         </w:tc>
       </w:tr>
       <w:tr>
-        <w:tblPrEx>
-          <w:tblCellMar>
-            <w:top w:w="0" w:type="dxa"/>
-            <w:bottom w:w="0" w:type="dxa"/>
-          </w:tblCellMar>
-        </w:tblPrEx>
         <w:tc>
           <w:tcPr>
             <w:tcW w:w="9360" w:type="dxa"/>
@@ -9783,7 +10102,27 @@
           <w:bCs/>
           <w:color w:val="000000"/>
         </w:rPr>
-        <w:t>Member 4  (Name: _______________________________________________)</w:t>
+        <w:t xml:space="preserve">Member </w:t>
+      </w:r>
+      <w:proofErr w:type="gramStart"/>
+      <w:r>
+        <w:rPr>
+          <w:rFonts w:ascii="Arial" w:eastAsia="Arial" w:hAnsi="Arial" w:cs="Arial"/>
+          <w:b/>
+          <w:bCs/>
+          <w:color w:val="000000"/>
+        </w:rPr>
+        <w:t>4  (Name: _</w:t>
+      </w:r>
+      <w:proofErr w:type="gramEnd"/>
+      <w:r>
+        <w:rPr>
+          <w:rFonts w:ascii="Arial" w:eastAsia="Arial" w:hAnsi="Arial" w:cs="Arial"/>
+          <w:b/>
+          <w:bCs/>
+          <w:color w:val="000000"/>
+        </w:rPr>
+        <w:t>______________________________________________)</w:t>
       </w:r>
     </w:p>
     <w:tbl>
@@ -9807,12 +10146,6 @@
         <w:gridCol w:w="9360"/>
       </w:tblGrid>
       <w:tr>
-        <w:tblPrEx>
-          <w:tblCellMar>
-            <w:top w:w="0" w:type="dxa"/>
-            <w:bottom w:w="0" w:type="dxa"/>
-          </w:tblCellMar>
-        </w:tblPrEx>
         <w:tc>
           <w:tcPr>
             <w:tcW w:w="9360" w:type="dxa"/>
@@ -9835,12 +10168,6 @@
         </w:tc>
       </w:tr>
       <w:tr>
-        <w:tblPrEx>
-          <w:tblCellMar>
-            <w:top w:w="0" w:type="dxa"/>
-            <w:bottom w:w="0" w:type="dxa"/>
-          </w:tblCellMar>
-        </w:tblPrEx>
         <w:tc>
           <w:tcPr>
             <w:tcW w:w="9360" w:type="dxa"/>
@@ -9863,12 +10190,6 @@
         </w:tc>
       </w:tr>
       <w:tr>
-        <w:tblPrEx>
-          <w:tblCellMar>
-            <w:top w:w="0" w:type="dxa"/>
-            <w:bottom w:w="0" w:type="dxa"/>
-          </w:tblCellMar>
-        </w:tblPrEx>
         <w:tc>
           <w:tcPr>
             <w:tcW w:w="9360" w:type="dxa"/>
@@ -9908,7 +10229,27 @@
           <w:bCs/>
           <w:color w:val="000000"/>
         </w:rPr>
-        <w:t>Member 5  (Name: _______________________________________________)</w:t>
+        <w:t xml:space="preserve">Member </w:t>
+      </w:r>
+      <w:proofErr w:type="gramStart"/>
+      <w:r>
+        <w:rPr>
+          <w:rFonts w:ascii="Arial" w:eastAsia="Arial" w:hAnsi="Arial" w:cs="Arial"/>
+          <w:b/>
+          <w:bCs/>
+          <w:color w:val="000000"/>
+        </w:rPr>
+        <w:t>5  (</w:t>
+      </w:r>
+      <w:proofErr w:type="gramEnd"/>
+      <w:r>
+        <w:rPr>
+          <w:rFonts w:ascii="Arial" w:eastAsia="Arial" w:hAnsi="Arial" w:cs="Arial"/>
+          <w:b/>
+          <w:bCs/>
+          <w:color w:val="000000"/>
+        </w:rPr>
+        <w:t>Name: _______________________________________________)</w:t>
       </w:r>
     </w:p>
     <w:tbl>
@@ -9932,12 +10273,6 @@
         <w:gridCol w:w="9360"/>
       </w:tblGrid>
       <w:tr>
-        <w:tblPrEx>
-          <w:tblCellMar>
-            <w:top w:w="0" w:type="dxa"/>
-            <w:bottom w:w="0" w:type="dxa"/>
-          </w:tblCellMar>
-        </w:tblPrEx>
         <w:tc>
           <w:tcPr>
             <w:tcW w:w="9360" w:type="dxa"/>
@@ -9960,12 +10295,6 @@
         </w:tc>
       </w:tr>
       <w:tr>
-        <w:tblPrEx>
-          <w:tblCellMar>
-            <w:top w:w="0" w:type="dxa"/>
-            <w:bottom w:w="0" w:type="dxa"/>
-          </w:tblCellMar>
-        </w:tblPrEx>
         <w:tc>
           <w:tcPr>
             <w:tcW w:w="9360" w:type="dxa"/>
@@ -9988,12 +10317,6 @@
         </w:tc>
       </w:tr>
       <w:tr>
-        <w:tblPrEx>
-          <w:tblCellMar>
-            <w:top w:w="0" w:type="dxa"/>
-            <w:bottom w:w="0" w:type="dxa"/>
-          </w:tblCellMar>
-        </w:tblPrEx>
         <w:tc>
           <w:tcPr>
             <w:tcW w:w="9360" w:type="dxa"/>
@@ -10086,7 +10409,17 @@
         <w:sz w:val="16"/>
         <w:szCs w:val="16"/>
       </w:rPr>
-      <w:t xml:space="preserve">Assignment 04 – CI/CD Pipeline Integration  </w:t>
+      <w:t xml:space="preserve">Assignment 04 – CI/CD Pipeline </w:t>
+    </w:r>
+    <w:proofErr w:type="gramStart"/>
+    <w:r>
+      <w:rPr>
+        <w:rFonts w:ascii="Arial" w:eastAsia="Arial" w:hAnsi="Arial" w:cs="Arial"/>
+        <w:color w:val="555555"/>
+        <w:sz w:val="16"/>
+        <w:szCs w:val="16"/>
+      </w:rPr>
+      <w:t xml:space="preserve">Integration  </w:t>
     </w:r>
     <w:r>
       <w:rPr>
@@ -10096,6 +10429,15 @@
         <w:szCs w:val="16"/>
       </w:rPr>
       <w:tab/>
+    </w:r>
+    <w:proofErr w:type="gramEnd"/>
+    <w:r>
+      <w:rPr>
+        <w:rFonts w:ascii="Arial" w:eastAsia="Arial" w:hAnsi="Arial" w:cs="Arial"/>
+        <w:color w:val="555555"/>
+        <w:sz w:val="16"/>
+        <w:szCs w:val="16"/>
+      </w:rPr>
       <w:t xml:space="preserve"> Page </w:t>
     </w:r>
     <w:r>
@@ -10206,7 +10548,19 @@
         <w:sz w:val="18"/>
         <w:szCs w:val="18"/>
       </w:rPr>
-      <w:t>University of Central Punjab – Faculty of Information Technology</w:t>
+      <w:t xml:space="preserve">University of Central Punjab – Faculty of Information </w:t>
+    </w:r>
+    <w:proofErr w:type="gramStart"/>
+    <w:r>
+      <w:rPr>
+        <w:rFonts w:ascii="Arial" w:eastAsia="Arial" w:hAnsi="Arial" w:cs="Arial"/>
+        <w:b/>
+        <w:bCs/>
+        <w:color w:val="1F3864"/>
+        <w:sz w:val="18"/>
+        <w:szCs w:val="18"/>
+      </w:rPr>
+      <w:t>Technology</w:t>
     </w:r>
     <w:r>
       <w:rPr>
@@ -10215,7 +10569,17 @@
         <w:sz w:val="18"/>
         <w:szCs w:val="18"/>
       </w:rPr>
-      <w:t xml:space="preserve">  |  </w:t>
+      <w:t xml:space="preserve">  |</w:t>
+    </w:r>
+    <w:proofErr w:type="gramEnd"/>
+    <w:r>
+      <w:rPr>
+        <w:rFonts w:ascii="Arial" w:eastAsia="Arial" w:hAnsi="Arial" w:cs="Arial"/>
+        <w:color w:val="ADB9CA"/>
+        <w:sz w:val="18"/>
+        <w:szCs w:val="18"/>
+      </w:rPr>
+      <w:t xml:space="preserve">  </w:t>
     </w:r>
     <w:r>
       <w:rPr>
@@ -11065,7 +11429,6 @@
   <w:style w:type="character" w:default="1" w:styleId="DefaultParagraphFont">
     <w:name w:val="Default Paragraph Font"/>
     <w:uiPriority w:val="1"/>
-    <w:semiHidden/>
     <w:unhideWhenUsed/>
   </w:style>
   <w:style w:type="table" w:default="1" w:styleId="TableNormal">

</xml_diff>

<commit_message>
Add task detail page
</commit_message>
<xml_diff>
--- a/Assignment_04_Spring2026.docx
+++ b/Assignment_04_Spring2026.docx
@@ -1,6 +1,6 @@
 
 <file path=word/document.xml><?xml version="1.0" encoding="utf-8"?>
-<w:document xmlns:wpc="http://schemas.microsoft.com/office/word/2010/wordprocessingCanvas" xmlns:cx="http://schemas.microsoft.com/office/drawing/2014/chartex" xmlns:cx1="http://schemas.microsoft.com/office/drawing/2015/9/8/chartex" xmlns:cx2="http://schemas.microsoft.com/office/drawing/2015/10/21/chartex" xmlns:cx3="http://schemas.microsoft.com/office/drawing/2016/5/9/chartex" xmlns:cx4="http://schemas.microsoft.com/office/drawing/2016/5/10/chartex" xmlns:cx5="http://schemas.microsoft.com/office/drawing/2016/5/11/chartex" xmlns:cx6="http://schemas.microsoft.com/office/drawing/2016/5/12/chartex" xmlns:cx7="http://schemas.microsoft.com/office/drawing/2016/5/13/chartex" xmlns:cx8="http://schemas.microsoft.com/office/drawing/2016/5/14/chartex" xmlns:mc="http://schemas.openxmlformats.org/markup-compatibility/2006" xmlns:aink="http://schemas.microsoft.com/office/drawing/2016/ink" xmlns:am3d="http://schemas.microsoft.com/office/drawing/2017/model3d" xmlns:o="urn:schemas-microsoft-com:office:office" xmlns:oel="http://schemas.microsoft.com/office/2019/extlst" xmlns:r="http://schemas.openxmlformats.org/officeDocument/2006/relationships" xmlns:m="http://schemas.openxmlformats.org/officeDocument/2006/math" xmlns:v="urn:schemas-microsoft-com:vml" xmlns:wp14="http://schemas.microsoft.com/office/word/2010/wordprocessingDrawing" xmlns:wp="http://schemas.openxmlformats.org/drawingml/2006/wordprocessingDrawing" xmlns:w10="urn:schemas-microsoft-com:office:word" xmlns:w="http://schemas.openxmlformats.org/wordprocessingml/2006/main" xmlns:w14="http://schemas.microsoft.com/office/word/2010/wordml" xmlns:w15="http://schemas.microsoft.com/office/word/2012/wordml" xmlns:w16cex="http://schemas.microsoft.com/office/word/2018/wordml/cex" xmlns:w16cid="http://schemas.microsoft.com/office/word/2016/wordml/cid" xmlns:w16="http://schemas.microsoft.com/office/word/2018/wordml" xmlns:w16du="http://schemas.microsoft.com/office/word/2023/wordml/word16du" xmlns:w16sdtdh="http://schemas.microsoft.com/office/word/2020/wordml/sdtdatahash" xmlns:w16sdtfl="http://schemas.microsoft.com/office/word/2024/wordml/sdtformatlock" xmlns:w16se="http://schemas.microsoft.com/office/word/2015/wordml/symex" xmlns:wpg="http://schemas.microsoft.com/office/word/2010/wordprocessingGroup" xmlns:wpi="http://schemas.microsoft.com/office/word/2010/wordprocessingInk" xmlns:wne="http://schemas.microsoft.com/office/word/2006/wordml" xmlns:wps="http://schemas.microsoft.com/office/word/2010/wordprocessingShape" mc:Ignorable="w14 w15 w16se w16cid w16 w16cex w16sdtdh w16sdtfl w16du wp14">
+<w:document xmlns:mc="http://schemas.openxmlformats.org/markup-compatibility/2006" xmlns:r="http://schemas.openxmlformats.org/officeDocument/2006/relationships" xmlns:w="http://schemas.openxmlformats.org/wordprocessingml/2006/main" xmlns:w14="http://schemas.microsoft.com/office/word/2010/wordml" mc:Ignorable="w14 w15 w16se w16cid w16 w16cex w16sdtdh w16sdtfl w16du wp14">
   <w:body>
     <w:p>
       <w:pPr>
@@ -1538,7 +1538,11 @@
             </w:tcMar>
             <w:vAlign w:val="center"/>
           </w:tcPr>
-          <w:p/>
+          <w:p>
+            <w:r>
+              <w:t>Muhammad Asfand Yar Haider</w:t>
+            </w:r>
+          </w:p>
         </w:tc>
         <w:tc>
           <w:tcPr>
@@ -1558,7 +1562,11 @@
             </w:tcMar>
             <w:vAlign w:val="center"/>
           </w:tcPr>
-          <w:p/>
+          <w:p>
+            <w:r>
+              <w:t>m-a-y-h</w:t>
+            </w:r>
+          </w:p>
         </w:tc>
         <w:tc>
           <w:tcPr>
@@ -1578,7 +1586,11 @@
             </w:tcMar>
             <w:vAlign w:val="center"/>
           </w:tcPr>
-          <w:p/>
+          <w:p>
+            <w:r>
+              <w:t>Member</w:t>
+            </w:r>
+          </w:p>
         </w:tc>
         <w:tc>
           <w:tcPr>
@@ -1598,7 +1610,11 @@
             </w:tcMar>
             <w:vAlign w:val="center"/>
           </w:tcPr>
-          <w:p/>
+          <w:p>
+            <w:r>
+              <w:t>task-detail.html</w:t>
+            </w:r>
+          </w:p>
         </w:tc>
         <w:tc>
           <w:tcPr>
@@ -1618,7 +1634,11 @@
             </w:tcMar>
             <w:vAlign w:val="center"/>
           </w:tcPr>
-          <w:p/>
+          <w:p>
+            <w:r>
+              <w:t>feature/m-a-y-h/task-detail</w:t>
+            </w:r>
+          </w:p>
         </w:tc>
         <w:tc>
           <w:tcPr>
@@ -1638,7 +1658,11 @@
             </w:tcMar>
             <w:vAlign w:val="center"/>
           </w:tcPr>
-          <w:p/>
+          <w:p>
+            <w:r>
+              <w:t>Yes</w:t>
+            </w:r>
+          </w:p>
         </w:tc>
       </w:tr>
       <w:tr>
@@ -10102,7 +10126,7 @@
           <w:bCs/>
           <w:color w:val="000000"/>
         </w:rPr>
-        <w:t xml:space="preserve">Member </w:t>
+        <w:t xml:space="preserve">Member 4  (Name: Muhammad Asfand Yar Haider)</w:t>
       </w:r>
       <w:proofErr w:type="gramStart"/>
       <w:r>
@@ -10112,7 +10136,7 @@
           <w:bCs/>
           <w:color w:val="000000"/>
         </w:rPr>
-        <w:t>4  (Name: _</w:t>
+        <w:t/>
       </w:r>
       <w:proofErr w:type="gramEnd"/>
       <w:r>
@@ -10122,7 +10146,7 @@
           <w:bCs/>
           <w:color w:val="000000"/>
         </w:rPr>
-        <w:t>______________________________________________)</w:t>
+        <w:t/>
       </w:r>
     </w:p>
     <w:tbl>
@@ -10164,7 +10188,11 @@
             </w:tcMar>
             <w:vAlign w:val="center"/>
           </w:tcPr>
-          <w:p/>
+          <w:p>
+            <w:r>
+              <w:t>I learnt how a PR-based CI pipeline checks changes before merge.</w:t>
+            </w:r>
+          </w:p>
         </w:tc>
       </w:tr>
       <w:tr>
@@ -10186,7 +10214,11 @@
             </w:tcMar>
             <w:vAlign w:val="center"/>
           </w:tcPr>
-          <w:p/>
+          <w:p>
+            <w:r>
+              <w:t>I built the Task Detail page and connected it with the shared TaskFlow navigation and stylesheet.</w:t>
+            </w:r>
+          </w:p>
         </w:tc>
       </w:tr>
       <w:tr>
@@ -10208,7 +10240,11 @@
             </w:tcMar>
             <w:vAlign w:val="center"/>
           </w:tcPr>
-          <w:p/>
+          <w:p>
+            <w:r>
+              <w:t>The challenging part was understanding which work belonged to members versus the Team Lead.</w:t>
+            </w:r>
+          </w:p>
         </w:tc>
       </w:tr>
     </w:tbl>
@@ -10216,6 +10252,9 @@
       <w:pPr>
         <w:spacing w:after="100"/>
       </w:pPr>
+      <w:r>
+        <w:t>Our team handled this by reviewing feature branches separately before merging into develop.</w:t>
+      </w:r>
     </w:p>
     <w:p>
       <w:pPr>

</xml_diff>

<commit_message>
Fill in Table 1 details for Abdul Mateen
</commit_message>
<xml_diff>
--- a/Assignment_04_Spring2026.docx
+++ b/Assignment_04_Spring2026.docx
@@ -636,20 +636,14 @@
       </w:tblPr>
       <w:tblGrid>
         <w:gridCol w:w="471"/>
-        <w:gridCol w:w="1424"/>
-        <w:gridCol w:w="1349"/>
+        <w:gridCol w:w="1202"/>
+        <w:gridCol w:w="1425"/>
         <w:gridCol w:w="1561"/>
-        <w:gridCol w:w="1306"/>
-        <w:gridCol w:w="1596"/>
-        <w:gridCol w:w="1653"/>
+        <w:gridCol w:w="1205"/>
+        <w:gridCol w:w="1980"/>
+        <w:gridCol w:w="1516"/>
       </w:tblGrid>
       <w:tr>
-        <w:tblPrEx>
-          <w:tblCellMar>
-            <w:top w:w="0" w:type="dxa"/>
-            <w:bottom w:w="0" w:type="dxa"/>
-          </w:tblCellMar>
-        </w:tblPrEx>
         <w:trPr>
           <w:tblHeader/>
         </w:trPr>
@@ -879,12 +873,6 @@
         </w:tc>
       </w:tr>
       <w:tr>
-        <w:tblPrEx>
-          <w:tblCellMar>
-            <w:top w:w="0" w:type="dxa"/>
-            <w:bottom w:w="0" w:type="dxa"/>
-          </w:tblCellMar>
-        </w:tblPrEx>
         <w:tc>
           <w:tcPr>
             <w:tcW w:w="440" w:type="dxa"/>
@@ -1037,12 +1025,6 @@
         </w:tc>
       </w:tr>
       <w:tr>
-        <w:tblPrEx>
-          <w:tblCellMar>
-            <w:top w:w="0" w:type="dxa"/>
-            <w:bottom w:w="0" w:type="dxa"/>
-          </w:tblCellMar>
-        </w:tblPrEx>
         <w:tc>
           <w:tcPr>
             <w:tcW w:w="440" w:type="dxa"/>
@@ -1091,7 +1073,11 @@
             </w:tcMar>
             <w:vAlign w:val="center"/>
           </w:tcPr>
-          <w:p/>
+          <w:p>
+            <w:r>
+              <w:t>Abdul Mateen</w:t>
+            </w:r>
+          </w:p>
         </w:tc>
         <w:tc>
           <w:tcPr>
@@ -1111,7 +1097,11 @@
             </w:tcMar>
             <w:vAlign w:val="center"/>
           </w:tcPr>
-          <w:p/>
+          <w:p>
+            <w:r>
+              <w:t>Abdulmateen-67</w:t>
+            </w:r>
+          </w:p>
         </w:tc>
         <w:tc>
           <w:tcPr>
@@ -1131,7 +1121,11 @@
             </w:tcMar>
             <w:vAlign w:val="center"/>
           </w:tcPr>
-          <w:p/>
+          <w:p>
+            <w:r>
+              <w:t>Member</w:t>
+            </w:r>
+          </w:p>
         </w:tc>
         <w:tc>
           <w:tcPr>
@@ -1151,7 +1145,11 @@
             </w:tcMar>
             <w:vAlign w:val="center"/>
           </w:tcPr>
-          <w:p/>
+          <w:p>
+            <w:r>
+              <w:t>Add-task.html</w:t>
+            </w:r>
+          </w:p>
         </w:tc>
         <w:tc>
           <w:tcPr>
@@ -1171,7 +1169,11 @@
             </w:tcMar>
             <w:vAlign w:val="center"/>
           </w:tcPr>
-          <w:p/>
+          <w:p>
+            <w:r>
+              <w:t>feature/abdulmateen-67/add-task</w:t>
+            </w:r>
+          </w:p>
         </w:tc>
         <w:tc>
           <w:tcPr>
@@ -1191,16 +1193,14 @@
             </w:tcMar>
             <w:vAlign w:val="center"/>
           </w:tcPr>
-          <w:p/>
+          <w:p>
+            <w:r>
+              <w:t>Yes</w:t>
+            </w:r>
+          </w:p>
         </w:tc>
       </w:tr>
       <w:tr>
-        <w:tblPrEx>
-          <w:tblCellMar>
-            <w:top w:w="0" w:type="dxa"/>
-            <w:bottom w:w="0" w:type="dxa"/>
-          </w:tblCellMar>
-        </w:tblPrEx>
         <w:tc>
           <w:tcPr>
             <w:tcW w:w="440" w:type="dxa"/>
@@ -1353,12 +1353,6 @@
         </w:tc>
       </w:tr>
       <w:tr>
-        <w:tblPrEx>
-          <w:tblCellMar>
-            <w:top w:w="0" w:type="dxa"/>
-            <w:bottom w:w="0" w:type="dxa"/>
-          </w:tblCellMar>
-        </w:tblPrEx>
         <w:tc>
           <w:tcPr>
             <w:tcW w:w="440" w:type="dxa"/>
@@ -1511,12 +1505,6 @@
         </w:tc>
       </w:tr>
       <w:tr>
-        <w:tblPrEx>
-          <w:tblCellMar>
-            <w:top w:w="0" w:type="dxa"/>
-            <w:bottom w:w="0" w:type="dxa"/>
-          </w:tblCellMar>
-        </w:tblPrEx>
         <w:tc>
           <w:tcPr>
             <w:tcW w:w="440" w:type="dxa"/>
@@ -1831,12 +1819,6 @@
         <w:gridCol w:w="4860"/>
       </w:tblGrid>
       <w:tr>
-        <w:tblPrEx>
-          <w:tblCellMar>
-            <w:top w:w="0" w:type="dxa"/>
-            <w:bottom w:w="0" w:type="dxa"/>
-          </w:tblCellMar>
-        </w:tblPrEx>
         <w:trPr>
           <w:tblHeader/>
         </w:trPr>
@@ -1970,12 +1952,6 @@
         </w:tc>
       </w:tr>
       <w:tr>
-        <w:tblPrEx>
-          <w:tblCellMar>
-            <w:top w:w="0" w:type="dxa"/>
-            <w:bottom w:w="0" w:type="dxa"/>
-          </w:tblCellMar>
-        </w:tblPrEx>
         <w:tc>
           <w:tcPr>
             <w:tcW w:w="500" w:type="dxa"/>
@@ -2102,12 +2078,6 @@
         </w:tc>
       </w:tr>
       <w:tr>
-        <w:tblPrEx>
-          <w:tblCellMar>
-            <w:top w:w="0" w:type="dxa"/>
-            <w:bottom w:w="0" w:type="dxa"/>
-          </w:tblCellMar>
-        </w:tblPrEx>
         <w:tc>
           <w:tcPr>
             <w:tcW w:w="500" w:type="dxa"/>
@@ -2252,12 +2222,6 @@
         </w:tc>
       </w:tr>
       <w:tr>
-        <w:tblPrEx>
-          <w:tblCellMar>
-            <w:top w:w="0" w:type="dxa"/>
-            <w:bottom w:w="0" w:type="dxa"/>
-          </w:tblCellMar>
-        </w:tblPrEx>
         <w:tc>
           <w:tcPr>
             <w:tcW w:w="500" w:type="dxa"/>
@@ -2384,12 +2348,6 @@
         </w:tc>
       </w:tr>
       <w:tr>
-        <w:tblPrEx>
-          <w:tblCellMar>
-            <w:top w:w="0" w:type="dxa"/>
-            <w:bottom w:w="0" w:type="dxa"/>
-          </w:tblCellMar>
-        </w:tblPrEx>
         <w:tc>
           <w:tcPr>
             <w:tcW w:w="500" w:type="dxa"/>
@@ -2516,12 +2474,6 @@
         </w:tc>
       </w:tr>
       <w:tr>
-        <w:tblPrEx>
-          <w:tblCellMar>
-            <w:top w:w="0" w:type="dxa"/>
-            <w:bottom w:w="0" w:type="dxa"/>
-          </w:tblCellMar>
-        </w:tblPrEx>
         <w:tc>
           <w:tcPr>
             <w:tcW w:w="500" w:type="dxa"/>
@@ -2550,6 +2502,7 @@
                 <w:sz w:val="18"/>
                 <w:szCs w:val="18"/>
               </w:rPr>
+              <w:lastRenderedPageBreak/>
               <w:t>5</w:t>
             </w:r>
           </w:p>
@@ -2665,7 +2618,6 @@
           <w:bCs/>
           <w:color w:val="000000"/>
         </w:rPr>
-        <w:lastRenderedPageBreak/>
         <w:t>Each member's individual workflow:</w:t>
       </w:r>
     </w:p>
@@ -3037,12 +2989,6 @@
         <w:gridCol w:w="6160"/>
       </w:tblGrid>
       <w:tr>
-        <w:tblPrEx>
-          <w:tblCellMar>
-            <w:top w:w="0" w:type="dxa"/>
-            <w:bottom w:w="0" w:type="dxa"/>
-          </w:tblCellMar>
-        </w:tblPrEx>
         <w:trPr>
           <w:tblHeader/>
         </w:trPr>
@@ -3112,12 +3058,6 @@
         </w:tc>
       </w:tr>
       <w:tr>
-        <w:tblPrEx>
-          <w:tblCellMar>
-            <w:top w:w="0" w:type="dxa"/>
-            <w:bottom w:w="0" w:type="dxa"/>
-          </w:tblCellMar>
-        </w:tblPrEx>
         <w:tc>
           <w:tcPr>
             <w:tcW w:w="3200" w:type="dxa"/>
@@ -3200,12 +3140,6 @@
         </w:tc>
       </w:tr>
       <w:tr>
-        <w:tblPrEx>
-          <w:tblCellMar>
-            <w:top w:w="0" w:type="dxa"/>
-            <w:bottom w:w="0" w:type="dxa"/>
-          </w:tblCellMar>
-        </w:tblPrEx>
         <w:tc>
           <w:tcPr>
             <w:tcW w:w="3200" w:type="dxa"/>
@@ -3288,12 +3222,6 @@
         </w:tc>
       </w:tr>
       <w:tr>
-        <w:tblPrEx>
-          <w:tblCellMar>
-            <w:top w:w="0" w:type="dxa"/>
-            <w:bottom w:w="0" w:type="dxa"/>
-          </w:tblCellMar>
-        </w:tblPrEx>
         <w:tc>
           <w:tcPr>
             <w:tcW w:w="3200" w:type="dxa"/>
@@ -3376,12 +3304,6 @@
         </w:tc>
       </w:tr>
       <w:tr>
-        <w:tblPrEx>
-          <w:tblCellMar>
-            <w:top w:w="0" w:type="dxa"/>
-            <w:bottom w:w="0" w:type="dxa"/>
-          </w:tblCellMar>
-        </w:tblPrEx>
         <w:tc>
           <w:tcPr>
             <w:tcW w:w="3200" w:type="dxa"/>
@@ -3464,12 +3386,6 @@
         </w:tc>
       </w:tr>
       <w:tr>
-        <w:tblPrEx>
-          <w:tblCellMar>
-            <w:top w:w="0" w:type="dxa"/>
-            <w:bottom w:w="0" w:type="dxa"/>
-          </w:tblCellMar>
-        </w:tblPrEx>
         <w:tc>
           <w:tcPr>
             <w:tcW w:w="3200" w:type="dxa"/>
@@ -3552,12 +3468,6 @@
         </w:tc>
       </w:tr>
       <w:tr>
-        <w:tblPrEx>
-          <w:tblCellMar>
-            <w:top w:w="0" w:type="dxa"/>
-            <w:bottom w:w="0" w:type="dxa"/>
-          </w:tblCellMar>
-        </w:tblPrEx>
         <w:tc>
           <w:tcPr>
             <w:tcW w:w="3200" w:type="dxa"/>
@@ -3640,12 +3550,6 @@
         </w:tc>
       </w:tr>
       <w:tr>
-        <w:tblPrEx>
-          <w:tblCellMar>
-            <w:top w:w="0" w:type="dxa"/>
-            <w:bottom w:w="0" w:type="dxa"/>
-          </w:tblCellMar>
-        </w:tblPrEx>
         <w:tc>
           <w:tcPr>
             <w:tcW w:w="3200" w:type="dxa"/>
@@ -3710,12 +3614,6 @@
         </w:tc>
       </w:tr>
       <w:tr>
-        <w:tblPrEx>
-          <w:tblCellMar>
-            <w:top w:w="0" w:type="dxa"/>
-            <w:bottom w:w="0" w:type="dxa"/>
-          </w:tblCellMar>
-        </w:tblPrEx>
         <w:tc>
           <w:tcPr>
             <w:tcW w:w="3200" w:type="dxa"/>
@@ -3789,12 +3687,6 @@
         </w:tc>
       </w:tr>
       <w:tr>
-        <w:tblPrEx>
-          <w:tblCellMar>
-            <w:top w:w="0" w:type="dxa"/>
-            <w:bottom w:w="0" w:type="dxa"/>
-          </w:tblCellMar>
-        </w:tblPrEx>
         <w:tc>
           <w:tcPr>
             <w:tcW w:w="3200" w:type="dxa"/>
@@ -3868,12 +3760,6 @@
         </w:tc>
       </w:tr>
       <w:tr>
-        <w:tblPrEx>
-          <w:tblCellMar>
-            <w:top w:w="0" w:type="dxa"/>
-            <w:bottom w:w="0" w:type="dxa"/>
-          </w:tblCellMar>
-        </w:tblPrEx>
         <w:tc>
           <w:tcPr>
             <w:tcW w:w="3200" w:type="dxa"/>
@@ -3902,6 +3788,7 @@
                 <w:sz w:val="18"/>
                 <w:szCs w:val="18"/>
               </w:rPr>
+              <w:lastRenderedPageBreak/>
               <w:t>Assignment_04_Spring2026.docx</w:t>
             </w:r>
           </w:p>
@@ -3972,7 +3859,6 @@
           <w:rFonts w:ascii="Arial" w:eastAsia="Arial" w:hAnsi="Arial" w:cs="Arial"/>
           <w:color w:val="000000"/>
         </w:rPr>
-        <w:lastRenderedPageBreak/>
         <w:t xml:space="preserve">The Team Lead (TL) is responsible for creating all secrets listed below. The TL is the repository admin and the credentials in use </w:t>
       </w:r>
       <w:r>
@@ -4120,12 +4006,6 @@
         <w:gridCol w:w="4420"/>
       </w:tblGrid>
       <w:tr>
-        <w:tblPrEx>
-          <w:tblCellMar>
-            <w:top w:w="0" w:type="dxa"/>
-            <w:bottom w:w="0" w:type="dxa"/>
-          </w:tblCellMar>
-        </w:tblPrEx>
         <w:trPr>
           <w:tblHeader/>
         </w:trPr>
@@ -4227,12 +4107,6 @@
         </w:tc>
       </w:tr>
       <w:tr>
-        <w:tblPrEx>
-          <w:tblCellMar>
-            <w:top w:w="0" w:type="dxa"/>
-            <w:bottom w:w="0" w:type="dxa"/>
-          </w:tblCellMar>
-        </w:tblPrEx>
         <w:trPr>
           <w:trHeight w:val="427"/>
         </w:trPr>
@@ -4336,12 +4210,6 @@
         </w:tc>
       </w:tr>
       <w:tr>
-        <w:tblPrEx>
-          <w:tblCellMar>
-            <w:top w:w="0" w:type="dxa"/>
-            <w:bottom w:w="0" w:type="dxa"/>
-          </w:tblCellMar>
-        </w:tblPrEx>
         <w:tc>
           <w:tcPr>
             <w:tcW w:w="2000" w:type="dxa"/>
@@ -4454,12 +4322,6 @@
         </w:tc>
       </w:tr>
       <w:tr>
-        <w:tblPrEx>
-          <w:tblCellMar>
-            <w:top w:w="0" w:type="dxa"/>
-            <w:bottom w:w="0" w:type="dxa"/>
-          </w:tblCellMar>
-        </w:tblPrEx>
         <w:tc>
           <w:tcPr>
             <w:tcW w:w="2000" w:type="dxa"/>
@@ -4815,6 +4677,7 @@
           <w:rFonts w:ascii="Arial" w:eastAsia="Arial" w:hAnsi="Arial" w:cs="Arial"/>
           <w:color w:val="000000"/>
         </w:rPr>
+        <w:lastRenderedPageBreak/>
         <w:t xml:space="preserve">The CI status check must appear as a required check in the Branch Protection Rules on </w:t>
       </w:r>
       <w:r>
@@ -5141,12 +5004,6 @@
         <w:gridCol w:w="4380"/>
       </w:tblGrid>
       <w:tr>
-        <w:tblPrEx>
-          <w:tblCellMar>
-            <w:top w:w="0" w:type="dxa"/>
-            <w:bottom w:w="0" w:type="dxa"/>
-          </w:tblCellMar>
-        </w:tblPrEx>
         <w:trPr>
           <w:tblHeader/>
         </w:trPr>
@@ -5248,12 +5105,6 @@
         </w:tc>
       </w:tr>
       <w:tr>
-        <w:tblPrEx>
-          <w:tblCellMar>
-            <w:top w:w="0" w:type="dxa"/>
-            <w:bottom w:w="0" w:type="dxa"/>
-          </w:tblCellMar>
-        </w:tblPrEx>
         <w:tc>
           <w:tcPr>
             <w:tcW w:w="1600" w:type="dxa"/>
@@ -5366,12 +5217,6 @@
         </w:tc>
       </w:tr>
       <w:tr>
-        <w:tblPrEx>
-          <w:tblCellMar>
-            <w:top w:w="0" w:type="dxa"/>
-            <w:bottom w:w="0" w:type="dxa"/>
-          </w:tblCellMar>
-        </w:tblPrEx>
         <w:tc>
           <w:tcPr>
             <w:tcW w:w="1600" w:type="dxa"/>
@@ -5863,6 +5708,7 @@
           <w:sz w:val="19"/>
           <w:szCs w:val="19"/>
         </w:rPr>
+        <w:lastRenderedPageBreak/>
         <w:t>Build the assigned HTML page with proper content and link it to style.css</w:t>
       </w:r>
     </w:p>
@@ -6066,12 +5912,6 @@
         <w:gridCol w:w="2150"/>
       </w:tblGrid>
       <w:tr>
-        <w:tblPrEx>
-          <w:tblCellMar>
-            <w:top w:w="0" w:type="dxa"/>
-            <w:bottom w:w="0" w:type="dxa"/>
-          </w:tblCellMar>
-        </w:tblPrEx>
         <w:trPr>
           <w:tblHeader/>
         </w:trPr>
@@ -6173,12 +6013,6 @@
         </w:tc>
       </w:tr>
       <w:tr>
-        <w:tblPrEx>
-          <w:tblCellMar>
-            <w:top w:w="0" w:type="dxa"/>
-            <w:bottom w:w="0" w:type="dxa"/>
-          </w:tblCellMar>
-        </w:tblPrEx>
         <w:tc>
           <w:tcPr>
             <w:tcW w:w="700" w:type="dxa"/>
@@ -6265,12 +6099,6 @@
         </w:tc>
       </w:tr>
       <w:tr>
-        <w:tblPrEx>
-          <w:tblCellMar>
-            <w:top w:w="0" w:type="dxa"/>
-            <w:bottom w:w="0" w:type="dxa"/>
-          </w:tblCellMar>
-        </w:tblPrEx>
         <w:tc>
           <w:tcPr>
             <w:tcW w:w="700" w:type="dxa"/>
@@ -6365,12 +6193,6 @@
         </w:tc>
       </w:tr>
       <w:tr>
-        <w:tblPrEx>
-          <w:tblCellMar>
-            <w:top w:w="0" w:type="dxa"/>
-            <w:bottom w:w="0" w:type="dxa"/>
-          </w:tblCellMar>
-        </w:tblPrEx>
         <w:tc>
           <w:tcPr>
             <w:tcW w:w="700" w:type="dxa"/>
@@ -6465,12 +6287,6 @@
         </w:tc>
       </w:tr>
       <w:tr>
-        <w:tblPrEx>
-          <w:tblCellMar>
-            <w:top w:w="0" w:type="dxa"/>
-            <w:bottom w:w="0" w:type="dxa"/>
-          </w:tblCellMar>
-        </w:tblPrEx>
         <w:tc>
           <w:tcPr>
             <w:tcW w:w="700" w:type="dxa"/>
@@ -6557,12 +6373,6 @@
         </w:tc>
       </w:tr>
       <w:tr>
-        <w:tblPrEx>
-          <w:tblCellMar>
-            <w:top w:w="0" w:type="dxa"/>
-            <w:bottom w:w="0" w:type="dxa"/>
-          </w:tblCellMar>
-        </w:tblPrEx>
         <w:tc>
           <w:tcPr>
             <w:tcW w:w="700" w:type="dxa"/>
@@ -6666,12 +6476,6 @@
         </w:tc>
       </w:tr>
       <w:tr>
-        <w:tblPrEx>
-          <w:tblCellMar>
-            <w:top w:w="0" w:type="dxa"/>
-            <w:bottom w:w="0" w:type="dxa"/>
-          </w:tblCellMar>
-        </w:tblPrEx>
         <w:tc>
           <w:tcPr>
             <w:tcW w:w="700" w:type="dxa"/>
@@ -6766,12 +6570,6 @@
         </w:tc>
       </w:tr>
       <w:tr>
-        <w:tblPrEx>
-          <w:tblCellMar>
-            <w:top w:w="0" w:type="dxa"/>
-            <w:bottom w:w="0" w:type="dxa"/>
-          </w:tblCellMar>
-        </w:tblPrEx>
         <w:tc>
           <w:tcPr>
             <w:tcW w:w="700" w:type="dxa"/>
@@ -6875,12 +6673,6 @@
         </w:tc>
       </w:tr>
       <w:tr>
-        <w:tblPrEx>
-          <w:tblCellMar>
-            <w:top w:w="0" w:type="dxa"/>
-            <w:bottom w:w="0" w:type="dxa"/>
-          </w:tblCellMar>
-        </w:tblPrEx>
         <w:tc>
           <w:tcPr>
             <w:tcW w:w="700" w:type="dxa"/>
@@ -6967,12 +6759,6 @@
         </w:tc>
       </w:tr>
       <w:tr>
-        <w:tblPrEx>
-          <w:tblCellMar>
-            <w:top w:w="0" w:type="dxa"/>
-            <w:bottom w:w="0" w:type="dxa"/>
-          </w:tblCellMar>
-        </w:tblPrEx>
         <w:tc>
           <w:tcPr>
             <w:tcW w:w="700" w:type="dxa"/>
@@ -7067,12 +6853,6 @@
         </w:tc>
       </w:tr>
       <w:tr>
-        <w:tblPrEx>
-          <w:tblCellMar>
-            <w:top w:w="0" w:type="dxa"/>
-            <w:bottom w:w="0" w:type="dxa"/>
-          </w:tblCellMar>
-        </w:tblPrEx>
         <w:tc>
           <w:tcPr>
             <w:tcW w:w="700" w:type="dxa"/>
@@ -7167,12 +6947,6 @@
         </w:tc>
       </w:tr>
       <w:tr>
-        <w:tblPrEx>
-          <w:tblCellMar>
-            <w:top w:w="0" w:type="dxa"/>
-            <w:bottom w:w="0" w:type="dxa"/>
-          </w:tblCellMar>
-        </w:tblPrEx>
         <w:tc>
           <w:tcPr>
             <w:tcW w:w="700" w:type="dxa"/>
@@ -7285,12 +7059,6 @@
         </w:tc>
       </w:tr>
       <w:tr>
-        <w:tblPrEx>
-          <w:tblCellMar>
-            <w:top w:w="0" w:type="dxa"/>
-            <w:bottom w:w="0" w:type="dxa"/>
-          </w:tblCellMar>
-        </w:tblPrEx>
         <w:tc>
           <w:tcPr>
             <w:tcW w:w="700" w:type="dxa"/>
@@ -7377,12 +7145,6 @@
         </w:tc>
       </w:tr>
       <w:tr>
-        <w:tblPrEx>
-          <w:tblCellMar>
-            <w:top w:w="0" w:type="dxa"/>
-            <w:bottom w:w="0" w:type="dxa"/>
-          </w:tblCellMar>
-        </w:tblPrEx>
         <w:tc>
           <w:tcPr>
             <w:tcW w:w="700" w:type="dxa"/>
@@ -7486,12 +7248,6 @@
         </w:tc>
       </w:tr>
       <w:tr>
-        <w:tblPrEx>
-          <w:tblCellMar>
-            <w:top w:w="0" w:type="dxa"/>
-            <w:bottom w:w="0" w:type="dxa"/>
-          </w:tblCellMar>
-        </w:tblPrEx>
         <w:tc>
           <w:tcPr>
             <w:tcW w:w="700" w:type="dxa"/>
@@ -7586,12 +7342,6 @@
         </w:tc>
       </w:tr>
       <w:tr>
-        <w:tblPrEx>
-          <w:tblCellMar>
-            <w:top w:w="0" w:type="dxa"/>
-            <w:bottom w:w="0" w:type="dxa"/>
-          </w:tblCellMar>
-        </w:tblPrEx>
         <w:tc>
           <w:tcPr>
             <w:tcW w:w="700" w:type="dxa"/>
@@ -7686,12 +7436,6 @@
         </w:tc>
       </w:tr>
       <w:tr>
-        <w:tblPrEx>
-          <w:tblCellMar>
-            <w:top w:w="0" w:type="dxa"/>
-            <w:bottom w:w="0" w:type="dxa"/>
-          </w:tblCellMar>
-        </w:tblPrEx>
         <w:tc>
           <w:tcPr>
             <w:tcW w:w="700" w:type="dxa"/>
@@ -7786,12 +7530,6 @@
         </w:tc>
       </w:tr>
       <w:tr>
-        <w:tblPrEx>
-          <w:tblCellMar>
-            <w:top w:w="0" w:type="dxa"/>
-            <w:bottom w:w="0" w:type="dxa"/>
-          </w:tblCellMar>
-        </w:tblPrEx>
         <w:tc>
           <w:tcPr>
             <w:tcW w:w="700" w:type="dxa"/>
@@ -7878,12 +7616,6 @@
         </w:tc>
       </w:tr>
       <w:tr>
-        <w:tblPrEx>
-          <w:tblCellMar>
-            <w:top w:w="0" w:type="dxa"/>
-            <w:bottom w:w="0" w:type="dxa"/>
-          </w:tblCellMar>
-        </w:tblPrEx>
         <w:tc>
           <w:tcPr>
             <w:tcW w:w="700" w:type="dxa"/>
@@ -7987,12 +7719,6 @@
         </w:tc>
       </w:tr>
       <w:tr>
-        <w:tblPrEx>
-          <w:tblCellMar>
-            <w:top w:w="0" w:type="dxa"/>
-            <w:bottom w:w="0" w:type="dxa"/>
-          </w:tblCellMar>
-        </w:tblPrEx>
         <w:tc>
           <w:tcPr>
             <w:tcW w:w="700" w:type="dxa"/>
@@ -8087,12 +7813,6 @@
         </w:tc>
       </w:tr>
       <w:tr>
-        <w:tblPrEx>
-          <w:tblCellMar>
-            <w:top w:w="0" w:type="dxa"/>
-            <w:bottom w:w="0" w:type="dxa"/>
-          </w:tblCellMar>
-        </w:tblPrEx>
         <w:tc>
           <w:tcPr>
             <w:tcW w:w="700" w:type="dxa"/>
@@ -8121,6 +7841,7 @@
                 <w:sz w:val="18"/>
                 <w:szCs w:val="18"/>
               </w:rPr>
+              <w:lastRenderedPageBreak/>
               <w:t>15</w:t>
             </w:r>
           </w:p>
@@ -8187,12 +7908,6 @@
         </w:tc>
       </w:tr>
       <w:tr>
-        <w:tblPrEx>
-          <w:tblCellMar>
-            <w:top w:w="0" w:type="dxa"/>
-            <w:bottom w:w="0" w:type="dxa"/>
-          </w:tblCellMar>
-        </w:tblPrEx>
         <w:tc>
           <w:tcPr>
             <w:tcW w:w="700" w:type="dxa"/>
@@ -8279,12 +7994,6 @@
         </w:tc>
       </w:tr>
       <w:tr>
-        <w:tblPrEx>
-          <w:tblCellMar>
-            <w:top w:w="0" w:type="dxa"/>
-            <w:bottom w:w="0" w:type="dxa"/>
-          </w:tblCellMar>
-        </w:tblPrEx>
         <w:tc>
           <w:tcPr>
             <w:tcW w:w="700" w:type="dxa"/>
@@ -8379,12 +8088,6 @@
         </w:tc>
       </w:tr>
       <w:tr>
-        <w:tblPrEx>
-          <w:tblCellMar>
-            <w:top w:w="0" w:type="dxa"/>
-            <w:bottom w:w="0" w:type="dxa"/>
-          </w:tblCellMar>
-        </w:tblPrEx>
         <w:tc>
           <w:tcPr>
             <w:tcW w:w="700" w:type="dxa"/>
@@ -8479,12 +8182,6 @@
         </w:tc>
       </w:tr>
       <w:tr>
-        <w:tblPrEx>
-          <w:tblCellMar>
-            <w:top w:w="0" w:type="dxa"/>
-            <w:bottom w:w="0" w:type="dxa"/>
-          </w:tblCellMar>
-        </w:tblPrEx>
         <w:tc>
           <w:tcPr>
             <w:tcW w:w="700" w:type="dxa"/>
@@ -8889,12 +8586,6 @@
         <w:gridCol w:w="6160"/>
       </w:tblGrid>
       <w:tr>
-        <w:tblPrEx>
-          <w:tblCellMar>
-            <w:top w:w="0" w:type="dxa"/>
-            <w:bottom w:w="0" w:type="dxa"/>
-          </w:tblCellMar>
-        </w:tblPrEx>
         <w:tc>
           <w:tcPr>
             <w:tcW w:w="3200" w:type="dxa"/>
@@ -8961,12 +8652,6 @@
         </w:tc>
       </w:tr>
       <w:tr>
-        <w:tblPrEx>
-          <w:tblCellMar>
-            <w:top w:w="0" w:type="dxa"/>
-            <w:bottom w:w="0" w:type="dxa"/>
-          </w:tblCellMar>
-        </w:tblPrEx>
         <w:tc>
           <w:tcPr>
             <w:tcW w:w="3200" w:type="dxa"/>
@@ -9043,12 +8728,6 @@
         </w:tc>
       </w:tr>
       <w:tr>
-        <w:tblPrEx>
-          <w:tblCellMar>
-            <w:top w:w="0" w:type="dxa"/>
-            <w:bottom w:w="0" w:type="dxa"/>
-          </w:tblCellMar>
-        </w:tblPrEx>
         <w:tc>
           <w:tcPr>
             <w:tcW w:w="3200" w:type="dxa"/>
@@ -9103,12 +8782,6 @@
         </w:tc>
       </w:tr>
       <w:tr>
-        <w:tblPrEx>
-          <w:tblCellMar>
-            <w:top w:w="0" w:type="dxa"/>
-            <w:bottom w:w="0" w:type="dxa"/>
-          </w:tblCellMar>
-        </w:tblPrEx>
         <w:tc>
           <w:tcPr>
             <w:tcW w:w="3200" w:type="dxa"/>
@@ -9163,12 +8836,6 @@
         </w:tc>
       </w:tr>
       <w:tr>
-        <w:tblPrEx>
-          <w:tblCellMar>
-            <w:top w:w="0" w:type="dxa"/>
-            <w:bottom w:w="0" w:type="dxa"/>
-          </w:tblCellMar>
-        </w:tblPrEx>
         <w:tc>
           <w:tcPr>
             <w:tcW w:w="3200" w:type="dxa"/>
@@ -9234,12 +8901,6 @@
         </w:tc>
       </w:tr>
       <w:tr>
-        <w:tblPrEx>
-          <w:tblCellMar>
-            <w:top w:w="0" w:type="dxa"/>
-            <w:bottom w:w="0" w:type="dxa"/>
-          </w:tblCellMar>
-        </w:tblPrEx>
         <w:tc>
           <w:tcPr>
             <w:tcW w:w="3200" w:type="dxa"/>
@@ -9294,12 +8955,6 @@
         </w:tc>
       </w:tr>
       <w:tr>
-        <w:tblPrEx>
-          <w:tblCellMar>
-            <w:top w:w="0" w:type="dxa"/>
-            <w:bottom w:w="0" w:type="dxa"/>
-          </w:tblCellMar>
-        </w:tblPrEx>
         <w:tc>
           <w:tcPr>
             <w:tcW w:w="3200" w:type="dxa"/>
@@ -9375,6 +9030,7 @@
           <w:sz w:val="28"/>
           <w:szCs w:val="28"/>
         </w:rPr>
+        <w:lastRenderedPageBreak/>
         <w:t>TEAM REFLECTION</w:t>
       </w:r>
     </w:p>
@@ -9432,12 +9088,6 @@
         <w:gridCol w:w="9360"/>
       </w:tblGrid>
       <w:tr>
-        <w:tblPrEx>
-          <w:tblCellMar>
-            <w:top w:w="0" w:type="dxa"/>
-            <w:bottom w:w="0" w:type="dxa"/>
-          </w:tblCellMar>
-        </w:tblPrEx>
         <w:tc>
           <w:tcPr>
             <w:tcW w:w="9360" w:type="dxa"/>
@@ -9460,12 +9110,6 @@
         </w:tc>
       </w:tr>
       <w:tr>
-        <w:tblPrEx>
-          <w:tblCellMar>
-            <w:top w:w="0" w:type="dxa"/>
-            <w:bottom w:w="0" w:type="dxa"/>
-          </w:tblCellMar>
-        </w:tblPrEx>
         <w:tc>
           <w:tcPr>
             <w:tcW w:w="9360" w:type="dxa"/>
@@ -9488,12 +9132,6 @@
         </w:tc>
       </w:tr>
       <w:tr>
-        <w:tblPrEx>
-          <w:tblCellMar>
-            <w:top w:w="0" w:type="dxa"/>
-            <w:bottom w:w="0" w:type="dxa"/>
-          </w:tblCellMar>
-        </w:tblPrEx>
         <w:tc>
           <w:tcPr>
             <w:tcW w:w="9360" w:type="dxa"/>
@@ -9557,12 +9195,6 @@
         <w:gridCol w:w="9360"/>
       </w:tblGrid>
       <w:tr>
-        <w:tblPrEx>
-          <w:tblCellMar>
-            <w:top w:w="0" w:type="dxa"/>
-            <w:bottom w:w="0" w:type="dxa"/>
-          </w:tblCellMar>
-        </w:tblPrEx>
         <w:tc>
           <w:tcPr>
             <w:tcW w:w="9360" w:type="dxa"/>
@@ -9585,12 +9217,6 @@
         </w:tc>
       </w:tr>
       <w:tr>
-        <w:tblPrEx>
-          <w:tblCellMar>
-            <w:top w:w="0" w:type="dxa"/>
-            <w:bottom w:w="0" w:type="dxa"/>
-          </w:tblCellMar>
-        </w:tblPrEx>
         <w:tc>
           <w:tcPr>
             <w:tcW w:w="9360" w:type="dxa"/>
@@ -9613,12 +9239,6 @@
         </w:tc>
       </w:tr>
       <w:tr>
-        <w:tblPrEx>
-          <w:tblCellMar>
-            <w:top w:w="0" w:type="dxa"/>
-            <w:bottom w:w="0" w:type="dxa"/>
-          </w:tblCellMar>
-        </w:tblPrEx>
         <w:tc>
           <w:tcPr>
             <w:tcW w:w="9360" w:type="dxa"/>
@@ -9682,12 +9302,6 @@
         <w:gridCol w:w="9360"/>
       </w:tblGrid>
       <w:tr>
-        <w:tblPrEx>
-          <w:tblCellMar>
-            <w:top w:w="0" w:type="dxa"/>
-            <w:bottom w:w="0" w:type="dxa"/>
-          </w:tblCellMar>
-        </w:tblPrEx>
         <w:tc>
           <w:tcPr>
             <w:tcW w:w="9360" w:type="dxa"/>
@@ -9710,12 +9324,6 @@
         </w:tc>
       </w:tr>
       <w:tr>
-        <w:tblPrEx>
-          <w:tblCellMar>
-            <w:top w:w="0" w:type="dxa"/>
-            <w:bottom w:w="0" w:type="dxa"/>
-          </w:tblCellMar>
-        </w:tblPrEx>
         <w:tc>
           <w:tcPr>
             <w:tcW w:w="9360" w:type="dxa"/>
@@ -9738,12 +9346,6 @@
         </w:tc>
       </w:tr>
       <w:tr>
-        <w:tblPrEx>
-          <w:tblCellMar>
-            <w:top w:w="0" w:type="dxa"/>
-            <w:bottom w:w="0" w:type="dxa"/>
-          </w:tblCellMar>
-        </w:tblPrEx>
         <w:tc>
           <w:tcPr>
             <w:tcW w:w="9360" w:type="dxa"/>
@@ -9807,12 +9409,6 @@
         <w:gridCol w:w="9360"/>
       </w:tblGrid>
       <w:tr>
-        <w:tblPrEx>
-          <w:tblCellMar>
-            <w:top w:w="0" w:type="dxa"/>
-            <w:bottom w:w="0" w:type="dxa"/>
-          </w:tblCellMar>
-        </w:tblPrEx>
         <w:tc>
           <w:tcPr>
             <w:tcW w:w="9360" w:type="dxa"/>
@@ -9835,12 +9431,6 @@
         </w:tc>
       </w:tr>
       <w:tr>
-        <w:tblPrEx>
-          <w:tblCellMar>
-            <w:top w:w="0" w:type="dxa"/>
-            <w:bottom w:w="0" w:type="dxa"/>
-          </w:tblCellMar>
-        </w:tblPrEx>
         <w:tc>
           <w:tcPr>
             <w:tcW w:w="9360" w:type="dxa"/>
@@ -9863,12 +9453,6 @@
         </w:tc>
       </w:tr>
       <w:tr>
-        <w:tblPrEx>
-          <w:tblCellMar>
-            <w:top w:w="0" w:type="dxa"/>
-            <w:bottom w:w="0" w:type="dxa"/>
-          </w:tblCellMar>
-        </w:tblPrEx>
         <w:tc>
           <w:tcPr>
             <w:tcW w:w="9360" w:type="dxa"/>
@@ -9932,12 +9516,6 @@
         <w:gridCol w:w="9360"/>
       </w:tblGrid>
       <w:tr>
-        <w:tblPrEx>
-          <w:tblCellMar>
-            <w:top w:w="0" w:type="dxa"/>
-            <w:bottom w:w="0" w:type="dxa"/>
-          </w:tblCellMar>
-        </w:tblPrEx>
         <w:tc>
           <w:tcPr>
             <w:tcW w:w="9360" w:type="dxa"/>
@@ -9960,12 +9538,6 @@
         </w:tc>
       </w:tr>
       <w:tr>
-        <w:tblPrEx>
-          <w:tblCellMar>
-            <w:top w:w="0" w:type="dxa"/>
-            <w:bottom w:w="0" w:type="dxa"/>
-          </w:tblCellMar>
-        </w:tblPrEx>
         <w:tc>
           <w:tcPr>
             <w:tcW w:w="9360" w:type="dxa"/>
@@ -9988,12 +9560,6 @@
         </w:tc>
       </w:tr>
       <w:tr>
-        <w:tblPrEx>
-          <w:tblCellMar>
-            <w:top w:w="0" w:type="dxa"/>
-            <w:bottom w:w="0" w:type="dxa"/>
-          </w:tblCellMar>
-        </w:tblPrEx>
         <w:tc>
           <w:tcPr>
             <w:tcW w:w="9360" w:type="dxa"/>
@@ -11065,7 +10631,6 @@
   <w:style w:type="character" w:default="1" w:styleId="DefaultParagraphFont">
     <w:name w:val="Default Paragraph Font"/>
     <w:uiPriority w:val="1"/>
-    <w:semiHidden/>
     <w:unhideWhenUsed/>
   </w:style>
   <w:style w:type="table" w:default="1" w:styleId="TableNormal">

</xml_diff>

<commit_message>
Fill in Reflection details in doc
</commit_message>
<xml_diff>
--- a/Assignment_04_Spring2026.docx
+++ b/Assignment_04_Spring2026.docx
@@ -9171,7 +9171,16 @@
           <w:bCs/>
           <w:color w:val="000000"/>
         </w:rPr>
-        <w:t>Member 2  (Name: _______________________________________________)</w:t>
+        <w:t xml:space="preserve">Member 2  (Name: </w:t>
+      </w:r>
+      <w:r>
+        <w:rPr>
+          <w:rFonts w:ascii="Arial" w:eastAsia="Arial" w:hAnsi="Arial" w:cs="Arial"/>
+          <w:b/>
+          <w:bCs/>
+          <w:color w:val="000000"/>
+        </w:rPr>
+        <w:t>Abdul Mateen</w:t>
       </w:r>
     </w:p>
     <w:tbl>
@@ -9213,7 +9222,11 @@
             </w:tcMar>
             <w:vAlign w:val="center"/>
           </w:tcPr>
-          <w:p/>
+          <w:p>
+            <w:r>
+              <w:t>Through this assignment, I learned how to integrate a CI/CD pipeline using GitHub Actions with Docker and Render.</w:t>
+            </w:r>
+          </w:p>
         </w:tc>
       </w:tr>
       <w:tr>
@@ -9235,7 +9248,11 @@
             </w:tcMar>
             <w:vAlign w:val="center"/>
           </w:tcPr>
-          <w:p/>
+          <w:p>
+            <w:r>
+              <w:t>My most challenging part was understanding how the CI workflow triggers on a PR and how the CD workflow fires only after a merge.</w:t>
+            </w:r>
+          </w:p>
         </w:tc>
       </w:tr>
       <w:tr>
@@ -9257,7 +9274,11 @@
             </w:tcMar>
             <w:vAlign w:val="center"/>
           </w:tcPr>
-          <w:p/>
+          <w:p>
+            <w:r>
+              <w:t>Working on the Add Task page taught me how feature branches isolate individual work within a team. The automated deployment flow from code push to a live URL made the DevOps lifecycle very tangible.</w:t>
+            </w:r>
+          </w:p>
         </w:tc>
       </w:tr>
     </w:tbl>

</xml_diff>

<commit_message>
Add Abdul Mateen details to Table 1 in assignment docx
</commit_message>
<xml_diff>
--- a/Assignment_04_Spring2026.docx
+++ b/Assignment_04_Spring2026.docx
@@ -1,6 +1,6 @@
 
 <file path=word/document.xml><?xml version="1.0" encoding="utf-8"?>
-<w:document xmlns:wpc="http://schemas.microsoft.com/office/word/2010/wordprocessingCanvas" xmlns:cx="http://schemas.microsoft.com/office/drawing/2014/chartex" xmlns:cx1="http://schemas.microsoft.com/office/drawing/2015/9/8/chartex" xmlns:cx2="http://schemas.microsoft.com/office/drawing/2015/10/21/chartex" xmlns:cx3="http://schemas.microsoft.com/office/drawing/2016/5/9/chartex" xmlns:cx4="http://schemas.microsoft.com/office/drawing/2016/5/10/chartex" xmlns:cx5="http://schemas.microsoft.com/office/drawing/2016/5/11/chartex" xmlns:cx6="http://schemas.microsoft.com/office/drawing/2016/5/12/chartex" xmlns:cx7="http://schemas.microsoft.com/office/drawing/2016/5/13/chartex" xmlns:cx8="http://schemas.microsoft.com/office/drawing/2016/5/14/chartex" xmlns:mc="http://schemas.openxmlformats.org/markup-compatibility/2006" xmlns:aink="http://schemas.microsoft.com/office/drawing/2016/ink" xmlns:am3d="http://schemas.microsoft.com/office/drawing/2017/model3d" xmlns:o="urn:schemas-microsoft-com:office:office" xmlns:oel="http://schemas.microsoft.com/office/2019/extlst" xmlns:r="http://schemas.openxmlformats.org/officeDocument/2006/relationships" xmlns:m="http://schemas.openxmlformats.org/officeDocument/2006/math" xmlns:v="urn:schemas-microsoft-com:vml" xmlns:wp14="http://schemas.microsoft.com/office/word/2010/wordprocessingDrawing" xmlns:wp="http://schemas.openxmlformats.org/drawingml/2006/wordprocessingDrawing" xmlns:w10="urn:schemas-microsoft-com:office:word" xmlns:w="http://schemas.openxmlformats.org/wordprocessingml/2006/main" xmlns:w14="http://schemas.microsoft.com/office/word/2010/wordml" xmlns:w15="http://schemas.microsoft.com/office/word/2012/wordml" xmlns:w16cex="http://schemas.microsoft.com/office/word/2018/wordml/cex" xmlns:w16cid="http://schemas.microsoft.com/office/word/2016/wordml/cid" xmlns:w16="http://schemas.microsoft.com/office/word/2018/wordml" xmlns:w16du="http://schemas.microsoft.com/office/word/2023/wordml/word16du" xmlns:w16sdtdh="http://schemas.microsoft.com/office/word/2020/wordml/sdtdatahash" xmlns:w16sdtfl="http://schemas.microsoft.com/office/word/2024/wordml/sdtformatlock" xmlns:w16se="http://schemas.microsoft.com/office/word/2015/wordml/symex" xmlns:wpg="http://schemas.microsoft.com/office/word/2010/wordprocessingGroup" xmlns:wpi="http://schemas.microsoft.com/office/word/2010/wordprocessingInk" xmlns:wne="http://schemas.microsoft.com/office/word/2006/wordml" xmlns:wps="http://schemas.microsoft.com/office/word/2010/wordprocessingShape" mc:Ignorable="w14 w15 w16se w16cid w16 w16cex w16sdtdh w16sdtfl w16du wp14">
+<w:document xmlns:mc="http://schemas.openxmlformats.org/markup-compatibility/2006" xmlns:r="http://schemas.openxmlformats.org/officeDocument/2006/relationships" xmlns:w="http://schemas.openxmlformats.org/wordprocessingml/2006/main" xmlns:w14="http://schemas.microsoft.com/office/word/2010/wordml" mc:Ignorable="w14 w15 w16se w16cid w16 w16cex w16sdtdh w16sdtfl w16du wp14">
   <w:body>
     <w:p>
       <w:pPr>
@@ -348,7 +348,47 @@
           <w:sz w:val="24"/>
           <w:szCs w:val="24"/>
         </w:rPr>
-        <w:t xml:space="preserve"> (can be six members but in that case TL has to create an additional page for that member and then assign all tasks accordingly)</w:t>
+        <w:t xml:space="preserve"> (can be six members but in that </w:t>
+      </w:r>
+      <w:proofErr w:type="gramStart"/>
+      <w:r>
+        <w:rPr>
+          <w:rFonts w:ascii="Arial" w:eastAsia="Arial" w:hAnsi="Arial" w:cs="Arial"/>
+          <w:color w:val="000000"/>
+          <w:sz w:val="24"/>
+          <w:szCs w:val="24"/>
+        </w:rPr>
+        <w:t>case</w:t>
+      </w:r>
+      <w:proofErr w:type="gramEnd"/>
+      <w:r>
+        <w:rPr>
+          <w:rFonts w:ascii="Arial" w:eastAsia="Arial" w:hAnsi="Arial" w:cs="Arial"/>
+          <w:color w:val="000000"/>
+          <w:sz w:val="24"/>
+          <w:szCs w:val="24"/>
+        </w:rPr>
+        <w:t xml:space="preserve"> TL </w:t>
+      </w:r>
+      <w:proofErr w:type="gramStart"/>
+      <w:r>
+        <w:rPr>
+          <w:rFonts w:ascii="Arial" w:eastAsia="Arial" w:hAnsi="Arial" w:cs="Arial"/>
+          <w:color w:val="000000"/>
+          <w:sz w:val="24"/>
+          <w:szCs w:val="24"/>
+        </w:rPr>
+        <w:t>has to</w:t>
+      </w:r>
+      <w:proofErr w:type="gramEnd"/>
+      <w:r>
+        <w:rPr>
+          <w:rFonts w:ascii="Arial" w:eastAsia="Arial" w:hAnsi="Arial" w:cs="Arial"/>
+          <w:color w:val="000000"/>
+          <w:sz w:val="24"/>
+          <w:szCs w:val="24"/>
+        </w:rPr>
+        <w:t xml:space="preserve"> create an additional page for that member and then assign all tasks accordingly)</w:t>
       </w:r>
     </w:p>
     <w:p>
@@ -440,7 +480,47 @@
           <w:sz w:val="24"/>
           <w:szCs w:val="24"/>
         </w:rPr>
-        <w:t>Secrets Ownership: All GitHub secrets (DOCKERHUB_USERNAME, DOCKERHUB_TOKEN, RENDER_DEPLOY_HOOK_URL) must be created by the Team Lead using the TL's own Docker Hub and Render credentials. No team member other than the TL should create or modify secrets.</w:t>
+        <w:t xml:space="preserve">Secrets Ownership: All GitHub secrets (DOCKERHUB_USERNAME, DOCKERHUB_TOKEN, RENDER_DEPLOY_HOOK_URL) must be created by the Team Lead using </w:t>
+      </w:r>
+      <w:proofErr w:type="gramStart"/>
+      <w:r>
+        <w:rPr>
+          <w:rFonts w:ascii="Arial" w:eastAsia="Arial" w:hAnsi="Arial" w:cs="Arial"/>
+          <w:color w:val="000000"/>
+          <w:sz w:val="24"/>
+          <w:szCs w:val="24"/>
+        </w:rPr>
+        <w:t>the TL's</w:t>
+      </w:r>
+      <w:proofErr w:type="gramEnd"/>
+      <w:r>
+        <w:rPr>
+          <w:rFonts w:ascii="Arial" w:eastAsia="Arial" w:hAnsi="Arial" w:cs="Arial"/>
+          <w:color w:val="000000"/>
+          <w:sz w:val="24"/>
+          <w:szCs w:val="24"/>
+        </w:rPr>
+        <w:t xml:space="preserve"> own Docker Hub and Render credentials. No team member other than </w:t>
+      </w:r>
+      <w:proofErr w:type="gramStart"/>
+      <w:r>
+        <w:rPr>
+          <w:rFonts w:ascii="Arial" w:eastAsia="Arial" w:hAnsi="Arial" w:cs="Arial"/>
+          <w:color w:val="000000"/>
+          <w:sz w:val="24"/>
+          <w:szCs w:val="24"/>
+        </w:rPr>
+        <w:t>the TL</w:t>
+      </w:r>
+      <w:proofErr w:type="gramEnd"/>
+      <w:r>
+        <w:rPr>
+          <w:rFonts w:ascii="Arial" w:eastAsia="Arial" w:hAnsi="Arial" w:cs="Arial"/>
+          <w:color w:val="000000"/>
+          <w:sz w:val="24"/>
+          <w:szCs w:val="24"/>
+        </w:rPr>
+        <w:t xml:space="preserve"> should create or modify secrets.</w:t>
       </w:r>
     </w:p>
     <w:p>
@@ -463,7 +543,27 @@
           <w:sz w:val="24"/>
           <w:szCs w:val="24"/>
         </w:rPr>
-        <w:t>All deployments MUST be triggered via the GitHub Actions CD pipeline. Manual deployment on Render is NOT allowed after the initial service setup.</w:t>
+        <w:t xml:space="preserve">All deployments MUST be triggered via the GitHub Actions CD pipeline. Manual deployment </w:t>
+      </w:r>
+      <w:proofErr w:type="gramStart"/>
+      <w:r>
+        <w:rPr>
+          <w:rFonts w:ascii="Arial" w:eastAsia="Arial" w:hAnsi="Arial" w:cs="Arial"/>
+          <w:color w:val="000000"/>
+          <w:sz w:val="24"/>
+          <w:szCs w:val="24"/>
+        </w:rPr>
+        <w:t>on</w:t>
+      </w:r>
+      <w:proofErr w:type="gramEnd"/>
+      <w:r>
+        <w:rPr>
+          <w:rFonts w:ascii="Arial" w:eastAsia="Arial" w:hAnsi="Arial" w:cs="Arial"/>
+          <w:color w:val="000000"/>
+          <w:sz w:val="24"/>
+          <w:szCs w:val="24"/>
+        </w:rPr>
+        <w:t xml:space="preserve"> Render is NOT allowed after the initial service setup.</w:t>
       </w:r>
     </w:p>
     <w:p>
@@ -592,8 +692,9 @@
           <w:sz w:val="18"/>
           <w:szCs w:val="18"/>
         </w:rPr>
-        <w:t xml:space="preserve">Table 1: Group Details </w:t>
-      </w:r>
+        <w:t xml:space="preserve">Table 1: Group </w:t>
+      </w:r>
+      <w:proofErr w:type="gramStart"/>
       <w:r>
         <w:rPr>
           <w:rFonts w:ascii="Arial" w:eastAsia="Arial" w:hAnsi="Arial" w:cs="Arial"/>
@@ -603,7 +704,7 @@
           <w:sz w:val="18"/>
           <w:szCs w:val="18"/>
         </w:rPr>
-        <w:t>,</w:t>
+        <w:t xml:space="preserve">Details </w:t>
       </w:r>
       <w:r>
         <w:rPr>
@@ -614,7 +715,67 @@
           <w:sz w:val="18"/>
           <w:szCs w:val="18"/>
         </w:rPr>
-        <w:t xml:space="preserve"> Each student must fill their own row (including Assigned Page) in the versioned copy inside the repo</w:t>
+        <w:t>,</w:t>
+      </w:r>
+      <w:proofErr w:type="gramEnd"/>
+      <w:r>
+        <w:rPr>
+          <w:rFonts w:ascii="Arial" w:eastAsia="Arial" w:hAnsi="Arial" w:cs="Arial"/>
+          <w:b/>
+          <w:bCs/>
+          <w:color w:val="444444"/>
+          <w:sz w:val="18"/>
+          <w:szCs w:val="18"/>
+        </w:rPr>
+        <w:t xml:space="preserve"> </w:t>
+      </w:r>
+      <w:proofErr w:type="gramStart"/>
+      <w:r>
+        <w:rPr>
+          <w:rFonts w:ascii="Arial" w:eastAsia="Arial" w:hAnsi="Arial" w:cs="Arial"/>
+          <w:b/>
+          <w:bCs/>
+          <w:color w:val="444444"/>
+          <w:sz w:val="18"/>
+          <w:szCs w:val="18"/>
+        </w:rPr>
+        <w:t>Each</w:t>
+      </w:r>
+      <w:proofErr w:type="gramEnd"/>
+      <w:r>
+        <w:rPr>
+          <w:rFonts w:ascii="Arial" w:eastAsia="Arial" w:hAnsi="Arial" w:cs="Arial"/>
+          <w:b/>
+          <w:bCs/>
+          <w:color w:val="444444"/>
+          <w:sz w:val="18"/>
+          <w:szCs w:val="18"/>
+        </w:rPr>
+        <w:t xml:space="preserve"> student must fill their own row (including Assigned Page) in the </w:t>
+      </w:r>
+      <w:proofErr w:type="gramStart"/>
+      <w:r>
+        <w:rPr>
+          <w:rFonts w:ascii="Arial" w:eastAsia="Arial" w:hAnsi="Arial" w:cs="Arial"/>
+          <w:b/>
+          <w:bCs/>
+          <w:color w:val="444444"/>
+          <w:sz w:val="18"/>
+          <w:szCs w:val="18"/>
+        </w:rPr>
+        <w:t>versioned</w:t>
+      </w:r>
+      <w:proofErr w:type="gramEnd"/>
+      <w:r>
+        <w:rPr>
+          <w:rFonts w:ascii="Arial" w:eastAsia="Arial" w:hAnsi="Arial" w:cs="Arial"/>
+          <w:b/>
+          <w:bCs/>
+          <w:color w:val="444444"/>
+          <w:sz w:val="18"/>
+          <w:szCs w:val="18"/>
+        </w:rPr>
+        <w:t xml:space="preserve"> copy inside the repo</w:t>
       </w:r>
     </w:p>
     <w:tbl>
@@ -635,13 +796,13 @@
         <w:tblLook w:val="0000" w:firstRow="0" w:lastRow="0" w:firstColumn="0" w:lastColumn="0" w:noHBand="0" w:noVBand="0"/>
       </w:tblPr>
       <w:tblGrid>
-        <w:gridCol w:w="471"/>
-        <w:gridCol w:w="1202"/>
-        <w:gridCol w:w="1425"/>
-        <w:gridCol w:w="1561"/>
-        <w:gridCol w:w="1205"/>
-        <w:gridCol w:w="1980"/>
-        <w:gridCol w:w="1516"/>
+        <w:gridCol w:w="468"/>
+        <w:gridCol w:w="1231"/>
+        <w:gridCol w:w="1876"/>
+        <w:gridCol w:w="1540"/>
+        <w:gridCol w:w="1128"/>
+        <w:gridCol w:w="2477"/>
+        <w:gridCol w:w="1344"/>
       </w:tblGrid>
       <w:tr>
         <w:trPr>
@@ -1073,11 +1234,7 @@
             </w:tcMar>
             <w:vAlign w:val="center"/>
           </w:tcPr>
-          <w:p>
-            <w:r>
-              <w:t>Abdul Mateen</w:t>
-            </w:r>
-          </w:p>
+          <w:p/>
         </w:tc>
         <w:tc>
           <w:tcPr>
@@ -1097,11 +1254,7 @@
             </w:tcMar>
             <w:vAlign w:val="center"/>
           </w:tcPr>
-          <w:p>
-            <w:r>
-              <w:t>Abdulmateen-67</w:t>
-            </w:r>
-          </w:p>
+          <w:p/>
         </w:tc>
         <w:tc>
           <w:tcPr>
@@ -1121,11 +1274,7 @@
             </w:tcMar>
             <w:vAlign w:val="center"/>
           </w:tcPr>
-          <w:p>
-            <w:r>
-              <w:t>Member</w:t>
-            </w:r>
-          </w:p>
+          <w:p/>
         </w:tc>
         <w:tc>
           <w:tcPr>
@@ -1145,11 +1294,7 @@
             </w:tcMar>
             <w:vAlign w:val="center"/>
           </w:tcPr>
-          <w:p>
-            <w:r>
-              <w:t>Add-task.html</w:t>
-            </w:r>
-          </w:p>
+          <w:p/>
         </w:tc>
         <w:tc>
           <w:tcPr>
@@ -1169,11 +1314,7 @@
             </w:tcMar>
             <w:vAlign w:val="center"/>
           </w:tcPr>
-          <w:p>
-            <w:r>
-              <w:t>feature/abdulmateen-67/add-task</w:t>
-            </w:r>
-          </w:p>
+          <w:p/>
         </w:tc>
         <w:tc>
           <w:tcPr>
@@ -1193,11 +1334,7 @@
             </w:tcMar>
             <w:vAlign w:val="center"/>
           </w:tcPr>
-          <w:p>
-            <w:r>
-              <w:t>Yes</w:t>
-            </w:r>
-          </w:p>
+          <w:p/>
         </w:tc>
       </w:tr>
       <w:tr>
@@ -1401,7 +1538,11 @@
             </w:tcMar>
             <w:vAlign w:val="center"/>
           </w:tcPr>
-          <w:p/>
+          <w:p>
+            <w:r>
+              <w:t>Muhammad Asfand Yar Haider</w:t>
+            </w:r>
+          </w:p>
         </w:tc>
         <w:tc>
           <w:tcPr>
@@ -1421,7 +1562,11 @@
             </w:tcMar>
             <w:vAlign w:val="center"/>
           </w:tcPr>
-          <w:p/>
+          <w:p>
+            <w:r>
+              <w:t>m-a-y-h</w:t>
+            </w:r>
+          </w:p>
         </w:tc>
         <w:tc>
           <w:tcPr>
@@ -1441,7 +1586,11 @@
             </w:tcMar>
             <w:vAlign w:val="center"/>
           </w:tcPr>
-          <w:p/>
+          <w:p>
+            <w:r>
+              <w:t>Member</w:t>
+            </w:r>
+          </w:p>
         </w:tc>
         <w:tc>
           <w:tcPr>
@@ -1461,7 +1610,11 @@
             </w:tcMar>
             <w:vAlign w:val="center"/>
           </w:tcPr>
-          <w:p/>
+          <w:p>
+            <w:r>
+              <w:t>task-detail.html</w:t>
+            </w:r>
+          </w:p>
         </w:tc>
         <w:tc>
           <w:tcPr>
@@ -1481,7 +1634,11 @@
             </w:tcMar>
             <w:vAlign w:val="center"/>
           </w:tcPr>
-          <w:p/>
+          <w:p>
+            <w:r>
+              <w:t>feature/m-a-y-h/task-detail</w:t>
+            </w:r>
+          </w:p>
         </w:tc>
         <w:tc>
           <w:tcPr>
@@ -1501,7 +1658,11 @@
             </w:tcMar>
             <w:vAlign w:val="center"/>
           </w:tcPr>
-          <w:p/>
+          <w:p>
+            <w:r>
+              <w:t>Yes</w:t>
+            </w:r>
+          </w:p>
         </w:tc>
       </w:tr>
       <w:tr>
@@ -1553,7 +1714,11 @@
             </w:tcMar>
             <w:vAlign w:val="center"/>
           </w:tcPr>
-          <w:p/>
+          <w:p>
+            <w:r>
+              <w:t>Muhammad Ahmad</w:t>
+            </w:r>
+          </w:p>
         </w:tc>
         <w:tc>
           <w:tcPr>
@@ -1573,7 +1738,11 @@
             </w:tcMar>
             <w:vAlign w:val="center"/>
           </w:tcPr>
-          <w:p/>
+          <w:p>
+            <w:r>
+              <w:t>MuhammadAhmad-n17</w:t>
+            </w:r>
+          </w:p>
         </w:tc>
         <w:tc>
           <w:tcPr>
@@ -1593,7 +1762,11 @@
             </w:tcMar>
             <w:vAlign w:val="center"/>
           </w:tcPr>
-          <w:p/>
+          <w:p>
+            <w:r>
+              <w:t>Member</w:t>
+            </w:r>
+          </w:p>
         </w:tc>
         <w:tc>
           <w:tcPr>
@@ -1613,7 +1786,11 @@
             </w:tcMar>
             <w:vAlign w:val="center"/>
           </w:tcPr>
-          <w:p/>
+          <w:p>
+            <w:r>
+              <w:t>about.html</w:t>
+            </w:r>
+          </w:p>
         </w:tc>
         <w:tc>
           <w:tcPr>
@@ -1633,7 +1810,11 @@
             </w:tcMar>
             <w:vAlign w:val="center"/>
           </w:tcPr>
-          <w:p/>
+          <w:p>
+            <w:r>
+              <w:t>feature/MuhammadAhmad-n17/about</w:t>
+            </w:r>
+          </w:p>
         </w:tc>
         <w:tc>
           <w:tcPr>
@@ -1653,7 +1834,11 @@
             </w:tcMar>
             <w:vAlign w:val="center"/>
           </w:tcPr>
-          <w:p/>
+          <w:p>
+            <w:r>
+              <w:t>Yes</w:t>
+            </w:r>
+          </w:p>
         </w:tc>
       </w:tr>
     </w:tbl>
@@ -1715,7 +1900,23 @@
           <w:rFonts w:ascii="Arial" w:eastAsia="Arial" w:hAnsi="Arial" w:cs="Arial"/>
           <w:color w:val="555555"/>
         </w:rPr>
-        <w:t>[Paste Your Render Live URL Here]</w:t>
+        <w:t xml:space="preserve">[Paste </w:t>
+      </w:r>
+      <w:proofErr w:type="gramStart"/>
+      <w:r>
+        <w:rPr>
+          <w:rFonts w:ascii="Arial" w:eastAsia="Arial" w:hAnsi="Arial" w:cs="Arial"/>
+          <w:color w:val="555555"/>
+        </w:rPr>
+        <w:t>Your Render</w:t>
+      </w:r>
+      <w:proofErr w:type="gramEnd"/>
+      <w:r>
+        <w:rPr>
+          <w:rFonts w:ascii="Arial" w:eastAsia="Arial" w:hAnsi="Arial" w:cs="Arial"/>
+          <w:color w:val="555555"/>
+        </w:rPr>
+        <w:t xml:space="preserve"> Live URL Here]</w:t>
       </w:r>
     </w:p>
     <w:p>
@@ -2198,7 +2399,17 @@
                 <w:sz w:val="18"/>
                 <w:szCs w:val="18"/>
               </w:rPr>
-              <w:t xml:space="preserve">An HTML form allowing the user to enter a new task </w:t>
+              <w:t xml:space="preserve">An HTML form allowing the user to enter a new </w:t>
+            </w:r>
+            <w:proofErr w:type="gramStart"/>
+            <w:r>
+              <w:rPr>
+                <w:rFonts w:ascii="Arial" w:eastAsia="Arial" w:hAnsi="Arial" w:cs="Arial"/>
+                <w:color w:val="000000"/>
+                <w:sz w:val="18"/>
+                <w:szCs w:val="18"/>
+              </w:rPr>
+              <w:t xml:space="preserve">task </w:t>
             </w:r>
             <w:r>
               <w:rPr>
@@ -2209,6 +2420,7 @@
               </w:rPr>
               <w:t>,</w:t>
             </w:r>
+            <w:proofErr w:type="gramEnd"/>
             <w:r>
               <w:rPr>
                 <w:rFonts w:ascii="Arial" w:eastAsia="Arial" w:hAnsi="Arial" w:cs="Arial"/>
@@ -2649,7 +2861,23 @@
           <w:rFonts w:ascii="Arial" w:eastAsia="Arial" w:hAnsi="Arial" w:cs="Arial"/>
           <w:color w:val="000000"/>
         </w:rPr>
-        <w:t xml:space="preserve"> using the naming convention: feature/&lt;member-github-username&gt;/&lt;page-name&gt;  (e.g., feature/ali-hassan/add-task).</w:t>
+        <w:t xml:space="preserve"> using the naming convention: feature/&lt;member-github-username&gt;/&lt;page-name</w:t>
+      </w:r>
+      <w:proofErr w:type="gramStart"/>
+      <w:r>
+        <w:rPr>
+          <w:rFonts w:ascii="Arial" w:eastAsia="Arial" w:hAnsi="Arial" w:cs="Arial"/>
+          <w:color w:val="000000"/>
+        </w:rPr>
+        <w:t>&gt;  (</w:t>
+      </w:r>
+      <w:proofErr w:type="gramEnd"/>
+      <w:r>
+        <w:rPr>
+          <w:rFonts w:ascii="Arial" w:eastAsia="Arial" w:hAnsi="Arial" w:cs="Arial"/>
+          <w:color w:val="000000"/>
+        </w:rPr>
+        <w:t>e.g., feature/ali-hassan/add-task).</w:t>
       </w:r>
     </w:p>
     <w:p>
@@ -2731,7 +2959,23 @@
           <w:rFonts w:ascii="Arial" w:eastAsia="Arial" w:hAnsi="Arial" w:cs="Arial"/>
           <w:color w:val="000000"/>
         </w:rPr>
-        <w:t xml:space="preserve">Once CI passes and the PR is reviewed and approved, the Team Lead merges the PR. The merge generates a push event on </w:t>
+        <w:t xml:space="preserve">Once CI passes and the PR is reviewed and approved, the Team Lead </w:t>
+      </w:r>
+      <w:proofErr w:type="gramStart"/>
+      <w:r>
+        <w:rPr>
+          <w:rFonts w:ascii="Arial" w:eastAsia="Arial" w:hAnsi="Arial" w:cs="Arial"/>
+          <w:color w:val="000000"/>
+        </w:rPr>
+        <w:t>merges</w:t>
+      </w:r>
+      <w:proofErr w:type="gramEnd"/>
+      <w:r>
+        <w:rPr>
+          <w:rFonts w:ascii="Arial" w:eastAsia="Arial" w:hAnsi="Arial" w:cs="Arial"/>
+          <w:color w:val="000000"/>
+        </w:rPr>
+        <w:t xml:space="preserve"> the PR. The merge generates a push event on </w:t>
       </w:r>
       <w:r>
         <w:rPr>
@@ -2814,7 +3058,23 @@
           <w:rFonts w:ascii="Arial" w:eastAsia="Arial" w:hAnsi="Arial" w:cs="Arial"/>
           <w:color w:val="000000"/>
         </w:rPr>
-        <w:t>The Team Lead must complete the following setup steps before the team starts working:</w:t>
+        <w:t xml:space="preserve">The Team Lead must complete the </w:t>
+      </w:r>
+      <w:proofErr w:type="gramStart"/>
+      <w:r>
+        <w:rPr>
+          <w:rFonts w:ascii="Arial" w:eastAsia="Arial" w:hAnsi="Arial" w:cs="Arial"/>
+          <w:color w:val="000000"/>
+        </w:rPr>
+        <w:t>following setup</w:t>
+      </w:r>
+      <w:proofErr w:type="gramEnd"/>
+      <w:r>
+        <w:rPr>
+          <w:rFonts w:ascii="Arial" w:eastAsia="Arial" w:hAnsi="Arial" w:cs="Arial"/>
+          <w:color w:val="000000"/>
+        </w:rPr>
+        <w:t xml:space="preserve"> steps before the team starts working:</w:t>
       </w:r>
     </w:p>
     <w:p>
@@ -2910,7 +3170,23 @@
           <w:rFonts w:ascii="Arial" w:eastAsia="Arial" w:hAnsi="Arial" w:cs="Arial"/>
           <w:color w:val="000000"/>
         </w:rPr>
-        <w:t>Team Lead: Sign up on Render (render.com), create a new Web Service connected to the Docker Hub image repository, and copy the deploy hook URL from the Render service settings. This URL will be stored as the RENDER_DEPLOY_HOOK_URL secret.</w:t>
+        <w:t xml:space="preserve">Team Lead: Sign up </w:t>
+      </w:r>
+      <w:proofErr w:type="gramStart"/>
+      <w:r>
+        <w:rPr>
+          <w:rFonts w:ascii="Arial" w:eastAsia="Arial" w:hAnsi="Arial" w:cs="Arial"/>
+          <w:color w:val="000000"/>
+        </w:rPr>
+        <w:t>on</w:t>
+      </w:r>
+      <w:proofErr w:type="gramEnd"/>
+      <w:r>
+        <w:rPr>
+          <w:rFonts w:ascii="Arial" w:eastAsia="Arial" w:hAnsi="Arial" w:cs="Arial"/>
+          <w:color w:val="000000"/>
+        </w:rPr>
+        <w:t xml:space="preserve"> Render (render.com), create a new Web Service connected to the Docker Hub image repository, and copy the deploy hook URL from the Render service settings. This URL will be stored as the RENDER_DEPLOY_HOOK_URL secret.</w:t>
       </w:r>
     </w:p>
     <w:p>
@@ -3116,7 +3392,17 @@
                 <w:sz w:val="18"/>
                 <w:szCs w:val="18"/>
               </w:rPr>
-              <w:t xml:space="preserve">Home / Dashboard page </w:t>
+              <w:t xml:space="preserve">Home / Dashboard </w:t>
+            </w:r>
+            <w:proofErr w:type="gramStart"/>
+            <w:r>
+              <w:rPr>
+                <w:rFonts w:ascii="Arial" w:eastAsia="Arial" w:hAnsi="Arial" w:cs="Arial"/>
+                <w:color w:val="000000"/>
+                <w:sz w:val="18"/>
+                <w:szCs w:val="18"/>
+              </w:rPr>
+              <w:t xml:space="preserve">page </w:t>
             </w:r>
             <w:r>
               <w:rPr>
@@ -3127,6 +3413,7 @@
               </w:rPr>
               <w:t>,</w:t>
             </w:r>
+            <w:proofErr w:type="gramEnd"/>
             <w:r>
               <w:rPr>
                 <w:rFonts w:ascii="Arial" w:eastAsia="Arial" w:hAnsi="Arial" w:cs="Arial"/>
@@ -3198,7 +3485,17 @@
                 <w:sz w:val="18"/>
                 <w:szCs w:val="18"/>
               </w:rPr>
-              <w:t xml:space="preserve">Add Task page </w:t>
+              <w:t xml:space="preserve">Add Task </w:t>
+            </w:r>
+            <w:proofErr w:type="gramStart"/>
+            <w:r>
+              <w:rPr>
+                <w:rFonts w:ascii="Arial" w:eastAsia="Arial" w:hAnsi="Arial" w:cs="Arial"/>
+                <w:color w:val="000000"/>
+                <w:sz w:val="18"/>
+                <w:szCs w:val="18"/>
+              </w:rPr>
+              <w:t xml:space="preserve">page </w:t>
             </w:r>
             <w:r>
               <w:rPr>
@@ -3209,6 +3506,7 @@
               </w:rPr>
               <w:t>,</w:t>
             </w:r>
+            <w:proofErr w:type="gramEnd"/>
             <w:r>
               <w:rPr>
                 <w:rFonts w:ascii="Arial" w:eastAsia="Arial" w:hAnsi="Arial" w:cs="Arial"/>
@@ -3280,7 +3578,17 @@
                 <w:sz w:val="18"/>
                 <w:szCs w:val="18"/>
               </w:rPr>
-              <w:t xml:space="preserve">Task List page </w:t>
+              <w:t xml:space="preserve">Task List </w:t>
+            </w:r>
+            <w:proofErr w:type="gramStart"/>
+            <w:r>
+              <w:rPr>
+                <w:rFonts w:ascii="Arial" w:eastAsia="Arial" w:hAnsi="Arial" w:cs="Arial"/>
+                <w:color w:val="000000"/>
+                <w:sz w:val="18"/>
+                <w:szCs w:val="18"/>
+              </w:rPr>
+              <w:t xml:space="preserve">page </w:t>
             </w:r>
             <w:r>
               <w:rPr>
@@ -3291,6 +3599,7 @@
               </w:rPr>
               <w:t>,</w:t>
             </w:r>
+            <w:proofErr w:type="gramEnd"/>
             <w:r>
               <w:rPr>
                 <w:rFonts w:ascii="Arial" w:eastAsia="Arial" w:hAnsi="Arial" w:cs="Arial"/>
@@ -3362,7 +3671,17 @@
                 <w:sz w:val="18"/>
                 <w:szCs w:val="18"/>
               </w:rPr>
-              <w:t xml:space="preserve">Task Detail page </w:t>
+              <w:t xml:space="preserve">Task Detail </w:t>
+            </w:r>
+            <w:proofErr w:type="gramStart"/>
+            <w:r>
+              <w:rPr>
+                <w:rFonts w:ascii="Arial" w:eastAsia="Arial" w:hAnsi="Arial" w:cs="Arial"/>
+                <w:color w:val="000000"/>
+                <w:sz w:val="18"/>
+                <w:szCs w:val="18"/>
+              </w:rPr>
+              <w:t xml:space="preserve">page </w:t>
             </w:r>
             <w:r>
               <w:rPr>
@@ -3373,6 +3692,7 @@
               </w:rPr>
               <w:t>,</w:t>
             </w:r>
+            <w:proofErr w:type="gramEnd"/>
             <w:r>
               <w:rPr>
                 <w:rFonts w:ascii="Arial" w:eastAsia="Arial" w:hAnsi="Arial" w:cs="Arial"/>
@@ -3444,7 +3764,17 @@
                 <w:sz w:val="18"/>
                 <w:szCs w:val="18"/>
               </w:rPr>
-              <w:t xml:space="preserve">About / Help page </w:t>
+              <w:t xml:space="preserve">About / Help </w:t>
+            </w:r>
+            <w:proofErr w:type="gramStart"/>
+            <w:r>
+              <w:rPr>
+                <w:rFonts w:ascii="Arial" w:eastAsia="Arial" w:hAnsi="Arial" w:cs="Arial"/>
+                <w:color w:val="000000"/>
+                <w:sz w:val="18"/>
+                <w:szCs w:val="18"/>
+              </w:rPr>
+              <w:t xml:space="preserve">page </w:t>
             </w:r>
             <w:r>
               <w:rPr>
@@ -3455,6 +3785,7 @@
               </w:rPr>
               <w:t>,</w:t>
             </w:r>
+            <w:proofErr w:type="gramEnd"/>
             <w:r>
               <w:rPr>
                 <w:rFonts w:ascii="Arial" w:eastAsia="Arial" w:hAnsi="Arial" w:cs="Arial"/>
@@ -3526,7 +3857,17 @@
                 <w:sz w:val="18"/>
                 <w:szCs w:val="18"/>
               </w:rPr>
-              <w:t xml:space="preserve">Shared stylesheet </w:t>
+              <w:t xml:space="preserve">Shared </w:t>
+            </w:r>
+            <w:proofErr w:type="gramStart"/>
+            <w:r>
+              <w:rPr>
+                <w:rFonts w:ascii="Arial" w:eastAsia="Arial" w:hAnsi="Arial" w:cs="Arial"/>
+                <w:color w:val="000000"/>
+                <w:sz w:val="18"/>
+                <w:szCs w:val="18"/>
+              </w:rPr>
+              <w:t xml:space="preserve">stylesheet </w:t>
             </w:r>
             <w:r>
               <w:rPr>
@@ -3537,6 +3878,7 @@
               </w:rPr>
               <w:t>,</w:t>
             </w:r>
+            <w:proofErr w:type="gramEnd"/>
             <w:r>
               <w:rPr>
                 <w:rFonts w:ascii="Arial" w:eastAsia="Arial" w:hAnsi="Arial" w:cs="Arial"/>
@@ -3859,7 +4201,31 @@
           <w:rFonts w:ascii="Arial" w:eastAsia="Arial" w:hAnsi="Arial" w:cs="Arial"/>
           <w:color w:val="000000"/>
         </w:rPr>
-        <w:t xml:space="preserve">The Team Lead (TL) is responsible for creating all secrets listed below. The TL is the repository admin and the credentials in use </w:t>
+        <w:t xml:space="preserve">The Team Lead (TL) is responsible for creating all secrets listed below. </w:t>
+      </w:r>
+      <w:proofErr w:type="gramStart"/>
+      <w:r>
+        <w:rPr>
+          <w:rFonts w:ascii="Arial" w:eastAsia="Arial" w:hAnsi="Arial" w:cs="Arial"/>
+          <w:color w:val="000000"/>
+        </w:rPr>
+        <w:t>The TL</w:t>
+      </w:r>
+      <w:proofErr w:type="gramEnd"/>
+      <w:r>
+        <w:rPr>
+          <w:rFonts w:ascii="Arial" w:eastAsia="Arial" w:hAnsi="Arial" w:cs="Arial"/>
+          <w:color w:val="000000"/>
+        </w:rPr>
+        <w:t xml:space="preserve"> is the repository admin and the credentials in </w:t>
+      </w:r>
+      <w:proofErr w:type="gramStart"/>
+      <w:r>
+        <w:rPr>
+          <w:rFonts w:ascii="Arial" w:eastAsia="Arial" w:hAnsi="Arial" w:cs="Arial"/>
+          <w:color w:val="000000"/>
+        </w:rPr>
+        <w:t xml:space="preserve">use </w:t>
       </w:r>
       <w:r>
         <w:rPr>
@@ -3868,12 +4234,21 @@
         </w:rPr>
         <w:t>,</w:t>
       </w:r>
-      <w:r>
-        <w:rPr>
-          <w:rFonts w:ascii="Arial" w:eastAsia="Arial" w:hAnsi="Arial" w:cs="Arial"/>
-          <w:color w:val="000000"/>
-        </w:rPr>
-        <w:t xml:space="preserve"> Docker Hub and Render </w:t>
+      <w:proofErr w:type="gramEnd"/>
+      <w:r>
+        <w:rPr>
+          <w:rFonts w:ascii="Arial" w:eastAsia="Arial" w:hAnsi="Arial" w:cs="Arial"/>
+          <w:color w:val="000000"/>
+        </w:rPr>
+        <w:t xml:space="preserve"> Docker Hub and </w:t>
+      </w:r>
+      <w:proofErr w:type="gramStart"/>
+      <w:r>
+        <w:rPr>
+          <w:rFonts w:ascii="Arial" w:eastAsia="Arial" w:hAnsi="Arial" w:cs="Arial"/>
+          <w:color w:val="000000"/>
+        </w:rPr>
+        <w:t xml:space="preserve">Render </w:t>
       </w:r>
       <w:r>
         <w:rPr>
@@ -3882,6 +4257,7 @@
         </w:rPr>
         <w:t>,</w:t>
       </w:r>
+      <w:proofErr w:type="gramEnd"/>
       <w:r>
         <w:rPr>
           <w:rFonts w:ascii="Arial" w:eastAsia="Arial" w:hAnsi="Arial" w:cs="Arial"/>
@@ -4298,7 +4674,17 @@
                 <w:sz w:val="18"/>
                 <w:szCs w:val="18"/>
               </w:rPr>
-              <w:t xml:space="preserve">Team Lead's Docker Hub Personal Access Token (PAT) </w:t>
+              <w:t>Team Lead's Docker Hub Personal Access Token (PAT</w:t>
+            </w:r>
+            <w:proofErr w:type="gramStart"/>
+            <w:r>
+              <w:rPr>
+                <w:rFonts w:ascii="Arial" w:eastAsia="Arial" w:hAnsi="Arial" w:cs="Arial"/>
+                <w:color w:val="000000"/>
+                <w:sz w:val="18"/>
+                <w:szCs w:val="18"/>
+              </w:rPr>
+              <w:t xml:space="preserve">) </w:t>
             </w:r>
             <w:r>
               <w:rPr>
@@ -4309,6 +4695,7 @@
               </w:rPr>
               <w:t>,</w:t>
             </w:r>
+            <w:proofErr w:type="gramEnd"/>
             <w:r>
               <w:rPr>
                 <w:rFonts w:ascii="Arial" w:eastAsia="Arial" w:hAnsi="Arial" w:cs="Arial"/>
@@ -4433,7 +4820,27 @@
           <w:sz w:val="18"/>
           <w:szCs w:val="18"/>
         </w:rPr>
-        <w:t xml:space="preserve">All three secrets must be created by the Team Lead, as the TL is the repository admin and the credentials belong to them. DOCKERHUB_USERNAME and DOCKERHUB_TOKEN must be the Team Lead's own Docker Hub credentials, added as repository-level secrets (Settings → Secrets and variables → Actions → Repository secrets). RENDER_DEPLOY_HOOK_URL is obtained from the Render web service set up by the Team Lead and must be added as an environment-level secret inside the </w:t>
+        <w:t xml:space="preserve">All three secrets must be created by the Team Lead, as </w:t>
+      </w:r>
+      <w:proofErr w:type="gramStart"/>
+      <w:r>
+        <w:rPr>
+          <w:rFonts w:ascii="Arial" w:eastAsia="Arial" w:hAnsi="Arial" w:cs="Arial"/>
+          <w:color w:val="555555"/>
+          <w:sz w:val="18"/>
+          <w:szCs w:val="18"/>
+        </w:rPr>
+        <w:t>the TL</w:t>
+      </w:r>
+      <w:proofErr w:type="gramEnd"/>
+      <w:r>
+        <w:rPr>
+          <w:rFonts w:ascii="Arial" w:eastAsia="Arial" w:hAnsi="Arial" w:cs="Arial"/>
+          <w:color w:val="555555"/>
+          <w:sz w:val="18"/>
+          <w:szCs w:val="18"/>
+        </w:rPr>
+        <w:t xml:space="preserve"> is the repository admin and the credentials belong to them. DOCKERHUB_USERNAME and DOCKERHUB_TOKEN must be the Team Lead's own Docker Hub credentials, added as repository-level secrets (Settings → Secrets and variables → Actions → Repository secrets). RENDER_DEPLOY_HOOK_URL is obtained from the Render web service set up by the Team Lead and must be added as an environment-level secret inside the </w:t>
       </w:r>
       <w:r>
         <w:rPr>
@@ -4475,7 +4882,31 @@
           <w:sz w:val="28"/>
           <w:szCs w:val="28"/>
         </w:rPr>
-        <w:t>CI PIPELINE REQUIREMENTS  (.github/workflows/ci.yml)</w:t>
+        <w:t xml:space="preserve">CI PIPELINE </w:t>
+      </w:r>
+      <w:proofErr w:type="gramStart"/>
+      <w:r>
+        <w:rPr>
+          <w:rFonts w:ascii="Arial" w:eastAsia="Arial" w:hAnsi="Arial" w:cs="Arial"/>
+          <w:b/>
+          <w:bCs/>
+          <w:color w:val="1F3864"/>
+          <w:sz w:val="28"/>
+          <w:szCs w:val="28"/>
+        </w:rPr>
+        <w:t>REQUIREMENTS  (</w:t>
+      </w:r>
+      <w:proofErr w:type="gramEnd"/>
+      <w:r>
+        <w:rPr>
+          <w:rFonts w:ascii="Arial" w:eastAsia="Arial" w:hAnsi="Arial" w:cs="Arial"/>
+          <w:b/>
+          <w:bCs/>
+          <w:color w:val="1F3864"/>
+          <w:sz w:val="28"/>
+          <w:szCs w:val="28"/>
+        </w:rPr>
+        <w:t>.github/workflows/ci.yml)</w:t>
       </w:r>
     </w:p>
     <w:p>
@@ -4594,7 +5025,15 @@
           <w:rFonts w:ascii="Arial" w:eastAsia="Arial" w:hAnsi="Arial" w:cs="Arial"/>
           <w:color w:val="000000"/>
         </w:rPr>
-        <w:t xml:space="preserve">Step 4 – Tag Image: Tag the image using a meaningful strategy </w:t>
+        <w:t xml:space="preserve">Step 4 – Tag Image: Tag the image using a meaningful </w:t>
+      </w:r>
+      <w:proofErr w:type="gramStart"/>
+      <w:r>
+        <w:rPr>
+          <w:rFonts w:ascii="Arial" w:eastAsia="Arial" w:hAnsi="Arial" w:cs="Arial"/>
+          <w:color w:val="000000"/>
+        </w:rPr>
+        <w:t xml:space="preserve">strategy </w:t>
       </w:r>
       <w:r>
         <w:rPr>
@@ -4603,6 +5042,7 @@
         </w:rPr>
         <w:t>,</w:t>
       </w:r>
+      <w:proofErr w:type="gramEnd"/>
       <w:r>
         <w:rPr>
           <w:rFonts w:ascii="Arial" w:eastAsia="Arial" w:hAnsi="Arial" w:cs="Arial"/>
@@ -4716,7 +5156,31 @@
           <w:sz w:val="28"/>
           <w:szCs w:val="28"/>
         </w:rPr>
-        <w:t>CD PIPELINE REQUIREMENTS  (.github/workflows/cd.yml)</w:t>
+        <w:t xml:space="preserve">CD PIPELINE </w:t>
+      </w:r>
+      <w:proofErr w:type="gramStart"/>
+      <w:r>
+        <w:rPr>
+          <w:rFonts w:ascii="Arial" w:eastAsia="Arial" w:hAnsi="Arial" w:cs="Arial"/>
+          <w:b/>
+          <w:bCs/>
+          <w:color w:val="1F3864"/>
+          <w:sz w:val="28"/>
+          <w:szCs w:val="28"/>
+        </w:rPr>
+        <w:t>REQUIREMENTS  (</w:t>
+      </w:r>
+      <w:proofErr w:type="gramEnd"/>
+      <w:r>
+        <w:rPr>
+          <w:rFonts w:ascii="Arial" w:eastAsia="Arial" w:hAnsi="Arial" w:cs="Arial"/>
+          <w:b/>
+          <w:bCs/>
+          <w:color w:val="1F3864"/>
+          <w:sz w:val="28"/>
+          <w:szCs w:val="28"/>
+        </w:rPr>
+        <w:t>.github/workflows/cd.yml)</w:t>
       </w:r>
     </w:p>
     <w:p>
@@ -4836,7 +5300,23 @@
           <w:rFonts w:ascii="Arial" w:eastAsia="Arial" w:hAnsi="Arial" w:cs="Arial"/>
           <w:color w:val="000000"/>
         </w:rPr>
-        <w:t>Step 3 – Deploy: Send an HTTP POST request to the Render deploy hook URL using curl:</w:t>
+        <w:t xml:space="preserve">Step 3 – Deploy: Send an HTTP POST request to the Render </w:t>
+      </w:r>
+      <w:proofErr w:type="gramStart"/>
+      <w:r>
+        <w:rPr>
+          <w:rFonts w:ascii="Arial" w:eastAsia="Arial" w:hAnsi="Arial" w:cs="Arial"/>
+          <w:color w:val="000000"/>
+        </w:rPr>
+        <w:t>deploy</w:t>
+      </w:r>
+      <w:proofErr w:type="gramEnd"/>
+      <w:r>
+        <w:rPr>
+          <w:rFonts w:ascii="Arial" w:eastAsia="Arial" w:hAnsi="Arial" w:cs="Arial"/>
+          <w:color w:val="000000"/>
+        </w:rPr>
+        <w:t xml:space="preserve"> hook URL using curl:</w:t>
       </w:r>
     </w:p>
     <w:p>
@@ -4854,7 +5334,43 @@
           <w:sz w:val="19"/>
           <w:szCs w:val="19"/>
         </w:rPr>
-        <w:t>curl -X POST ${{ secrets.RENDER_DEPLOY_HOOK_URL }}</w:t>
+        <w:t>curl -X POST $</w:t>
+      </w:r>
+      <w:proofErr w:type="gramStart"/>
+      <w:r>
+        <w:rPr>
+          <w:rFonts w:ascii="Arial" w:eastAsia="Arial" w:hAnsi="Arial" w:cs="Arial"/>
+          <w:sz w:val="19"/>
+          <w:szCs w:val="19"/>
+        </w:rPr>
+        <w:t>{{ secrets</w:t>
+      </w:r>
+      <w:proofErr w:type="gramEnd"/>
+      <w:r>
+        <w:rPr>
+          <w:rFonts w:ascii="Arial" w:eastAsia="Arial" w:hAnsi="Arial" w:cs="Arial"/>
+          <w:sz w:val="19"/>
+          <w:szCs w:val="19"/>
+        </w:rPr>
+        <w:t>.RENDER_DEPLOY_HOOK_</w:t>
+      </w:r>
+      <w:proofErr w:type="gramStart"/>
+      <w:r>
+        <w:rPr>
+          <w:rFonts w:ascii="Arial" w:eastAsia="Arial" w:hAnsi="Arial" w:cs="Arial"/>
+          <w:sz w:val="19"/>
+          <w:szCs w:val="19"/>
+        </w:rPr>
+        <w:t>URL }</w:t>
+      </w:r>
+      <w:proofErr w:type="gramEnd"/>
+      <w:r>
+        <w:rPr>
+          <w:rFonts w:ascii="Arial" w:eastAsia="Arial" w:hAnsi="Arial" w:cs="Arial"/>
+          <w:sz w:val="19"/>
+          <w:szCs w:val="19"/>
+        </w:rPr>
+        <w:t>}</w:t>
       </w:r>
     </w:p>
     <w:p>
@@ -4906,7 +5422,23 @@
           <w:rFonts w:ascii="Arial" w:eastAsia="Arial" w:hAnsi="Arial" w:cs="Arial"/>
           <w:color w:val="000000"/>
         </w:rPr>
-        <w:t>The CD workflow file must declare runs-on: ubuntu-latest.</w:t>
+        <w:t xml:space="preserve">The CD workflow file must </w:t>
+      </w:r>
+      <w:proofErr w:type="gramStart"/>
+      <w:r>
+        <w:rPr>
+          <w:rFonts w:ascii="Arial" w:eastAsia="Arial" w:hAnsi="Arial" w:cs="Arial"/>
+          <w:color w:val="000000"/>
+        </w:rPr>
+        <w:t>declare</w:t>
+      </w:r>
+      <w:proofErr w:type="gramEnd"/>
+      <w:r>
+        <w:rPr>
+          <w:rFonts w:ascii="Arial" w:eastAsia="Arial" w:hAnsi="Arial" w:cs="Arial"/>
+          <w:color w:val="000000"/>
+        </w:rPr>
+        <w:t xml:space="preserve"> runs-on: ubuntu-latest.</w:t>
       </w:r>
     </w:p>
     <w:p>
@@ -4923,7 +5455,15 @@
           <w:rFonts w:ascii="Arial" w:eastAsia="Arial" w:hAnsi="Arial" w:cs="Arial"/>
           <w:color w:val="000000"/>
         </w:rPr>
-        <w:t xml:space="preserve">The job must NOT contain any Docker build or push steps </w:t>
+        <w:t xml:space="preserve">The job must NOT contain any Docker build or push </w:t>
+      </w:r>
+      <w:proofErr w:type="gramStart"/>
+      <w:r>
+        <w:rPr>
+          <w:rFonts w:ascii="Arial" w:eastAsia="Arial" w:hAnsi="Arial" w:cs="Arial"/>
+          <w:color w:val="000000"/>
+        </w:rPr>
+        <w:t xml:space="preserve">steps </w:t>
       </w:r>
       <w:r>
         <w:rPr>
@@ -4932,6 +5472,7 @@
         </w:rPr>
         <w:t>,</w:t>
       </w:r>
+      <w:proofErr w:type="gramEnd"/>
       <w:r>
         <w:rPr>
           <w:rFonts w:ascii="Arial" w:eastAsia="Arial" w:hAnsi="Arial" w:cs="Arial"/>
@@ -5402,7 +5943,15 @@
           <w:rFonts w:ascii="Arial" w:eastAsia="Arial" w:hAnsi="Arial" w:cs="Arial"/>
           <w:color w:val="000000"/>
         </w:rPr>
-        <w:t xml:space="preserve">Team Lead: Set up the initial repository structure </w:t>
+        <w:t xml:space="preserve">Team Lead: Set up the initial repository </w:t>
+      </w:r>
+      <w:proofErr w:type="gramStart"/>
+      <w:r>
+        <w:rPr>
+          <w:rFonts w:ascii="Arial" w:eastAsia="Arial" w:hAnsi="Arial" w:cs="Arial"/>
+          <w:color w:val="000000"/>
+        </w:rPr>
+        <w:t xml:space="preserve">structure </w:t>
       </w:r>
       <w:r>
         <w:rPr>
@@ -5411,6 +5960,7 @@
         </w:rPr>
         <w:t>,</w:t>
       </w:r>
+      <w:proofErr w:type="gramEnd"/>
       <w:r>
         <w:rPr>
           <w:rFonts w:ascii="Arial" w:eastAsia="Arial" w:hAnsi="Arial" w:cs="Arial"/>
@@ -5447,7 +5997,15 @@
           <w:rFonts w:ascii="Arial" w:eastAsia="Arial" w:hAnsi="Arial" w:cs="Arial"/>
           <w:color w:val="000000"/>
         </w:rPr>
-        <w:t xml:space="preserve">Commit the Assignment 04 question paper (.docx) to the root of the repository. Every team member must fill in their details </w:t>
+        <w:t xml:space="preserve">Commit the Assignment 04 question paper (.docx) to the root of the repository. Every team member must fill in their </w:t>
+      </w:r>
+      <w:proofErr w:type="gramStart"/>
+      <w:r>
+        <w:rPr>
+          <w:rFonts w:ascii="Arial" w:eastAsia="Arial" w:hAnsi="Arial" w:cs="Arial"/>
+          <w:color w:val="000000"/>
+        </w:rPr>
+        <w:t xml:space="preserve">details </w:t>
       </w:r>
       <w:r>
         <w:rPr>
@@ -5456,12 +6014,21 @@
         </w:rPr>
         <w:t>,</w:t>
       </w:r>
-      <w:r>
-        <w:rPr>
-          <w:rFonts w:ascii="Arial" w:eastAsia="Arial" w:hAnsi="Arial" w:cs="Arial"/>
-          <w:color w:val="000000"/>
-        </w:rPr>
-        <w:t xml:space="preserve"> including their Assigned Page </w:t>
+      <w:proofErr w:type="gramEnd"/>
+      <w:r>
+        <w:rPr>
+          <w:rFonts w:ascii="Arial" w:eastAsia="Arial" w:hAnsi="Arial" w:cs="Arial"/>
+          <w:color w:val="000000"/>
+        </w:rPr>
+        <w:t xml:space="preserve"> including their Assigned </w:t>
+      </w:r>
+      <w:proofErr w:type="gramStart"/>
+      <w:r>
+        <w:rPr>
+          <w:rFonts w:ascii="Arial" w:eastAsia="Arial" w:hAnsi="Arial" w:cs="Arial"/>
+          <w:color w:val="000000"/>
+        </w:rPr>
+        <w:t xml:space="preserve">Page </w:t>
       </w:r>
       <w:r>
         <w:rPr>
@@ -5470,12 +6037,29 @@
         </w:rPr>
         <w:t>,</w:t>
       </w:r>
-      <w:r>
-        <w:rPr>
-          <w:rFonts w:ascii="Arial" w:eastAsia="Arial" w:hAnsi="Arial" w:cs="Arial"/>
-          <w:color w:val="000000"/>
-        </w:rPr>
-        <w:t xml:space="preserve"> in their row in Table 1 in the versioned document.</w:t>
+      <w:proofErr w:type="gramEnd"/>
+      <w:r>
+        <w:rPr>
+          <w:rFonts w:ascii="Arial" w:eastAsia="Arial" w:hAnsi="Arial" w:cs="Arial"/>
+          <w:color w:val="000000"/>
+        </w:rPr>
+        <w:t xml:space="preserve"> in their row in Table 1 in the </w:t>
+      </w:r>
+      <w:proofErr w:type="gramStart"/>
+      <w:r>
+        <w:rPr>
+          <w:rFonts w:ascii="Arial" w:eastAsia="Arial" w:hAnsi="Arial" w:cs="Arial"/>
+          <w:color w:val="000000"/>
+        </w:rPr>
+        <w:t>versioned</w:t>
+      </w:r>
+      <w:proofErr w:type="gramEnd"/>
+      <w:r>
+        <w:rPr>
+          <w:rFonts w:ascii="Arial" w:eastAsia="Arial" w:hAnsi="Arial" w:cs="Arial"/>
+          <w:color w:val="000000"/>
+        </w:rPr>
+        <w:t xml:space="preserve"> document.</w:t>
       </w:r>
     </w:p>
     <w:p>
@@ -5506,7 +6090,15 @@
           <w:rFonts w:ascii="Arial" w:eastAsia="Arial" w:hAnsi="Arial" w:cs="Arial"/>
           <w:color w:val="000000"/>
         </w:rPr>
-        <w:t xml:space="preserve"> and configure all three secrets </w:t>
+        <w:t xml:space="preserve"> and configure all three </w:t>
+      </w:r>
+      <w:proofErr w:type="gramStart"/>
+      <w:r>
+        <w:rPr>
+          <w:rFonts w:ascii="Arial" w:eastAsia="Arial" w:hAnsi="Arial" w:cs="Arial"/>
+          <w:color w:val="000000"/>
+        </w:rPr>
+        <w:t xml:space="preserve">secrets </w:t>
       </w:r>
       <w:r>
         <w:rPr>
@@ -5515,6 +6107,7 @@
         </w:rPr>
         <w:t>,</w:t>
       </w:r>
+      <w:proofErr w:type="gramEnd"/>
       <w:r>
         <w:rPr>
           <w:rFonts w:ascii="Arial" w:eastAsia="Arial" w:hAnsi="Arial" w:cs="Arial"/>
@@ -5582,7 +6175,15 @@
           <w:rFonts w:ascii="Arial" w:eastAsia="Arial" w:hAnsi="Arial" w:cs="Arial"/>
           <w:color w:val="000000"/>
         </w:rPr>
-        <w:t xml:space="preserve">Create the CI workflow at .github/workflows/ci.yml </w:t>
+        <w:t xml:space="preserve">Create the CI workflow at </w:t>
+      </w:r>
+      <w:proofErr w:type="gramStart"/>
+      <w:r>
+        <w:rPr>
+          <w:rFonts w:ascii="Arial" w:eastAsia="Arial" w:hAnsi="Arial" w:cs="Arial"/>
+          <w:color w:val="000000"/>
+        </w:rPr>
+        <w:t xml:space="preserve">.github/workflows/ci.yml </w:t>
       </w:r>
       <w:r>
         <w:rPr>
@@ -5591,6 +6192,7 @@
         </w:rPr>
         <w:t>,</w:t>
       </w:r>
+      <w:proofErr w:type="gramEnd"/>
       <w:r>
         <w:rPr>
           <w:rFonts w:ascii="Arial" w:eastAsia="Arial" w:hAnsi="Arial" w:cs="Arial"/>
@@ -5627,7 +6229,15 @@
           <w:rFonts w:ascii="Arial" w:eastAsia="Arial" w:hAnsi="Arial" w:cs="Arial"/>
           <w:color w:val="000000"/>
         </w:rPr>
-        <w:t xml:space="preserve">Create the CD workflow at .github/workflows/cd.yml </w:t>
+        <w:t xml:space="preserve">Create the CD workflow at </w:t>
+      </w:r>
+      <w:proofErr w:type="gramStart"/>
+      <w:r>
+        <w:rPr>
+          <w:rFonts w:ascii="Arial" w:eastAsia="Arial" w:hAnsi="Arial" w:cs="Arial"/>
+          <w:color w:val="000000"/>
+        </w:rPr>
+        <w:t xml:space="preserve">.github/workflows/cd.yml </w:t>
       </w:r>
       <w:r>
         <w:rPr>
@@ -5636,6 +6246,7 @@
         </w:rPr>
         <w:t>,</w:t>
       </w:r>
+      <w:proofErr w:type="gramEnd"/>
       <w:r>
         <w:rPr>
           <w:rFonts w:ascii="Arial" w:eastAsia="Arial" w:hAnsi="Arial" w:cs="Arial"/>
@@ -5753,15 +6364,16 @@
           <w:sz w:val="19"/>
           <w:szCs w:val="19"/>
         </w:rPr>
-        <w:t>“develop”</w:t>
-      </w:r>
+        <w:t>“develop</w:t>
+      </w:r>
+      <w:proofErr w:type="gramStart"/>
       <w:r>
         <w:rPr>
           <w:rFonts w:ascii="Arial" w:eastAsia="Arial" w:hAnsi="Arial" w:cs="Arial"/>
           <w:sz w:val="19"/>
           <w:szCs w:val="19"/>
         </w:rPr>
-        <w:t xml:space="preserve"> </w:t>
+        <w:t>”</w:t>
       </w:r>
       <w:r>
         <w:rPr>
@@ -5769,8 +6381,17 @@
           <w:sz w:val="19"/>
           <w:szCs w:val="19"/>
         </w:rPr>
+        <w:t xml:space="preserve"> </w:t>
+      </w:r>
+      <w:r>
+        <w:rPr>
+          <w:rFonts w:ascii="Arial" w:eastAsia="Arial" w:hAnsi="Arial" w:cs="Arial"/>
+          <w:sz w:val="19"/>
+          <w:szCs w:val="19"/>
+        </w:rPr>
         <w:t>,</w:t>
       </w:r>
+      <w:proofErr w:type="gramEnd"/>
       <w:r>
         <w:rPr>
           <w:rFonts w:ascii="Arial" w:eastAsia="Arial" w:hAnsi="Arial" w:cs="Arial"/>
@@ -5795,16 +6416,26 @@
           <w:sz w:val="19"/>
           <w:szCs w:val="19"/>
         </w:rPr>
-        <w:t xml:space="preserve">Request a review; after approval the Team Lead merges the PR </w:t>
-      </w:r>
+        <w:t xml:space="preserve">Request a review; after approval the Team Lead merges the </w:t>
+      </w:r>
+      <w:proofErr w:type="gramStart"/>
       <w:r>
         <w:rPr>
           <w:rFonts w:ascii="Arial" w:eastAsia="Arial" w:hAnsi="Arial" w:cs="Arial"/>
           <w:sz w:val="19"/>
           <w:szCs w:val="19"/>
         </w:rPr>
+        <w:t xml:space="preserve">PR </w:t>
+      </w:r>
+      <w:r>
+        <w:rPr>
+          <w:rFonts w:ascii="Arial" w:eastAsia="Arial" w:hAnsi="Arial" w:cs="Arial"/>
+          <w:sz w:val="19"/>
+          <w:szCs w:val="19"/>
+        </w:rPr>
         <w:t>,</w:t>
       </w:r>
+      <w:proofErr w:type="gramEnd"/>
       <w:r>
         <w:rPr>
           <w:rFonts w:ascii="Arial" w:eastAsia="Arial" w:hAnsi="Arial" w:cs="Arial"/>
@@ -5828,7 +6459,23 @@
           <w:rFonts w:ascii="Arial" w:eastAsia="Arial" w:hAnsi="Arial" w:cs="Arial"/>
           <w:color w:val="000000"/>
         </w:rPr>
-        <w:t>After all 5 PRs are merged, verify the live TaskFlow application on Render contains all five pages and navigation between them works correctly.</w:t>
+        <w:t xml:space="preserve">After </w:t>
+      </w:r>
+      <w:proofErr w:type="gramStart"/>
+      <w:r>
+        <w:rPr>
+          <w:rFonts w:ascii="Arial" w:eastAsia="Arial" w:hAnsi="Arial" w:cs="Arial"/>
+          <w:color w:val="000000"/>
+        </w:rPr>
+        <w:t>all</w:t>
+      </w:r>
+      <w:proofErr w:type="gramEnd"/>
+      <w:r>
+        <w:rPr>
+          <w:rFonts w:ascii="Arial" w:eastAsia="Arial" w:hAnsi="Arial" w:cs="Arial"/>
+          <w:color w:val="000000"/>
+        </w:rPr>
+        <w:t xml:space="preserve"> 5 PRs are merged, verify the live TaskFlow application on Render contains all five pages and navigation between them works correctly.</w:t>
       </w:r>
     </w:p>
     <w:p>
@@ -8397,7 +9044,15 @@
           <w:rFonts w:ascii="Arial" w:eastAsia="Arial" w:hAnsi="Arial" w:cs="Arial"/>
           <w:color w:val="000000"/>
         </w:rPr>
-        <w:t xml:space="preserve">Screenshot 2: Each member's CI workflow run triggered by their individual PR </w:t>
+        <w:t xml:space="preserve">Screenshot 2: Each member's CI workflow run triggered by their individual </w:t>
+      </w:r>
+      <w:proofErr w:type="gramStart"/>
+      <w:r>
+        <w:rPr>
+          <w:rFonts w:ascii="Arial" w:eastAsia="Arial" w:hAnsi="Arial" w:cs="Arial"/>
+          <w:color w:val="000000"/>
+        </w:rPr>
+        <w:t xml:space="preserve">PR </w:t>
       </w:r>
       <w:r>
         <w:rPr>
@@ -8406,6 +9061,7 @@
         </w:rPr>
         <w:t>,</w:t>
       </w:r>
+      <w:proofErr w:type="gramEnd"/>
       <w:r>
         <w:rPr>
           <w:rFonts w:ascii="Arial" w:eastAsia="Arial" w:hAnsi="Arial" w:cs="Arial"/>
@@ -8452,7 +9108,15 @@
           <w:rFonts w:ascii="Arial" w:eastAsia="Arial" w:hAnsi="Arial" w:cs="Arial"/>
           <w:color w:val="000000"/>
         </w:rPr>
-        <w:t>“develop”</w:t>
+        <w:t>“develop</w:t>
+      </w:r>
+      <w:proofErr w:type="gramStart"/>
+      <w:r>
+        <w:rPr>
+          <w:rFonts w:ascii="Arial" w:eastAsia="Arial" w:hAnsi="Arial" w:cs="Arial"/>
+          <w:color w:val="000000"/>
+        </w:rPr>
+        <w:t>”</w:t>
       </w:r>
       <w:r>
         <w:rPr>
@@ -8468,6 +9132,7 @@
         </w:rPr>
         <w:t>,</w:t>
       </w:r>
+      <w:proofErr w:type="gramEnd"/>
       <w:r>
         <w:rPr>
           <w:rFonts w:ascii="Arial" w:eastAsia="Arial" w:hAnsi="Arial" w:cs="Arial"/>
@@ -8561,7 +9226,23 @@
           <w:rFonts w:ascii="Arial" w:eastAsia="Arial" w:hAnsi="Arial" w:cs="Arial"/>
           <w:color w:val="000000"/>
         </w:rPr>
-        <w:t>Paste your verification screenshots in the table below. Label each one clearly.</w:t>
+        <w:t xml:space="preserve">Paste your verification screenshots </w:t>
+      </w:r>
+      <w:proofErr w:type="gramStart"/>
+      <w:r>
+        <w:rPr>
+          <w:rFonts w:ascii="Arial" w:eastAsia="Arial" w:hAnsi="Arial" w:cs="Arial"/>
+          <w:color w:val="000000"/>
+        </w:rPr>
+        <w:t>in</w:t>
+      </w:r>
+      <w:proofErr w:type="gramEnd"/>
+      <w:r>
+        <w:rPr>
+          <w:rFonts w:ascii="Arial" w:eastAsia="Arial" w:hAnsi="Arial" w:cs="Arial"/>
+          <w:color w:val="000000"/>
+        </w:rPr>
+        <w:t xml:space="preserve"> the table below. Label each one clearly.</w:t>
       </w:r>
     </w:p>
     <w:tbl>
@@ -9064,7 +9745,27 @@
           <w:bCs/>
           <w:color w:val="000000"/>
         </w:rPr>
-        <w:t>Member 1  (Name: _______________________________________________)</w:t>
+        <w:t xml:space="preserve">Member </w:t>
+      </w:r>
+      <w:proofErr w:type="gramStart"/>
+      <w:r>
+        <w:rPr>
+          <w:rFonts w:ascii="Arial" w:eastAsia="Arial" w:hAnsi="Arial" w:cs="Arial"/>
+          <w:b/>
+          <w:bCs/>
+          <w:color w:val="000000"/>
+        </w:rPr>
+        <w:t>1  (Name: _</w:t>
+      </w:r>
+      <w:proofErr w:type="gramEnd"/>
+      <w:r>
+        <w:rPr>
+          <w:rFonts w:ascii="Arial" w:eastAsia="Arial" w:hAnsi="Arial" w:cs="Arial"/>
+          <w:b/>
+          <w:bCs/>
+          <w:color w:val="000000"/>
+        </w:rPr>
+        <w:t>______________________________________________)</w:t>
       </w:r>
     </w:p>
     <w:tbl>
@@ -9171,8 +9872,9 @@
           <w:bCs/>
           <w:color w:val="000000"/>
         </w:rPr>
-        <w:t xml:space="preserve">Member 2  (Name: </w:t>
-      </w:r>
+        <w:t xml:space="preserve">Member </w:t>
+      </w:r>
+      <w:proofErr w:type="gramStart"/>
       <w:r>
         <w:rPr>
           <w:rFonts w:ascii="Arial" w:eastAsia="Arial" w:hAnsi="Arial" w:cs="Arial"/>
@@ -9180,7 +9882,17 @@
           <w:bCs/>
           <w:color w:val="000000"/>
         </w:rPr>
-        <w:t>Abdul Mateen</w:t>
+        <w:t>2  (</w:t>
+      </w:r>
+      <w:proofErr w:type="gramEnd"/>
+      <w:r>
+        <w:rPr>
+          <w:rFonts w:ascii="Arial" w:eastAsia="Arial" w:hAnsi="Arial" w:cs="Arial"/>
+          <w:b/>
+          <w:bCs/>
+          <w:color w:val="000000"/>
+        </w:rPr>
+        <w:t>Name: _______________________________________________)</w:t>
       </w:r>
     </w:p>
     <w:tbl>
@@ -9222,11 +9934,7 @@
             </w:tcMar>
             <w:vAlign w:val="center"/>
           </w:tcPr>
-          <w:p>
-            <w:r>
-              <w:t>Through this assignment, I learned how to integrate a CI/CD pipeline using GitHub Actions with Docker and Render.</w:t>
-            </w:r>
-          </w:p>
+          <w:p/>
         </w:tc>
       </w:tr>
       <w:tr>
@@ -9248,11 +9956,7 @@
             </w:tcMar>
             <w:vAlign w:val="center"/>
           </w:tcPr>
-          <w:p>
-            <w:r>
-              <w:t>My most challenging part was understanding how the CI workflow triggers on a PR and how the CD workflow fires only after a merge.</w:t>
-            </w:r>
-          </w:p>
+          <w:p/>
         </w:tc>
       </w:tr>
       <w:tr>
@@ -9274,11 +9978,7 @@
             </w:tcMar>
             <w:vAlign w:val="center"/>
           </w:tcPr>
-          <w:p>
-            <w:r>
-              <w:t>Working on the Add Task page taught me how feature branches isolate individual work within a team. The automated deployment flow from code push to a live URL made the DevOps lifecycle very tangible.</w:t>
-            </w:r>
-          </w:p>
+          <w:p/>
         </w:tc>
       </w:tr>
     </w:tbl>
@@ -9299,7 +9999,27 @@
           <w:bCs/>
           <w:color w:val="000000"/>
         </w:rPr>
-        <w:t>Member 3  (Name: _______________________________________________)</w:t>
+        <w:t xml:space="preserve">Member </w:t>
+      </w:r>
+      <w:proofErr w:type="gramStart"/>
+      <w:r>
+        <w:rPr>
+          <w:rFonts w:ascii="Arial" w:eastAsia="Arial" w:hAnsi="Arial" w:cs="Arial"/>
+          <w:b/>
+          <w:bCs/>
+          <w:color w:val="000000"/>
+        </w:rPr>
+        <w:t>3  (</w:t>
+      </w:r>
+      <w:proofErr w:type="gramEnd"/>
+      <w:r>
+        <w:rPr>
+          <w:rFonts w:ascii="Arial" w:eastAsia="Arial" w:hAnsi="Arial" w:cs="Arial"/>
+          <w:b/>
+          <w:bCs/>
+          <w:color w:val="000000"/>
+        </w:rPr>
+        <w:t>Name: _______________________________________________)</w:t>
       </w:r>
     </w:p>
     <w:tbl>
@@ -9406,7 +10126,27 @@
           <w:bCs/>
           <w:color w:val="000000"/>
         </w:rPr>
-        <w:t>Member 4  (Name: _______________________________________________)</w:t>
+        <w:t xml:space="preserve">Member 4  (Name: Muhammad Asfand Yar Haider)</w:t>
+      </w:r>
+      <w:proofErr w:type="gramStart"/>
+      <w:r>
+        <w:rPr>
+          <w:rFonts w:ascii="Arial" w:eastAsia="Arial" w:hAnsi="Arial" w:cs="Arial"/>
+          <w:b/>
+          <w:bCs/>
+          <w:color w:val="000000"/>
+        </w:rPr>
+        <w:t/>
+      </w:r>
+      <w:proofErr w:type="gramEnd"/>
+      <w:r>
+        <w:rPr>
+          <w:rFonts w:ascii="Arial" w:eastAsia="Arial" w:hAnsi="Arial" w:cs="Arial"/>
+          <w:b/>
+          <w:bCs/>
+          <w:color w:val="000000"/>
+        </w:rPr>
+        <w:t/>
       </w:r>
     </w:p>
     <w:tbl>
@@ -9448,7 +10188,11 @@
             </w:tcMar>
             <w:vAlign w:val="center"/>
           </w:tcPr>
-          <w:p/>
+          <w:p>
+            <w:r>
+              <w:t>I learnt how a PR-based CI pipeline checks changes before merge.</w:t>
+            </w:r>
+          </w:p>
         </w:tc>
       </w:tr>
       <w:tr>
@@ -9470,7 +10214,11 @@
             </w:tcMar>
             <w:vAlign w:val="center"/>
           </w:tcPr>
-          <w:p/>
+          <w:p>
+            <w:r>
+              <w:t>I built the Task Detail page and connected it with the shared TaskFlow navigation and stylesheet.</w:t>
+            </w:r>
+          </w:p>
         </w:tc>
       </w:tr>
       <w:tr>
@@ -9492,7 +10240,11 @@
             </w:tcMar>
             <w:vAlign w:val="center"/>
           </w:tcPr>
-          <w:p/>
+          <w:p>
+            <w:r>
+              <w:t>The challenging part was understanding which work belonged to members versus the Team Lead.</w:t>
+            </w:r>
+          </w:p>
         </w:tc>
       </w:tr>
     </w:tbl>
@@ -9500,6 +10252,9 @@
       <w:pPr>
         <w:spacing w:after="100"/>
       </w:pPr>
+      <w:r>
+        <w:t>Our team handled this by reviewing feature branches separately before merging into develop.</w:t>
+      </w:r>
     </w:p>
     <w:p>
       <w:pPr>
@@ -9513,7 +10268,27 @@
           <w:bCs/>
           <w:color w:val="000000"/>
         </w:rPr>
-        <w:t>Member 5  (Name: _______________________________________________)</w:t>
+        <w:t xml:space="preserve">Member </w:t>
+      </w:r>
+      <w:proofErr w:type="gramStart"/>
+      <w:r>
+        <w:rPr>
+          <w:rFonts w:ascii="Arial" w:eastAsia="Arial" w:hAnsi="Arial" w:cs="Arial"/>
+          <w:b/>
+          <w:bCs/>
+          <w:color w:val="000000"/>
+        </w:rPr>
+        <w:t>5  (</w:t>
+      </w:r>
+      <w:proofErr w:type="gramEnd"/>
+      <w:r>
+        <w:rPr>
+          <w:rFonts w:ascii="Arial" w:eastAsia="Arial" w:hAnsi="Arial" w:cs="Arial"/>
+          <w:b/>
+          <w:bCs/>
+          <w:color w:val="000000"/>
+        </w:rPr>
+        <w:t>Name: _______________________________________________)</w:t>
       </w:r>
     </w:p>
     <w:tbl>
@@ -9673,7 +10448,17 @@
         <w:sz w:val="16"/>
         <w:szCs w:val="16"/>
       </w:rPr>
-      <w:t xml:space="preserve">Assignment 04 – CI/CD Pipeline Integration  </w:t>
+      <w:t xml:space="preserve">Assignment 04 – CI/CD Pipeline </w:t>
+    </w:r>
+    <w:proofErr w:type="gramStart"/>
+    <w:r>
+      <w:rPr>
+        <w:rFonts w:ascii="Arial" w:eastAsia="Arial" w:hAnsi="Arial" w:cs="Arial"/>
+        <w:color w:val="555555"/>
+        <w:sz w:val="16"/>
+        <w:szCs w:val="16"/>
+      </w:rPr>
+      <w:t xml:space="preserve">Integration  </w:t>
     </w:r>
     <w:r>
       <w:rPr>
@@ -9683,6 +10468,15 @@
         <w:szCs w:val="16"/>
       </w:rPr>
       <w:tab/>
+    </w:r>
+    <w:proofErr w:type="gramEnd"/>
+    <w:r>
+      <w:rPr>
+        <w:rFonts w:ascii="Arial" w:eastAsia="Arial" w:hAnsi="Arial" w:cs="Arial"/>
+        <w:color w:val="555555"/>
+        <w:sz w:val="16"/>
+        <w:szCs w:val="16"/>
+      </w:rPr>
       <w:t xml:space="preserve"> Page </w:t>
     </w:r>
     <w:r>
@@ -9793,7 +10587,19 @@
         <w:sz w:val="18"/>
         <w:szCs w:val="18"/>
       </w:rPr>
-      <w:t>University of Central Punjab – Faculty of Information Technology</w:t>
+      <w:t xml:space="preserve">University of Central Punjab – Faculty of Information </w:t>
+    </w:r>
+    <w:proofErr w:type="gramStart"/>
+    <w:r>
+      <w:rPr>
+        <w:rFonts w:ascii="Arial" w:eastAsia="Arial" w:hAnsi="Arial" w:cs="Arial"/>
+        <w:b/>
+        <w:bCs/>
+        <w:color w:val="1F3864"/>
+        <w:sz w:val="18"/>
+        <w:szCs w:val="18"/>
+      </w:rPr>
+      <w:t>Technology</w:t>
     </w:r>
     <w:r>
       <w:rPr>
@@ -9802,7 +10608,17 @@
         <w:sz w:val="18"/>
         <w:szCs w:val="18"/>
       </w:rPr>
-      <w:t xml:space="preserve">  |  </w:t>
+      <w:t xml:space="preserve">  |</w:t>
+    </w:r>
+    <w:proofErr w:type="gramEnd"/>
+    <w:r>
+      <w:rPr>
+        <w:rFonts w:ascii="Arial" w:eastAsia="Arial" w:hAnsi="Arial" w:cs="Arial"/>
+        <w:color w:val="ADB9CA"/>
+        <w:sz w:val="18"/>
+        <w:szCs w:val="18"/>
+      </w:rPr>
+      <w:t xml:space="preserve">  </w:t>
     </w:r>
     <w:r>
       <w:rPr>

</xml_diff>

<commit_message>
docs: update assignment document with reflections
</commit_message>
<xml_diff>
--- a/Assignment_04_Spring2026.docx
+++ b/Assignment_04_Spring2026.docx
@@ -1,6 +1,6 @@
 
 <file path=word/document.xml><?xml version="1.0" encoding="utf-8"?>
-<w:document xmlns:mc="http://schemas.openxmlformats.org/markup-compatibility/2006" xmlns:r="http://schemas.openxmlformats.org/officeDocument/2006/relationships" xmlns:w="http://schemas.openxmlformats.org/wordprocessingml/2006/main" xmlns:w14="http://schemas.microsoft.com/office/word/2010/wordml" mc:Ignorable="w14 w15 w16se w16cid w16 w16cex w16sdtdh w16sdtfl w16du wp14">
+<w:document xmlns:wpc="http://schemas.microsoft.com/office/word/2010/wordprocessingCanvas" xmlns:cx="http://schemas.microsoft.com/office/drawing/2014/chartex" xmlns:cx1="http://schemas.microsoft.com/office/drawing/2015/9/8/chartex" xmlns:cx2="http://schemas.microsoft.com/office/drawing/2015/10/21/chartex" xmlns:cx3="http://schemas.microsoft.com/office/drawing/2016/5/9/chartex" xmlns:cx4="http://schemas.microsoft.com/office/drawing/2016/5/10/chartex" xmlns:cx5="http://schemas.microsoft.com/office/drawing/2016/5/11/chartex" xmlns:cx6="http://schemas.microsoft.com/office/drawing/2016/5/12/chartex" xmlns:cx7="http://schemas.microsoft.com/office/drawing/2016/5/13/chartex" xmlns:cx8="http://schemas.microsoft.com/office/drawing/2016/5/14/chartex" xmlns:mc="http://schemas.openxmlformats.org/markup-compatibility/2006" xmlns:aink="http://schemas.microsoft.com/office/drawing/2016/ink" xmlns:am3d="http://schemas.microsoft.com/office/drawing/2017/model3d" xmlns:o="urn:schemas-microsoft-com:office:office" xmlns:oel="http://schemas.microsoft.com/office/2019/extlst" xmlns:r="http://schemas.openxmlformats.org/officeDocument/2006/relationships" xmlns:m="http://schemas.openxmlformats.org/officeDocument/2006/math" xmlns:v="urn:schemas-microsoft-com:vml" xmlns:wp14="http://schemas.microsoft.com/office/word/2010/wordprocessingDrawing" xmlns:wp="http://schemas.openxmlformats.org/drawingml/2006/wordprocessingDrawing" xmlns:w10="urn:schemas-microsoft-com:office:word" xmlns:w="http://schemas.openxmlformats.org/wordprocessingml/2006/main" xmlns:w14="http://schemas.microsoft.com/office/word/2010/wordml" xmlns:w15="http://schemas.microsoft.com/office/word/2012/wordml" xmlns:w16cex="http://schemas.microsoft.com/office/word/2018/wordml/cex" xmlns:w16cid="http://schemas.microsoft.com/office/word/2016/wordml/cid" xmlns:w16="http://schemas.microsoft.com/office/word/2018/wordml" xmlns:w16du="http://schemas.microsoft.com/office/word/2023/wordml/word16du" xmlns:w16sdtdh="http://schemas.microsoft.com/office/word/2020/wordml/sdtdatahash" xmlns:w16sdtfl="http://schemas.microsoft.com/office/word/2024/wordml/sdtformatlock" xmlns:w16se="http://schemas.microsoft.com/office/word/2015/wordml/symex" xmlns:wpg="http://schemas.microsoft.com/office/word/2010/wordprocessingGroup" xmlns:wpi="http://schemas.microsoft.com/office/word/2010/wordprocessingInk" xmlns:wne="http://schemas.microsoft.com/office/word/2006/wordml" xmlns:wps="http://schemas.microsoft.com/office/word/2010/wordprocessingShape" mc:Ignorable="w14 w15 w16se w16cid w16 w16cex w16sdtdh w16sdtfl w16du wp14">
   <w:body>
     <w:p>
       <w:pPr>
@@ -348,47 +348,7 @@
           <w:sz w:val="24"/>
           <w:szCs w:val="24"/>
         </w:rPr>
-        <w:t xml:space="preserve"> (can be six members but in that </w:t>
-      </w:r>
-      <w:proofErr w:type="gramStart"/>
-      <w:r>
-        <w:rPr>
-          <w:rFonts w:ascii="Arial" w:eastAsia="Arial" w:hAnsi="Arial" w:cs="Arial"/>
-          <w:color w:val="000000"/>
-          <w:sz w:val="24"/>
-          <w:szCs w:val="24"/>
-        </w:rPr>
-        <w:t>case</w:t>
-      </w:r>
-      <w:proofErr w:type="gramEnd"/>
-      <w:r>
-        <w:rPr>
-          <w:rFonts w:ascii="Arial" w:eastAsia="Arial" w:hAnsi="Arial" w:cs="Arial"/>
-          <w:color w:val="000000"/>
-          <w:sz w:val="24"/>
-          <w:szCs w:val="24"/>
-        </w:rPr>
-        <w:t xml:space="preserve"> TL </w:t>
-      </w:r>
-      <w:proofErr w:type="gramStart"/>
-      <w:r>
-        <w:rPr>
-          <w:rFonts w:ascii="Arial" w:eastAsia="Arial" w:hAnsi="Arial" w:cs="Arial"/>
-          <w:color w:val="000000"/>
-          <w:sz w:val="24"/>
-          <w:szCs w:val="24"/>
-        </w:rPr>
-        <w:t>has to</w:t>
-      </w:r>
-      <w:proofErr w:type="gramEnd"/>
-      <w:r>
-        <w:rPr>
-          <w:rFonts w:ascii="Arial" w:eastAsia="Arial" w:hAnsi="Arial" w:cs="Arial"/>
-          <w:color w:val="000000"/>
-          <w:sz w:val="24"/>
-          <w:szCs w:val="24"/>
-        </w:rPr>
-        <w:t xml:space="preserve"> create an additional page for that member and then assign all tasks accordingly)</w:t>
+        <w:t xml:space="preserve"> (can be six members but in that case TL has to create an additional page for that member and then assign all tasks accordingly)</w:t>
       </w:r>
     </w:p>
     <w:p>
@@ -480,47 +440,7 @@
           <w:sz w:val="24"/>
           <w:szCs w:val="24"/>
         </w:rPr>
-        <w:t xml:space="preserve">Secrets Ownership: All GitHub secrets (DOCKERHUB_USERNAME, DOCKERHUB_TOKEN, RENDER_DEPLOY_HOOK_URL) must be created by the Team Lead using </w:t>
-      </w:r>
-      <w:proofErr w:type="gramStart"/>
-      <w:r>
-        <w:rPr>
-          <w:rFonts w:ascii="Arial" w:eastAsia="Arial" w:hAnsi="Arial" w:cs="Arial"/>
-          <w:color w:val="000000"/>
-          <w:sz w:val="24"/>
-          <w:szCs w:val="24"/>
-        </w:rPr>
-        <w:t>the TL's</w:t>
-      </w:r>
-      <w:proofErr w:type="gramEnd"/>
-      <w:r>
-        <w:rPr>
-          <w:rFonts w:ascii="Arial" w:eastAsia="Arial" w:hAnsi="Arial" w:cs="Arial"/>
-          <w:color w:val="000000"/>
-          <w:sz w:val="24"/>
-          <w:szCs w:val="24"/>
-        </w:rPr>
-        <w:t xml:space="preserve"> own Docker Hub and Render credentials. No team member other than </w:t>
-      </w:r>
-      <w:proofErr w:type="gramStart"/>
-      <w:r>
-        <w:rPr>
-          <w:rFonts w:ascii="Arial" w:eastAsia="Arial" w:hAnsi="Arial" w:cs="Arial"/>
-          <w:color w:val="000000"/>
-          <w:sz w:val="24"/>
-          <w:szCs w:val="24"/>
-        </w:rPr>
-        <w:t>the TL</w:t>
-      </w:r>
-      <w:proofErr w:type="gramEnd"/>
-      <w:r>
-        <w:rPr>
-          <w:rFonts w:ascii="Arial" w:eastAsia="Arial" w:hAnsi="Arial" w:cs="Arial"/>
-          <w:color w:val="000000"/>
-          <w:sz w:val="24"/>
-          <w:szCs w:val="24"/>
-        </w:rPr>
-        <w:t xml:space="preserve"> should create or modify secrets.</w:t>
+        <w:t>Secrets Ownership: All GitHub secrets (DOCKERHUB_USERNAME, DOCKERHUB_TOKEN, RENDER_DEPLOY_HOOK_URL) must be created by the Team Lead using the TL's own Docker Hub and Render credentials. No team member other than the TL should create or modify secrets.</w:t>
       </w:r>
     </w:p>
     <w:p>
@@ -543,27 +463,7 @@
           <w:sz w:val="24"/>
           <w:szCs w:val="24"/>
         </w:rPr>
-        <w:t xml:space="preserve">All deployments MUST be triggered via the GitHub Actions CD pipeline. Manual deployment </w:t>
-      </w:r>
-      <w:proofErr w:type="gramStart"/>
-      <w:r>
-        <w:rPr>
-          <w:rFonts w:ascii="Arial" w:eastAsia="Arial" w:hAnsi="Arial" w:cs="Arial"/>
-          <w:color w:val="000000"/>
-          <w:sz w:val="24"/>
-          <w:szCs w:val="24"/>
-        </w:rPr>
-        <w:t>on</w:t>
-      </w:r>
-      <w:proofErr w:type="gramEnd"/>
-      <w:r>
-        <w:rPr>
-          <w:rFonts w:ascii="Arial" w:eastAsia="Arial" w:hAnsi="Arial" w:cs="Arial"/>
-          <w:color w:val="000000"/>
-          <w:sz w:val="24"/>
-          <w:szCs w:val="24"/>
-        </w:rPr>
-        <w:t xml:space="preserve"> Render is NOT allowed after the initial service setup.</w:t>
+        <w:t>All deployments MUST be triggered via the GitHub Actions CD pipeline. Manual deployment on Render is NOT allowed after the initial service setup.</w:t>
       </w:r>
     </w:p>
     <w:p>
@@ -692,9 +592,8 @@
           <w:sz w:val="18"/>
           <w:szCs w:val="18"/>
         </w:rPr>
-        <w:t xml:space="preserve">Table 1: Group </w:t>
-      </w:r>
-      <w:proofErr w:type="gramStart"/>
+        <w:t xml:space="preserve">Table 1: Group Details </w:t>
+      </w:r>
       <w:r>
         <w:rPr>
           <w:rFonts w:ascii="Arial" w:eastAsia="Arial" w:hAnsi="Arial" w:cs="Arial"/>
@@ -704,7 +603,7 @@
           <w:sz w:val="18"/>
           <w:szCs w:val="18"/>
         </w:rPr>
-        <w:t xml:space="preserve">Details </w:t>
+        <w:t>,</w:t>
       </w:r>
       <w:r>
         <w:rPr>
@@ -715,67 +614,7 @@
           <w:sz w:val="18"/>
           <w:szCs w:val="18"/>
         </w:rPr>
-        <w:t>,</w:t>
-      </w:r>
-      <w:proofErr w:type="gramEnd"/>
-      <w:r>
-        <w:rPr>
-          <w:rFonts w:ascii="Arial" w:eastAsia="Arial" w:hAnsi="Arial" w:cs="Arial"/>
-          <w:b/>
-          <w:bCs/>
-          <w:color w:val="444444"/>
-          <w:sz w:val="18"/>
-          <w:szCs w:val="18"/>
-        </w:rPr>
-        <w:t xml:space="preserve"> </w:t>
-      </w:r>
-      <w:proofErr w:type="gramStart"/>
-      <w:r>
-        <w:rPr>
-          <w:rFonts w:ascii="Arial" w:eastAsia="Arial" w:hAnsi="Arial" w:cs="Arial"/>
-          <w:b/>
-          <w:bCs/>
-          <w:color w:val="444444"/>
-          <w:sz w:val="18"/>
-          <w:szCs w:val="18"/>
-        </w:rPr>
-        <w:t>Each</w:t>
-      </w:r>
-      <w:proofErr w:type="gramEnd"/>
-      <w:r>
-        <w:rPr>
-          <w:rFonts w:ascii="Arial" w:eastAsia="Arial" w:hAnsi="Arial" w:cs="Arial"/>
-          <w:b/>
-          <w:bCs/>
-          <w:color w:val="444444"/>
-          <w:sz w:val="18"/>
-          <w:szCs w:val="18"/>
-        </w:rPr>
-        <w:t xml:space="preserve"> student must fill their own row (including Assigned Page) in the </w:t>
-      </w:r>
-      <w:proofErr w:type="gramStart"/>
-      <w:r>
-        <w:rPr>
-          <w:rFonts w:ascii="Arial" w:eastAsia="Arial" w:hAnsi="Arial" w:cs="Arial"/>
-          <w:b/>
-          <w:bCs/>
-          <w:color w:val="444444"/>
-          <w:sz w:val="18"/>
-          <w:szCs w:val="18"/>
-        </w:rPr>
-        <w:t>versioned</w:t>
-      </w:r>
-      <w:proofErr w:type="gramEnd"/>
-      <w:r>
-        <w:rPr>
-          <w:rFonts w:ascii="Arial" w:eastAsia="Arial" w:hAnsi="Arial" w:cs="Arial"/>
-          <w:b/>
-          <w:bCs/>
-          <w:color w:val="444444"/>
-          <w:sz w:val="18"/>
-          <w:szCs w:val="18"/>
-        </w:rPr>
-        <w:t xml:space="preserve"> copy inside the repo</w:t>
+        <w:t xml:space="preserve"> Each student must fill their own row (including Assigned Page) in the versioned copy inside the repo</w:t>
       </w:r>
     </w:p>
     <w:tbl>
@@ -796,13 +635,13 @@
         <w:tblLook w:val="0000" w:firstRow="0" w:lastRow="0" w:firstColumn="0" w:lastColumn="0" w:noHBand="0" w:noVBand="0"/>
       </w:tblPr>
       <w:tblGrid>
-        <w:gridCol w:w="468"/>
-        <w:gridCol w:w="1231"/>
-        <w:gridCol w:w="1876"/>
-        <w:gridCol w:w="1540"/>
-        <w:gridCol w:w="1128"/>
-        <w:gridCol w:w="2477"/>
-        <w:gridCol w:w="1344"/>
+        <w:gridCol w:w="466"/>
+        <w:gridCol w:w="1220"/>
+        <w:gridCol w:w="1952"/>
+        <w:gridCol w:w="1523"/>
+        <w:gridCol w:w="1127"/>
+        <w:gridCol w:w="2447"/>
+        <w:gridCol w:w="1329"/>
       </w:tblGrid>
       <w:tr>
         <w:trPr>
@@ -1082,7 +921,11 @@
             </w:tcMar>
             <w:vAlign w:val="center"/>
           </w:tcPr>
-          <w:p/>
+          <w:p>
+            <w:r>
+              <w:t>Haroon Ashar</w:t>
+            </w:r>
+          </w:p>
         </w:tc>
         <w:tc>
           <w:tcPr>
@@ -1102,7 +945,13 @@
             </w:tcMar>
             <w:vAlign w:val="center"/>
           </w:tcPr>
-          <w:p/>
+          <w:p>
+            <w:proofErr w:type="spellStart"/>
+            <w:r>
+              <w:t>HaroonAshar</w:t>
+            </w:r>
+            <w:proofErr w:type="spellEnd"/>
+          </w:p>
         </w:tc>
         <w:tc>
           <w:tcPr>
@@ -1122,7 +971,11 @@
             </w:tcMar>
             <w:vAlign w:val="center"/>
           </w:tcPr>
-          <w:p/>
+          <w:p>
+            <w:r>
+              <w:t>Lead</w:t>
+            </w:r>
+          </w:p>
         </w:tc>
         <w:tc>
           <w:tcPr>
@@ -1142,7 +995,11 @@
             </w:tcMar>
             <w:vAlign w:val="center"/>
           </w:tcPr>
-          <w:p/>
+          <w:p>
+            <w:r>
+              <w:t>Index.html</w:t>
+            </w:r>
+          </w:p>
         </w:tc>
         <w:tc>
           <w:tcPr>
@@ -1162,7 +1019,11 @@
             </w:tcMar>
             <w:vAlign w:val="center"/>
           </w:tcPr>
-          <w:p/>
+          <w:p>
+            <w:r>
+              <w:t>develop</w:t>
+            </w:r>
+          </w:p>
         </w:tc>
         <w:tc>
           <w:tcPr>
@@ -1182,7 +1043,11 @@
             </w:tcMar>
             <w:vAlign w:val="center"/>
           </w:tcPr>
-          <w:p/>
+          <w:p>
+            <w:r>
+              <w:t>yes</w:t>
+            </w:r>
+          </w:p>
         </w:tc>
       </w:tr>
       <w:tr>
@@ -1234,7 +1099,11 @@
             </w:tcMar>
             <w:vAlign w:val="center"/>
           </w:tcPr>
-          <w:p/>
+          <w:p>
+            <w:r>
+              <w:t>Abdul Mateen</w:t>
+            </w:r>
+          </w:p>
         </w:tc>
         <w:tc>
           <w:tcPr>
@@ -1254,7 +1123,11 @@
             </w:tcMar>
             <w:vAlign w:val="center"/>
           </w:tcPr>
-          <w:p/>
+          <w:p>
+            <w:r>
+              <w:t>abdulmateen-67</w:t>
+            </w:r>
+          </w:p>
         </w:tc>
         <w:tc>
           <w:tcPr>
@@ -1274,7 +1147,11 @@
             </w:tcMar>
             <w:vAlign w:val="center"/>
           </w:tcPr>
-          <w:p/>
+          <w:p>
+            <w:r>
+              <w:t>Member</w:t>
+            </w:r>
+          </w:p>
         </w:tc>
         <w:tc>
           <w:tcPr>
@@ -1294,7 +1171,11 @@
             </w:tcMar>
             <w:vAlign w:val="center"/>
           </w:tcPr>
-          <w:p/>
+          <w:p>
+            <w:r>
+              <w:t>Add-task.html</w:t>
+            </w:r>
+          </w:p>
         </w:tc>
         <w:tc>
           <w:tcPr>
@@ -1314,7 +1195,11 @@
             </w:tcMar>
             <w:vAlign w:val="center"/>
           </w:tcPr>
-          <w:p/>
+          <w:p>
+            <w:r>
+              <w:t>feature/abdulmateen-67/add-task</w:t>
+            </w:r>
+          </w:p>
         </w:tc>
         <w:tc>
           <w:tcPr>
@@ -1334,7 +1219,11 @@
             </w:tcMar>
             <w:vAlign w:val="center"/>
           </w:tcPr>
-          <w:p/>
+          <w:p>
+            <w:r>
+              <w:t>yes</w:t>
+            </w:r>
+          </w:p>
         </w:tc>
       </w:tr>
       <w:tr>
@@ -1386,7 +1275,11 @@
             </w:tcMar>
             <w:vAlign w:val="center"/>
           </w:tcPr>
-          <w:p/>
+          <w:p>
+            <w:r>
+              <w:t>Muhammad Hashaam Dogar</w:t>
+            </w:r>
+          </w:p>
         </w:tc>
         <w:tc>
           <w:tcPr>
@@ -1406,7 +1299,11 @@
             </w:tcMar>
             <w:vAlign w:val="center"/>
           </w:tcPr>
-          <w:p/>
+          <w:p>
+            <w:r>
+              <w:t>HASHAAMDOGAR</w:t>
+            </w:r>
+          </w:p>
         </w:tc>
         <w:tc>
           <w:tcPr>
@@ -1426,7 +1323,11 @@
             </w:tcMar>
             <w:vAlign w:val="center"/>
           </w:tcPr>
-          <w:p/>
+          <w:p>
+            <w:r>
+              <w:t>Member</w:t>
+            </w:r>
+          </w:p>
         </w:tc>
         <w:tc>
           <w:tcPr>
@@ -1446,7 +1347,11 @@
             </w:tcMar>
             <w:vAlign w:val="center"/>
           </w:tcPr>
-          <w:p/>
+          <w:p>
+            <w:r>
+              <w:t>task-list.html</w:t>
+            </w:r>
+          </w:p>
         </w:tc>
         <w:tc>
           <w:tcPr>
@@ -1466,7 +1371,19 @@
             </w:tcMar>
             <w:vAlign w:val="center"/>
           </w:tcPr>
-          <w:p/>
+          <w:p>
+            <w:r>
+              <w:t>feature/</w:t>
+            </w:r>
+            <w:proofErr w:type="spellStart"/>
+            <w:r>
+              <w:t>hashaam</w:t>
+            </w:r>
+            <w:proofErr w:type="spellEnd"/>
+            <w:r>
+              <w:t>-dev/task-list</w:t>
+            </w:r>
+          </w:p>
         </w:tc>
         <w:tc>
           <w:tcPr>
@@ -1486,7 +1403,11 @@
             </w:tcMar>
             <w:vAlign w:val="center"/>
           </w:tcPr>
-          <w:p/>
+          <w:p>
+            <w:r>
+              <w:t>yes</w:t>
+            </w:r>
+          </w:p>
         </w:tc>
       </w:tr>
       <w:tr>
@@ -1851,15 +1772,45 @@
       <w:pPr>
         <w:spacing w:before="60" w:after="40"/>
         <w:jc w:val="both"/>
-      </w:pPr>
-      <w:r>
         <w:rPr>
           <w:rFonts w:ascii="Arial" w:eastAsia="Arial" w:hAnsi="Arial" w:cs="Arial"/>
           <w:b/>
           <w:bCs/>
           <w:color w:val="000000"/>
         </w:rPr>
+      </w:pPr>
+      <w:r>
+        <w:rPr>
+          <w:rFonts w:ascii="Arial" w:eastAsia="Arial" w:hAnsi="Arial" w:cs="Arial"/>
+          <w:b/>
+          <w:bCs/>
+          <w:color w:val="000000"/>
+        </w:rPr>
         <w:t>Group Repository URL:</w:t>
+      </w:r>
+    </w:p>
+    <w:p>
+      <w:pPr>
+        <w:spacing w:before="60" w:after="40"/>
+        <w:jc w:val="both"/>
+      </w:pPr>
+      <w:r>
+        <w:t>https://github.com/HaroonAshar/taskflow-cicd</w:t>
+      </w:r>
+    </w:p>
+    <w:p>
+      <w:pPr>
+        <w:spacing w:before="60" w:after="40"/>
+        <w:jc w:val="both"/>
+      </w:pPr>
+      <w:r>
+        <w:rPr>
+          <w:rFonts w:ascii="Arial" w:eastAsia="Arial" w:hAnsi="Arial" w:cs="Arial"/>
+          <w:b/>
+          <w:bCs/>
+          <w:color w:val="000000"/>
+        </w:rPr>
+        <w:t>Deployed Application URL:</w:t>
       </w:r>
     </w:p>
     <w:p>
@@ -1872,51 +1823,7 @@
           <w:rFonts w:ascii="Arial" w:eastAsia="Arial" w:hAnsi="Arial" w:cs="Arial"/>
           <w:color w:val="555555"/>
         </w:rPr>
-        <w:t>[Paste Your GitHub Repository URL Here]</w:t>
-      </w:r>
-    </w:p>
-    <w:p>
-      <w:pPr>
-        <w:spacing w:before="60" w:after="40"/>
-        <w:jc w:val="both"/>
-      </w:pPr>
-      <w:r>
-        <w:rPr>
-          <w:rFonts w:ascii="Arial" w:eastAsia="Arial" w:hAnsi="Arial" w:cs="Arial"/>
-          <w:b/>
-          <w:bCs/>
-          <w:color w:val="000000"/>
-        </w:rPr>
-        <w:t>Deployed Application URL:</w:t>
-      </w:r>
-    </w:p>
-    <w:p>
-      <w:pPr>
-        <w:spacing w:before="60" w:after="120"/>
-        <w:jc w:val="both"/>
-      </w:pPr>
-      <w:r>
-        <w:rPr>
-          <w:rFonts w:ascii="Arial" w:eastAsia="Arial" w:hAnsi="Arial" w:cs="Arial"/>
-          <w:color w:val="555555"/>
-        </w:rPr>
-        <w:t xml:space="preserve">[Paste </w:t>
-      </w:r>
-      <w:proofErr w:type="gramStart"/>
-      <w:r>
-        <w:rPr>
-          <w:rFonts w:ascii="Arial" w:eastAsia="Arial" w:hAnsi="Arial" w:cs="Arial"/>
-          <w:color w:val="555555"/>
-        </w:rPr>
-        <w:t>Your Render</w:t>
-      </w:r>
-      <w:proofErr w:type="gramEnd"/>
-      <w:r>
-        <w:rPr>
-          <w:rFonts w:ascii="Arial" w:eastAsia="Arial" w:hAnsi="Arial" w:cs="Arial"/>
-          <w:color w:val="555555"/>
-        </w:rPr>
-        <w:t xml:space="preserve"> Live URL Here]</w:t>
+        <w:t>[Paste Your Render Live URL Here]</w:t>
       </w:r>
     </w:p>
     <w:p>
@@ -1953,7 +1860,39 @@
           <w:rFonts w:ascii="Arial" w:eastAsia="Arial" w:hAnsi="Arial" w:cs="Arial"/>
           <w:color w:val="000000"/>
         </w:rPr>
-        <w:t>Your team is the development crew for TaskFlow, a lightweight task-management web application consisting of five HTML pages. The Team Lead sets up the repository, Dockerfile, shared stylesheet, and the CI/CD pipelines. Each team member is then individually responsible for building one specific page of the application, following the full Git, GitHub, and Docker flow independently.</w:t>
+        <w:t xml:space="preserve">Your team is the development crew for </w:t>
+      </w:r>
+      <w:proofErr w:type="spellStart"/>
+      <w:r>
+        <w:rPr>
+          <w:rFonts w:ascii="Arial" w:eastAsia="Arial" w:hAnsi="Arial" w:cs="Arial"/>
+          <w:color w:val="000000"/>
+        </w:rPr>
+        <w:t>TaskFlow</w:t>
+      </w:r>
+      <w:proofErr w:type="spellEnd"/>
+      <w:r>
+        <w:rPr>
+          <w:rFonts w:ascii="Arial" w:eastAsia="Arial" w:hAnsi="Arial" w:cs="Arial"/>
+          <w:color w:val="000000"/>
+        </w:rPr>
+        <w:t xml:space="preserve">, a lightweight task-management web application consisting of five HTML pages. The Team Lead sets up the repository, </w:t>
+      </w:r>
+      <w:proofErr w:type="spellStart"/>
+      <w:r>
+        <w:rPr>
+          <w:rFonts w:ascii="Arial" w:eastAsia="Arial" w:hAnsi="Arial" w:cs="Arial"/>
+          <w:color w:val="000000"/>
+        </w:rPr>
+        <w:t>Dockerfile</w:t>
+      </w:r>
+      <w:proofErr w:type="spellEnd"/>
+      <w:r>
+        <w:rPr>
+          <w:rFonts w:ascii="Arial" w:eastAsia="Arial" w:hAnsi="Arial" w:cs="Arial"/>
+          <w:color w:val="000000"/>
+        </w:rPr>
+        <w:t>, shared stylesheet, and the CI/CD pipelines. Each team member is then individually responsible for building one specific page of the application, following the full Git, GitHub, and Docker flow independently.</w:t>
       </w:r>
     </w:p>
     <w:p>
@@ -1971,7 +1910,23 @@
           <w:rFonts w:ascii="Arial" w:eastAsia="Arial" w:hAnsi="Arial" w:cs="Arial"/>
           <w:color w:val="000000"/>
         </w:rPr>
-        <w:t>The 5 pages of the TaskFlow application and their assignment are defined in Table 3 below. The Team Lead takes Page 1 (Home / Dashboard) in addition to their setup responsibilities.</w:t>
+        <w:t xml:space="preserve">The 5 pages of the </w:t>
+      </w:r>
+      <w:proofErr w:type="spellStart"/>
+      <w:r>
+        <w:rPr>
+          <w:rFonts w:ascii="Arial" w:eastAsia="Arial" w:hAnsi="Arial" w:cs="Arial"/>
+          <w:color w:val="000000"/>
+        </w:rPr>
+        <w:t>TaskFlow</w:t>
+      </w:r>
+      <w:proofErr w:type="spellEnd"/>
+      <w:r>
+        <w:rPr>
+          <w:rFonts w:ascii="Arial" w:eastAsia="Arial" w:hAnsi="Arial" w:cs="Arial"/>
+          <w:color w:val="000000"/>
+        </w:rPr>
+        <w:t xml:space="preserve"> application and their assignment are defined in Table 3 below. The Team Lead takes Page 1 (Home / Dashboard) in addition to their setup responsibilities.</w:t>
       </w:r>
     </w:p>
     <w:p>
@@ -1993,7 +1948,31 @@
           <w:sz w:val="18"/>
           <w:szCs w:val="18"/>
         </w:rPr>
-        <w:t>Table 3: TaskFlow Page Assignment</w:t>
+        <w:t xml:space="preserve">Table 3: </w:t>
+      </w:r>
+      <w:proofErr w:type="spellStart"/>
+      <w:r>
+        <w:rPr>
+          <w:rFonts w:ascii="Arial" w:eastAsia="Arial" w:hAnsi="Arial" w:cs="Arial"/>
+          <w:b/>
+          <w:bCs/>
+          <w:color w:val="444444"/>
+          <w:sz w:val="18"/>
+          <w:szCs w:val="18"/>
+        </w:rPr>
+        <w:t>TaskFlow</w:t>
+      </w:r>
+      <w:proofErr w:type="spellEnd"/>
+      <w:r>
+        <w:rPr>
+          <w:rFonts w:ascii="Arial" w:eastAsia="Arial" w:hAnsi="Arial" w:cs="Arial"/>
+          <w:b/>
+          <w:bCs/>
+          <w:color w:val="444444"/>
+          <w:sz w:val="18"/>
+          <w:szCs w:val="18"/>
+        </w:rPr>
+        <w:t xml:space="preserve"> Page Assignment</w:t>
       </w:r>
     </w:p>
     <w:tbl>
@@ -2399,17 +2378,7 @@
                 <w:sz w:val="18"/>
                 <w:szCs w:val="18"/>
               </w:rPr>
-              <w:t xml:space="preserve">An HTML form allowing the user to enter a new </w:t>
-            </w:r>
-            <w:proofErr w:type="gramStart"/>
-            <w:r>
-              <w:rPr>
-                <w:rFonts w:ascii="Arial" w:eastAsia="Arial" w:hAnsi="Arial" w:cs="Arial"/>
-                <w:color w:val="000000"/>
-                <w:sz w:val="18"/>
-                <w:szCs w:val="18"/>
-              </w:rPr>
-              <w:t xml:space="preserve">task </w:t>
+              <w:t xml:space="preserve">An HTML form allowing the user to enter a new task </w:t>
             </w:r>
             <w:r>
               <w:rPr>
@@ -2420,7 +2389,6 @@
               </w:rPr>
               <w:t>,</w:t>
             </w:r>
-            <w:proofErr w:type="gramEnd"/>
             <w:r>
               <w:rPr>
                 <w:rFonts w:ascii="Arial" w:eastAsia="Arial" w:hAnsi="Arial" w:cs="Arial"/>
@@ -2588,6 +2556,7 @@
                 <w:sz w:val="18"/>
                 <w:szCs w:val="18"/>
               </w:rPr>
+              <w:lastRenderedPageBreak/>
               <w:t>4</w:t>
             </w:r>
           </w:p>
@@ -2714,7 +2683,6 @@
                 <w:sz w:val="18"/>
                 <w:szCs w:val="18"/>
               </w:rPr>
-              <w:lastRenderedPageBreak/>
               <w:t>5</w:t>
             </w:r>
           </w:p>
@@ -2807,7 +2775,27 @@
                 <w:sz w:val="18"/>
                 <w:szCs w:val="18"/>
               </w:rPr>
-              <w:t>A page describing the TaskFlow application, its purpose, and a simple usage guide explaining how to navigate and use the app.</w:t>
+              <w:t xml:space="preserve">A page describing the </w:t>
+            </w:r>
+            <w:proofErr w:type="spellStart"/>
+            <w:r>
+              <w:rPr>
+                <w:rFonts w:ascii="Arial" w:eastAsia="Arial" w:hAnsi="Arial" w:cs="Arial"/>
+                <w:color w:val="000000"/>
+                <w:sz w:val="18"/>
+                <w:szCs w:val="18"/>
+              </w:rPr>
+              <w:t>TaskFlow</w:t>
+            </w:r>
+            <w:proofErr w:type="spellEnd"/>
+            <w:r>
+              <w:rPr>
+                <w:rFonts w:ascii="Arial" w:eastAsia="Arial" w:hAnsi="Arial" w:cs="Arial"/>
+                <w:color w:val="000000"/>
+                <w:sz w:val="18"/>
+                <w:szCs w:val="18"/>
+              </w:rPr>
+              <w:t xml:space="preserve"> application, its purpose, and a simple usage guide explaining how to navigate and use the app.</w:t>
             </w:r>
           </w:p>
         </w:tc>
@@ -2861,23 +2849,39 @@
           <w:rFonts w:ascii="Arial" w:eastAsia="Arial" w:hAnsi="Arial" w:cs="Arial"/>
           <w:color w:val="000000"/>
         </w:rPr>
-        <w:t xml:space="preserve"> using the naming convention: feature/&lt;member-github-username&gt;/&lt;page-name</w:t>
-      </w:r>
-      <w:proofErr w:type="gramStart"/>
-      <w:r>
-        <w:rPr>
-          <w:rFonts w:ascii="Arial" w:eastAsia="Arial" w:hAnsi="Arial" w:cs="Arial"/>
-          <w:color w:val="000000"/>
-        </w:rPr>
-        <w:t>&gt;  (</w:t>
-      </w:r>
-      <w:proofErr w:type="gramEnd"/>
-      <w:r>
-        <w:rPr>
-          <w:rFonts w:ascii="Arial" w:eastAsia="Arial" w:hAnsi="Arial" w:cs="Arial"/>
-          <w:color w:val="000000"/>
-        </w:rPr>
-        <w:t>e.g., feature/ali-hassan/add-task).</w:t>
+        <w:t xml:space="preserve"> using the naming convention: feature/&lt;member-</w:t>
+      </w:r>
+      <w:proofErr w:type="spellStart"/>
+      <w:r>
+        <w:rPr>
+          <w:rFonts w:ascii="Arial" w:eastAsia="Arial" w:hAnsi="Arial" w:cs="Arial"/>
+          <w:color w:val="000000"/>
+        </w:rPr>
+        <w:t>github</w:t>
+      </w:r>
+      <w:proofErr w:type="spellEnd"/>
+      <w:r>
+        <w:rPr>
+          <w:rFonts w:ascii="Arial" w:eastAsia="Arial" w:hAnsi="Arial" w:cs="Arial"/>
+          <w:color w:val="000000"/>
+        </w:rPr>
+        <w:t>-username&gt;/&lt;page-name&gt;  (e.g., feature/</w:t>
+      </w:r>
+      <w:proofErr w:type="spellStart"/>
+      <w:r>
+        <w:rPr>
+          <w:rFonts w:ascii="Arial" w:eastAsia="Arial" w:hAnsi="Arial" w:cs="Arial"/>
+          <w:color w:val="000000"/>
+        </w:rPr>
+        <w:t>ali-hassan</w:t>
+      </w:r>
+      <w:proofErr w:type="spellEnd"/>
+      <w:r>
+        <w:rPr>
+          <w:rFonts w:ascii="Arial" w:eastAsia="Arial" w:hAnsi="Arial" w:cs="Arial"/>
+          <w:color w:val="000000"/>
+        </w:rPr>
+        <w:t>/add-task).</w:t>
       </w:r>
     </w:p>
     <w:p>
@@ -2959,23 +2963,7 @@
           <w:rFonts w:ascii="Arial" w:eastAsia="Arial" w:hAnsi="Arial" w:cs="Arial"/>
           <w:color w:val="000000"/>
         </w:rPr>
-        <w:t xml:space="preserve">Once CI passes and the PR is reviewed and approved, the Team Lead </w:t>
-      </w:r>
-      <w:proofErr w:type="gramStart"/>
-      <w:r>
-        <w:rPr>
-          <w:rFonts w:ascii="Arial" w:eastAsia="Arial" w:hAnsi="Arial" w:cs="Arial"/>
-          <w:color w:val="000000"/>
-        </w:rPr>
-        <w:t>merges</w:t>
-      </w:r>
-      <w:proofErr w:type="gramEnd"/>
-      <w:r>
-        <w:rPr>
-          <w:rFonts w:ascii="Arial" w:eastAsia="Arial" w:hAnsi="Arial" w:cs="Arial"/>
-          <w:color w:val="000000"/>
-        </w:rPr>
-        <w:t xml:space="preserve"> the PR. The merge generates a push event on </w:t>
+        <w:t xml:space="preserve">Once CI passes and the PR is reviewed and approved, the Team Lead merges the PR. The merge generates a push event on </w:t>
       </w:r>
       <w:r>
         <w:rPr>
@@ -3021,7 +3009,23 @@
           <w:rFonts w:ascii="Arial" w:eastAsia="Arial" w:hAnsi="Arial" w:cs="Arial"/>
           <w:color w:val="2E75B6"/>
         </w:rPr>
-        <w:t xml:space="preserve"> → CD deploys to Render → Live TaskFlow updated with the new page.</w:t>
+        <w:t xml:space="preserve"> → CD deploys to Render → Live </w:t>
+      </w:r>
+      <w:proofErr w:type="spellStart"/>
+      <w:r>
+        <w:rPr>
+          <w:rFonts w:ascii="Arial" w:eastAsia="Arial" w:hAnsi="Arial" w:cs="Arial"/>
+          <w:color w:val="2E75B6"/>
+        </w:rPr>
+        <w:t>TaskFlow</w:t>
+      </w:r>
+      <w:proofErr w:type="spellEnd"/>
+      <w:r>
+        <w:rPr>
+          <w:rFonts w:ascii="Arial" w:eastAsia="Arial" w:hAnsi="Arial" w:cs="Arial"/>
+          <w:color w:val="2E75B6"/>
+        </w:rPr>
+        <w:t xml:space="preserve"> updated with the new page.</w:t>
       </w:r>
     </w:p>
     <w:p>
@@ -3058,23 +3062,7 @@
           <w:rFonts w:ascii="Arial" w:eastAsia="Arial" w:hAnsi="Arial" w:cs="Arial"/>
           <w:color w:val="000000"/>
         </w:rPr>
-        <w:t xml:space="preserve">The Team Lead must complete the </w:t>
-      </w:r>
-      <w:proofErr w:type="gramStart"/>
-      <w:r>
-        <w:rPr>
-          <w:rFonts w:ascii="Arial" w:eastAsia="Arial" w:hAnsi="Arial" w:cs="Arial"/>
-          <w:color w:val="000000"/>
-        </w:rPr>
-        <w:t>following setup</w:t>
-      </w:r>
-      <w:proofErr w:type="gramEnd"/>
-      <w:r>
-        <w:rPr>
-          <w:rFonts w:ascii="Arial" w:eastAsia="Arial" w:hAnsi="Arial" w:cs="Arial"/>
-          <w:color w:val="000000"/>
-        </w:rPr>
-        <w:t xml:space="preserve"> steps before the team starts working:</w:t>
+        <w:t>The Team Lead must complete the following setup steps before the team starts working:</w:t>
       </w:r>
     </w:p>
     <w:p>
@@ -3091,7 +3079,23 @@
           <w:rFonts w:ascii="Arial" w:eastAsia="Arial" w:hAnsi="Arial" w:cs="Arial"/>
           <w:color w:val="000000"/>
         </w:rPr>
-        <w:t>Create a new public GitHub repository named taskflow-cicd (or a name agreed by the team). Do NOT clone or fork any existing repository.</w:t>
+        <w:t xml:space="preserve">Create a new public GitHub repository named </w:t>
+      </w:r>
+      <w:proofErr w:type="spellStart"/>
+      <w:r>
+        <w:rPr>
+          <w:rFonts w:ascii="Arial" w:eastAsia="Arial" w:hAnsi="Arial" w:cs="Arial"/>
+          <w:color w:val="000000"/>
+        </w:rPr>
+        <w:t>taskflow-cicd</w:t>
+      </w:r>
+      <w:proofErr w:type="spellEnd"/>
+      <w:r>
+        <w:rPr>
+          <w:rFonts w:ascii="Arial" w:eastAsia="Arial" w:hAnsi="Arial" w:cs="Arial"/>
+          <w:color w:val="000000"/>
+        </w:rPr>
+        <w:t xml:space="preserve"> (or a name agreed by the team). Do NOT clone or fork any existing repository.</w:t>
       </w:r>
     </w:p>
     <w:p>
@@ -3170,23 +3174,7 @@
           <w:rFonts w:ascii="Arial" w:eastAsia="Arial" w:hAnsi="Arial" w:cs="Arial"/>
           <w:color w:val="000000"/>
         </w:rPr>
-        <w:t xml:space="preserve">Team Lead: Sign up </w:t>
-      </w:r>
-      <w:proofErr w:type="gramStart"/>
-      <w:r>
-        <w:rPr>
-          <w:rFonts w:ascii="Arial" w:eastAsia="Arial" w:hAnsi="Arial" w:cs="Arial"/>
-          <w:color w:val="000000"/>
-        </w:rPr>
-        <w:t>on</w:t>
-      </w:r>
-      <w:proofErr w:type="gramEnd"/>
-      <w:r>
-        <w:rPr>
-          <w:rFonts w:ascii="Arial" w:eastAsia="Arial" w:hAnsi="Arial" w:cs="Arial"/>
-          <w:color w:val="000000"/>
-        </w:rPr>
-        <w:t xml:space="preserve"> Render (render.com), create a new Web Service connected to the Docker Hub image repository, and copy the deploy hook URL from the Render service settings. This URL will be stored as the RENDER_DEPLOY_HOOK_URL secret.</w:t>
+        <w:t>Team Lead: Sign up on Render (render.com), create a new Web Service connected to the Docker Hub image repository, and copy the deploy hook URL from the Render service settings. This URL will be stored as the RENDER_DEPLOY_HOOK_URL secret.</w:t>
       </w:r>
     </w:p>
     <w:p>
@@ -3392,17 +3380,7 @@
                 <w:sz w:val="18"/>
                 <w:szCs w:val="18"/>
               </w:rPr>
-              <w:t xml:space="preserve">Home / Dashboard </w:t>
-            </w:r>
-            <w:proofErr w:type="gramStart"/>
-            <w:r>
-              <w:rPr>
-                <w:rFonts w:ascii="Arial" w:eastAsia="Arial" w:hAnsi="Arial" w:cs="Arial"/>
-                <w:color w:val="000000"/>
-                <w:sz w:val="18"/>
-                <w:szCs w:val="18"/>
-              </w:rPr>
-              <w:t xml:space="preserve">page </w:t>
+              <w:t xml:space="preserve">Home / Dashboard page </w:t>
             </w:r>
             <w:r>
               <w:rPr>
@@ -3413,7 +3391,6 @@
               </w:rPr>
               <w:t>,</w:t>
             </w:r>
-            <w:proofErr w:type="gramEnd"/>
             <w:r>
               <w:rPr>
                 <w:rFonts w:ascii="Arial" w:eastAsia="Arial" w:hAnsi="Arial" w:cs="Arial"/>
@@ -3485,17 +3462,7 @@
                 <w:sz w:val="18"/>
                 <w:szCs w:val="18"/>
               </w:rPr>
-              <w:t xml:space="preserve">Add Task </w:t>
-            </w:r>
-            <w:proofErr w:type="gramStart"/>
-            <w:r>
-              <w:rPr>
-                <w:rFonts w:ascii="Arial" w:eastAsia="Arial" w:hAnsi="Arial" w:cs="Arial"/>
-                <w:color w:val="000000"/>
-                <w:sz w:val="18"/>
-                <w:szCs w:val="18"/>
-              </w:rPr>
-              <w:t xml:space="preserve">page </w:t>
+              <w:t xml:space="preserve">Add Task page </w:t>
             </w:r>
             <w:r>
               <w:rPr>
@@ -3506,7 +3473,6 @@
               </w:rPr>
               <w:t>,</w:t>
             </w:r>
-            <w:proofErr w:type="gramEnd"/>
             <w:r>
               <w:rPr>
                 <w:rFonts w:ascii="Arial" w:eastAsia="Arial" w:hAnsi="Arial" w:cs="Arial"/>
@@ -3578,17 +3544,7 @@
                 <w:sz w:val="18"/>
                 <w:szCs w:val="18"/>
               </w:rPr>
-              <w:t xml:space="preserve">Task List </w:t>
-            </w:r>
-            <w:proofErr w:type="gramStart"/>
-            <w:r>
-              <w:rPr>
-                <w:rFonts w:ascii="Arial" w:eastAsia="Arial" w:hAnsi="Arial" w:cs="Arial"/>
-                <w:color w:val="000000"/>
-                <w:sz w:val="18"/>
-                <w:szCs w:val="18"/>
-              </w:rPr>
-              <w:t xml:space="preserve">page </w:t>
+              <w:t xml:space="preserve">Task List page </w:t>
             </w:r>
             <w:r>
               <w:rPr>
@@ -3599,7 +3555,6 @@
               </w:rPr>
               <w:t>,</w:t>
             </w:r>
-            <w:proofErr w:type="gramEnd"/>
             <w:r>
               <w:rPr>
                 <w:rFonts w:ascii="Arial" w:eastAsia="Arial" w:hAnsi="Arial" w:cs="Arial"/>
@@ -3671,17 +3626,7 @@
                 <w:sz w:val="18"/>
                 <w:szCs w:val="18"/>
               </w:rPr>
-              <w:t xml:space="preserve">Task Detail </w:t>
-            </w:r>
-            <w:proofErr w:type="gramStart"/>
-            <w:r>
-              <w:rPr>
-                <w:rFonts w:ascii="Arial" w:eastAsia="Arial" w:hAnsi="Arial" w:cs="Arial"/>
-                <w:color w:val="000000"/>
-                <w:sz w:val="18"/>
-                <w:szCs w:val="18"/>
-              </w:rPr>
-              <w:t xml:space="preserve">page </w:t>
+              <w:t xml:space="preserve">Task Detail page </w:t>
             </w:r>
             <w:r>
               <w:rPr>
@@ -3692,7 +3637,6 @@
               </w:rPr>
               <w:t>,</w:t>
             </w:r>
-            <w:proofErr w:type="gramEnd"/>
             <w:r>
               <w:rPr>
                 <w:rFonts w:ascii="Arial" w:eastAsia="Arial" w:hAnsi="Arial" w:cs="Arial"/>
@@ -3764,17 +3708,7 @@
                 <w:sz w:val="18"/>
                 <w:szCs w:val="18"/>
               </w:rPr>
-              <w:t xml:space="preserve">About / Help </w:t>
-            </w:r>
-            <w:proofErr w:type="gramStart"/>
-            <w:r>
-              <w:rPr>
-                <w:rFonts w:ascii="Arial" w:eastAsia="Arial" w:hAnsi="Arial" w:cs="Arial"/>
-                <w:color w:val="000000"/>
-                <w:sz w:val="18"/>
-                <w:szCs w:val="18"/>
-              </w:rPr>
-              <w:t xml:space="preserve">page </w:t>
+              <w:t xml:space="preserve">About / Help page </w:t>
             </w:r>
             <w:r>
               <w:rPr>
@@ -3785,7 +3719,6 @@
               </w:rPr>
               <w:t>,</w:t>
             </w:r>
-            <w:proofErr w:type="gramEnd"/>
             <w:r>
               <w:rPr>
                 <w:rFonts w:ascii="Arial" w:eastAsia="Arial" w:hAnsi="Arial" w:cs="Arial"/>
@@ -3857,17 +3790,7 @@
                 <w:sz w:val="18"/>
                 <w:szCs w:val="18"/>
               </w:rPr>
-              <w:t xml:space="preserve">Shared </w:t>
-            </w:r>
-            <w:proofErr w:type="gramStart"/>
-            <w:r>
-              <w:rPr>
-                <w:rFonts w:ascii="Arial" w:eastAsia="Arial" w:hAnsi="Arial" w:cs="Arial"/>
-                <w:color w:val="000000"/>
-                <w:sz w:val="18"/>
-                <w:szCs w:val="18"/>
-              </w:rPr>
-              <w:t xml:space="preserve">stylesheet </w:t>
+              <w:t xml:space="preserve">Shared stylesheet </w:t>
             </w:r>
             <w:r>
               <w:rPr>
@@ -3878,7 +3801,6 @@
               </w:rPr>
               <w:t>,</w:t>
             </w:r>
-            <w:proofErr w:type="gramEnd"/>
             <w:r>
               <w:rPr>
                 <w:rFonts w:ascii="Arial" w:eastAsia="Arial" w:hAnsi="Arial" w:cs="Arial"/>
@@ -3911,6 +3833,7 @@
             <w:vAlign w:val="center"/>
           </w:tcPr>
           <w:p>
+            <w:proofErr w:type="spellStart"/>
             <w:r>
               <w:rPr>
                 <w:rFonts w:ascii="Arial" w:eastAsia="Arial" w:hAnsi="Arial" w:cs="Arial"/>
@@ -3922,6 +3845,7 @@
               </w:rPr>
               <w:t>Dockerfile</w:t>
             </w:r>
+            <w:proofErr w:type="spellEnd"/>
           </w:p>
         </w:tc>
         <w:tc>
@@ -3943,14 +3867,25 @@
             <w:vAlign w:val="center"/>
           </w:tcPr>
           <w:p>
-            <w:r>
-              <w:rPr>
-                <w:rFonts w:ascii="Arial" w:eastAsia="Arial" w:hAnsi="Arial" w:cs="Arial"/>
-                <w:color w:val="000000"/>
-                <w:sz w:val="18"/>
-                <w:szCs w:val="18"/>
-              </w:rPr>
-              <w:t>Dockerfile to containerize the application (nginx-based)</w:t>
+            <w:proofErr w:type="spellStart"/>
+            <w:r>
+              <w:rPr>
+                <w:rFonts w:ascii="Arial" w:eastAsia="Arial" w:hAnsi="Arial" w:cs="Arial"/>
+                <w:color w:val="000000"/>
+                <w:sz w:val="18"/>
+                <w:szCs w:val="18"/>
+              </w:rPr>
+              <w:t>Dockerfile</w:t>
+            </w:r>
+            <w:proofErr w:type="spellEnd"/>
+            <w:r>
+              <w:rPr>
+                <w:rFonts w:ascii="Arial" w:eastAsia="Arial" w:hAnsi="Arial" w:cs="Arial"/>
+                <w:color w:val="000000"/>
+                <w:sz w:val="18"/>
+                <w:szCs w:val="18"/>
+              </w:rPr>
+              <w:t xml:space="preserve"> to containerize the application (nginx-based)</w:t>
             </w:r>
           </w:p>
         </w:tc>
@@ -3984,8 +3919,46 @@
                 <w:sz w:val="18"/>
                 <w:szCs w:val="18"/>
               </w:rPr>
-              <w:t>.github/workflows/ci.yml</w:t>
-            </w:r>
+              <w:lastRenderedPageBreak/>
+              <w:t>.</w:t>
+            </w:r>
+            <w:proofErr w:type="spellStart"/>
+            <w:r>
+              <w:rPr>
+                <w:rFonts w:ascii="Arial" w:eastAsia="Arial" w:hAnsi="Arial" w:cs="Arial"/>
+                <w:b/>
+                <w:bCs/>
+                <w:color w:val="000000"/>
+                <w:sz w:val="18"/>
+                <w:szCs w:val="18"/>
+              </w:rPr>
+              <w:t>github</w:t>
+            </w:r>
+            <w:proofErr w:type="spellEnd"/>
+            <w:r>
+              <w:rPr>
+                <w:rFonts w:ascii="Arial" w:eastAsia="Arial" w:hAnsi="Arial" w:cs="Arial"/>
+                <w:b/>
+                <w:bCs/>
+                <w:color w:val="000000"/>
+                <w:sz w:val="18"/>
+                <w:szCs w:val="18"/>
+              </w:rPr>
+              <w:t>/workflows/</w:t>
+            </w:r>
+            <w:proofErr w:type="spellStart"/>
+            <w:r>
+              <w:rPr>
+                <w:rFonts w:ascii="Arial" w:eastAsia="Arial" w:hAnsi="Arial" w:cs="Arial"/>
+                <w:b/>
+                <w:bCs/>
+                <w:color w:val="000000"/>
+                <w:sz w:val="18"/>
+                <w:szCs w:val="18"/>
+              </w:rPr>
+              <w:t>ci.yml</w:t>
+            </w:r>
+            <w:proofErr w:type="spellEnd"/>
           </w:p>
         </w:tc>
         <w:tc>
@@ -4057,8 +4030,45 @@
                 <w:sz w:val="18"/>
                 <w:szCs w:val="18"/>
               </w:rPr>
-              <w:t>.github/workflows/cd.yml</w:t>
-            </w:r>
+              <w:t>.</w:t>
+            </w:r>
+            <w:proofErr w:type="spellStart"/>
+            <w:r>
+              <w:rPr>
+                <w:rFonts w:ascii="Arial" w:eastAsia="Arial" w:hAnsi="Arial" w:cs="Arial"/>
+                <w:b/>
+                <w:bCs/>
+                <w:color w:val="000000"/>
+                <w:sz w:val="18"/>
+                <w:szCs w:val="18"/>
+              </w:rPr>
+              <w:t>github</w:t>
+            </w:r>
+            <w:proofErr w:type="spellEnd"/>
+            <w:r>
+              <w:rPr>
+                <w:rFonts w:ascii="Arial" w:eastAsia="Arial" w:hAnsi="Arial" w:cs="Arial"/>
+                <w:b/>
+                <w:bCs/>
+                <w:color w:val="000000"/>
+                <w:sz w:val="18"/>
+                <w:szCs w:val="18"/>
+              </w:rPr>
+              <w:t>/workflows/</w:t>
+            </w:r>
+            <w:proofErr w:type="spellStart"/>
+            <w:r>
+              <w:rPr>
+                <w:rFonts w:ascii="Arial" w:eastAsia="Arial" w:hAnsi="Arial" w:cs="Arial"/>
+                <w:b/>
+                <w:bCs/>
+                <w:color w:val="000000"/>
+                <w:sz w:val="18"/>
+                <w:szCs w:val="18"/>
+              </w:rPr>
+              <w:t>cd.yml</w:t>
+            </w:r>
+            <w:proofErr w:type="spellEnd"/>
           </w:p>
         </w:tc>
         <w:tc>
@@ -4130,7 +4140,6 @@
                 <w:sz w:val="18"/>
                 <w:szCs w:val="18"/>
               </w:rPr>
-              <w:lastRenderedPageBreak/>
               <w:t>Assignment_04_Spring2026.docx</w:t>
             </w:r>
           </w:p>
@@ -4201,31 +4210,7 @@
           <w:rFonts w:ascii="Arial" w:eastAsia="Arial" w:hAnsi="Arial" w:cs="Arial"/>
           <w:color w:val="000000"/>
         </w:rPr>
-        <w:t xml:space="preserve">The Team Lead (TL) is responsible for creating all secrets listed below. </w:t>
-      </w:r>
-      <w:proofErr w:type="gramStart"/>
-      <w:r>
-        <w:rPr>
-          <w:rFonts w:ascii="Arial" w:eastAsia="Arial" w:hAnsi="Arial" w:cs="Arial"/>
-          <w:color w:val="000000"/>
-        </w:rPr>
-        <w:t>The TL</w:t>
-      </w:r>
-      <w:proofErr w:type="gramEnd"/>
-      <w:r>
-        <w:rPr>
-          <w:rFonts w:ascii="Arial" w:eastAsia="Arial" w:hAnsi="Arial" w:cs="Arial"/>
-          <w:color w:val="000000"/>
-        </w:rPr>
-        <w:t xml:space="preserve"> is the repository admin and the credentials in </w:t>
-      </w:r>
-      <w:proofErr w:type="gramStart"/>
-      <w:r>
-        <w:rPr>
-          <w:rFonts w:ascii="Arial" w:eastAsia="Arial" w:hAnsi="Arial" w:cs="Arial"/>
-          <w:color w:val="000000"/>
-        </w:rPr>
-        <w:t xml:space="preserve">use </w:t>
+        <w:t xml:space="preserve">The Team Lead (TL) is responsible for creating all secrets listed below. The TL is the repository admin and the credentials in use </w:t>
       </w:r>
       <w:r>
         <w:rPr>
@@ -4234,21 +4219,12 @@
         </w:rPr>
         <w:t>,</w:t>
       </w:r>
-      <w:proofErr w:type="gramEnd"/>
-      <w:r>
-        <w:rPr>
-          <w:rFonts w:ascii="Arial" w:eastAsia="Arial" w:hAnsi="Arial" w:cs="Arial"/>
-          <w:color w:val="000000"/>
-        </w:rPr>
-        <w:t xml:space="preserve"> Docker Hub and </w:t>
-      </w:r>
-      <w:proofErr w:type="gramStart"/>
-      <w:r>
-        <w:rPr>
-          <w:rFonts w:ascii="Arial" w:eastAsia="Arial" w:hAnsi="Arial" w:cs="Arial"/>
-          <w:color w:val="000000"/>
-        </w:rPr>
-        <w:t xml:space="preserve">Render </w:t>
+      <w:r>
+        <w:rPr>
+          <w:rFonts w:ascii="Arial" w:eastAsia="Arial" w:hAnsi="Arial" w:cs="Arial"/>
+          <w:color w:val="000000"/>
+        </w:rPr>
+        <w:t xml:space="preserve"> Docker Hub and Render </w:t>
       </w:r>
       <w:r>
         <w:rPr>
@@ -4257,7 +4233,6 @@
         </w:rPr>
         <w:t>,</w:t>
       </w:r>
-      <w:proofErr w:type="gramEnd"/>
       <w:r>
         <w:rPr>
           <w:rFonts w:ascii="Arial" w:eastAsia="Arial" w:hAnsi="Arial" w:cs="Arial"/>
@@ -4674,17 +4649,7 @@
                 <w:sz w:val="18"/>
                 <w:szCs w:val="18"/>
               </w:rPr>
-              <w:t>Team Lead's Docker Hub Personal Access Token (PAT</w:t>
-            </w:r>
-            <w:proofErr w:type="gramStart"/>
-            <w:r>
-              <w:rPr>
-                <w:rFonts w:ascii="Arial" w:eastAsia="Arial" w:hAnsi="Arial" w:cs="Arial"/>
-                <w:color w:val="000000"/>
-                <w:sz w:val="18"/>
-                <w:szCs w:val="18"/>
-              </w:rPr>
-              <w:t xml:space="preserve">) </w:t>
+              <w:t xml:space="preserve">Team Lead's Docker Hub Personal Access Token (PAT) </w:t>
             </w:r>
             <w:r>
               <w:rPr>
@@ -4695,7 +4660,6 @@
               </w:rPr>
               <w:t>,</w:t>
             </w:r>
-            <w:proofErr w:type="gramEnd"/>
             <w:r>
               <w:rPr>
                 <w:rFonts w:ascii="Arial" w:eastAsia="Arial" w:hAnsi="Arial" w:cs="Arial"/>
@@ -4820,27 +4784,7 @@
           <w:sz w:val="18"/>
           <w:szCs w:val="18"/>
         </w:rPr>
-        <w:t xml:space="preserve">All three secrets must be created by the Team Lead, as </w:t>
-      </w:r>
-      <w:proofErr w:type="gramStart"/>
-      <w:r>
-        <w:rPr>
-          <w:rFonts w:ascii="Arial" w:eastAsia="Arial" w:hAnsi="Arial" w:cs="Arial"/>
-          <w:color w:val="555555"/>
-          <w:sz w:val="18"/>
-          <w:szCs w:val="18"/>
-        </w:rPr>
-        <w:t>the TL</w:t>
-      </w:r>
-      <w:proofErr w:type="gramEnd"/>
-      <w:r>
-        <w:rPr>
-          <w:rFonts w:ascii="Arial" w:eastAsia="Arial" w:hAnsi="Arial" w:cs="Arial"/>
-          <w:color w:val="555555"/>
-          <w:sz w:val="18"/>
-          <w:szCs w:val="18"/>
-        </w:rPr>
-        <w:t xml:space="preserve"> is the repository admin and the credentials belong to them. DOCKERHUB_USERNAME and DOCKERHUB_TOKEN must be the Team Lead's own Docker Hub credentials, added as repository-level secrets (Settings → Secrets and variables → Actions → Repository secrets). RENDER_DEPLOY_HOOK_URL is obtained from the Render web service set up by the Team Lead and must be added as an environment-level secret inside the </w:t>
+        <w:t xml:space="preserve">All three secrets must be created by the Team Lead, as the TL is the repository admin and the credentials belong to them. DOCKERHUB_USERNAME and DOCKERHUB_TOKEN must be the Team Lead's own Docker Hub credentials, added as repository-level secrets (Settings → Secrets and variables → Actions → Repository secrets). RENDER_DEPLOY_HOOK_URL is obtained from the Render web service set up by the Team Lead and must be added as an environment-level secret inside the </w:t>
       </w:r>
       <w:r>
         <w:rPr>
@@ -4882,9 +4826,9 @@
           <w:sz w:val="28"/>
           <w:szCs w:val="28"/>
         </w:rPr>
-        <w:t xml:space="preserve">CI PIPELINE </w:t>
-      </w:r>
-      <w:proofErr w:type="gramStart"/>
+        <w:t>CI PIPELINE REQUIREMENTS  (.</w:t>
+      </w:r>
+      <w:proofErr w:type="spellStart"/>
       <w:r>
         <w:rPr>
           <w:rFonts w:ascii="Arial" w:eastAsia="Arial" w:hAnsi="Arial" w:cs="Arial"/>
@@ -4894,9 +4838,9 @@
           <w:sz w:val="28"/>
           <w:szCs w:val="28"/>
         </w:rPr>
-        <w:t>REQUIREMENTS  (</w:t>
-      </w:r>
-      <w:proofErr w:type="gramEnd"/>
+        <w:t>github</w:t>
+      </w:r>
+      <w:proofErr w:type="spellEnd"/>
       <w:r>
         <w:rPr>
           <w:rFonts w:ascii="Arial" w:eastAsia="Arial" w:hAnsi="Arial" w:cs="Arial"/>
@@ -4906,7 +4850,31 @@
           <w:sz w:val="28"/>
           <w:szCs w:val="28"/>
         </w:rPr>
-        <w:t>.github/workflows/ci.yml)</w:t>
+        <w:t>/workflows/</w:t>
+      </w:r>
+      <w:proofErr w:type="spellStart"/>
+      <w:r>
+        <w:rPr>
+          <w:rFonts w:ascii="Arial" w:eastAsia="Arial" w:hAnsi="Arial" w:cs="Arial"/>
+          <w:b/>
+          <w:bCs/>
+          <w:color w:val="1F3864"/>
+          <w:sz w:val="28"/>
+          <w:szCs w:val="28"/>
+        </w:rPr>
+        <w:t>ci.yml</w:t>
+      </w:r>
+      <w:proofErr w:type="spellEnd"/>
+      <w:r>
+        <w:rPr>
+          <w:rFonts w:ascii="Arial" w:eastAsia="Arial" w:hAnsi="Arial" w:cs="Arial"/>
+          <w:b/>
+          <w:bCs/>
+          <w:color w:val="1F3864"/>
+          <w:sz w:val="28"/>
+          <w:szCs w:val="28"/>
+        </w:rPr>
+        <w:t>)</w:t>
       </w:r>
     </w:p>
     <w:p>
@@ -4921,7 +4889,27 @@
           <w:bCs/>
           <w:color w:val="000000"/>
         </w:rPr>
-        <w:t xml:space="preserve">Trigger: The CI workflow must be triggered by a pull_request event targeting the </w:t>
+        <w:t xml:space="preserve">Trigger: The CI workflow must be triggered by a </w:t>
+      </w:r>
+      <w:proofErr w:type="spellStart"/>
+      <w:r>
+        <w:rPr>
+          <w:rFonts w:ascii="Arial" w:eastAsia="Arial" w:hAnsi="Arial" w:cs="Arial"/>
+          <w:b/>
+          <w:bCs/>
+          <w:color w:val="000000"/>
+        </w:rPr>
+        <w:t>pull_request</w:t>
+      </w:r>
+      <w:proofErr w:type="spellEnd"/>
+      <w:r>
+        <w:rPr>
+          <w:rFonts w:ascii="Arial" w:eastAsia="Arial" w:hAnsi="Arial" w:cs="Arial"/>
+          <w:b/>
+          <w:bCs/>
+          <w:color w:val="000000"/>
+        </w:rPr>
+        <w:t xml:space="preserve"> event targeting the </w:t>
       </w:r>
       <w:r>
         <w:rPr>
@@ -5008,7 +4996,23 @@
           <w:rFonts w:ascii="Arial" w:eastAsia="Arial" w:hAnsi="Arial" w:cs="Arial"/>
           <w:color w:val="000000"/>
         </w:rPr>
-        <w:t>Step 3 – Build Image: Build the Docker image from the Dockerfile in the project root.</w:t>
+        <w:t xml:space="preserve">Step 3 – Build Image: Build the Docker image from the </w:t>
+      </w:r>
+      <w:proofErr w:type="spellStart"/>
+      <w:r>
+        <w:rPr>
+          <w:rFonts w:ascii="Arial" w:eastAsia="Arial" w:hAnsi="Arial" w:cs="Arial"/>
+          <w:color w:val="000000"/>
+        </w:rPr>
+        <w:t>Dockerfile</w:t>
+      </w:r>
+      <w:proofErr w:type="spellEnd"/>
+      <w:r>
+        <w:rPr>
+          <w:rFonts w:ascii="Arial" w:eastAsia="Arial" w:hAnsi="Arial" w:cs="Arial"/>
+          <w:color w:val="000000"/>
+        </w:rPr>
+        <w:t xml:space="preserve"> in the project root.</w:t>
       </w:r>
     </w:p>
     <w:p>
@@ -5025,15 +5029,7 @@
           <w:rFonts w:ascii="Arial" w:eastAsia="Arial" w:hAnsi="Arial" w:cs="Arial"/>
           <w:color w:val="000000"/>
         </w:rPr>
-        <w:t xml:space="preserve">Step 4 – Tag Image: Tag the image using a meaningful </w:t>
-      </w:r>
-      <w:proofErr w:type="gramStart"/>
-      <w:r>
-        <w:rPr>
-          <w:rFonts w:ascii="Arial" w:eastAsia="Arial" w:hAnsi="Arial" w:cs="Arial"/>
-          <w:color w:val="000000"/>
-        </w:rPr>
-        <w:t xml:space="preserve">strategy </w:t>
+        <w:t xml:space="preserve">Step 4 – Tag Image: Tag the image using a meaningful strategy </w:t>
       </w:r>
       <w:r>
         <w:rPr>
@@ -5042,13 +5038,28 @@
         </w:rPr>
         <w:t>,</w:t>
       </w:r>
-      <w:proofErr w:type="gramEnd"/>
-      <w:r>
-        <w:rPr>
-          <w:rFonts w:ascii="Arial" w:eastAsia="Arial" w:hAnsi="Arial" w:cs="Arial"/>
-          <w:color w:val="000000"/>
-        </w:rPr>
-        <w:t xml:space="preserve"> at minimum the 'latest' tag; optionally also tag with the short commit SHA (github.sha).</w:t>
+      <w:r>
+        <w:rPr>
+          <w:rFonts w:ascii="Arial" w:eastAsia="Arial" w:hAnsi="Arial" w:cs="Arial"/>
+          <w:color w:val="000000"/>
+        </w:rPr>
+        <w:t xml:space="preserve"> at minimum the 'latest' tag; optionally also tag with the short commit SHA (</w:t>
+      </w:r>
+      <w:proofErr w:type="spellStart"/>
+      <w:r>
+        <w:rPr>
+          <w:rFonts w:ascii="Arial" w:eastAsia="Arial" w:hAnsi="Arial" w:cs="Arial"/>
+          <w:color w:val="000000"/>
+        </w:rPr>
+        <w:t>github.sha</w:t>
+      </w:r>
+      <w:proofErr w:type="spellEnd"/>
+      <w:r>
+        <w:rPr>
+          <w:rFonts w:ascii="Arial" w:eastAsia="Arial" w:hAnsi="Arial" w:cs="Arial"/>
+          <w:color w:val="000000"/>
+        </w:rPr>
+        <w:t>).</w:t>
       </w:r>
     </w:p>
     <w:p>
@@ -5083,6 +5094,7 @@
           <w:rFonts w:ascii="Arial" w:eastAsia="Arial" w:hAnsi="Arial" w:cs="Arial"/>
           <w:color w:val="000000"/>
         </w:rPr>
+        <w:lastRenderedPageBreak/>
         <w:t>Additional requirements:</w:t>
       </w:r>
     </w:p>
@@ -5117,7 +5129,6 @@
           <w:rFonts w:ascii="Arial" w:eastAsia="Arial" w:hAnsi="Arial" w:cs="Arial"/>
           <w:color w:val="000000"/>
         </w:rPr>
-        <w:lastRenderedPageBreak/>
         <w:t xml:space="preserve">The CI status check must appear as a required check in the Branch Protection Rules on </w:t>
       </w:r>
       <w:r>
@@ -5156,9 +5167,9 @@
           <w:sz w:val="28"/>
           <w:szCs w:val="28"/>
         </w:rPr>
-        <w:t xml:space="preserve">CD PIPELINE </w:t>
-      </w:r>
-      <w:proofErr w:type="gramStart"/>
+        <w:t>CD PIPELINE REQUIREMENTS  (.</w:t>
+      </w:r>
+      <w:proofErr w:type="spellStart"/>
       <w:r>
         <w:rPr>
           <w:rFonts w:ascii="Arial" w:eastAsia="Arial" w:hAnsi="Arial" w:cs="Arial"/>
@@ -5168,9 +5179,9 @@
           <w:sz w:val="28"/>
           <w:szCs w:val="28"/>
         </w:rPr>
-        <w:t>REQUIREMENTS  (</w:t>
-      </w:r>
-      <w:proofErr w:type="gramEnd"/>
+        <w:t>github</w:t>
+      </w:r>
+      <w:proofErr w:type="spellEnd"/>
       <w:r>
         <w:rPr>
           <w:rFonts w:ascii="Arial" w:eastAsia="Arial" w:hAnsi="Arial" w:cs="Arial"/>
@@ -5180,7 +5191,31 @@
           <w:sz w:val="28"/>
           <w:szCs w:val="28"/>
         </w:rPr>
-        <w:t>.github/workflows/cd.yml)</w:t>
+        <w:t>/workflows/</w:t>
+      </w:r>
+      <w:proofErr w:type="spellStart"/>
+      <w:r>
+        <w:rPr>
+          <w:rFonts w:ascii="Arial" w:eastAsia="Arial" w:hAnsi="Arial" w:cs="Arial"/>
+          <w:b/>
+          <w:bCs/>
+          <w:color w:val="1F3864"/>
+          <w:sz w:val="28"/>
+          <w:szCs w:val="28"/>
+        </w:rPr>
+        <w:t>cd.yml</w:t>
+      </w:r>
+      <w:proofErr w:type="spellEnd"/>
+      <w:r>
+        <w:rPr>
+          <w:rFonts w:ascii="Arial" w:eastAsia="Arial" w:hAnsi="Arial" w:cs="Arial"/>
+          <w:b/>
+          <w:bCs/>
+          <w:color w:val="1F3864"/>
+          <w:sz w:val="28"/>
+          <w:szCs w:val="28"/>
+        </w:rPr>
+        <w:t>)</w:t>
       </w:r>
     </w:p>
     <w:p>
@@ -5300,23 +5335,7 @@
           <w:rFonts w:ascii="Arial" w:eastAsia="Arial" w:hAnsi="Arial" w:cs="Arial"/>
           <w:color w:val="000000"/>
         </w:rPr>
-        <w:t xml:space="preserve">Step 3 – Deploy: Send an HTTP POST request to the Render </w:t>
-      </w:r>
-      <w:proofErr w:type="gramStart"/>
-      <w:r>
-        <w:rPr>
-          <w:rFonts w:ascii="Arial" w:eastAsia="Arial" w:hAnsi="Arial" w:cs="Arial"/>
-          <w:color w:val="000000"/>
-        </w:rPr>
-        <w:t>deploy</w:t>
-      </w:r>
-      <w:proofErr w:type="gramEnd"/>
-      <w:r>
-        <w:rPr>
-          <w:rFonts w:ascii="Arial" w:eastAsia="Arial" w:hAnsi="Arial" w:cs="Arial"/>
-          <w:color w:val="000000"/>
-        </w:rPr>
-        <w:t xml:space="preserve"> hook URL using curl:</w:t>
+        <w:t>Step 3 – Deploy: Send an HTTP POST request to the Render deploy hook URL using curl:</w:t>
       </w:r>
     </w:p>
     <w:p>
@@ -5334,43 +5353,25 @@
           <w:sz w:val="19"/>
           <w:szCs w:val="19"/>
         </w:rPr>
-        <w:t>curl -X POST $</w:t>
-      </w:r>
-      <w:proofErr w:type="gramStart"/>
+        <w:t xml:space="preserve">curl -X POST ${{ </w:t>
+      </w:r>
+      <w:proofErr w:type="spellStart"/>
       <w:r>
         <w:rPr>
           <w:rFonts w:ascii="Arial" w:eastAsia="Arial" w:hAnsi="Arial" w:cs="Arial"/>
           <w:sz w:val="19"/>
           <w:szCs w:val="19"/>
         </w:rPr>
-        <w:t>{{ secrets</w:t>
-      </w:r>
-      <w:proofErr w:type="gramEnd"/>
+        <w:t>secrets.RENDER_DEPLOY_HOOK_URL</w:t>
+      </w:r>
+      <w:proofErr w:type="spellEnd"/>
       <w:r>
         <w:rPr>
           <w:rFonts w:ascii="Arial" w:eastAsia="Arial" w:hAnsi="Arial" w:cs="Arial"/>
           <w:sz w:val="19"/>
           <w:szCs w:val="19"/>
         </w:rPr>
-        <w:t>.RENDER_DEPLOY_HOOK_</w:t>
-      </w:r>
-      <w:proofErr w:type="gramStart"/>
-      <w:r>
-        <w:rPr>
-          <w:rFonts w:ascii="Arial" w:eastAsia="Arial" w:hAnsi="Arial" w:cs="Arial"/>
-          <w:sz w:val="19"/>
-          <w:szCs w:val="19"/>
-        </w:rPr>
-        <w:t>URL }</w:t>
-      </w:r>
-      <w:proofErr w:type="gramEnd"/>
-      <w:r>
-        <w:rPr>
-          <w:rFonts w:ascii="Arial" w:eastAsia="Arial" w:hAnsi="Arial" w:cs="Arial"/>
-          <w:sz w:val="19"/>
-          <w:szCs w:val="19"/>
-        </w:rPr>
-        <w:t>}</w:t>
+        <w:t xml:space="preserve"> }}</w:t>
       </w:r>
     </w:p>
     <w:p>
@@ -5422,23 +5423,7 @@
           <w:rFonts w:ascii="Arial" w:eastAsia="Arial" w:hAnsi="Arial" w:cs="Arial"/>
           <w:color w:val="000000"/>
         </w:rPr>
-        <w:t xml:space="preserve">The CD workflow file must </w:t>
-      </w:r>
-      <w:proofErr w:type="gramStart"/>
-      <w:r>
-        <w:rPr>
-          <w:rFonts w:ascii="Arial" w:eastAsia="Arial" w:hAnsi="Arial" w:cs="Arial"/>
-          <w:color w:val="000000"/>
-        </w:rPr>
-        <w:t>declare</w:t>
-      </w:r>
-      <w:proofErr w:type="gramEnd"/>
-      <w:r>
-        <w:rPr>
-          <w:rFonts w:ascii="Arial" w:eastAsia="Arial" w:hAnsi="Arial" w:cs="Arial"/>
-          <w:color w:val="000000"/>
-        </w:rPr>
-        <w:t xml:space="preserve"> runs-on: ubuntu-latest.</w:t>
+        <w:t>The CD workflow file must declare runs-on: ubuntu-latest.</w:t>
       </w:r>
     </w:p>
     <w:p>
@@ -5455,15 +5440,7 @@
           <w:rFonts w:ascii="Arial" w:eastAsia="Arial" w:hAnsi="Arial" w:cs="Arial"/>
           <w:color w:val="000000"/>
         </w:rPr>
-        <w:t xml:space="preserve">The job must NOT contain any Docker build or push </w:t>
-      </w:r>
-      <w:proofErr w:type="gramStart"/>
-      <w:r>
-        <w:rPr>
-          <w:rFonts w:ascii="Arial" w:eastAsia="Arial" w:hAnsi="Arial" w:cs="Arial"/>
-          <w:color w:val="000000"/>
-        </w:rPr>
-        <w:t xml:space="preserve">steps </w:t>
+        <w:t xml:space="preserve">The job must NOT contain any Docker build or push steps </w:t>
       </w:r>
       <w:r>
         <w:rPr>
@@ -5472,7 +5449,6 @@
         </w:rPr>
         <w:t>,</w:t>
       </w:r>
-      <w:proofErr w:type="gramEnd"/>
       <w:r>
         <w:rPr>
           <w:rFonts w:ascii="Arial" w:eastAsia="Arial" w:hAnsi="Arial" w:cs="Arial"/>
@@ -5665,6 +5641,7 @@
             <w:vAlign w:val="center"/>
           </w:tcPr>
           <w:p>
+            <w:proofErr w:type="spellStart"/>
             <w:r>
               <w:rPr>
                 <w:rFonts w:ascii="Arial" w:eastAsia="Arial" w:hAnsi="Arial" w:cs="Arial"/>
@@ -5676,6 +5653,7 @@
               </w:rPr>
               <w:t>ci.yml</w:t>
             </w:r>
+            <w:proofErr w:type="spellEnd"/>
           </w:p>
         </w:tc>
         <w:tc>
@@ -5697,14 +5675,25 @@
             <w:vAlign w:val="center"/>
           </w:tcPr>
           <w:p>
-            <w:r>
-              <w:rPr>
-                <w:rFonts w:ascii="Arial" w:eastAsia="Arial" w:hAnsi="Arial" w:cs="Arial"/>
-                <w:color w:val="000000"/>
-                <w:sz w:val="18"/>
-                <w:szCs w:val="18"/>
-              </w:rPr>
-              <w:t xml:space="preserve">pull_request event targeting </w:t>
+            <w:proofErr w:type="spellStart"/>
+            <w:r>
+              <w:rPr>
+                <w:rFonts w:ascii="Arial" w:eastAsia="Arial" w:hAnsi="Arial" w:cs="Arial"/>
+                <w:color w:val="000000"/>
+                <w:sz w:val="18"/>
+                <w:szCs w:val="18"/>
+              </w:rPr>
+              <w:t>pull_request</w:t>
+            </w:r>
+            <w:proofErr w:type="spellEnd"/>
+            <w:r>
+              <w:rPr>
+                <w:rFonts w:ascii="Arial" w:eastAsia="Arial" w:hAnsi="Arial" w:cs="Arial"/>
+                <w:color w:val="000000"/>
+                <w:sz w:val="18"/>
+                <w:szCs w:val="18"/>
+              </w:rPr>
+              <w:t xml:space="preserve"> event targeting </w:t>
             </w:r>
             <w:r>
               <w:rPr>
@@ -5777,6 +5766,7 @@
             <w:vAlign w:val="center"/>
           </w:tcPr>
           <w:p>
+            <w:proofErr w:type="spellStart"/>
             <w:r>
               <w:rPr>
                 <w:rFonts w:ascii="Arial" w:eastAsia="Arial" w:hAnsi="Arial" w:cs="Arial"/>
@@ -5788,6 +5778,7 @@
               </w:rPr>
               <w:t>cd.yml</w:t>
             </w:r>
+            <w:proofErr w:type="spellEnd"/>
           </w:p>
         </w:tc>
         <w:tc>
@@ -5926,7 +5917,23 @@
           <w:rFonts w:ascii="Arial" w:eastAsia="Arial" w:hAnsi="Arial" w:cs="Arial"/>
           <w:color w:val="000000"/>
         </w:rPr>
-        <w:t>Create a new GitHub repository from scratch (taskflow-cicd or team-agreed name). Do NOT reuse any previous repository.</w:t>
+        <w:t>Create a new GitHub repository from scratch (</w:t>
+      </w:r>
+      <w:proofErr w:type="spellStart"/>
+      <w:r>
+        <w:rPr>
+          <w:rFonts w:ascii="Arial" w:eastAsia="Arial" w:hAnsi="Arial" w:cs="Arial"/>
+          <w:color w:val="000000"/>
+        </w:rPr>
+        <w:t>taskflow-cicd</w:t>
+      </w:r>
+      <w:proofErr w:type="spellEnd"/>
+      <w:r>
+        <w:rPr>
+          <w:rFonts w:ascii="Arial" w:eastAsia="Arial" w:hAnsi="Arial" w:cs="Arial"/>
+          <w:color w:val="000000"/>
+        </w:rPr>
+        <w:t xml:space="preserve"> or team-agreed name). Do NOT reuse any previous repository.</w:t>
       </w:r>
     </w:p>
     <w:p>
@@ -5943,15 +5950,7 @@
           <w:rFonts w:ascii="Arial" w:eastAsia="Arial" w:hAnsi="Arial" w:cs="Arial"/>
           <w:color w:val="000000"/>
         </w:rPr>
-        <w:t xml:space="preserve">Team Lead: Set up the initial repository </w:t>
-      </w:r>
-      <w:proofErr w:type="gramStart"/>
-      <w:r>
-        <w:rPr>
-          <w:rFonts w:ascii="Arial" w:eastAsia="Arial" w:hAnsi="Arial" w:cs="Arial"/>
-          <w:color w:val="000000"/>
-        </w:rPr>
-        <w:t xml:space="preserve">structure </w:t>
+        <w:t xml:space="preserve">Team Lead: Set up the initial repository structure </w:t>
       </w:r>
       <w:r>
         <w:rPr>
@@ -5960,7 +5959,6 @@
         </w:rPr>
         <w:t>,</w:t>
       </w:r>
-      <w:proofErr w:type="gramEnd"/>
       <w:r>
         <w:rPr>
           <w:rFonts w:ascii="Arial" w:eastAsia="Arial" w:hAnsi="Arial" w:cs="Arial"/>
@@ -5980,7 +5978,23 @@
           <w:rFonts w:ascii="Arial" w:eastAsia="Arial" w:hAnsi="Arial" w:cs="Arial"/>
           <w:color w:val="000000"/>
         </w:rPr>
-        <w:t xml:space="preserve"> branch, commit the shared style.css, Dockerfile, and a skeleton index.html (Home / Dashboard page).</w:t>
+        <w:t xml:space="preserve"> branch, commit the shared style.css, </w:t>
+      </w:r>
+      <w:proofErr w:type="spellStart"/>
+      <w:r>
+        <w:rPr>
+          <w:rFonts w:ascii="Arial" w:eastAsia="Arial" w:hAnsi="Arial" w:cs="Arial"/>
+          <w:color w:val="000000"/>
+        </w:rPr>
+        <w:t>Dockerfile</w:t>
+      </w:r>
+      <w:proofErr w:type="spellEnd"/>
+      <w:r>
+        <w:rPr>
+          <w:rFonts w:ascii="Arial" w:eastAsia="Arial" w:hAnsi="Arial" w:cs="Arial"/>
+          <w:color w:val="000000"/>
+        </w:rPr>
+        <w:t>, and a skeleton index.html (Home / Dashboard page).</w:t>
       </w:r>
     </w:p>
     <w:p>
@@ -5997,15 +6011,7 @@
           <w:rFonts w:ascii="Arial" w:eastAsia="Arial" w:hAnsi="Arial" w:cs="Arial"/>
           <w:color w:val="000000"/>
         </w:rPr>
-        <w:t xml:space="preserve">Commit the Assignment 04 question paper (.docx) to the root of the repository. Every team member must fill in their </w:t>
-      </w:r>
-      <w:proofErr w:type="gramStart"/>
-      <w:r>
-        <w:rPr>
-          <w:rFonts w:ascii="Arial" w:eastAsia="Arial" w:hAnsi="Arial" w:cs="Arial"/>
-          <w:color w:val="000000"/>
-        </w:rPr>
-        <w:t xml:space="preserve">details </w:t>
+        <w:t xml:space="preserve">Commit the Assignment 04 question paper (.docx) to the root of the repository. Every team member must fill in their details </w:t>
       </w:r>
       <w:r>
         <w:rPr>
@@ -6014,21 +6020,12 @@
         </w:rPr>
         <w:t>,</w:t>
       </w:r>
-      <w:proofErr w:type="gramEnd"/>
-      <w:r>
-        <w:rPr>
-          <w:rFonts w:ascii="Arial" w:eastAsia="Arial" w:hAnsi="Arial" w:cs="Arial"/>
-          <w:color w:val="000000"/>
-        </w:rPr>
-        <w:t xml:space="preserve"> including their Assigned </w:t>
-      </w:r>
-      <w:proofErr w:type="gramStart"/>
-      <w:r>
-        <w:rPr>
-          <w:rFonts w:ascii="Arial" w:eastAsia="Arial" w:hAnsi="Arial" w:cs="Arial"/>
-          <w:color w:val="000000"/>
-        </w:rPr>
-        <w:t xml:space="preserve">Page </w:t>
+      <w:r>
+        <w:rPr>
+          <w:rFonts w:ascii="Arial" w:eastAsia="Arial" w:hAnsi="Arial" w:cs="Arial"/>
+          <w:color w:val="000000"/>
+        </w:rPr>
+        <w:t xml:space="preserve"> including their Assigned Page </w:t>
       </w:r>
       <w:r>
         <w:rPr>
@@ -6037,29 +6034,12 @@
         </w:rPr>
         <w:t>,</w:t>
       </w:r>
-      <w:proofErr w:type="gramEnd"/>
-      <w:r>
-        <w:rPr>
-          <w:rFonts w:ascii="Arial" w:eastAsia="Arial" w:hAnsi="Arial" w:cs="Arial"/>
-          <w:color w:val="000000"/>
-        </w:rPr>
-        <w:t xml:space="preserve"> in their row in Table 1 in the </w:t>
-      </w:r>
-      <w:proofErr w:type="gramStart"/>
-      <w:r>
-        <w:rPr>
-          <w:rFonts w:ascii="Arial" w:eastAsia="Arial" w:hAnsi="Arial" w:cs="Arial"/>
-          <w:color w:val="000000"/>
-        </w:rPr>
-        <w:t>versioned</w:t>
-      </w:r>
-      <w:proofErr w:type="gramEnd"/>
-      <w:r>
-        <w:rPr>
-          <w:rFonts w:ascii="Arial" w:eastAsia="Arial" w:hAnsi="Arial" w:cs="Arial"/>
-          <w:color w:val="000000"/>
-        </w:rPr>
-        <w:t xml:space="preserve"> document.</w:t>
+      <w:r>
+        <w:rPr>
+          <w:rFonts w:ascii="Arial" w:eastAsia="Arial" w:hAnsi="Arial" w:cs="Arial"/>
+          <w:color w:val="000000"/>
+        </w:rPr>
+        <w:t xml:space="preserve"> in their row in Table 1 in the versioned document.</w:t>
       </w:r>
     </w:p>
     <w:p>
@@ -6090,15 +6070,7 @@
           <w:rFonts w:ascii="Arial" w:eastAsia="Arial" w:hAnsi="Arial" w:cs="Arial"/>
           <w:color w:val="000000"/>
         </w:rPr>
-        <w:t xml:space="preserve"> and configure all three </w:t>
-      </w:r>
-      <w:proofErr w:type="gramStart"/>
-      <w:r>
-        <w:rPr>
-          <w:rFonts w:ascii="Arial" w:eastAsia="Arial" w:hAnsi="Arial" w:cs="Arial"/>
-          <w:color w:val="000000"/>
-        </w:rPr>
-        <w:t xml:space="preserve">secrets </w:t>
+        <w:t xml:space="preserve"> and configure all three secrets </w:t>
       </w:r>
       <w:r>
         <w:rPr>
@@ -6107,7 +6079,6 @@
         </w:rPr>
         <w:t>,</w:t>
       </w:r>
-      <w:proofErr w:type="gramEnd"/>
       <w:r>
         <w:rPr>
           <w:rFonts w:ascii="Arial" w:eastAsia="Arial" w:hAnsi="Arial" w:cs="Arial"/>
@@ -6175,15 +6146,39 @@
           <w:rFonts w:ascii="Arial" w:eastAsia="Arial" w:hAnsi="Arial" w:cs="Arial"/>
           <w:color w:val="000000"/>
         </w:rPr>
-        <w:t xml:space="preserve">Create the CI workflow at </w:t>
-      </w:r>
-      <w:proofErr w:type="gramStart"/>
-      <w:r>
-        <w:rPr>
-          <w:rFonts w:ascii="Arial" w:eastAsia="Arial" w:hAnsi="Arial" w:cs="Arial"/>
-          <w:color w:val="000000"/>
-        </w:rPr>
-        <w:t xml:space="preserve">.github/workflows/ci.yml </w:t>
+        <w:t>Create the CI workflow at .</w:t>
+      </w:r>
+      <w:proofErr w:type="spellStart"/>
+      <w:r>
+        <w:rPr>
+          <w:rFonts w:ascii="Arial" w:eastAsia="Arial" w:hAnsi="Arial" w:cs="Arial"/>
+          <w:color w:val="000000"/>
+        </w:rPr>
+        <w:t>github</w:t>
+      </w:r>
+      <w:proofErr w:type="spellEnd"/>
+      <w:r>
+        <w:rPr>
+          <w:rFonts w:ascii="Arial" w:eastAsia="Arial" w:hAnsi="Arial" w:cs="Arial"/>
+          <w:color w:val="000000"/>
+        </w:rPr>
+        <w:t>/workflows/</w:t>
+      </w:r>
+      <w:proofErr w:type="spellStart"/>
+      <w:r>
+        <w:rPr>
+          <w:rFonts w:ascii="Arial" w:eastAsia="Arial" w:hAnsi="Arial" w:cs="Arial"/>
+          <w:color w:val="000000"/>
+        </w:rPr>
+        <w:t>ci.yml</w:t>
+      </w:r>
+      <w:proofErr w:type="spellEnd"/>
+      <w:r>
+        <w:rPr>
+          <w:rFonts w:ascii="Arial" w:eastAsia="Arial" w:hAnsi="Arial" w:cs="Arial"/>
+          <w:color w:val="000000"/>
+        </w:rPr>
+        <w:t xml:space="preserve"> </w:t>
       </w:r>
       <w:r>
         <w:rPr>
@@ -6192,13 +6187,28 @@
         </w:rPr>
         <w:t>,</w:t>
       </w:r>
-      <w:proofErr w:type="gramEnd"/>
-      <w:r>
-        <w:rPr>
-          <w:rFonts w:ascii="Arial" w:eastAsia="Arial" w:hAnsi="Arial" w:cs="Arial"/>
-          <w:color w:val="000000"/>
-        </w:rPr>
-        <w:t xml:space="preserve"> triggered on pull_request targeting </w:t>
+      <w:r>
+        <w:rPr>
+          <w:rFonts w:ascii="Arial" w:eastAsia="Arial" w:hAnsi="Arial" w:cs="Arial"/>
+          <w:color w:val="000000"/>
+        </w:rPr>
+        <w:t xml:space="preserve"> triggered on </w:t>
+      </w:r>
+      <w:proofErr w:type="spellStart"/>
+      <w:r>
+        <w:rPr>
+          <w:rFonts w:ascii="Arial" w:eastAsia="Arial" w:hAnsi="Arial" w:cs="Arial"/>
+          <w:color w:val="000000"/>
+        </w:rPr>
+        <w:t>pull_request</w:t>
+      </w:r>
+      <w:proofErr w:type="spellEnd"/>
+      <w:r>
+        <w:rPr>
+          <w:rFonts w:ascii="Arial" w:eastAsia="Arial" w:hAnsi="Arial" w:cs="Arial"/>
+          <w:color w:val="000000"/>
+        </w:rPr>
+        <w:t xml:space="preserve"> targeting </w:t>
       </w:r>
       <w:r>
         <w:rPr>
@@ -6229,15 +6239,39 @@
           <w:rFonts w:ascii="Arial" w:eastAsia="Arial" w:hAnsi="Arial" w:cs="Arial"/>
           <w:color w:val="000000"/>
         </w:rPr>
-        <w:t xml:space="preserve">Create the CD workflow at </w:t>
-      </w:r>
-      <w:proofErr w:type="gramStart"/>
-      <w:r>
-        <w:rPr>
-          <w:rFonts w:ascii="Arial" w:eastAsia="Arial" w:hAnsi="Arial" w:cs="Arial"/>
-          <w:color w:val="000000"/>
-        </w:rPr>
-        <w:t xml:space="preserve">.github/workflows/cd.yml </w:t>
+        <w:t>Create the CD workflow at .</w:t>
+      </w:r>
+      <w:proofErr w:type="spellStart"/>
+      <w:r>
+        <w:rPr>
+          <w:rFonts w:ascii="Arial" w:eastAsia="Arial" w:hAnsi="Arial" w:cs="Arial"/>
+          <w:color w:val="000000"/>
+        </w:rPr>
+        <w:t>github</w:t>
+      </w:r>
+      <w:proofErr w:type="spellEnd"/>
+      <w:r>
+        <w:rPr>
+          <w:rFonts w:ascii="Arial" w:eastAsia="Arial" w:hAnsi="Arial" w:cs="Arial"/>
+          <w:color w:val="000000"/>
+        </w:rPr>
+        <w:t>/workflows/</w:t>
+      </w:r>
+      <w:proofErr w:type="spellStart"/>
+      <w:r>
+        <w:rPr>
+          <w:rFonts w:ascii="Arial" w:eastAsia="Arial" w:hAnsi="Arial" w:cs="Arial"/>
+          <w:color w:val="000000"/>
+        </w:rPr>
+        <w:t>cd.yml</w:t>
+      </w:r>
+      <w:proofErr w:type="spellEnd"/>
+      <w:r>
+        <w:rPr>
+          <w:rFonts w:ascii="Arial" w:eastAsia="Arial" w:hAnsi="Arial" w:cs="Arial"/>
+          <w:color w:val="000000"/>
+        </w:rPr>
+        <w:t xml:space="preserve"> </w:t>
       </w:r>
       <w:r>
         <w:rPr>
@@ -6246,7 +6280,6 @@
         </w:rPr>
         <w:t>,</w:t>
       </w:r>
-      <w:proofErr w:type="gramEnd"/>
       <w:r>
         <w:rPr>
           <w:rFonts w:ascii="Arial" w:eastAsia="Arial" w:hAnsi="Arial" w:cs="Arial"/>
@@ -6283,6 +6316,7 @@
           <w:rFonts w:ascii="Arial" w:eastAsia="Arial" w:hAnsi="Arial" w:cs="Arial"/>
           <w:color w:val="000000"/>
         </w:rPr>
+        <w:lastRenderedPageBreak/>
         <w:t>Each team member must independently complete the following full DevOps flow for their assigned page (refer to Table 3):</w:t>
       </w:r>
     </w:p>
@@ -6301,7 +6335,25 @@
           <w:sz w:val="19"/>
           <w:szCs w:val="19"/>
         </w:rPr>
-        <w:t>Create a feature branch: feature/&lt;github-username&gt;/&lt;page-name&gt;</w:t>
+        <w:t>Create a feature branch: feature/&lt;</w:t>
+      </w:r>
+      <w:proofErr w:type="spellStart"/>
+      <w:r>
+        <w:rPr>
+          <w:rFonts w:ascii="Arial" w:eastAsia="Arial" w:hAnsi="Arial" w:cs="Arial"/>
+          <w:sz w:val="19"/>
+          <w:szCs w:val="19"/>
+        </w:rPr>
+        <w:t>github</w:t>
+      </w:r>
+      <w:proofErr w:type="spellEnd"/>
+      <w:r>
+        <w:rPr>
+          <w:rFonts w:ascii="Arial" w:eastAsia="Arial" w:hAnsi="Arial" w:cs="Arial"/>
+          <w:sz w:val="19"/>
+          <w:szCs w:val="19"/>
+        </w:rPr>
+        <w:t>-username&gt;/&lt;page-name&gt;</w:t>
       </w:r>
     </w:p>
     <w:p>
@@ -6319,7 +6371,6 @@
           <w:sz w:val="19"/>
           <w:szCs w:val="19"/>
         </w:rPr>
-        <w:lastRenderedPageBreak/>
         <w:t>Build the assigned HTML page with proper content and link it to style.css</w:t>
       </w:r>
     </w:p>
@@ -6364,16 +6415,15 @@
           <w:sz w:val="19"/>
           <w:szCs w:val="19"/>
         </w:rPr>
-        <w:t>“develop</w:t>
-      </w:r>
-      <w:proofErr w:type="gramStart"/>
+        <w:t>“develop”</w:t>
+      </w:r>
       <w:r>
         <w:rPr>
           <w:rFonts w:ascii="Arial" w:eastAsia="Arial" w:hAnsi="Arial" w:cs="Arial"/>
           <w:sz w:val="19"/>
           <w:szCs w:val="19"/>
         </w:rPr>
-        <w:t>”</w:t>
+        <w:t xml:space="preserve"> </w:t>
       </w:r>
       <w:r>
         <w:rPr>
@@ -6381,17 +6431,8 @@
           <w:sz w:val="19"/>
           <w:szCs w:val="19"/>
         </w:rPr>
-        <w:t xml:space="preserve"> </w:t>
-      </w:r>
-      <w:r>
-        <w:rPr>
-          <w:rFonts w:ascii="Arial" w:eastAsia="Arial" w:hAnsi="Arial" w:cs="Arial"/>
-          <w:sz w:val="19"/>
-          <w:szCs w:val="19"/>
-        </w:rPr>
         <w:t>,</w:t>
       </w:r>
-      <w:proofErr w:type="gramEnd"/>
       <w:r>
         <w:rPr>
           <w:rFonts w:ascii="Arial" w:eastAsia="Arial" w:hAnsi="Arial" w:cs="Arial"/>
@@ -6416,26 +6457,16 @@
           <w:sz w:val="19"/>
           <w:szCs w:val="19"/>
         </w:rPr>
-        <w:t xml:space="preserve">Request a review; after approval the Team Lead merges the </w:t>
-      </w:r>
-      <w:proofErr w:type="gramStart"/>
+        <w:t xml:space="preserve">Request a review; after approval the Team Lead merges the PR </w:t>
+      </w:r>
       <w:r>
         <w:rPr>
           <w:rFonts w:ascii="Arial" w:eastAsia="Arial" w:hAnsi="Arial" w:cs="Arial"/>
           <w:sz w:val="19"/>
           <w:szCs w:val="19"/>
         </w:rPr>
-        <w:t xml:space="preserve">PR </w:t>
-      </w:r>
-      <w:r>
-        <w:rPr>
-          <w:rFonts w:ascii="Arial" w:eastAsia="Arial" w:hAnsi="Arial" w:cs="Arial"/>
-          <w:sz w:val="19"/>
-          <w:szCs w:val="19"/>
-        </w:rPr>
         <w:t>,</w:t>
       </w:r>
-      <w:proofErr w:type="gramEnd"/>
       <w:r>
         <w:rPr>
           <w:rFonts w:ascii="Arial" w:eastAsia="Arial" w:hAnsi="Arial" w:cs="Arial"/>
@@ -6459,23 +6490,23 @@
           <w:rFonts w:ascii="Arial" w:eastAsia="Arial" w:hAnsi="Arial" w:cs="Arial"/>
           <w:color w:val="000000"/>
         </w:rPr>
-        <w:t xml:space="preserve">After </w:t>
-      </w:r>
-      <w:proofErr w:type="gramStart"/>
-      <w:r>
-        <w:rPr>
-          <w:rFonts w:ascii="Arial" w:eastAsia="Arial" w:hAnsi="Arial" w:cs="Arial"/>
-          <w:color w:val="000000"/>
-        </w:rPr>
-        <w:t>all</w:t>
-      </w:r>
-      <w:proofErr w:type="gramEnd"/>
-      <w:r>
-        <w:rPr>
-          <w:rFonts w:ascii="Arial" w:eastAsia="Arial" w:hAnsi="Arial" w:cs="Arial"/>
-          <w:color w:val="000000"/>
-        </w:rPr>
-        <w:t xml:space="preserve"> 5 PRs are merged, verify the live TaskFlow application on Render contains all five pages and navigation between them works correctly.</w:t>
+        <w:t xml:space="preserve">After all 5 PRs are merged, verify the live </w:t>
+      </w:r>
+      <w:proofErr w:type="spellStart"/>
+      <w:r>
+        <w:rPr>
+          <w:rFonts w:ascii="Arial" w:eastAsia="Arial" w:hAnsi="Arial" w:cs="Arial"/>
+          <w:color w:val="000000"/>
+        </w:rPr>
+        <w:t>TaskFlow</w:t>
+      </w:r>
+      <w:proofErr w:type="spellEnd"/>
+      <w:r>
+        <w:rPr>
+          <w:rFonts w:ascii="Arial" w:eastAsia="Arial" w:hAnsi="Arial" w:cs="Arial"/>
+          <w:color w:val="000000"/>
+        </w:rPr>
+        <w:t xml:space="preserve"> application on Render contains all five pages and navigation between them works correctly.</w:t>
       </w:r>
     </w:p>
     <w:p>
@@ -7754,29 +7785,9 @@
                 <w:sz w:val="18"/>
                 <w:szCs w:val="18"/>
               </w:rPr>
-              <w:t>CI Pipeline – Build &amp; Push Docker Image (ci.yml)</w:t>
-            </w:r>
-          </w:p>
-        </w:tc>
-        <w:tc>
-          <w:tcPr>
-            <w:tcW w:w="2150" w:type="dxa"/>
-            <w:tcBorders>
-              <w:top w:val="single" w:sz="6" w:space="0" w:color="ADB9CA"/>
-              <w:left w:val="single" w:sz="6" w:space="0" w:color="ADB9CA"/>
-              <w:bottom w:val="single" w:sz="6" w:space="0" w:color="ADB9CA"/>
-              <w:right w:val="single" w:sz="6" w:space="0" w:color="ADB9CA"/>
-            </w:tcBorders>
-            <w:shd w:val="clear" w:color="auto" w:fill="2E75B6"/>
-            <w:tcMar>
-              <w:top w:w="80" w:type="dxa"/>
-              <w:left w:w="140" w:type="dxa"/>
-              <w:bottom w:w="80" w:type="dxa"/>
-              <w:right w:w="140" w:type="dxa"/>
-            </w:tcMar>
-            <w:vAlign w:val="center"/>
-          </w:tcPr>
-          <w:p>
+              <w:t>CI Pipeline – Build &amp; Push Docker Image (</w:t>
+            </w:r>
+            <w:proofErr w:type="spellStart"/>
             <w:r>
               <w:rPr>
                 <w:rFonts w:ascii="Arial" w:eastAsia="Arial" w:hAnsi="Arial" w:cs="Arial"/>
@@ -7786,436 +7797,9 @@
                 <w:sz w:val="18"/>
                 <w:szCs w:val="18"/>
               </w:rPr>
-              <w:t>25 Marks</w:t>
-            </w:r>
-          </w:p>
-        </w:tc>
-      </w:tr>
-      <w:tr>
-        <w:tc>
-          <w:tcPr>
-            <w:tcW w:w="700" w:type="dxa"/>
-            <w:tcBorders>
-              <w:top w:val="single" w:sz="6" w:space="0" w:color="ADB9CA"/>
-              <w:left w:val="single" w:sz="6" w:space="0" w:color="ADB9CA"/>
-              <w:bottom w:val="single" w:sz="6" w:space="0" w:color="ADB9CA"/>
-              <w:right w:val="single" w:sz="6" w:space="0" w:color="ADB9CA"/>
-            </w:tcBorders>
-            <w:shd w:val="clear" w:color="auto" w:fill="E8F0FB"/>
-            <w:tcMar>
-              <w:top w:w="80" w:type="dxa"/>
-              <w:left w:w="140" w:type="dxa"/>
-              <w:bottom w:w="80" w:type="dxa"/>
-              <w:right w:w="140" w:type="dxa"/>
-            </w:tcMar>
-            <w:vAlign w:val="center"/>
-          </w:tcPr>
-          <w:p>
-            <w:r>
-              <w:rPr>
-                <w:rFonts w:ascii="Arial" w:eastAsia="Arial" w:hAnsi="Arial" w:cs="Arial"/>
-                <w:b/>
-                <w:bCs/>
-                <w:color w:val="000000"/>
-                <w:sz w:val="18"/>
-                <w:szCs w:val="18"/>
-              </w:rPr>
-              <w:t>9</w:t>
-            </w:r>
-          </w:p>
-        </w:tc>
-        <w:tc>
-          <w:tcPr>
-            <w:tcW w:w="6510" w:type="dxa"/>
-            <w:tcBorders>
-              <w:top w:val="single" w:sz="6" w:space="0" w:color="ADB9CA"/>
-              <w:left w:val="single" w:sz="6" w:space="0" w:color="ADB9CA"/>
-              <w:bottom w:val="single" w:sz="6" w:space="0" w:color="ADB9CA"/>
-              <w:right w:val="single" w:sz="6" w:space="0" w:color="ADB9CA"/>
-            </w:tcBorders>
-            <w:shd w:val="clear" w:color="auto" w:fill="E8F0FB"/>
-            <w:tcMar>
-              <w:top w:w="80" w:type="dxa"/>
-              <w:left w:w="140" w:type="dxa"/>
-              <w:bottom w:w="80" w:type="dxa"/>
-              <w:right w:w="140" w:type="dxa"/>
-            </w:tcMar>
-            <w:vAlign w:val="center"/>
-          </w:tcPr>
-          <w:p>
-            <w:r>
-              <w:rPr>
-                <w:rFonts w:ascii="Arial" w:eastAsia="Arial" w:hAnsi="Arial" w:cs="Arial"/>
-                <w:color w:val="000000"/>
-                <w:sz w:val="18"/>
-                <w:szCs w:val="18"/>
-              </w:rPr>
-              <w:t xml:space="preserve">CI workflow file created at .github/workflows/ci.yml with correct pull_request trigger targeting </w:t>
-            </w:r>
-            <w:r>
-              <w:rPr>
-                <w:rFonts w:ascii="Arial" w:eastAsia="Arial" w:hAnsi="Arial" w:cs="Arial"/>
-                <w:color w:val="000000"/>
-                <w:sz w:val="18"/>
-                <w:szCs w:val="18"/>
-              </w:rPr>
-              <w:t>“develop”</w:t>
-            </w:r>
-          </w:p>
-        </w:tc>
-        <w:tc>
-          <w:tcPr>
-            <w:tcW w:w="2150" w:type="dxa"/>
-            <w:tcBorders>
-              <w:top w:val="single" w:sz="6" w:space="0" w:color="ADB9CA"/>
-              <w:left w:val="single" w:sz="6" w:space="0" w:color="ADB9CA"/>
-              <w:bottom w:val="single" w:sz="6" w:space="0" w:color="ADB9CA"/>
-              <w:right w:val="single" w:sz="6" w:space="0" w:color="ADB9CA"/>
-            </w:tcBorders>
-            <w:shd w:val="clear" w:color="auto" w:fill="E8F0FB"/>
-            <w:tcMar>
-              <w:top w:w="80" w:type="dxa"/>
-              <w:left w:w="140" w:type="dxa"/>
-              <w:bottom w:w="80" w:type="dxa"/>
-              <w:right w:w="140" w:type="dxa"/>
-            </w:tcMar>
-            <w:vAlign w:val="center"/>
-          </w:tcPr>
-          <w:p>
-            <w:r>
-              <w:rPr>
-                <w:rFonts w:ascii="Arial" w:eastAsia="Arial" w:hAnsi="Arial" w:cs="Arial"/>
-                <w:color w:val="000000"/>
-                <w:sz w:val="18"/>
-                <w:szCs w:val="18"/>
-              </w:rPr>
-              <w:t>07</w:t>
-            </w:r>
-          </w:p>
-        </w:tc>
-      </w:tr>
-      <w:tr>
-        <w:tc>
-          <w:tcPr>
-            <w:tcW w:w="700" w:type="dxa"/>
-            <w:tcBorders>
-              <w:top w:val="single" w:sz="6" w:space="0" w:color="ADB9CA"/>
-              <w:left w:val="single" w:sz="6" w:space="0" w:color="ADB9CA"/>
-              <w:bottom w:val="single" w:sz="6" w:space="0" w:color="ADB9CA"/>
-              <w:right w:val="single" w:sz="6" w:space="0" w:color="ADB9CA"/>
-            </w:tcBorders>
-            <w:shd w:val="clear" w:color="auto" w:fill="FFFFFF"/>
-            <w:tcMar>
-              <w:top w:w="80" w:type="dxa"/>
-              <w:left w:w="140" w:type="dxa"/>
-              <w:bottom w:w="80" w:type="dxa"/>
-              <w:right w:w="140" w:type="dxa"/>
-            </w:tcMar>
-            <w:vAlign w:val="center"/>
-          </w:tcPr>
-          <w:p>
-            <w:r>
-              <w:rPr>
-                <w:rFonts w:ascii="Arial" w:eastAsia="Arial" w:hAnsi="Arial" w:cs="Arial"/>
-                <w:b/>
-                <w:bCs/>
-                <w:color w:val="000000"/>
-                <w:sz w:val="18"/>
-                <w:szCs w:val="18"/>
-              </w:rPr>
-              <w:t>10</w:t>
-            </w:r>
-          </w:p>
-        </w:tc>
-        <w:tc>
-          <w:tcPr>
-            <w:tcW w:w="6510" w:type="dxa"/>
-            <w:tcBorders>
-              <w:top w:val="single" w:sz="6" w:space="0" w:color="ADB9CA"/>
-              <w:left w:val="single" w:sz="6" w:space="0" w:color="ADB9CA"/>
-              <w:bottom w:val="single" w:sz="6" w:space="0" w:color="ADB9CA"/>
-              <w:right w:val="single" w:sz="6" w:space="0" w:color="ADB9CA"/>
-            </w:tcBorders>
-            <w:shd w:val="clear" w:color="auto" w:fill="FFFFFF"/>
-            <w:tcMar>
-              <w:top w:w="80" w:type="dxa"/>
-              <w:left w:w="140" w:type="dxa"/>
-              <w:bottom w:w="80" w:type="dxa"/>
-              <w:right w:w="140" w:type="dxa"/>
-            </w:tcMar>
-            <w:vAlign w:val="center"/>
-          </w:tcPr>
-          <w:p>
-            <w:r>
-              <w:rPr>
-                <w:rFonts w:ascii="Arial" w:eastAsia="Arial" w:hAnsi="Arial" w:cs="Arial"/>
-                <w:color w:val="000000"/>
-                <w:sz w:val="18"/>
-                <w:szCs w:val="18"/>
-              </w:rPr>
-              <w:t>Checkout code, login to Docker Hub using Team Lead's repository secrets</w:t>
-            </w:r>
-          </w:p>
-        </w:tc>
-        <w:tc>
-          <w:tcPr>
-            <w:tcW w:w="2150" w:type="dxa"/>
-            <w:tcBorders>
-              <w:top w:val="single" w:sz="6" w:space="0" w:color="ADB9CA"/>
-              <w:left w:val="single" w:sz="6" w:space="0" w:color="ADB9CA"/>
-              <w:bottom w:val="single" w:sz="6" w:space="0" w:color="ADB9CA"/>
-              <w:right w:val="single" w:sz="6" w:space="0" w:color="ADB9CA"/>
-            </w:tcBorders>
-            <w:shd w:val="clear" w:color="auto" w:fill="FFFFFF"/>
-            <w:tcMar>
-              <w:top w:w="80" w:type="dxa"/>
-              <w:left w:w="140" w:type="dxa"/>
-              <w:bottom w:w="80" w:type="dxa"/>
-              <w:right w:w="140" w:type="dxa"/>
-            </w:tcMar>
-            <w:vAlign w:val="center"/>
-          </w:tcPr>
-          <w:p>
-            <w:r>
-              <w:rPr>
-                <w:rFonts w:ascii="Arial" w:eastAsia="Arial" w:hAnsi="Arial" w:cs="Arial"/>
-                <w:color w:val="000000"/>
-                <w:sz w:val="18"/>
-                <w:szCs w:val="18"/>
-              </w:rPr>
-              <w:t>06</w:t>
-            </w:r>
-          </w:p>
-        </w:tc>
-      </w:tr>
-      <w:tr>
-        <w:tc>
-          <w:tcPr>
-            <w:tcW w:w="700" w:type="dxa"/>
-            <w:tcBorders>
-              <w:top w:val="single" w:sz="6" w:space="0" w:color="ADB9CA"/>
-              <w:left w:val="single" w:sz="6" w:space="0" w:color="ADB9CA"/>
-              <w:bottom w:val="single" w:sz="6" w:space="0" w:color="ADB9CA"/>
-              <w:right w:val="single" w:sz="6" w:space="0" w:color="ADB9CA"/>
-            </w:tcBorders>
-            <w:shd w:val="clear" w:color="auto" w:fill="E8F0FB"/>
-            <w:tcMar>
-              <w:top w:w="80" w:type="dxa"/>
-              <w:left w:w="140" w:type="dxa"/>
-              <w:bottom w:w="80" w:type="dxa"/>
-              <w:right w:w="140" w:type="dxa"/>
-            </w:tcMar>
-            <w:vAlign w:val="center"/>
-          </w:tcPr>
-          <w:p>
-            <w:r>
-              <w:rPr>
-                <w:rFonts w:ascii="Arial" w:eastAsia="Arial" w:hAnsi="Arial" w:cs="Arial"/>
-                <w:b/>
-                <w:bCs/>
-                <w:color w:val="000000"/>
-                <w:sz w:val="18"/>
-                <w:szCs w:val="18"/>
-              </w:rPr>
-              <w:t>11</w:t>
-            </w:r>
-          </w:p>
-        </w:tc>
-        <w:tc>
-          <w:tcPr>
-            <w:tcW w:w="6510" w:type="dxa"/>
-            <w:tcBorders>
-              <w:top w:val="single" w:sz="6" w:space="0" w:color="ADB9CA"/>
-              <w:left w:val="single" w:sz="6" w:space="0" w:color="ADB9CA"/>
-              <w:bottom w:val="single" w:sz="6" w:space="0" w:color="ADB9CA"/>
-              <w:right w:val="single" w:sz="6" w:space="0" w:color="ADB9CA"/>
-            </w:tcBorders>
-            <w:shd w:val="clear" w:color="auto" w:fill="E8F0FB"/>
-            <w:tcMar>
-              <w:top w:w="80" w:type="dxa"/>
-              <w:left w:w="140" w:type="dxa"/>
-              <w:bottom w:w="80" w:type="dxa"/>
-              <w:right w:w="140" w:type="dxa"/>
-            </w:tcMar>
-            <w:vAlign w:val="center"/>
-          </w:tcPr>
-          <w:p>
-            <w:r>
-              <w:rPr>
-                <w:rFonts w:ascii="Arial" w:eastAsia="Arial" w:hAnsi="Arial" w:cs="Arial"/>
-                <w:color w:val="000000"/>
-                <w:sz w:val="18"/>
-                <w:szCs w:val="18"/>
-              </w:rPr>
-              <w:t>Build Docker image and tag correctly (latest and/or commit SHA)</w:t>
-            </w:r>
-          </w:p>
-        </w:tc>
-        <w:tc>
-          <w:tcPr>
-            <w:tcW w:w="2150" w:type="dxa"/>
-            <w:tcBorders>
-              <w:top w:val="single" w:sz="6" w:space="0" w:color="ADB9CA"/>
-              <w:left w:val="single" w:sz="6" w:space="0" w:color="ADB9CA"/>
-              <w:bottom w:val="single" w:sz="6" w:space="0" w:color="ADB9CA"/>
-              <w:right w:val="single" w:sz="6" w:space="0" w:color="ADB9CA"/>
-            </w:tcBorders>
-            <w:shd w:val="clear" w:color="auto" w:fill="E8F0FB"/>
-            <w:tcMar>
-              <w:top w:w="80" w:type="dxa"/>
-              <w:left w:w="140" w:type="dxa"/>
-              <w:bottom w:w="80" w:type="dxa"/>
-              <w:right w:w="140" w:type="dxa"/>
-            </w:tcMar>
-            <w:vAlign w:val="center"/>
-          </w:tcPr>
-          <w:p>
-            <w:r>
-              <w:rPr>
-                <w:rFonts w:ascii="Arial" w:eastAsia="Arial" w:hAnsi="Arial" w:cs="Arial"/>
-                <w:color w:val="000000"/>
-                <w:sz w:val="18"/>
-                <w:szCs w:val="18"/>
-              </w:rPr>
-              <w:t>06</w:t>
-            </w:r>
-          </w:p>
-        </w:tc>
-      </w:tr>
-      <w:tr>
-        <w:tc>
-          <w:tcPr>
-            <w:tcW w:w="700" w:type="dxa"/>
-            <w:tcBorders>
-              <w:top w:val="single" w:sz="6" w:space="0" w:color="ADB9CA"/>
-              <w:left w:val="single" w:sz="6" w:space="0" w:color="ADB9CA"/>
-              <w:bottom w:val="single" w:sz="6" w:space="0" w:color="ADB9CA"/>
-              <w:right w:val="single" w:sz="6" w:space="0" w:color="ADB9CA"/>
-            </w:tcBorders>
-            <w:shd w:val="clear" w:color="auto" w:fill="FFFFFF"/>
-            <w:tcMar>
-              <w:top w:w="80" w:type="dxa"/>
-              <w:left w:w="140" w:type="dxa"/>
-              <w:bottom w:w="80" w:type="dxa"/>
-              <w:right w:w="140" w:type="dxa"/>
-            </w:tcMar>
-            <w:vAlign w:val="center"/>
-          </w:tcPr>
-          <w:p>
-            <w:r>
-              <w:rPr>
-                <w:rFonts w:ascii="Arial" w:eastAsia="Arial" w:hAnsi="Arial" w:cs="Arial"/>
-                <w:b/>
-                <w:bCs/>
-                <w:color w:val="000000"/>
-                <w:sz w:val="18"/>
-                <w:szCs w:val="18"/>
-              </w:rPr>
-              <w:t>12</w:t>
-            </w:r>
-          </w:p>
-        </w:tc>
-        <w:tc>
-          <w:tcPr>
-            <w:tcW w:w="6510" w:type="dxa"/>
-            <w:tcBorders>
-              <w:top w:val="single" w:sz="6" w:space="0" w:color="ADB9CA"/>
-              <w:left w:val="single" w:sz="6" w:space="0" w:color="ADB9CA"/>
-              <w:bottom w:val="single" w:sz="6" w:space="0" w:color="ADB9CA"/>
-              <w:right w:val="single" w:sz="6" w:space="0" w:color="ADB9CA"/>
-            </w:tcBorders>
-            <w:shd w:val="clear" w:color="auto" w:fill="FFFFFF"/>
-            <w:tcMar>
-              <w:top w:w="80" w:type="dxa"/>
-              <w:left w:w="140" w:type="dxa"/>
-              <w:bottom w:w="80" w:type="dxa"/>
-              <w:right w:w="140" w:type="dxa"/>
-            </w:tcMar>
-            <w:vAlign w:val="center"/>
-          </w:tcPr>
-          <w:p>
-            <w:r>
-              <w:rPr>
-                <w:rFonts w:ascii="Arial" w:eastAsia="Arial" w:hAnsi="Arial" w:cs="Arial"/>
-                <w:color w:val="000000"/>
-                <w:sz w:val="18"/>
-                <w:szCs w:val="18"/>
-              </w:rPr>
-              <w:t>Push image to Docker Hub successfully; workflow exits on any step failure</w:t>
-            </w:r>
-          </w:p>
-        </w:tc>
-        <w:tc>
-          <w:tcPr>
-            <w:tcW w:w="2150" w:type="dxa"/>
-            <w:tcBorders>
-              <w:top w:val="single" w:sz="6" w:space="0" w:color="ADB9CA"/>
-              <w:left w:val="single" w:sz="6" w:space="0" w:color="ADB9CA"/>
-              <w:bottom w:val="single" w:sz="6" w:space="0" w:color="ADB9CA"/>
-              <w:right w:val="single" w:sz="6" w:space="0" w:color="ADB9CA"/>
-            </w:tcBorders>
-            <w:shd w:val="clear" w:color="auto" w:fill="FFFFFF"/>
-            <w:tcMar>
-              <w:top w:w="80" w:type="dxa"/>
-              <w:left w:w="140" w:type="dxa"/>
-              <w:bottom w:w="80" w:type="dxa"/>
-              <w:right w:w="140" w:type="dxa"/>
-            </w:tcMar>
-            <w:vAlign w:val="center"/>
-          </w:tcPr>
-          <w:p>
-            <w:r>
-              <w:rPr>
-                <w:rFonts w:ascii="Arial" w:eastAsia="Arial" w:hAnsi="Arial" w:cs="Arial"/>
-                <w:color w:val="000000"/>
-                <w:sz w:val="18"/>
-                <w:szCs w:val="18"/>
-              </w:rPr>
-              <w:t>06</w:t>
-            </w:r>
-          </w:p>
-        </w:tc>
-      </w:tr>
-      <w:tr>
-        <w:tc>
-          <w:tcPr>
-            <w:tcW w:w="700" w:type="dxa"/>
-            <w:tcBorders>
-              <w:top w:val="single" w:sz="6" w:space="0" w:color="ADB9CA"/>
-              <w:left w:val="single" w:sz="6" w:space="0" w:color="ADB9CA"/>
-              <w:bottom w:val="single" w:sz="6" w:space="0" w:color="ADB9CA"/>
-              <w:right w:val="single" w:sz="6" w:space="0" w:color="ADB9CA"/>
-            </w:tcBorders>
-            <w:shd w:val="clear" w:color="auto" w:fill="2E75B6"/>
-            <w:tcMar>
-              <w:top w:w="80" w:type="dxa"/>
-              <w:left w:w="140" w:type="dxa"/>
-              <w:bottom w:w="80" w:type="dxa"/>
-              <w:right w:w="140" w:type="dxa"/>
-            </w:tcMar>
-            <w:vAlign w:val="center"/>
-          </w:tcPr>
-          <w:p/>
-        </w:tc>
-        <w:tc>
-          <w:tcPr>
-            <w:tcW w:w="6510" w:type="dxa"/>
-            <w:tcBorders>
-              <w:top w:val="single" w:sz="6" w:space="0" w:color="ADB9CA"/>
-              <w:left w:val="single" w:sz="6" w:space="0" w:color="ADB9CA"/>
-              <w:bottom w:val="single" w:sz="6" w:space="0" w:color="ADB9CA"/>
-              <w:right w:val="single" w:sz="6" w:space="0" w:color="ADB9CA"/>
-            </w:tcBorders>
-            <w:shd w:val="clear" w:color="auto" w:fill="2E75B6"/>
-            <w:tcMar>
-              <w:top w:w="80" w:type="dxa"/>
-              <w:left w:w="140" w:type="dxa"/>
-              <w:bottom w:w="80" w:type="dxa"/>
-              <w:right w:w="140" w:type="dxa"/>
-            </w:tcMar>
-            <w:vAlign w:val="center"/>
-          </w:tcPr>
-          <w:p>
+              <w:t>ci.yml</w:t>
+            </w:r>
+            <w:proofErr w:type="spellEnd"/>
             <w:r>
               <w:rPr>
                 <w:rFonts w:ascii="Arial" w:eastAsia="Arial" w:hAnsi="Arial" w:cs="Arial"/>
@@ -8225,7 +7809,7 @@
                 <w:sz w:val="18"/>
                 <w:szCs w:val="18"/>
               </w:rPr>
-              <w:t>CD Pipeline – Automated Deployment to Render (cd.yml)</w:t>
+              <w:t>)</w:t>
             </w:r>
           </w:p>
         </w:tc>
@@ -8257,7 +7841,7 @@
                 <w:sz w:val="18"/>
                 <w:szCs w:val="18"/>
               </w:rPr>
-              <w:t>20 Marks</w:t>
+              <w:t>25 Marks</w:t>
             </w:r>
           </w:p>
         </w:tc>
@@ -8291,7 +7875,7 @@
                 <w:sz w:val="18"/>
                 <w:szCs w:val="18"/>
               </w:rPr>
-              <w:t>13</w:t>
+              <w:t>9</w:t>
             </w:r>
           </w:p>
         </w:tc>
@@ -8321,7 +7905,67 @@
                 <w:sz w:val="18"/>
                 <w:szCs w:val="18"/>
               </w:rPr>
-              <w:t xml:space="preserve">CD workflow file created at .github/workflows/cd.yml with correct push trigger on </w:t>
+              <w:t>CI workflow file created at .</w:t>
+            </w:r>
+            <w:proofErr w:type="spellStart"/>
+            <w:r>
+              <w:rPr>
+                <w:rFonts w:ascii="Arial" w:eastAsia="Arial" w:hAnsi="Arial" w:cs="Arial"/>
+                <w:color w:val="000000"/>
+                <w:sz w:val="18"/>
+                <w:szCs w:val="18"/>
+              </w:rPr>
+              <w:t>github</w:t>
+            </w:r>
+            <w:proofErr w:type="spellEnd"/>
+            <w:r>
+              <w:rPr>
+                <w:rFonts w:ascii="Arial" w:eastAsia="Arial" w:hAnsi="Arial" w:cs="Arial"/>
+                <w:color w:val="000000"/>
+                <w:sz w:val="18"/>
+                <w:szCs w:val="18"/>
+              </w:rPr>
+              <w:t>/workflows/</w:t>
+            </w:r>
+            <w:proofErr w:type="spellStart"/>
+            <w:r>
+              <w:rPr>
+                <w:rFonts w:ascii="Arial" w:eastAsia="Arial" w:hAnsi="Arial" w:cs="Arial"/>
+                <w:color w:val="000000"/>
+                <w:sz w:val="18"/>
+                <w:szCs w:val="18"/>
+              </w:rPr>
+              <w:t>ci.yml</w:t>
+            </w:r>
+            <w:proofErr w:type="spellEnd"/>
+            <w:r>
+              <w:rPr>
+                <w:rFonts w:ascii="Arial" w:eastAsia="Arial" w:hAnsi="Arial" w:cs="Arial"/>
+                <w:color w:val="000000"/>
+                <w:sz w:val="18"/>
+                <w:szCs w:val="18"/>
+              </w:rPr>
+              <w:t xml:space="preserve"> with correct </w:t>
+            </w:r>
+            <w:proofErr w:type="spellStart"/>
+            <w:r>
+              <w:rPr>
+                <w:rFonts w:ascii="Arial" w:eastAsia="Arial" w:hAnsi="Arial" w:cs="Arial"/>
+                <w:color w:val="000000"/>
+                <w:sz w:val="18"/>
+                <w:szCs w:val="18"/>
+              </w:rPr>
+              <w:t>pull_request</w:t>
+            </w:r>
+            <w:proofErr w:type="spellEnd"/>
+            <w:r>
+              <w:rPr>
+                <w:rFonts w:ascii="Arial" w:eastAsia="Arial" w:hAnsi="Arial" w:cs="Arial"/>
+                <w:color w:val="000000"/>
+                <w:sz w:val="18"/>
+                <w:szCs w:val="18"/>
+              </w:rPr>
+              <w:t xml:space="preserve"> trigger targeting </w:t>
             </w:r>
             <w:r>
               <w:rPr>
@@ -8360,7 +8004,7 @@
                 <w:sz w:val="18"/>
                 <w:szCs w:val="18"/>
               </w:rPr>
-              <w:t>06</w:t>
+              <w:t>07</w:t>
             </w:r>
           </w:p>
         </w:tc>
@@ -8394,7 +8038,7 @@
                 <w:sz w:val="18"/>
                 <w:szCs w:val="18"/>
               </w:rPr>
-              <w:t>14</w:t>
+              <w:t>10</w:t>
             </w:r>
           </w:p>
         </w:tc>
@@ -8424,7 +8068,7 @@
                 <w:sz w:val="18"/>
                 <w:szCs w:val="18"/>
               </w:rPr>
-              <w:t>Job declares environment: development and accesses RENDER_DEPLOY_HOOK_URL correctly</w:t>
+              <w:t>Checkout code, login to Docker Hub using Team Lead's repository secrets</w:t>
             </w:r>
           </w:p>
         </w:tc>
@@ -8454,7 +8098,7 @@
                 <w:sz w:val="18"/>
                 <w:szCs w:val="18"/>
               </w:rPr>
-              <w:t>07</w:t>
+              <w:t>06</w:t>
             </w:r>
           </w:p>
         </w:tc>
@@ -8488,7 +8132,542 @@
                 <w:sz w:val="18"/>
                 <w:szCs w:val="18"/>
               </w:rPr>
+              <w:t>11</w:t>
+            </w:r>
+          </w:p>
+        </w:tc>
+        <w:tc>
+          <w:tcPr>
+            <w:tcW w:w="6510" w:type="dxa"/>
+            <w:tcBorders>
+              <w:top w:val="single" w:sz="6" w:space="0" w:color="ADB9CA"/>
+              <w:left w:val="single" w:sz="6" w:space="0" w:color="ADB9CA"/>
+              <w:bottom w:val="single" w:sz="6" w:space="0" w:color="ADB9CA"/>
+              <w:right w:val="single" w:sz="6" w:space="0" w:color="ADB9CA"/>
+            </w:tcBorders>
+            <w:shd w:val="clear" w:color="auto" w:fill="E8F0FB"/>
+            <w:tcMar>
+              <w:top w:w="80" w:type="dxa"/>
+              <w:left w:w="140" w:type="dxa"/>
+              <w:bottom w:w="80" w:type="dxa"/>
+              <w:right w:w="140" w:type="dxa"/>
+            </w:tcMar>
+            <w:vAlign w:val="center"/>
+          </w:tcPr>
+          <w:p>
+            <w:r>
+              <w:rPr>
+                <w:rFonts w:ascii="Arial" w:eastAsia="Arial" w:hAnsi="Arial" w:cs="Arial"/>
+                <w:color w:val="000000"/>
+                <w:sz w:val="18"/>
+                <w:szCs w:val="18"/>
+              </w:rPr>
+              <w:t>Build Docker image and tag correctly (latest and/or commit SHA)</w:t>
+            </w:r>
+          </w:p>
+        </w:tc>
+        <w:tc>
+          <w:tcPr>
+            <w:tcW w:w="2150" w:type="dxa"/>
+            <w:tcBorders>
+              <w:top w:val="single" w:sz="6" w:space="0" w:color="ADB9CA"/>
+              <w:left w:val="single" w:sz="6" w:space="0" w:color="ADB9CA"/>
+              <w:bottom w:val="single" w:sz="6" w:space="0" w:color="ADB9CA"/>
+              <w:right w:val="single" w:sz="6" w:space="0" w:color="ADB9CA"/>
+            </w:tcBorders>
+            <w:shd w:val="clear" w:color="auto" w:fill="E8F0FB"/>
+            <w:tcMar>
+              <w:top w:w="80" w:type="dxa"/>
+              <w:left w:w="140" w:type="dxa"/>
+              <w:bottom w:w="80" w:type="dxa"/>
+              <w:right w:w="140" w:type="dxa"/>
+            </w:tcMar>
+            <w:vAlign w:val="center"/>
+          </w:tcPr>
+          <w:p>
+            <w:r>
+              <w:rPr>
+                <w:rFonts w:ascii="Arial" w:eastAsia="Arial" w:hAnsi="Arial" w:cs="Arial"/>
+                <w:color w:val="000000"/>
+                <w:sz w:val="18"/>
+                <w:szCs w:val="18"/>
+              </w:rPr>
+              <w:t>06</w:t>
+            </w:r>
+          </w:p>
+        </w:tc>
+      </w:tr>
+      <w:tr>
+        <w:tc>
+          <w:tcPr>
+            <w:tcW w:w="700" w:type="dxa"/>
+            <w:tcBorders>
+              <w:top w:val="single" w:sz="6" w:space="0" w:color="ADB9CA"/>
+              <w:left w:val="single" w:sz="6" w:space="0" w:color="ADB9CA"/>
+              <w:bottom w:val="single" w:sz="6" w:space="0" w:color="ADB9CA"/>
+              <w:right w:val="single" w:sz="6" w:space="0" w:color="ADB9CA"/>
+            </w:tcBorders>
+            <w:shd w:val="clear" w:color="auto" w:fill="FFFFFF"/>
+            <w:tcMar>
+              <w:top w:w="80" w:type="dxa"/>
+              <w:left w:w="140" w:type="dxa"/>
+              <w:bottom w:w="80" w:type="dxa"/>
+              <w:right w:w="140" w:type="dxa"/>
+            </w:tcMar>
+            <w:vAlign w:val="center"/>
+          </w:tcPr>
+          <w:p>
+            <w:r>
+              <w:rPr>
+                <w:rFonts w:ascii="Arial" w:eastAsia="Arial" w:hAnsi="Arial" w:cs="Arial"/>
+                <w:b/>
+                <w:bCs/>
+                <w:color w:val="000000"/>
+                <w:sz w:val="18"/>
+                <w:szCs w:val="18"/>
+              </w:rPr>
+              <w:t>12</w:t>
+            </w:r>
+          </w:p>
+        </w:tc>
+        <w:tc>
+          <w:tcPr>
+            <w:tcW w:w="6510" w:type="dxa"/>
+            <w:tcBorders>
+              <w:top w:val="single" w:sz="6" w:space="0" w:color="ADB9CA"/>
+              <w:left w:val="single" w:sz="6" w:space="0" w:color="ADB9CA"/>
+              <w:bottom w:val="single" w:sz="6" w:space="0" w:color="ADB9CA"/>
+              <w:right w:val="single" w:sz="6" w:space="0" w:color="ADB9CA"/>
+            </w:tcBorders>
+            <w:shd w:val="clear" w:color="auto" w:fill="FFFFFF"/>
+            <w:tcMar>
+              <w:top w:w="80" w:type="dxa"/>
+              <w:left w:w="140" w:type="dxa"/>
+              <w:bottom w:w="80" w:type="dxa"/>
+              <w:right w:w="140" w:type="dxa"/>
+            </w:tcMar>
+            <w:vAlign w:val="center"/>
+          </w:tcPr>
+          <w:p>
+            <w:r>
+              <w:rPr>
+                <w:rFonts w:ascii="Arial" w:eastAsia="Arial" w:hAnsi="Arial" w:cs="Arial"/>
+                <w:color w:val="000000"/>
+                <w:sz w:val="18"/>
+                <w:szCs w:val="18"/>
+              </w:rPr>
+              <w:t>Push image to Docker Hub successfully; workflow exits on any step failure</w:t>
+            </w:r>
+          </w:p>
+        </w:tc>
+        <w:tc>
+          <w:tcPr>
+            <w:tcW w:w="2150" w:type="dxa"/>
+            <w:tcBorders>
+              <w:top w:val="single" w:sz="6" w:space="0" w:color="ADB9CA"/>
+              <w:left w:val="single" w:sz="6" w:space="0" w:color="ADB9CA"/>
+              <w:bottom w:val="single" w:sz="6" w:space="0" w:color="ADB9CA"/>
+              <w:right w:val="single" w:sz="6" w:space="0" w:color="ADB9CA"/>
+            </w:tcBorders>
+            <w:shd w:val="clear" w:color="auto" w:fill="FFFFFF"/>
+            <w:tcMar>
+              <w:top w:w="80" w:type="dxa"/>
+              <w:left w:w="140" w:type="dxa"/>
+              <w:bottom w:w="80" w:type="dxa"/>
+              <w:right w:w="140" w:type="dxa"/>
+            </w:tcMar>
+            <w:vAlign w:val="center"/>
+          </w:tcPr>
+          <w:p>
+            <w:r>
+              <w:rPr>
+                <w:rFonts w:ascii="Arial" w:eastAsia="Arial" w:hAnsi="Arial" w:cs="Arial"/>
+                <w:color w:val="000000"/>
+                <w:sz w:val="18"/>
+                <w:szCs w:val="18"/>
+              </w:rPr>
+              <w:t>06</w:t>
+            </w:r>
+          </w:p>
+        </w:tc>
+      </w:tr>
+      <w:tr>
+        <w:tc>
+          <w:tcPr>
+            <w:tcW w:w="700" w:type="dxa"/>
+            <w:tcBorders>
+              <w:top w:val="single" w:sz="6" w:space="0" w:color="ADB9CA"/>
+              <w:left w:val="single" w:sz="6" w:space="0" w:color="ADB9CA"/>
+              <w:bottom w:val="single" w:sz="6" w:space="0" w:color="ADB9CA"/>
+              <w:right w:val="single" w:sz="6" w:space="0" w:color="ADB9CA"/>
+            </w:tcBorders>
+            <w:shd w:val="clear" w:color="auto" w:fill="2E75B6"/>
+            <w:tcMar>
+              <w:top w:w="80" w:type="dxa"/>
+              <w:left w:w="140" w:type="dxa"/>
+              <w:bottom w:w="80" w:type="dxa"/>
+              <w:right w:w="140" w:type="dxa"/>
+            </w:tcMar>
+            <w:vAlign w:val="center"/>
+          </w:tcPr>
+          <w:p/>
+        </w:tc>
+        <w:tc>
+          <w:tcPr>
+            <w:tcW w:w="6510" w:type="dxa"/>
+            <w:tcBorders>
+              <w:top w:val="single" w:sz="6" w:space="0" w:color="ADB9CA"/>
+              <w:left w:val="single" w:sz="6" w:space="0" w:color="ADB9CA"/>
+              <w:bottom w:val="single" w:sz="6" w:space="0" w:color="ADB9CA"/>
+              <w:right w:val="single" w:sz="6" w:space="0" w:color="ADB9CA"/>
+            </w:tcBorders>
+            <w:shd w:val="clear" w:color="auto" w:fill="2E75B6"/>
+            <w:tcMar>
+              <w:top w:w="80" w:type="dxa"/>
+              <w:left w:w="140" w:type="dxa"/>
+              <w:bottom w:w="80" w:type="dxa"/>
+              <w:right w:w="140" w:type="dxa"/>
+            </w:tcMar>
+            <w:vAlign w:val="center"/>
+          </w:tcPr>
+          <w:p>
+            <w:r>
+              <w:rPr>
+                <w:rFonts w:ascii="Arial" w:eastAsia="Arial" w:hAnsi="Arial" w:cs="Arial"/>
+                <w:b/>
+                <w:bCs/>
+                <w:color w:val="FFFFFF"/>
+                <w:sz w:val="18"/>
+                <w:szCs w:val="18"/>
+              </w:rPr>
+              <w:t>CD Pipeline – Automated Deployment to Render (</w:t>
+            </w:r>
+            <w:proofErr w:type="spellStart"/>
+            <w:r>
+              <w:rPr>
+                <w:rFonts w:ascii="Arial" w:eastAsia="Arial" w:hAnsi="Arial" w:cs="Arial"/>
+                <w:b/>
+                <w:bCs/>
+                <w:color w:val="FFFFFF"/>
+                <w:sz w:val="18"/>
+                <w:szCs w:val="18"/>
+              </w:rPr>
+              <w:t>cd.yml</w:t>
+            </w:r>
+            <w:proofErr w:type="spellEnd"/>
+            <w:r>
+              <w:rPr>
+                <w:rFonts w:ascii="Arial" w:eastAsia="Arial" w:hAnsi="Arial" w:cs="Arial"/>
+                <w:b/>
+                <w:bCs/>
+                <w:color w:val="FFFFFF"/>
+                <w:sz w:val="18"/>
+                <w:szCs w:val="18"/>
+              </w:rPr>
+              <w:t>)</w:t>
+            </w:r>
+          </w:p>
+        </w:tc>
+        <w:tc>
+          <w:tcPr>
+            <w:tcW w:w="2150" w:type="dxa"/>
+            <w:tcBorders>
+              <w:top w:val="single" w:sz="6" w:space="0" w:color="ADB9CA"/>
+              <w:left w:val="single" w:sz="6" w:space="0" w:color="ADB9CA"/>
+              <w:bottom w:val="single" w:sz="6" w:space="0" w:color="ADB9CA"/>
+              <w:right w:val="single" w:sz="6" w:space="0" w:color="ADB9CA"/>
+            </w:tcBorders>
+            <w:shd w:val="clear" w:color="auto" w:fill="2E75B6"/>
+            <w:tcMar>
+              <w:top w:w="80" w:type="dxa"/>
+              <w:left w:w="140" w:type="dxa"/>
+              <w:bottom w:w="80" w:type="dxa"/>
+              <w:right w:w="140" w:type="dxa"/>
+            </w:tcMar>
+            <w:vAlign w:val="center"/>
+          </w:tcPr>
+          <w:p>
+            <w:r>
+              <w:rPr>
+                <w:rFonts w:ascii="Arial" w:eastAsia="Arial" w:hAnsi="Arial" w:cs="Arial"/>
+                <w:b/>
+                <w:bCs/>
+                <w:color w:val="FFFFFF"/>
+                <w:sz w:val="18"/>
+                <w:szCs w:val="18"/>
+              </w:rPr>
+              <w:t>20 Marks</w:t>
+            </w:r>
+          </w:p>
+        </w:tc>
+      </w:tr>
+      <w:tr>
+        <w:tc>
+          <w:tcPr>
+            <w:tcW w:w="700" w:type="dxa"/>
+            <w:tcBorders>
+              <w:top w:val="single" w:sz="6" w:space="0" w:color="ADB9CA"/>
+              <w:left w:val="single" w:sz="6" w:space="0" w:color="ADB9CA"/>
+              <w:bottom w:val="single" w:sz="6" w:space="0" w:color="ADB9CA"/>
+              <w:right w:val="single" w:sz="6" w:space="0" w:color="ADB9CA"/>
+            </w:tcBorders>
+            <w:shd w:val="clear" w:color="auto" w:fill="E8F0FB"/>
+            <w:tcMar>
+              <w:top w:w="80" w:type="dxa"/>
+              <w:left w:w="140" w:type="dxa"/>
+              <w:bottom w:w="80" w:type="dxa"/>
+              <w:right w:w="140" w:type="dxa"/>
+            </w:tcMar>
+            <w:vAlign w:val="center"/>
+          </w:tcPr>
+          <w:p>
+            <w:r>
+              <w:rPr>
+                <w:rFonts w:ascii="Arial" w:eastAsia="Arial" w:hAnsi="Arial" w:cs="Arial"/>
+                <w:b/>
+                <w:bCs/>
+                <w:color w:val="000000"/>
+                <w:sz w:val="18"/>
+                <w:szCs w:val="18"/>
+              </w:rPr>
+              <w:t>13</w:t>
+            </w:r>
+          </w:p>
+        </w:tc>
+        <w:tc>
+          <w:tcPr>
+            <w:tcW w:w="6510" w:type="dxa"/>
+            <w:tcBorders>
+              <w:top w:val="single" w:sz="6" w:space="0" w:color="ADB9CA"/>
+              <w:left w:val="single" w:sz="6" w:space="0" w:color="ADB9CA"/>
+              <w:bottom w:val="single" w:sz="6" w:space="0" w:color="ADB9CA"/>
+              <w:right w:val="single" w:sz="6" w:space="0" w:color="ADB9CA"/>
+            </w:tcBorders>
+            <w:shd w:val="clear" w:color="auto" w:fill="E8F0FB"/>
+            <w:tcMar>
+              <w:top w:w="80" w:type="dxa"/>
+              <w:left w:w="140" w:type="dxa"/>
+              <w:bottom w:w="80" w:type="dxa"/>
+              <w:right w:w="140" w:type="dxa"/>
+            </w:tcMar>
+            <w:vAlign w:val="center"/>
+          </w:tcPr>
+          <w:p>
+            <w:r>
+              <w:rPr>
+                <w:rFonts w:ascii="Arial" w:eastAsia="Arial" w:hAnsi="Arial" w:cs="Arial"/>
+                <w:color w:val="000000"/>
+                <w:sz w:val="18"/>
+                <w:szCs w:val="18"/>
+              </w:rPr>
+              <w:t>CD workflow file created at .</w:t>
+            </w:r>
+            <w:proofErr w:type="spellStart"/>
+            <w:r>
+              <w:rPr>
+                <w:rFonts w:ascii="Arial" w:eastAsia="Arial" w:hAnsi="Arial" w:cs="Arial"/>
+                <w:color w:val="000000"/>
+                <w:sz w:val="18"/>
+                <w:szCs w:val="18"/>
+              </w:rPr>
+              <w:t>github</w:t>
+            </w:r>
+            <w:proofErr w:type="spellEnd"/>
+            <w:r>
+              <w:rPr>
+                <w:rFonts w:ascii="Arial" w:eastAsia="Arial" w:hAnsi="Arial" w:cs="Arial"/>
+                <w:color w:val="000000"/>
+                <w:sz w:val="18"/>
+                <w:szCs w:val="18"/>
+              </w:rPr>
+              <w:t>/workflows/</w:t>
+            </w:r>
+            <w:proofErr w:type="spellStart"/>
+            <w:r>
+              <w:rPr>
+                <w:rFonts w:ascii="Arial" w:eastAsia="Arial" w:hAnsi="Arial" w:cs="Arial"/>
+                <w:color w:val="000000"/>
+                <w:sz w:val="18"/>
+                <w:szCs w:val="18"/>
+              </w:rPr>
+              <w:t>cd.yml</w:t>
+            </w:r>
+            <w:proofErr w:type="spellEnd"/>
+            <w:r>
+              <w:rPr>
+                <w:rFonts w:ascii="Arial" w:eastAsia="Arial" w:hAnsi="Arial" w:cs="Arial"/>
+                <w:color w:val="000000"/>
+                <w:sz w:val="18"/>
+                <w:szCs w:val="18"/>
+              </w:rPr>
+              <w:t xml:space="preserve"> with correct push trigger on </w:t>
+            </w:r>
+            <w:r>
+              <w:rPr>
+                <w:rFonts w:ascii="Arial" w:eastAsia="Arial" w:hAnsi="Arial" w:cs="Arial"/>
+                <w:color w:val="000000"/>
+                <w:sz w:val="18"/>
+                <w:szCs w:val="18"/>
+              </w:rPr>
+              <w:t>“develop”</w:t>
+            </w:r>
+          </w:p>
+        </w:tc>
+        <w:tc>
+          <w:tcPr>
+            <w:tcW w:w="2150" w:type="dxa"/>
+            <w:tcBorders>
+              <w:top w:val="single" w:sz="6" w:space="0" w:color="ADB9CA"/>
+              <w:left w:val="single" w:sz="6" w:space="0" w:color="ADB9CA"/>
+              <w:bottom w:val="single" w:sz="6" w:space="0" w:color="ADB9CA"/>
+              <w:right w:val="single" w:sz="6" w:space="0" w:color="ADB9CA"/>
+            </w:tcBorders>
+            <w:shd w:val="clear" w:color="auto" w:fill="E8F0FB"/>
+            <w:tcMar>
+              <w:top w:w="80" w:type="dxa"/>
+              <w:left w:w="140" w:type="dxa"/>
+              <w:bottom w:w="80" w:type="dxa"/>
+              <w:right w:w="140" w:type="dxa"/>
+            </w:tcMar>
+            <w:vAlign w:val="center"/>
+          </w:tcPr>
+          <w:p>
+            <w:r>
+              <w:rPr>
+                <w:rFonts w:ascii="Arial" w:eastAsia="Arial" w:hAnsi="Arial" w:cs="Arial"/>
+                <w:color w:val="000000"/>
+                <w:sz w:val="18"/>
+                <w:szCs w:val="18"/>
+              </w:rPr>
+              <w:t>06</w:t>
+            </w:r>
+          </w:p>
+        </w:tc>
+      </w:tr>
+      <w:tr>
+        <w:tc>
+          <w:tcPr>
+            <w:tcW w:w="700" w:type="dxa"/>
+            <w:tcBorders>
+              <w:top w:val="single" w:sz="6" w:space="0" w:color="ADB9CA"/>
+              <w:left w:val="single" w:sz="6" w:space="0" w:color="ADB9CA"/>
+              <w:bottom w:val="single" w:sz="6" w:space="0" w:color="ADB9CA"/>
+              <w:right w:val="single" w:sz="6" w:space="0" w:color="ADB9CA"/>
+            </w:tcBorders>
+            <w:shd w:val="clear" w:color="auto" w:fill="FFFFFF"/>
+            <w:tcMar>
+              <w:top w:w="80" w:type="dxa"/>
+              <w:left w:w="140" w:type="dxa"/>
+              <w:bottom w:w="80" w:type="dxa"/>
+              <w:right w:w="140" w:type="dxa"/>
+            </w:tcMar>
+            <w:vAlign w:val="center"/>
+          </w:tcPr>
+          <w:p>
+            <w:r>
+              <w:rPr>
+                <w:rFonts w:ascii="Arial" w:eastAsia="Arial" w:hAnsi="Arial" w:cs="Arial"/>
+                <w:b/>
+                <w:bCs/>
+                <w:color w:val="000000"/>
+                <w:sz w:val="18"/>
+                <w:szCs w:val="18"/>
+              </w:rPr>
               <w:lastRenderedPageBreak/>
+              <w:t>14</w:t>
+            </w:r>
+          </w:p>
+        </w:tc>
+        <w:tc>
+          <w:tcPr>
+            <w:tcW w:w="6510" w:type="dxa"/>
+            <w:tcBorders>
+              <w:top w:val="single" w:sz="6" w:space="0" w:color="ADB9CA"/>
+              <w:left w:val="single" w:sz="6" w:space="0" w:color="ADB9CA"/>
+              <w:bottom w:val="single" w:sz="6" w:space="0" w:color="ADB9CA"/>
+              <w:right w:val="single" w:sz="6" w:space="0" w:color="ADB9CA"/>
+            </w:tcBorders>
+            <w:shd w:val="clear" w:color="auto" w:fill="FFFFFF"/>
+            <w:tcMar>
+              <w:top w:w="80" w:type="dxa"/>
+              <w:left w:w="140" w:type="dxa"/>
+              <w:bottom w:w="80" w:type="dxa"/>
+              <w:right w:w="140" w:type="dxa"/>
+            </w:tcMar>
+            <w:vAlign w:val="center"/>
+          </w:tcPr>
+          <w:p>
+            <w:r>
+              <w:rPr>
+                <w:rFonts w:ascii="Arial" w:eastAsia="Arial" w:hAnsi="Arial" w:cs="Arial"/>
+                <w:color w:val="000000"/>
+                <w:sz w:val="18"/>
+                <w:szCs w:val="18"/>
+              </w:rPr>
+              <w:t>Job declares environment: development and accesses RENDER_DEPLOY_HOOK_URL correctly</w:t>
+            </w:r>
+          </w:p>
+        </w:tc>
+        <w:tc>
+          <w:tcPr>
+            <w:tcW w:w="2150" w:type="dxa"/>
+            <w:tcBorders>
+              <w:top w:val="single" w:sz="6" w:space="0" w:color="ADB9CA"/>
+              <w:left w:val="single" w:sz="6" w:space="0" w:color="ADB9CA"/>
+              <w:bottom w:val="single" w:sz="6" w:space="0" w:color="ADB9CA"/>
+              <w:right w:val="single" w:sz="6" w:space="0" w:color="ADB9CA"/>
+            </w:tcBorders>
+            <w:shd w:val="clear" w:color="auto" w:fill="FFFFFF"/>
+            <w:tcMar>
+              <w:top w:w="80" w:type="dxa"/>
+              <w:left w:w="140" w:type="dxa"/>
+              <w:bottom w:w="80" w:type="dxa"/>
+              <w:right w:w="140" w:type="dxa"/>
+            </w:tcMar>
+            <w:vAlign w:val="center"/>
+          </w:tcPr>
+          <w:p>
+            <w:r>
+              <w:rPr>
+                <w:rFonts w:ascii="Arial" w:eastAsia="Arial" w:hAnsi="Arial" w:cs="Arial"/>
+                <w:color w:val="000000"/>
+                <w:sz w:val="18"/>
+                <w:szCs w:val="18"/>
+              </w:rPr>
+              <w:t>07</w:t>
+            </w:r>
+          </w:p>
+        </w:tc>
+      </w:tr>
+      <w:tr>
+        <w:tc>
+          <w:tcPr>
+            <w:tcW w:w="700" w:type="dxa"/>
+            <w:tcBorders>
+              <w:top w:val="single" w:sz="6" w:space="0" w:color="ADB9CA"/>
+              <w:left w:val="single" w:sz="6" w:space="0" w:color="ADB9CA"/>
+              <w:bottom w:val="single" w:sz="6" w:space="0" w:color="ADB9CA"/>
+              <w:right w:val="single" w:sz="6" w:space="0" w:color="ADB9CA"/>
+            </w:tcBorders>
+            <w:shd w:val="clear" w:color="auto" w:fill="E8F0FB"/>
+            <w:tcMar>
+              <w:top w:w="80" w:type="dxa"/>
+              <w:left w:w="140" w:type="dxa"/>
+              <w:bottom w:w="80" w:type="dxa"/>
+              <w:right w:w="140" w:type="dxa"/>
+            </w:tcMar>
+            <w:vAlign w:val="center"/>
+          </w:tcPr>
+          <w:p>
+            <w:r>
+              <w:rPr>
+                <w:rFonts w:ascii="Arial" w:eastAsia="Arial" w:hAnsi="Arial" w:cs="Arial"/>
+                <w:b/>
+                <w:bCs/>
+                <w:color w:val="000000"/>
+                <w:sz w:val="18"/>
+                <w:szCs w:val="18"/>
+              </w:rPr>
               <w:t>15</w:t>
             </w:r>
           </w:p>
@@ -9044,15 +9223,7 @@
           <w:rFonts w:ascii="Arial" w:eastAsia="Arial" w:hAnsi="Arial" w:cs="Arial"/>
           <w:color w:val="000000"/>
         </w:rPr>
-        <w:t xml:space="preserve">Screenshot 2: Each member's CI workflow run triggered by their individual </w:t>
-      </w:r>
-      <w:proofErr w:type="gramStart"/>
-      <w:r>
-        <w:rPr>
-          <w:rFonts w:ascii="Arial" w:eastAsia="Arial" w:hAnsi="Arial" w:cs="Arial"/>
-          <w:color w:val="000000"/>
-        </w:rPr>
-        <w:t xml:space="preserve">PR </w:t>
+        <w:t xml:space="preserve">Screenshot 2: Each member's CI workflow run triggered by their individual PR </w:t>
       </w:r>
       <w:r>
         <w:rPr>
@@ -9061,7 +9232,6 @@
         </w:rPr>
         <w:t>,</w:t>
       </w:r>
-      <w:proofErr w:type="gramEnd"/>
       <w:r>
         <w:rPr>
           <w:rFonts w:ascii="Arial" w:eastAsia="Arial" w:hAnsi="Arial" w:cs="Arial"/>
@@ -9108,15 +9278,7 @@
           <w:rFonts w:ascii="Arial" w:eastAsia="Arial" w:hAnsi="Arial" w:cs="Arial"/>
           <w:color w:val="000000"/>
         </w:rPr>
-        <w:t>“develop</w:t>
-      </w:r>
-      <w:proofErr w:type="gramStart"/>
-      <w:r>
-        <w:rPr>
-          <w:rFonts w:ascii="Arial" w:eastAsia="Arial" w:hAnsi="Arial" w:cs="Arial"/>
-          <w:color w:val="000000"/>
-        </w:rPr>
-        <w:t>”</w:t>
+        <w:t>“develop”</w:t>
       </w:r>
       <w:r>
         <w:rPr>
@@ -9132,7 +9294,6 @@
         </w:rPr>
         <w:t>,</w:t>
       </w:r>
-      <w:proofErr w:type="gramEnd"/>
       <w:r>
         <w:rPr>
           <w:rFonts w:ascii="Arial" w:eastAsia="Arial" w:hAnsi="Arial" w:cs="Arial"/>
@@ -9155,7 +9316,23 @@
           <w:rFonts w:ascii="Arial" w:eastAsia="Arial" w:hAnsi="Arial" w:cs="Arial"/>
           <w:color w:val="000000"/>
         </w:rPr>
-        <w:t>Screenshot 5: Live TaskFlow application on Render showing all five pages are accessible.</w:t>
+        <w:t xml:space="preserve">Screenshot 5: Live </w:t>
+      </w:r>
+      <w:proofErr w:type="spellStart"/>
+      <w:r>
+        <w:rPr>
+          <w:rFonts w:ascii="Arial" w:eastAsia="Arial" w:hAnsi="Arial" w:cs="Arial"/>
+          <w:color w:val="000000"/>
+        </w:rPr>
+        <w:t>TaskFlow</w:t>
+      </w:r>
+      <w:proofErr w:type="spellEnd"/>
+      <w:r>
+        <w:rPr>
+          <w:rFonts w:ascii="Arial" w:eastAsia="Arial" w:hAnsi="Arial" w:cs="Arial"/>
+          <w:color w:val="000000"/>
+        </w:rPr>
+        <w:t xml:space="preserve"> application on Render showing all five pages are accessible.</w:t>
       </w:r>
     </w:p>
     <w:p>
@@ -9226,23 +9403,7 @@
           <w:rFonts w:ascii="Arial" w:eastAsia="Arial" w:hAnsi="Arial" w:cs="Arial"/>
           <w:color w:val="000000"/>
         </w:rPr>
-        <w:t xml:space="preserve">Paste your verification screenshots </w:t>
-      </w:r>
-      <w:proofErr w:type="gramStart"/>
-      <w:r>
-        <w:rPr>
-          <w:rFonts w:ascii="Arial" w:eastAsia="Arial" w:hAnsi="Arial" w:cs="Arial"/>
-          <w:color w:val="000000"/>
-        </w:rPr>
-        <w:t>in</w:t>
-      </w:r>
-      <w:proofErr w:type="gramEnd"/>
-      <w:r>
-        <w:rPr>
-          <w:rFonts w:ascii="Arial" w:eastAsia="Arial" w:hAnsi="Arial" w:cs="Arial"/>
-          <w:color w:val="000000"/>
-        </w:rPr>
-        <w:t xml:space="preserve"> the table below. Label each one clearly.</w:t>
+        <w:t>Paste your verification screenshots in the table below. Label each one clearly.</w:t>
       </w:r>
     </w:p>
     <w:tbl>
@@ -9610,7 +9771,31 @@
                 <w:sz w:val="18"/>
                 <w:szCs w:val="18"/>
               </w:rPr>
-              <w:t>Live TaskFlow on Render – All 5 Pages Accessible</w:t>
+              <w:t xml:space="preserve">Live </w:t>
+            </w:r>
+            <w:proofErr w:type="spellStart"/>
+            <w:r>
+              <w:rPr>
+                <w:rFonts w:ascii="Arial" w:eastAsia="Arial" w:hAnsi="Arial" w:cs="Arial"/>
+                <w:b/>
+                <w:bCs/>
+                <w:color w:val="000000"/>
+                <w:sz w:val="18"/>
+                <w:szCs w:val="18"/>
+              </w:rPr>
+              <w:t>TaskFlow</w:t>
+            </w:r>
+            <w:proofErr w:type="spellEnd"/>
+            <w:r>
+              <w:rPr>
+                <w:rFonts w:ascii="Arial" w:eastAsia="Arial" w:hAnsi="Arial" w:cs="Arial"/>
+                <w:b/>
+                <w:bCs/>
+                <w:color w:val="000000"/>
+                <w:sz w:val="18"/>
+                <w:szCs w:val="18"/>
+              </w:rPr>
+              <w:t xml:space="preserve"> on Render – All 5 Pages Accessible</w:t>
             </w:r>
           </w:p>
         </w:tc>
@@ -9664,6 +9849,7 @@
                 <w:sz w:val="18"/>
                 <w:szCs w:val="18"/>
               </w:rPr>
+              <w:lastRenderedPageBreak/>
               <w:t>Assignment 04 .docx Visible in GitHub Repo</w:t>
             </w:r>
           </w:p>
@@ -9711,7 +9897,6 @@
           <w:sz w:val="28"/>
           <w:szCs w:val="28"/>
         </w:rPr>
-        <w:lastRenderedPageBreak/>
         <w:t>TEAM REFLECTION</w:t>
       </w:r>
     </w:p>
@@ -9745,9 +9930,8 @@
           <w:bCs/>
           <w:color w:val="000000"/>
         </w:rPr>
-        <w:t xml:space="preserve">Member </w:t>
-      </w:r>
-      <w:proofErr w:type="gramStart"/>
+        <w:t xml:space="preserve">Member 1  (Name: </w:t>
+      </w:r>
       <w:r>
         <w:rPr>
           <w:rFonts w:ascii="Arial" w:eastAsia="Arial" w:hAnsi="Arial" w:cs="Arial"/>
@@ -9755,17 +9939,7 @@
           <w:bCs/>
           <w:color w:val="000000"/>
         </w:rPr>
-        <w:t>1  (Name: _</w:t>
-      </w:r>
-      <w:proofErr w:type="gramEnd"/>
-      <w:r>
-        <w:rPr>
-          <w:rFonts w:ascii="Arial" w:eastAsia="Arial" w:hAnsi="Arial" w:cs="Arial"/>
-          <w:b/>
-          <w:bCs/>
-          <w:color w:val="000000"/>
-        </w:rPr>
-        <w:t>______________________________________________)</w:t>
+        <w:t>Haroon Ashar)</w:t>
       </w:r>
     </w:p>
     <w:tbl>
@@ -9807,7 +9981,11 @@
             </w:tcMar>
             <w:vAlign w:val="center"/>
           </w:tcPr>
-          <w:p/>
+          <w:p>
+            <w:r>
+              <w:t>Managing the CI/CD pipeline setup taught me how automated workflows can significantly streamline the software delivery process</w:t>
+            </w:r>
+          </w:p>
         </w:tc>
       </w:tr>
       <w:tr>
@@ -9829,7 +10007,11 @@
             </w:tcMar>
             <w:vAlign w:val="center"/>
           </w:tcPr>
-          <w:p/>
+          <w:p>
+            <w:r>
+              <w:t>Coordinating the team's pull requests and resolving merge conflicts gave me hands-on experience with real-world collaboration challenges</w:t>
+            </w:r>
+          </w:p>
         </w:tc>
       </w:tr>
       <w:tr>
@@ -9851,7 +10033,11 @@
             </w:tcMar>
             <w:vAlign w:val="center"/>
           </w:tcPr>
-          <w:p/>
+          <w:p>
+            <w:r>
+              <w:t>Overall this assignment deepened my understanding of DevOps practices and the importance of structured branching strategies in team projects.</w:t>
+            </w:r>
+          </w:p>
         </w:tc>
       </w:tr>
     </w:tbl>
@@ -9872,9 +10058,8 @@
           <w:bCs/>
           <w:color w:val="000000"/>
         </w:rPr>
-        <w:t xml:space="preserve">Member </w:t>
-      </w:r>
-      <w:proofErr w:type="gramStart"/>
+        <w:t xml:space="preserve">Member 2  (Name: </w:t>
+      </w:r>
       <w:r>
         <w:rPr>
           <w:rFonts w:ascii="Arial" w:eastAsia="Arial" w:hAnsi="Arial" w:cs="Arial"/>
@@ -9882,17 +10067,7 @@
           <w:bCs/>
           <w:color w:val="000000"/>
         </w:rPr>
-        <w:t>2  (</w:t>
-      </w:r>
-      <w:proofErr w:type="gramEnd"/>
-      <w:r>
-        <w:rPr>
-          <w:rFonts w:ascii="Arial" w:eastAsia="Arial" w:hAnsi="Arial" w:cs="Arial"/>
-          <w:b/>
-          <w:bCs/>
-          <w:color w:val="000000"/>
-        </w:rPr>
-        <w:t>Name: _______________________________________________)</w:t>
+        <w:t>Abdul Mateen)</w:t>
       </w:r>
     </w:p>
     <w:tbl>
@@ -9934,7 +10109,11 @@
             </w:tcMar>
             <w:vAlign w:val="center"/>
           </w:tcPr>
-          <w:p/>
+          <w:p>
+            <w:r>
+              <w:t>Through this assignment, I learned how to integrate a CI/CD pipeline using GitHub Actions with Docker and Render.</w:t>
+            </w:r>
+          </w:p>
         </w:tc>
       </w:tr>
       <w:tr>
@@ -9956,7 +10135,11 @@
             </w:tcMar>
             <w:vAlign w:val="center"/>
           </w:tcPr>
-          <w:p/>
+          <w:p>
+            <w:r>
+              <w:t>My most challenging part was understanding how the CI workflow triggers on a PR and how the CD workflow fires only after a merge. Working on the Add Task page taught me how feature branches isolate individual work within a team</w:t>
+            </w:r>
+          </w:p>
         </w:tc>
       </w:tr>
       <w:tr>
@@ -9978,7 +10161,11 @@
             </w:tcMar>
             <w:vAlign w:val="center"/>
           </w:tcPr>
-          <w:p/>
+          <w:p>
+            <w:r>
+              <w:t>The automated deployment flow from code push to a live URL made the DevOps lifecycle very tangible</w:t>
+            </w:r>
+          </w:p>
         </w:tc>
       </w:tr>
     </w:tbl>
@@ -9999,9 +10186,8 @@
           <w:bCs/>
           <w:color w:val="000000"/>
         </w:rPr>
-        <w:t xml:space="preserve">Member </w:t>
-      </w:r>
-      <w:proofErr w:type="gramStart"/>
+        <w:t xml:space="preserve">Member 3  (Name: </w:t>
+      </w:r>
       <w:r>
         <w:rPr>
           <w:rFonts w:ascii="Arial" w:eastAsia="Arial" w:hAnsi="Arial" w:cs="Arial"/>
@@ -10009,17 +10195,7 @@
           <w:bCs/>
           <w:color w:val="000000"/>
         </w:rPr>
-        <w:t>3  (</w:t>
-      </w:r>
-      <w:proofErr w:type="gramEnd"/>
-      <w:r>
-        <w:rPr>
-          <w:rFonts w:ascii="Arial" w:eastAsia="Arial" w:hAnsi="Arial" w:cs="Arial"/>
-          <w:b/>
-          <w:bCs/>
-          <w:color w:val="000000"/>
-        </w:rPr>
-        <w:t>Name: _______________________________________________)</w:t>
+        <w:t>Muhammad Ahmad)</w:t>
       </w:r>
     </w:p>
     <w:tbl>
@@ -10061,7 +10237,11 @@
             </w:tcMar>
             <w:vAlign w:val="center"/>
           </w:tcPr>
-          <w:p/>
+          <w:p>
+            <w:r>
+              <w:t xml:space="preserve">I learned how to create a feature branch, build an HTML page, and integrate it with the shared stylesheet and navigation. </w:t>
+            </w:r>
+          </w:p>
         </w:tc>
       </w:tr>
       <w:tr>
@@ -10083,7 +10263,11 @@
             </w:tcMar>
             <w:vAlign w:val="center"/>
           </w:tcPr>
-          <w:p/>
+          <w:p>
+            <w:r>
+              <w:t xml:space="preserve">I understood how CI automatically builds a Docker image when a PR targets develop. </w:t>
+            </w:r>
+          </w:p>
         </w:tc>
       </w:tr>
       <w:tr>
@@ -10105,7 +10289,11 @@
             </w:tcMar>
             <w:vAlign w:val="center"/>
           </w:tcPr>
-          <w:p/>
+          <w:p>
+            <w:r>
+              <w:t>The main challenge was matching my page's layout to existing pages, fixed after reviewer feedback. Overall, I gained hands-on experience with Git, pull requests, and CI/CD basics.</w:t>
+            </w:r>
+          </w:p>
         </w:tc>
       </w:tr>
     </w:tbl>
@@ -10126,27 +10314,7 @@
           <w:bCs/>
           <w:color w:val="000000"/>
         </w:rPr>
-        <w:t xml:space="preserve">Member 4  (Name: Muhammad Asfand Yar Haider)</w:t>
-      </w:r>
-      <w:proofErr w:type="gramStart"/>
-      <w:r>
-        <w:rPr>
-          <w:rFonts w:ascii="Arial" w:eastAsia="Arial" w:hAnsi="Arial" w:cs="Arial"/>
-          <w:b/>
-          <w:bCs/>
-          <w:color w:val="000000"/>
-        </w:rPr>
-        <w:t/>
-      </w:r>
-      <w:proofErr w:type="gramEnd"/>
-      <w:r>
-        <w:rPr>
-          <w:rFonts w:ascii="Arial" w:eastAsia="Arial" w:hAnsi="Arial" w:cs="Arial"/>
-          <w:b/>
-          <w:bCs/>
-          <w:color w:val="000000"/>
-        </w:rPr>
-        <w:t/>
+        <w:t>Member 4  (Name: Muhammad Asfand Yar Haider)</w:t>
       </w:r>
     </w:p>
     <w:tbl>
@@ -10216,7 +10384,15 @@
           </w:tcPr>
           <w:p>
             <w:r>
-              <w:t>I built the Task Detail page and connected it with the shared TaskFlow navigation and stylesheet.</w:t>
+              <w:t xml:space="preserve">I built the Task Detail page and connected it with the shared </w:t>
+            </w:r>
+            <w:proofErr w:type="spellStart"/>
+            <w:r>
+              <w:t>TaskFlow</w:t>
+            </w:r>
+            <w:proofErr w:type="spellEnd"/>
+            <w:r>
+              <w:t xml:space="preserve"> navigation and stylesheet.</w:t>
             </w:r>
           </w:p>
         </w:tc>
@@ -10268,9 +10444,8 @@
           <w:bCs/>
           <w:color w:val="000000"/>
         </w:rPr>
-        <w:t xml:space="preserve">Member </w:t>
-      </w:r>
-      <w:proofErr w:type="gramStart"/>
+        <w:t xml:space="preserve">Member 5  (Name: </w:t>
+      </w:r>
       <w:r>
         <w:rPr>
           <w:rFonts w:ascii="Arial" w:eastAsia="Arial" w:hAnsi="Arial" w:cs="Arial"/>
@@ -10278,17 +10453,7 @@
           <w:bCs/>
           <w:color w:val="000000"/>
         </w:rPr>
-        <w:t>5  (</w:t>
-      </w:r>
-      <w:proofErr w:type="gramEnd"/>
-      <w:r>
-        <w:rPr>
-          <w:rFonts w:ascii="Arial" w:eastAsia="Arial" w:hAnsi="Arial" w:cs="Arial"/>
-          <w:b/>
-          <w:bCs/>
-          <w:color w:val="000000"/>
-        </w:rPr>
-        <w:t>Name: _______________________________________________)</w:t>
+        <w:t>Hasham Dogar)</w:t>
       </w:r>
     </w:p>
     <w:tbl>
@@ -10448,17 +10613,7 @@
         <w:sz w:val="16"/>
         <w:szCs w:val="16"/>
       </w:rPr>
-      <w:t xml:space="preserve">Assignment 04 – CI/CD Pipeline </w:t>
-    </w:r>
-    <w:proofErr w:type="gramStart"/>
-    <w:r>
-      <w:rPr>
-        <w:rFonts w:ascii="Arial" w:eastAsia="Arial" w:hAnsi="Arial" w:cs="Arial"/>
-        <w:color w:val="555555"/>
-        <w:sz w:val="16"/>
-        <w:szCs w:val="16"/>
-      </w:rPr>
-      <w:t xml:space="preserve">Integration  </w:t>
+      <w:t xml:space="preserve">Assignment 04 – CI/CD Pipeline Integration  </w:t>
     </w:r>
     <w:r>
       <w:rPr>
@@ -10468,15 +10623,6 @@
         <w:szCs w:val="16"/>
       </w:rPr>
       <w:tab/>
-    </w:r>
-    <w:proofErr w:type="gramEnd"/>
-    <w:r>
-      <w:rPr>
-        <w:rFonts w:ascii="Arial" w:eastAsia="Arial" w:hAnsi="Arial" w:cs="Arial"/>
-        <w:color w:val="555555"/>
-        <w:sz w:val="16"/>
-        <w:szCs w:val="16"/>
-      </w:rPr>
       <w:t xml:space="preserve"> Page </w:t>
     </w:r>
     <w:r>
@@ -10587,19 +10733,7 @@
         <w:sz w:val="18"/>
         <w:szCs w:val="18"/>
       </w:rPr>
-      <w:t xml:space="preserve">University of Central Punjab – Faculty of Information </w:t>
-    </w:r>
-    <w:proofErr w:type="gramStart"/>
-    <w:r>
-      <w:rPr>
-        <w:rFonts w:ascii="Arial" w:eastAsia="Arial" w:hAnsi="Arial" w:cs="Arial"/>
-        <w:b/>
-        <w:bCs/>
-        <w:color w:val="1F3864"/>
-        <w:sz w:val="18"/>
-        <w:szCs w:val="18"/>
-      </w:rPr>
-      <w:t>Technology</w:t>
+      <w:t>University of Central Punjab – Faculty of Information Technology</w:t>
     </w:r>
     <w:r>
       <w:rPr>
@@ -10608,17 +10742,7 @@
         <w:sz w:val="18"/>
         <w:szCs w:val="18"/>
       </w:rPr>
-      <w:t xml:space="preserve">  |</w:t>
-    </w:r>
-    <w:proofErr w:type="gramEnd"/>
-    <w:r>
-      <w:rPr>
-        <w:rFonts w:ascii="Arial" w:eastAsia="Arial" w:hAnsi="Arial" w:cs="Arial"/>
-        <w:color w:val="ADB9CA"/>
-        <w:sz w:val="18"/>
-        <w:szCs w:val="18"/>
-      </w:rPr>
-      <w:t xml:space="preserve">  </w:t>
+      <w:t xml:space="preserve">  |  </w:t>
     </w:r>
     <w:r>
       <w:rPr>
@@ -11617,6 +11741,18 @@
     <w:uiPriority w:val="99"/>
     <w:rsid w:val="008E7902"/>
   </w:style>
+  <w:style w:type="character" w:styleId="UnresolvedMention">
+    <w:name w:val="Unresolved Mention"/>
+    <w:basedOn w:val="DefaultParagraphFont"/>
+    <w:uiPriority w:val="99"/>
+    <w:semiHidden/>
+    <w:unhideWhenUsed/>
+    <w:rsid w:val="0090493B"/>
+    <w:rPr>
+      <w:color w:val="605E5C"/>
+      <w:shd w:val="clear" w:color="auto" w:fill="E1DFDD"/>
+    </w:rPr>
+  </w:style>
 </w:styles>
 </file>
 

</xml_diff>

<commit_message>
docs: final assignment document updates
</commit_message>
<xml_diff>
--- a/Assignment_04_Spring2026.docx
+++ b/Assignment_04_Spring2026.docx
@@ -348,7 +348,27 @@
           <w:sz w:val="24"/>
           <w:szCs w:val="24"/>
         </w:rPr>
-        <w:t xml:space="preserve"> (can be six members but in that case TL has to create an additional page for that member and then assign all tasks accordingly)</w:t>
+        <w:t xml:space="preserve"> (can be six members but in that </w:t>
+      </w:r>
+      <w:proofErr w:type="gramStart"/>
+      <w:r>
+        <w:rPr>
+          <w:rFonts w:ascii="Arial" w:eastAsia="Arial" w:hAnsi="Arial" w:cs="Arial"/>
+          <w:color w:val="000000"/>
+          <w:sz w:val="24"/>
+          <w:szCs w:val="24"/>
+        </w:rPr>
+        <w:t>case</w:t>
+      </w:r>
+      <w:proofErr w:type="gramEnd"/>
+      <w:r>
+        <w:rPr>
+          <w:rFonts w:ascii="Arial" w:eastAsia="Arial" w:hAnsi="Arial" w:cs="Arial"/>
+          <w:color w:val="000000"/>
+          <w:sz w:val="24"/>
+          <w:szCs w:val="24"/>
+        </w:rPr>
+        <w:t xml:space="preserve"> TL has to create an additional page for that member and then assign all tasks accordingly)</w:t>
       </w:r>
     </w:p>
     <w:p>
@@ -592,8 +612,9 @@
           <w:sz w:val="18"/>
           <w:szCs w:val="18"/>
         </w:rPr>
-        <w:t xml:space="preserve">Table 1: Group Details </w:t>
-      </w:r>
+        <w:t xml:space="preserve">Table 1: Group </w:t>
+      </w:r>
+      <w:proofErr w:type="gramStart"/>
       <w:r>
         <w:rPr>
           <w:rFonts w:ascii="Arial" w:eastAsia="Arial" w:hAnsi="Arial" w:cs="Arial"/>
@@ -603,7 +624,7 @@
           <w:sz w:val="18"/>
           <w:szCs w:val="18"/>
         </w:rPr>
-        <w:t>,</w:t>
+        <w:t xml:space="preserve">Details </w:t>
       </w:r>
       <w:r>
         <w:rPr>
@@ -614,7 +635,43 @@
           <w:sz w:val="18"/>
           <w:szCs w:val="18"/>
         </w:rPr>
-        <w:t xml:space="preserve"> Each student must fill their own row (including Assigned Page) in the versioned copy inside the repo</w:t>
+        <w:t>,</w:t>
+      </w:r>
+      <w:proofErr w:type="gramEnd"/>
+      <w:r>
+        <w:rPr>
+          <w:rFonts w:ascii="Arial" w:eastAsia="Arial" w:hAnsi="Arial" w:cs="Arial"/>
+          <w:b/>
+          <w:bCs/>
+          <w:color w:val="444444"/>
+          <w:sz w:val="18"/>
+          <w:szCs w:val="18"/>
+        </w:rPr>
+        <w:t xml:space="preserve"> </w:t>
+      </w:r>
+      <w:proofErr w:type="gramStart"/>
+      <w:r>
+        <w:rPr>
+          <w:rFonts w:ascii="Arial" w:eastAsia="Arial" w:hAnsi="Arial" w:cs="Arial"/>
+          <w:b/>
+          <w:bCs/>
+          <w:color w:val="444444"/>
+          <w:sz w:val="18"/>
+          <w:szCs w:val="18"/>
+        </w:rPr>
+        <w:t>Each</w:t>
+      </w:r>
+      <w:proofErr w:type="gramEnd"/>
+      <w:r>
+        <w:rPr>
+          <w:rFonts w:ascii="Arial" w:eastAsia="Arial" w:hAnsi="Arial" w:cs="Arial"/>
+          <w:b/>
+          <w:bCs/>
+          <w:color w:val="444444"/>
+          <w:sz w:val="18"/>
+          <w:szCs w:val="18"/>
+        </w:rPr>
+        <w:t xml:space="preserve"> student must fill their own row (including Assigned Page) in the versioned copy inside the repo</w:t>
       </w:r>
     </w:p>
     <w:tbl>
@@ -2378,7 +2435,17 @@
                 <w:sz w:val="18"/>
                 <w:szCs w:val="18"/>
               </w:rPr>
-              <w:t xml:space="preserve">An HTML form allowing the user to enter a new task </w:t>
+              <w:t xml:space="preserve">An HTML form allowing the user to enter a new </w:t>
+            </w:r>
+            <w:proofErr w:type="gramStart"/>
+            <w:r>
+              <w:rPr>
+                <w:rFonts w:ascii="Arial" w:eastAsia="Arial" w:hAnsi="Arial" w:cs="Arial"/>
+                <w:color w:val="000000"/>
+                <w:sz w:val="18"/>
+                <w:szCs w:val="18"/>
+              </w:rPr>
+              <w:t xml:space="preserve">task </w:t>
             </w:r>
             <w:r>
               <w:rPr>
@@ -2389,6 +2456,7 @@
               </w:rPr>
               <w:t>,</w:t>
             </w:r>
+            <w:proofErr w:type="gramEnd"/>
             <w:r>
               <w:rPr>
                 <w:rFonts w:ascii="Arial" w:eastAsia="Arial" w:hAnsi="Arial" w:cs="Arial"/>
@@ -2865,7 +2933,23 @@
           <w:rFonts w:ascii="Arial" w:eastAsia="Arial" w:hAnsi="Arial" w:cs="Arial"/>
           <w:color w:val="000000"/>
         </w:rPr>
-        <w:t>-username&gt;/&lt;page-name&gt;  (e.g., feature/</w:t>
+        <w:t>-username&gt;/&lt;page-name</w:t>
+      </w:r>
+      <w:proofErr w:type="gramStart"/>
+      <w:r>
+        <w:rPr>
+          <w:rFonts w:ascii="Arial" w:eastAsia="Arial" w:hAnsi="Arial" w:cs="Arial"/>
+          <w:color w:val="000000"/>
+        </w:rPr>
+        <w:t>&gt;  (</w:t>
+      </w:r>
+      <w:proofErr w:type="gramEnd"/>
+      <w:r>
+        <w:rPr>
+          <w:rFonts w:ascii="Arial" w:eastAsia="Arial" w:hAnsi="Arial" w:cs="Arial"/>
+          <w:color w:val="000000"/>
+        </w:rPr>
+        <w:t>e.g., feature/</w:t>
       </w:r>
       <w:proofErr w:type="spellStart"/>
       <w:r>
@@ -3380,7 +3464,17 @@
                 <w:sz w:val="18"/>
                 <w:szCs w:val="18"/>
               </w:rPr>
-              <w:t xml:space="preserve">Home / Dashboard page </w:t>
+              <w:t xml:space="preserve">Home / Dashboard </w:t>
+            </w:r>
+            <w:proofErr w:type="gramStart"/>
+            <w:r>
+              <w:rPr>
+                <w:rFonts w:ascii="Arial" w:eastAsia="Arial" w:hAnsi="Arial" w:cs="Arial"/>
+                <w:color w:val="000000"/>
+                <w:sz w:val="18"/>
+                <w:szCs w:val="18"/>
+              </w:rPr>
+              <w:t xml:space="preserve">page </w:t>
             </w:r>
             <w:r>
               <w:rPr>
@@ -3391,6 +3485,7 @@
               </w:rPr>
               <w:t>,</w:t>
             </w:r>
+            <w:proofErr w:type="gramEnd"/>
             <w:r>
               <w:rPr>
                 <w:rFonts w:ascii="Arial" w:eastAsia="Arial" w:hAnsi="Arial" w:cs="Arial"/>
@@ -3462,7 +3557,17 @@
                 <w:sz w:val="18"/>
                 <w:szCs w:val="18"/>
               </w:rPr>
-              <w:t xml:space="preserve">Add Task page </w:t>
+              <w:t xml:space="preserve">Add Task </w:t>
+            </w:r>
+            <w:proofErr w:type="gramStart"/>
+            <w:r>
+              <w:rPr>
+                <w:rFonts w:ascii="Arial" w:eastAsia="Arial" w:hAnsi="Arial" w:cs="Arial"/>
+                <w:color w:val="000000"/>
+                <w:sz w:val="18"/>
+                <w:szCs w:val="18"/>
+              </w:rPr>
+              <w:t xml:space="preserve">page </w:t>
             </w:r>
             <w:r>
               <w:rPr>
@@ -3473,6 +3578,7 @@
               </w:rPr>
               <w:t>,</w:t>
             </w:r>
+            <w:proofErr w:type="gramEnd"/>
             <w:r>
               <w:rPr>
                 <w:rFonts w:ascii="Arial" w:eastAsia="Arial" w:hAnsi="Arial" w:cs="Arial"/>
@@ -3544,7 +3650,17 @@
                 <w:sz w:val="18"/>
                 <w:szCs w:val="18"/>
               </w:rPr>
-              <w:t xml:space="preserve">Task List page </w:t>
+              <w:t xml:space="preserve">Task List </w:t>
+            </w:r>
+            <w:proofErr w:type="gramStart"/>
+            <w:r>
+              <w:rPr>
+                <w:rFonts w:ascii="Arial" w:eastAsia="Arial" w:hAnsi="Arial" w:cs="Arial"/>
+                <w:color w:val="000000"/>
+                <w:sz w:val="18"/>
+                <w:szCs w:val="18"/>
+              </w:rPr>
+              <w:t xml:space="preserve">page </w:t>
             </w:r>
             <w:r>
               <w:rPr>
@@ -3555,6 +3671,7 @@
               </w:rPr>
               <w:t>,</w:t>
             </w:r>
+            <w:proofErr w:type="gramEnd"/>
             <w:r>
               <w:rPr>
                 <w:rFonts w:ascii="Arial" w:eastAsia="Arial" w:hAnsi="Arial" w:cs="Arial"/>
@@ -3626,7 +3743,17 @@
                 <w:sz w:val="18"/>
                 <w:szCs w:val="18"/>
               </w:rPr>
-              <w:t xml:space="preserve">Task Detail page </w:t>
+              <w:t xml:space="preserve">Task Detail </w:t>
+            </w:r>
+            <w:proofErr w:type="gramStart"/>
+            <w:r>
+              <w:rPr>
+                <w:rFonts w:ascii="Arial" w:eastAsia="Arial" w:hAnsi="Arial" w:cs="Arial"/>
+                <w:color w:val="000000"/>
+                <w:sz w:val="18"/>
+                <w:szCs w:val="18"/>
+              </w:rPr>
+              <w:t xml:space="preserve">page </w:t>
             </w:r>
             <w:r>
               <w:rPr>
@@ -3637,6 +3764,7 @@
               </w:rPr>
               <w:t>,</w:t>
             </w:r>
+            <w:proofErr w:type="gramEnd"/>
             <w:r>
               <w:rPr>
                 <w:rFonts w:ascii="Arial" w:eastAsia="Arial" w:hAnsi="Arial" w:cs="Arial"/>
@@ -3708,7 +3836,17 @@
                 <w:sz w:val="18"/>
                 <w:szCs w:val="18"/>
               </w:rPr>
-              <w:t xml:space="preserve">About / Help page </w:t>
+              <w:t xml:space="preserve">About / Help </w:t>
+            </w:r>
+            <w:proofErr w:type="gramStart"/>
+            <w:r>
+              <w:rPr>
+                <w:rFonts w:ascii="Arial" w:eastAsia="Arial" w:hAnsi="Arial" w:cs="Arial"/>
+                <w:color w:val="000000"/>
+                <w:sz w:val="18"/>
+                <w:szCs w:val="18"/>
+              </w:rPr>
+              <w:t xml:space="preserve">page </w:t>
             </w:r>
             <w:r>
               <w:rPr>
@@ -3719,6 +3857,7 @@
               </w:rPr>
               <w:t>,</w:t>
             </w:r>
+            <w:proofErr w:type="gramEnd"/>
             <w:r>
               <w:rPr>
                 <w:rFonts w:ascii="Arial" w:eastAsia="Arial" w:hAnsi="Arial" w:cs="Arial"/>
@@ -3790,7 +3929,17 @@
                 <w:sz w:val="18"/>
                 <w:szCs w:val="18"/>
               </w:rPr>
-              <w:t xml:space="preserve">Shared stylesheet </w:t>
+              <w:t xml:space="preserve">Shared </w:t>
+            </w:r>
+            <w:proofErr w:type="gramStart"/>
+            <w:r>
+              <w:rPr>
+                <w:rFonts w:ascii="Arial" w:eastAsia="Arial" w:hAnsi="Arial" w:cs="Arial"/>
+                <w:color w:val="000000"/>
+                <w:sz w:val="18"/>
+                <w:szCs w:val="18"/>
+              </w:rPr>
+              <w:t xml:space="preserve">stylesheet </w:t>
             </w:r>
             <w:r>
               <w:rPr>
@@ -3801,6 +3950,7 @@
               </w:rPr>
               <w:t>,</w:t>
             </w:r>
+            <w:proofErr w:type="gramEnd"/>
             <w:r>
               <w:rPr>
                 <w:rFonts w:ascii="Arial" w:eastAsia="Arial" w:hAnsi="Arial" w:cs="Arial"/>
@@ -4210,7 +4360,15 @@
           <w:rFonts w:ascii="Arial" w:eastAsia="Arial" w:hAnsi="Arial" w:cs="Arial"/>
           <w:color w:val="000000"/>
         </w:rPr>
-        <w:t xml:space="preserve">The Team Lead (TL) is responsible for creating all secrets listed below. The TL is the repository admin and the credentials in use </w:t>
+        <w:t xml:space="preserve">The Team Lead (TL) is responsible for creating all secrets listed below. The TL is the repository admin and the credentials in </w:t>
+      </w:r>
+      <w:proofErr w:type="gramStart"/>
+      <w:r>
+        <w:rPr>
+          <w:rFonts w:ascii="Arial" w:eastAsia="Arial" w:hAnsi="Arial" w:cs="Arial"/>
+          <w:color w:val="000000"/>
+        </w:rPr>
+        <w:t xml:space="preserve">use </w:t>
       </w:r>
       <w:r>
         <w:rPr>
@@ -4219,12 +4377,21 @@
         </w:rPr>
         <w:t>,</w:t>
       </w:r>
-      <w:r>
-        <w:rPr>
-          <w:rFonts w:ascii="Arial" w:eastAsia="Arial" w:hAnsi="Arial" w:cs="Arial"/>
-          <w:color w:val="000000"/>
-        </w:rPr>
-        <w:t xml:space="preserve"> Docker Hub and Render </w:t>
+      <w:proofErr w:type="gramEnd"/>
+      <w:r>
+        <w:rPr>
+          <w:rFonts w:ascii="Arial" w:eastAsia="Arial" w:hAnsi="Arial" w:cs="Arial"/>
+          <w:color w:val="000000"/>
+        </w:rPr>
+        <w:t xml:space="preserve"> Docker Hub and </w:t>
+      </w:r>
+      <w:proofErr w:type="gramStart"/>
+      <w:r>
+        <w:rPr>
+          <w:rFonts w:ascii="Arial" w:eastAsia="Arial" w:hAnsi="Arial" w:cs="Arial"/>
+          <w:color w:val="000000"/>
+        </w:rPr>
+        <w:t xml:space="preserve">Render </w:t>
       </w:r>
       <w:r>
         <w:rPr>
@@ -4233,6 +4400,7 @@
         </w:rPr>
         <w:t>,</w:t>
       </w:r>
+      <w:proofErr w:type="gramEnd"/>
       <w:r>
         <w:rPr>
           <w:rFonts w:ascii="Arial" w:eastAsia="Arial" w:hAnsi="Arial" w:cs="Arial"/>
@@ -4649,7 +4817,17 @@
                 <w:sz w:val="18"/>
                 <w:szCs w:val="18"/>
               </w:rPr>
-              <w:t xml:space="preserve">Team Lead's Docker Hub Personal Access Token (PAT) </w:t>
+              <w:t>Team Lead's Docker Hub Personal Access Token (PAT</w:t>
+            </w:r>
+            <w:proofErr w:type="gramStart"/>
+            <w:r>
+              <w:rPr>
+                <w:rFonts w:ascii="Arial" w:eastAsia="Arial" w:hAnsi="Arial" w:cs="Arial"/>
+                <w:color w:val="000000"/>
+                <w:sz w:val="18"/>
+                <w:szCs w:val="18"/>
+              </w:rPr>
+              <w:t xml:space="preserve">) </w:t>
             </w:r>
             <w:r>
               <w:rPr>
@@ -4660,6 +4838,7 @@
               </w:rPr>
               <w:t>,</w:t>
             </w:r>
+            <w:proofErr w:type="gramEnd"/>
             <w:r>
               <w:rPr>
                 <w:rFonts w:ascii="Arial" w:eastAsia="Arial" w:hAnsi="Arial" w:cs="Arial"/>
@@ -4826,7 +5005,31 @@
           <w:sz w:val="28"/>
           <w:szCs w:val="28"/>
         </w:rPr>
-        <w:t>CI PIPELINE REQUIREMENTS  (.</w:t>
+        <w:t xml:space="preserve">CI PIPELINE </w:t>
+      </w:r>
+      <w:proofErr w:type="gramStart"/>
+      <w:r>
+        <w:rPr>
+          <w:rFonts w:ascii="Arial" w:eastAsia="Arial" w:hAnsi="Arial" w:cs="Arial"/>
+          <w:b/>
+          <w:bCs/>
+          <w:color w:val="1F3864"/>
+          <w:sz w:val="28"/>
+          <w:szCs w:val="28"/>
+        </w:rPr>
+        <w:t>REQUIREMENTS  (</w:t>
+      </w:r>
+      <w:proofErr w:type="gramEnd"/>
+      <w:r>
+        <w:rPr>
+          <w:rFonts w:ascii="Arial" w:eastAsia="Arial" w:hAnsi="Arial" w:cs="Arial"/>
+          <w:b/>
+          <w:bCs/>
+          <w:color w:val="1F3864"/>
+          <w:sz w:val="28"/>
+          <w:szCs w:val="28"/>
+        </w:rPr>
+        <w:t>.</w:t>
       </w:r>
       <w:proofErr w:type="spellStart"/>
       <w:r>
@@ -5029,7 +5232,15 @@
           <w:rFonts w:ascii="Arial" w:eastAsia="Arial" w:hAnsi="Arial" w:cs="Arial"/>
           <w:color w:val="000000"/>
         </w:rPr>
-        <w:t xml:space="preserve">Step 4 – Tag Image: Tag the image using a meaningful strategy </w:t>
+        <w:t xml:space="preserve">Step 4 – Tag Image: Tag the image using a meaningful </w:t>
+      </w:r>
+      <w:proofErr w:type="gramStart"/>
+      <w:r>
+        <w:rPr>
+          <w:rFonts w:ascii="Arial" w:eastAsia="Arial" w:hAnsi="Arial" w:cs="Arial"/>
+          <w:color w:val="000000"/>
+        </w:rPr>
+        <w:t xml:space="preserve">strategy </w:t>
       </w:r>
       <w:r>
         <w:rPr>
@@ -5038,6 +5249,7 @@
         </w:rPr>
         <w:t>,</w:t>
       </w:r>
+      <w:proofErr w:type="gramEnd"/>
       <w:r>
         <w:rPr>
           <w:rFonts w:ascii="Arial" w:eastAsia="Arial" w:hAnsi="Arial" w:cs="Arial"/>
@@ -5167,7 +5379,31 @@
           <w:sz w:val="28"/>
           <w:szCs w:val="28"/>
         </w:rPr>
-        <w:t>CD PIPELINE REQUIREMENTS  (.</w:t>
+        <w:t xml:space="preserve">CD PIPELINE </w:t>
+      </w:r>
+      <w:proofErr w:type="gramStart"/>
+      <w:r>
+        <w:rPr>
+          <w:rFonts w:ascii="Arial" w:eastAsia="Arial" w:hAnsi="Arial" w:cs="Arial"/>
+          <w:b/>
+          <w:bCs/>
+          <w:color w:val="1F3864"/>
+          <w:sz w:val="28"/>
+          <w:szCs w:val="28"/>
+        </w:rPr>
+        <w:t>REQUIREMENTS  (</w:t>
+      </w:r>
+      <w:proofErr w:type="gramEnd"/>
+      <w:r>
+        <w:rPr>
+          <w:rFonts w:ascii="Arial" w:eastAsia="Arial" w:hAnsi="Arial" w:cs="Arial"/>
+          <w:b/>
+          <w:bCs/>
+          <w:color w:val="1F3864"/>
+          <w:sz w:val="28"/>
+          <w:szCs w:val="28"/>
+        </w:rPr>
+        <w:t>.</w:t>
       </w:r>
       <w:proofErr w:type="spellStart"/>
       <w:r>
@@ -5335,7 +5571,23 @@
           <w:rFonts w:ascii="Arial" w:eastAsia="Arial" w:hAnsi="Arial" w:cs="Arial"/>
           <w:color w:val="000000"/>
         </w:rPr>
-        <w:t>Step 3 – Deploy: Send an HTTP POST request to the Render deploy hook URL using curl:</w:t>
+        <w:t xml:space="preserve">Step 3 – Deploy: Send an HTTP POST request to the Render </w:t>
+      </w:r>
+      <w:proofErr w:type="gramStart"/>
+      <w:r>
+        <w:rPr>
+          <w:rFonts w:ascii="Arial" w:eastAsia="Arial" w:hAnsi="Arial" w:cs="Arial"/>
+          <w:color w:val="000000"/>
+        </w:rPr>
+        <w:t>deploy</w:t>
+      </w:r>
+      <w:proofErr w:type="gramEnd"/>
+      <w:r>
+        <w:rPr>
+          <w:rFonts w:ascii="Arial" w:eastAsia="Arial" w:hAnsi="Arial" w:cs="Arial"/>
+          <w:color w:val="000000"/>
+        </w:rPr>
+        <w:t xml:space="preserve"> hook URL using curl:</w:t>
       </w:r>
     </w:p>
     <w:p>
@@ -5353,25 +5605,61 @@
           <w:sz w:val="19"/>
           <w:szCs w:val="19"/>
         </w:rPr>
-        <w:t xml:space="preserve">curl -X POST ${{ </w:t>
-      </w:r>
-      <w:proofErr w:type="spellStart"/>
+        <w:t>curl -X POST $</w:t>
+      </w:r>
+      <w:proofErr w:type="gramStart"/>
       <w:r>
         <w:rPr>
           <w:rFonts w:ascii="Arial" w:eastAsia="Arial" w:hAnsi="Arial" w:cs="Arial"/>
           <w:sz w:val="19"/>
           <w:szCs w:val="19"/>
         </w:rPr>
-        <w:t>secrets.RENDER_DEPLOY_HOOK_URL</w:t>
-      </w:r>
-      <w:proofErr w:type="spellEnd"/>
+        <w:t xml:space="preserve">{{ </w:t>
+      </w:r>
+      <w:proofErr w:type="spellStart"/>
       <w:r>
         <w:rPr>
           <w:rFonts w:ascii="Arial" w:eastAsia="Arial" w:hAnsi="Arial" w:cs="Arial"/>
           <w:sz w:val="19"/>
           <w:szCs w:val="19"/>
         </w:rPr>
-        <w:t xml:space="preserve"> }}</w:t>
+        <w:t>secrets</w:t>
+      </w:r>
+      <w:proofErr w:type="gramEnd"/>
+      <w:r>
+        <w:rPr>
+          <w:rFonts w:ascii="Arial" w:eastAsia="Arial" w:hAnsi="Arial" w:cs="Arial"/>
+          <w:sz w:val="19"/>
+          <w:szCs w:val="19"/>
+        </w:rPr>
+        <w:t>.RENDER_DEPLOY_HOOK_</w:t>
+      </w:r>
+      <w:proofErr w:type="gramStart"/>
+      <w:r>
+        <w:rPr>
+          <w:rFonts w:ascii="Arial" w:eastAsia="Arial" w:hAnsi="Arial" w:cs="Arial"/>
+          <w:sz w:val="19"/>
+          <w:szCs w:val="19"/>
+        </w:rPr>
+        <w:t>URL</w:t>
+      </w:r>
+      <w:proofErr w:type="spellEnd"/>
+      <w:r>
+        <w:rPr>
+          <w:rFonts w:ascii="Arial" w:eastAsia="Arial" w:hAnsi="Arial" w:cs="Arial"/>
+          <w:sz w:val="19"/>
+          <w:szCs w:val="19"/>
+        </w:rPr>
+        <w:t xml:space="preserve"> }</w:t>
+      </w:r>
+      <w:proofErr w:type="gramEnd"/>
+      <w:r>
+        <w:rPr>
+          <w:rFonts w:ascii="Arial" w:eastAsia="Arial" w:hAnsi="Arial" w:cs="Arial"/>
+          <w:sz w:val="19"/>
+          <w:szCs w:val="19"/>
+        </w:rPr>
+        <w:t>}</w:t>
       </w:r>
     </w:p>
     <w:p>
@@ -5440,7 +5728,15 @@
           <w:rFonts w:ascii="Arial" w:eastAsia="Arial" w:hAnsi="Arial" w:cs="Arial"/>
           <w:color w:val="000000"/>
         </w:rPr>
-        <w:t xml:space="preserve">The job must NOT contain any Docker build or push steps </w:t>
+        <w:t xml:space="preserve">The job must NOT contain any Docker build or push </w:t>
+      </w:r>
+      <w:proofErr w:type="gramStart"/>
+      <w:r>
+        <w:rPr>
+          <w:rFonts w:ascii="Arial" w:eastAsia="Arial" w:hAnsi="Arial" w:cs="Arial"/>
+          <w:color w:val="000000"/>
+        </w:rPr>
+        <w:t xml:space="preserve">steps </w:t>
       </w:r>
       <w:r>
         <w:rPr>
@@ -5449,6 +5745,7 @@
         </w:rPr>
         <w:t>,</w:t>
       </w:r>
+      <w:proofErr w:type="gramEnd"/>
       <w:r>
         <w:rPr>
           <w:rFonts w:ascii="Arial" w:eastAsia="Arial" w:hAnsi="Arial" w:cs="Arial"/>
@@ -5950,7 +6247,15 @@
           <w:rFonts w:ascii="Arial" w:eastAsia="Arial" w:hAnsi="Arial" w:cs="Arial"/>
           <w:color w:val="000000"/>
         </w:rPr>
-        <w:t xml:space="preserve">Team Lead: Set up the initial repository structure </w:t>
+        <w:t xml:space="preserve">Team Lead: Set up the initial repository </w:t>
+      </w:r>
+      <w:proofErr w:type="gramStart"/>
+      <w:r>
+        <w:rPr>
+          <w:rFonts w:ascii="Arial" w:eastAsia="Arial" w:hAnsi="Arial" w:cs="Arial"/>
+          <w:color w:val="000000"/>
+        </w:rPr>
+        <w:t xml:space="preserve">structure </w:t>
       </w:r>
       <w:r>
         <w:rPr>
@@ -5959,6 +6264,7 @@
         </w:rPr>
         <w:t>,</w:t>
       </w:r>
+      <w:proofErr w:type="gramEnd"/>
       <w:r>
         <w:rPr>
           <w:rFonts w:ascii="Arial" w:eastAsia="Arial" w:hAnsi="Arial" w:cs="Arial"/>
@@ -6011,7 +6317,15 @@
           <w:rFonts w:ascii="Arial" w:eastAsia="Arial" w:hAnsi="Arial" w:cs="Arial"/>
           <w:color w:val="000000"/>
         </w:rPr>
-        <w:t xml:space="preserve">Commit the Assignment 04 question paper (.docx) to the root of the repository. Every team member must fill in their details </w:t>
+        <w:t xml:space="preserve">Commit the Assignment 04 question paper (.docx) to the root of the repository. Every team member must fill in their </w:t>
+      </w:r>
+      <w:proofErr w:type="gramStart"/>
+      <w:r>
+        <w:rPr>
+          <w:rFonts w:ascii="Arial" w:eastAsia="Arial" w:hAnsi="Arial" w:cs="Arial"/>
+          <w:color w:val="000000"/>
+        </w:rPr>
+        <w:t xml:space="preserve">details </w:t>
       </w:r>
       <w:r>
         <w:rPr>
@@ -6020,12 +6334,21 @@
         </w:rPr>
         <w:t>,</w:t>
       </w:r>
-      <w:r>
-        <w:rPr>
-          <w:rFonts w:ascii="Arial" w:eastAsia="Arial" w:hAnsi="Arial" w:cs="Arial"/>
-          <w:color w:val="000000"/>
-        </w:rPr>
-        <w:t xml:space="preserve"> including their Assigned Page </w:t>
+      <w:proofErr w:type="gramEnd"/>
+      <w:r>
+        <w:rPr>
+          <w:rFonts w:ascii="Arial" w:eastAsia="Arial" w:hAnsi="Arial" w:cs="Arial"/>
+          <w:color w:val="000000"/>
+        </w:rPr>
+        <w:t xml:space="preserve"> including their Assigned </w:t>
+      </w:r>
+      <w:proofErr w:type="gramStart"/>
+      <w:r>
+        <w:rPr>
+          <w:rFonts w:ascii="Arial" w:eastAsia="Arial" w:hAnsi="Arial" w:cs="Arial"/>
+          <w:color w:val="000000"/>
+        </w:rPr>
+        <w:t xml:space="preserve">Page </w:t>
       </w:r>
       <w:r>
         <w:rPr>
@@ -6034,6 +6357,7 @@
         </w:rPr>
         <w:t>,</w:t>
       </w:r>
+      <w:proofErr w:type="gramEnd"/>
       <w:r>
         <w:rPr>
           <w:rFonts w:ascii="Arial" w:eastAsia="Arial" w:hAnsi="Arial" w:cs="Arial"/>
@@ -6070,7 +6394,15 @@
           <w:rFonts w:ascii="Arial" w:eastAsia="Arial" w:hAnsi="Arial" w:cs="Arial"/>
           <w:color w:val="000000"/>
         </w:rPr>
-        <w:t xml:space="preserve"> and configure all three secrets </w:t>
+        <w:t xml:space="preserve"> and configure all three </w:t>
+      </w:r>
+      <w:proofErr w:type="gramStart"/>
+      <w:r>
+        <w:rPr>
+          <w:rFonts w:ascii="Arial" w:eastAsia="Arial" w:hAnsi="Arial" w:cs="Arial"/>
+          <w:color w:val="000000"/>
+        </w:rPr>
+        <w:t xml:space="preserve">secrets </w:t>
       </w:r>
       <w:r>
         <w:rPr>
@@ -6079,6 +6411,7 @@
         </w:rPr>
         <w:t>,</w:t>
       </w:r>
+      <w:proofErr w:type="gramEnd"/>
       <w:r>
         <w:rPr>
           <w:rFonts w:ascii="Arial" w:eastAsia="Arial" w:hAnsi="Arial" w:cs="Arial"/>
@@ -6146,7 +6479,15 @@
           <w:rFonts w:ascii="Arial" w:eastAsia="Arial" w:hAnsi="Arial" w:cs="Arial"/>
           <w:color w:val="000000"/>
         </w:rPr>
-        <w:t>Create the CI workflow at .</w:t>
+        <w:t xml:space="preserve">Create the CI workflow at </w:t>
+      </w:r>
+      <w:proofErr w:type="gramStart"/>
+      <w:r>
+        <w:rPr>
+          <w:rFonts w:ascii="Arial" w:eastAsia="Arial" w:hAnsi="Arial" w:cs="Arial"/>
+          <w:color w:val="000000"/>
+        </w:rPr>
+        <w:t>.</w:t>
       </w:r>
       <w:proofErr w:type="spellStart"/>
       <w:r>
@@ -6187,6 +6528,7 @@
         </w:rPr>
         <w:t>,</w:t>
       </w:r>
+      <w:proofErr w:type="gramEnd"/>
       <w:r>
         <w:rPr>
           <w:rFonts w:ascii="Arial" w:eastAsia="Arial" w:hAnsi="Arial" w:cs="Arial"/>
@@ -6239,7 +6581,15 @@
           <w:rFonts w:ascii="Arial" w:eastAsia="Arial" w:hAnsi="Arial" w:cs="Arial"/>
           <w:color w:val="000000"/>
         </w:rPr>
-        <w:t>Create the CD workflow at .</w:t>
+        <w:t xml:space="preserve">Create the CD workflow at </w:t>
+      </w:r>
+      <w:proofErr w:type="gramStart"/>
+      <w:r>
+        <w:rPr>
+          <w:rFonts w:ascii="Arial" w:eastAsia="Arial" w:hAnsi="Arial" w:cs="Arial"/>
+          <w:color w:val="000000"/>
+        </w:rPr>
+        <w:t>.</w:t>
       </w:r>
       <w:proofErr w:type="spellStart"/>
       <w:r>
@@ -6280,6 +6630,7 @@
         </w:rPr>
         <w:t>,</w:t>
       </w:r>
+      <w:proofErr w:type="gramEnd"/>
       <w:r>
         <w:rPr>
           <w:rFonts w:ascii="Arial" w:eastAsia="Arial" w:hAnsi="Arial" w:cs="Arial"/>
@@ -6415,15 +6766,16 @@
           <w:sz w:val="19"/>
           <w:szCs w:val="19"/>
         </w:rPr>
-        <w:t>“develop”</w:t>
-      </w:r>
+        <w:t>“develop</w:t>
+      </w:r>
+      <w:proofErr w:type="gramStart"/>
       <w:r>
         <w:rPr>
           <w:rFonts w:ascii="Arial" w:eastAsia="Arial" w:hAnsi="Arial" w:cs="Arial"/>
           <w:sz w:val="19"/>
           <w:szCs w:val="19"/>
         </w:rPr>
-        <w:t xml:space="preserve"> </w:t>
+        <w:t>”</w:t>
       </w:r>
       <w:r>
         <w:rPr>
@@ -6431,8 +6783,17 @@
           <w:sz w:val="19"/>
           <w:szCs w:val="19"/>
         </w:rPr>
+        <w:t xml:space="preserve"> </w:t>
+      </w:r>
+      <w:r>
+        <w:rPr>
+          <w:rFonts w:ascii="Arial" w:eastAsia="Arial" w:hAnsi="Arial" w:cs="Arial"/>
+          <w:sz w:val="19"/>
+          <w:szCs w:val="19"/>
+        </w:rPr>
         <w:t>,</w:t>
       </w:r>
+      <w:proofErr w:type="gramEnd"/>
       <w:r>
         <w:rPr>
           <w:rFonts w:ascii="Arial" w:eastAsia="Arial" w:hAnsi="Arial" w:cs="Arial"/>
@@ -6457,16 +6818,26 @@
           <w:sz w:val="19"/>
           <w:szCs w:val="19"/>
         </w:rPr>
-        <w:t xml:space="preserve">Request a review; after approval the Team Lead merges the PR </w:t>
-      </w:r>
+        <w:t xml:space="preserve">Request a review; after approval the Team Lead merges the </w:t>
+      </w:r>
+      <w:proofErr w:type="gramStart"/>
       <w:r>
         <w:rPr>
           <w:rFonts w:ascii="Arial" w:eastAsia="Arial" w:hAnsi="Arial" w:cs="Arial"/>
           <w:sz w:val="19"/>
           <w:szCs w:val="19"/>
         </w:rPr>
+        <w:t xml:space="preserve">PR </w:t>
+      </w:r>
+      <w:r>
+        <w:rPr>
+          <w:rFonts w:ascii="Arial" w:eastAsia="Arial" w:hAnsi="Arial" w:cs="Arial"/>
+          <w:sz w:val="19"/>
+          <w:szCs w:val="19"/>
+        </w:rPr>
         <w:t>,</w:t>
       </w:r>
+      <w:proofErr w:type="gramEnd"/>
       <w:r>
         <w:rPr>
           <w:rFonts w:ascii="Arial" w:eastAsia="Arial" w:hAnsi="Arial" w:cs="Arial"/>
@@ -6490,7 +6861,23 @@
           <w:rFonts w:ascii="Arial" w:eastAsia="Arial" w:hAnsi="Arial" w:cs="Arial"/>
           <w:color w:val="000000"/>
         </w:rPr>
-        <w:t xml:space="preserve">After all 5 PRs are merged, verify the live </w:t>
+        <w:t xml:space="preserve">After </w:t>
+      </w:r>
+      <w:proofErr w:type="gramStart"/>
+      <w:r>
+        <w:rPr>
+          <w:rFonts w:ascii="Arial" w:eastAsia="Arial" w:hAnsi="Arial" w:cs="Arial"/>
+          <w:color w:val="000000"/>
+        </w:rPr>
+        <w:t>all</w:t>
+      </w:r>
+      <w:proofErr w:type="gramEnd"/>
+      <w:r>
+        <w:rPr>
+          <w:rFonts w:ascii="Arial" w:eastAsia="Arial" w:hAnsi="Arial" w:cs="Arial"/>
+          <w:color w:val="000000"/>
+        </w:rPr>
+        <w:t xml:space="preserve"> 5 PRs are merged, verify the live </w:t>
       </w:r>
       <w:proofErr w:type="spellStart"/>
       <w:r>
@@ -9223,7 +9610,15 @@
           <w:rFonts w:ascii="Arial" w:eastAsia="Arial" w:hAnsi="Arial" w:cs="Arial"/>
           <w:color w:val="000000"/>
         </w:rPr>
-        <w:t xml:space="preserve">Screenshot 2: Each member's CI workflow run triggered by their individual PR </w:t>
+        <w:t xml:space="preserve">Screenshot 2: Each member's CI workflow run triggered by their individual </w:t>
+      </w:r>
+      <w:proofErr w:type="gramStart"/>
+      <w:r>
+        <w:rPr>
+          <w:rFonts w:ascii="Arial" w:eastAsia="Arial" w:hAnsi="Arial" w:cs="Arial"/>
+          <w:color w:val="000000"/>
+        </w:rPr>
+        <w:t xml:space="preserve">PR </w:t>
       </w:r>
       <w:r>
         <w:rPr>
@@ -9232,6 +9627,7 @@
         </w:rPr>
         <w:t>,</w:t>
       </w:r>
+      <w:proofErr w:type="gramEnd"/>
       <w:r>
         <w:rPr>
           <w:rFonts w:ascii="Arial" w:eastAsia="Arial" w:hAnsi="Arial" w:cs="Arial"/>
@@ -9278,7 +9674,15 @@
           <w:rFonts w:ascii="Arial" w:eastAsia="Arial" w:hAnsi="Arial" w:cs="Arial"/>
           <w:color w:val="000000"/>
         </w:rPr>
-        <w:t>“develop”</w:t>
+        <w:t>“develop</w:t>
+      </w:r>
+      <w:proofErr w:type="gramStart"/>
+      <w:r>
+        <w:rPr>
+          <w:rFonts w:ascii="Arial" w:eastAsia="Arial" w:hAnsi="Arial" w:cs="Arial"/>
+          <w:color w:val="000000"/>
+        </w:rPr>
+        <w:t>”</w:t>
       </w:r>
       <w:r>
         <w:rPr>
@@ -9294,6 +9698,7 @@
         </w:rPr>
         <w:t>,</w:t>
       </w:r>
+      <w:proofErr w:type="gramEnd"/>
       <w:r>
         <w:rPr>
           <w:rFonts w:ascii="Arial" w:eastAsia="Arial" w:hAnsi="Arial" w:cs="Arial"/>
@@ -9424,8 +9829,8 @@
         <w:tblLook w:val="0000" w:firstRow="0" w:lastRow="0" w:firstColumn="0" w:lastColumn="0" w:noHBand="0" w:noVBand="0"/>
       </w:tblPr>
       <w:tblGrid>
-        <w:gridCol w:w="3200"/>
-        <w:gridCol w:w="6160"/>
+        <w:gridCol w:w="1359"/>
+        <w:gridCol w:w="8705"/>
       </w:tblGrid>
       <w:tr>
         <w:tc>
@@ -9522,6 +9927,7 @@
                 <w:sz w:val="18"/>
                 <w:szCs w:val="18"/>
               </w:rPr>
+              <w:lastRenderedPageBreak/>
               <w:t xml:space="preserve">GitHub </w:t>
             </w:r>
             <w:r>
@@ -9566,7 +9972,61 @@
             </w:tcMar>
             <w:vAlign w:val="center"/>
           </w:tcPr>
-          <w:p/>
+          <w:p>
+            <w:r>
+              <w:rPr>
+                <w:noProof/>
+              </w:rPr>
+              <w:drawing>
+                <wp:inline distT="0" distB="0" distL="0" distR="0" wp14:anchorId="587F5B66" wp14:editId="77B02B6C">
+                  <wp:extent cx="6400800" cy="3467100"/>
+                  <wp:effectExtent l="0" t="0" r="0" b="0"/>
+                  <wp:docPr id="607527398" name="Picture 1"/>
+                  <wp:cNvGraphicFramePr>
+                    <a:graphicFrameLocks xmlns:a="http://schemas.openxmlformats.org/drawingml/2006/main" noChangeAspect="1"/>
+                  </wp:cNvGraphicFramePr>
+                  <a:graphic xmlns:a="http://schemas.openxmlformats.org/drawingml/2006/main">
+                    <a:graphicData uri="http://schemas.openxmlformats.org/drawingml/2006/picture">
+                      <pic:pic xmlns:pic="http://schemas.openxmlformats.org/drawingml/2006/picture">
+                        <pic:nvPicPr>
+                          <pic:cNvPr id="0" name="Picture 1"/>
+                          <pic:cNvPicPr>
+                            <a:picLocks noChangeAspect="1" noChangeArrowheads="1"/>
+                          </pic:cNvPicPr>
+                        </pic:nvPicPr>
+                        <pic:blipFill>
+                          <a:blip r:embed="rId7" cstate="print">
+                            <a:extLst>
+                              <a:ext uri="{28A0092B-C50C-407E-A947-70E740481C1C}">
+                                <a14:useLocalDpi xmlns:a14="http://schemas.microsoft.com/office/drawing/2010/main" val="0"/>
+                              </a:ext>
+                            </a:extLst>
+                          </a:blip>
+                          <a:srcRect/>
+                          <a:stretch>
+                            <a:fillRect/>
+                          </a:stretch>
+                        </pic:blipFill>
+                        <pic:spPr bwMode="auto">
+                          <a:xfrm>
+                            <a:off x="0" y="0"/>
+                            <a:ext cx="6400800" cy="3467100"/>
+                          </a:xfrm>
+                          <a:prstGeom prst="rect">
+                            <a:avLst/>
+                          </a:prstGeom>
+                          <a:noFill/>
+                          <a:ln>
+                            <a:noFill/>
+                          </a:ln>
+                        </pic:spPr>
+                      </pic:pic>
+                    </a:graphicData>
+                  </a:graphic>
+                </wp:inline>
+              </w:drawing>
+            </w:r>
+          </w:p>
         </w:tc>
       </w:tr>
       <w:tr>
@@ -9620,7 +10080,61 @@
             </w:tcMar>
             <w:vAlign w:val="center"/>
           </w:tcPr>
-          <w:p/>
+          <w:p>
+            <w:r>
+              <w:rPr>
+                <w:noProof/>
+              </w:rPr>
+              <w:drawing>
+                <wp:inline distT="0" distB="0" distL="0" distR="0" wp14:anchorId="61246B12" wp14:editId="4E32388C">
+                  <wp:extent cx="6400800" cy="3467100"/>
+                  <wp:effectExtent l="0" t="0" r="0" b="0"/>
+                  <wp:docPr id="285168914" name="Picture 2"/>
+                  <wp:cNvGraphicFramePr>
+                    <a:graphicFrameLocks xmlns:a="http://schemas.openxmlformats.org/drawingml/2006/main" noChangeAspect="1"/>
+                  </wp:cNvGraphicFramePr>
+                  <a:graphic xmlns:a="http://schemas.openxmlformats.org/drawingml/2006/main">
+                    <a:graphicData uri="http://schemas.openxmlformats.org/drawingml/2006/picture">
+                      <pic:pic xmlns:pic="http://schemas.openxmlformats.org/drawingml/2006/picture">
+                        <pic:nvPicPr>
+                          <pic:cNvPr id="0" name="Picture 3"/>
+                          <pic:cNvPicPr>
+                            <a:picLocks noChangeAspect="1" noChangeArrowheads="1"/>
+                          </pic:cNvPicPr>
+                        </pic:nvPicPr>
+                        <pic:blipFill>
+                          <a:blip r:embed="rId8" cstate="print">
+                            <a:extLst>
+                              <a:ext uri="{28A0092B-C50C-407E-A947-70E740481C1C}">
+                                <a14:useLocalDpi xmlns:a14="http://schemas.microsoft.com/office/drawing/2010/main" val="0"/>
+                              </a:ext>
+                            </a:extLst>
+                          </a:blip>
+                          <a:srcRect/>
+                          <a:stretch>
+                            <a:fillRect/>
+                          </a:stretch>
+                        </pic:blipFill>
+                        <pic:spPr bwMode="auto">
+                          <a:xfrm>
+                            <a:off x="0" y="0"/>
+                            <a:ext cx="6400800" cy="3467100"/>
+                          </a:xfrm>
+                          <a:prstGeom prst="rect">
+                            <a:avLst/>
+                          </a:prstGeom>
+                          <a:noFill/>
+                          <a:ln>
+                            <a:noFill/>
+                          </a:ln>
+                        </pic:spPr>
+                      </pic:pic>
+                    </a:graphicData>
+                  </a:graphic>
+                </wp:inline>
+              </w:drawing>
+            </w:r>
+          </w:p>
         </w:tc>
       </w:tr>
       <w:tr>
@@ -9652,6 +10166,7 @@
                 <w:sz w:val="18"/>
                 <w:szCs w:val="18"/>
               </w:rPr>
+              <w:lastRenderedPageBreak/>
               <w:t>Docker Hub – Pushed Image with Tags</w:t>
             </w:r>
           </w:p>
@@ -9674,7 +10189,61 @@
             </w:tcMar>
             <w:vAlign w:val="center"/>
           </w:tcPr>
-          <w:p/>
+          <w:p>
+            <w:r>
+              <w:rPr>
+                <w:noProof/>
+              </w:rPr>
+              <w:drawing>
+                <wp:inline distT="0" distB="0" distL="0" distR="0" wp14:anchorId="18692249" wp14:editId="44AD7A1B">
+                  <wp:extent cx="6400800" cy="3467100"/>
+                  <wp:effectExtent l="0" t="0" r="0" b="0"/>
+                  <wp:docPr id="2075862516" name="Picture 3"/>
+                  <wp:cNvGraphicFramePr>
+                    <a:graphicFrameLocks xmlns:a="http://schemas.openxmlformats.org/drawingml/2006/main" noChangeAspect="1"/>
+                  </wp:cNvGraphicFramePr>
+                  <a:graphic xmlns:a="http://schemas.openxmlformats.org/drawingml/2006/main">
+                    <a:graphicData uri="http://schemas.openxmlformats.org/drawingml/2006/picture">
+                      <pic:pic xmlns:pic="http://schemas.openxmlformats.org/drawingml/2006/picture">
+                        <pic:nvPicPr>
+                          <pic:cNvPr id="0" name="Picture 5"/>
+                          <pic:cNvPicPr>
+                            <a:picLocks noChangeAspect="1" noChangeArrowheads="1"/>
+                          </pic:cNvPicPr>
+                        </pic:nvPicPr>
+                        <pic:blipFill>
+                          <a:blip r:embed="rId9" cstate="print">
+                            <a:extLst>
+                              <a:ext uri="{28A0092B-C50C-407E-A947-70E740481C1C}">
+                                <a14:useLocalDpi xmlns:a14="http://schemas.microsoft.com/office/drawing/2010/main" val="0"/>
+                              </a:ext>
+                            </a:extLst>
+                          </a:blip>
+                          <a:srcRect/>
+                          <a:stretch>
+                            <a:fillRect/>
+                          </a:stretch>
+                        </pic:blipFill>
+                        <pic:spPr bwMode="auto">
+                          <a:xfrm>
+                            <a:off x="0" y="0"/>
+                            <a:ext cx="6400800" cy="3467100"/>
+                          </a:xfrm>
+                          <a:prstGeom prst="rect">
+                            <a:avLst/>
+                          </a:prstGeom>
+                          <a:noFill/>
+                          <a:ln>
+                            <a:noFill/>
+                          </a:ln>
+                        </pic:spPr>
+                      </pic:pic>
+                    </a:graphicData>
+                  </a:graphic>
+                </wp:inline>
+              </w:drawing>
+            </w:r>
+          </w:p>
         </w:tc>
       </w:tr>
       <w:tr>
@@ -9739,7 +10308,61 @@
             </w:tcMar>
             <w:vAlign w:val="center"/>
           </w:tcPr>
-          <w:p/>
+          <w:p>
+            <w:r>
+              <w:rPr>
+                <w:noProof/>
+              </w:rPr>
+              <w:drawing>
+                <wp:inline distT="0" distB="0" distL="0" distR="0" wp14:anchorId="0880EF15" wp14:editId="07AAF609">
+                  <wp:extent cx="6400800" cy="3467100"/>
+                  <wp:effectExtent l="0" t="0" r="0" b="0"/>
+                  <wp:docPr id="175212615" name="Picture 4"/>
+                  <wp:cNvGraphicFramePr>
+                    <a:graphicFrameLocks xmlns:a="http://schemas.openxmlformats.org/drawingml/2006/main" noChangeAspect="1"/>
+                  </wp:cNvGraphicFramePr>
+                  <a:graphic xmlns:a="http://schemas.openxmlformats.org/drawingml/2006/main">
+                    <a:graphicData uri="http://schemas.openxmlformats.org/drawingml/2006/picture">
+                      <pic:pic xmlns:pic="http://schemas.openxmlformats.org/drawingml/2006/picture">
+                        <pic:nvPicPr>
+                          <pic:cNvPr id="0" name="Picture 7"/>
+                          <pic:cNvPicPr>
+                            <a:picLocks noChangeAspect="1" noChangeArrowheads="1"/>
+                          </pic:cNvPicPr>
+                        </pic:nvPicPr>
+                        <pic:blipFill>
+                          <a:blip r:embed="rId10" cstate="print">
+                            <a:extLst>
+                              <a:ext uri="{28A0092B-C50C-407E-A947-70E740481C1C}">
+                                <a14:useLocalDpi xmlns:a14="http://schemas.microsoft.com/office/drawing/2010/main" val="0"/>
+                              </a:ext>
+                            </a:extLst>
+                          </a:blip>
+                          <a:srcRect/>
+                          <a:stretch>
+                            <a:fillRect/>
+                          </a:stretch>
+                        </pic:blipFill>
+                        <pic:spPr bwMode="auto">
+                          <a:xfrm>
+                            <a:off x="0" y="0"/>
+                            <a:ext cx="6400800" cy="3467100"/>
+                          </a:xfrm>
+                          <a:prstGeom prst="rect">
+                            <a:avLst/>
+                          </a:prstGeom>
+                          <a:noFill/>
+                          <a:ln>
+                            <a:noFill/>
+                          </a:ln>
+                        </pic:spPr>
+                      </pic:pic>
+                    </a:graphicData>
+                  </a:graphic>
+                </wp:inline>
+              </w:drawing>
+            </w:r>
+          </w:p>
         </w:tc>
       </w:tr>
       <w:tr>
@@ -9771,6 +10394,7 @@
                 <w:sz w:val="18"/>
                 <w:szCs w:val="18"/>
               </w:rPr>
+              <w:lastRenderedPageBreak/>
               <w:t xml:space="preserve">Live </w:t>
             </w:r>
             <w:proofErr w:type="spellStart"/>
@@ -9817,7 +10441,61 @@
             </w:tcMar>
             <w:vAlign w:val="center"/>
           </w:tcPr>
-          <w:p/>
+          <w:p>
+            <w:r>
+              <w:rPr>
+                <w:noProof/>
+              </w:rPr>
+              <w:drawing>
+                <wp:inline distT="0" distB="0" distL="0" distR="0" wp14:anchorId="259E2E1E" wp14:editId="3D29CD04">
+                  <wp:extent cx="6400800" cy="3467100"/>
+                  <wp:effectExtent l="0" t="0" r="0" b="0"/>
+                  <wp:docPr id="939400828" name="Picture 5"/>
+                  <wp:cNvGraphicFramePr>
+                    <a:graphicFrameLocks xmlns:a="http://schemas.openxmlformats.org/drawingml/2006/main" noChangeAspect="1"/>
+                  </wp:cNvGraphicFramePr>
+                  <a:graphic xmlns:a="http://schemas.openxmlformats.org/drawingml/2006/main">
+                    <a:graphicData uri="http://schemas.openxmlformats.org/drawingml/2006/picture">
+                      <pic:pic xmlns:pic="http://schemas.openxmlformats.org/drawingml/2006/picture">
+                        <pic:nvPicPr>
+                          <pic:cNvPr id="0" name="Picture 9"/>
+                          <pic:cNvPicPr>
+                            <a:picLocks noChangeAspect="1" noChangeArrowheads="1"/>
+                          </pic:cNvPicPr>
+                        </pic:nvPicPr>
+                        <pic:blipFill>
+                          <a:blip r:embed="rId11" cstate="print">
+                            <a:extLst>
+                              <a:ext uri="{28A0092B-C50C-407E-A947-70E740481C1C}">
+                                <a14:useLocalDpi xmlns:a14="http://schemas.microsoft.com/office/drawing/2010/main" val="0"/>
+                              </a:ext>
+                            </a:extLst>
+                          </a:blip>
+                          <a:srcRect/>
+                          <a:stretch>
+                            <a:fillRect/>
+                          </a:stretch>
+                        </pic:blipFill>
+                        <pic:spPr bwMode="auto">
+                          <a:xfrm>
+                            <a:off x="0" y="0"/>
+                            <a:ext cx="6400800" cy="3467100"/>
+                          </a:xfrm>
+                          <a:prstGeom prst="rect">
+                            <a:avLst/>
+                          </a:prstGeom>
+                          <a:noFill/>
+                          <a:ln>
+                            <a:noFill/>
+                          </a:ln>
+                        </pic:spPr>
+                      </pic:pic>
+                    </a:graphicData>
+                  </a:graphic>
+                </wp:inline>
+              </w:drawing>
+            </w:r>
+          </w:p>
         </w:tc>
       </w:tr>
       <w:tr>
@@ -9849,7 +10527,6 @@
                 <w:sz w:val="18"/>
                 <w:szCs w:val="18"/>
               </w:rPr>
-              <w:lastRenderedPageBreak/>
               <w:t>Assignment 04 .docx Visible in GitHub Repo</w:t>
             </w:r>
           </w:p>
@@ -9872,7 +10549,61 @@
             </w:tcMar>
             <w:vAlign w:val="center"/>
           </w:tcPr>
-          <w:p/>
+          <w:p>
+            <w:r>
+              <w:rPr>
+                <w:noProof/>
+              </w:rPr>
+              <w:drawing>
+                <wp:inline distT="0" distB="0" distL="0" distR="0" wp14:anchorId="370E1664" wp14:editId="4957822D">
+                  <wp:extent cx="6400800" cy="3467100"/>
+                  <wp:effectExtent l="0" t="0" r="0" b="0"/>
+                  <wp:docPr id="828877718" name="Picture 6"/>
+                  <wp:cNvGraphicFramePr>
+                    <a:graphicFrameLocks xmlns:a="http://schemas.openxmlformats.org/drawingml/2006/main" noChangeAspect="1"/>
+                  </wp:cNvGraphicFramePr>
+                  <a:graphic xmlns:a="http://schemas.openxmlformats.org/drawingml/2006/main">
+                    <a:graphicData uri="http://schemas.openxmlformats.org/drawingml/2006/picture">
+                      <pic:pic xmlns:pic="http://schemas.openxmlformats.org/drawingml/2006/picture">
+                        <pic:nvPicPr>
+                          <pic:cNvPr id="0" name="Picture 11"/>
+                          <pic:cNvPicPr>
+                            <a:picLocks noChangeAspect="1" noChangeArrowheads="1"/>
+                          </pic:cNvPicPr>
+                        </pic:nvPicPr>
+                        <pic:blipFill>
+                          <a:blip r:embed="rId12" cstate="print">
+                            <a:extLst>
+                              <a:ext uri="{28A0092B-C50C-407E-A947-70E740481C1C}">
+                                <a14:useLocalDpi xmlns:a14="http://schemas.microsoft.com/office/drawing/2010/main" val="0"/>
+                              </a:ext>
+                            </a:extLst>
+                          </a:blip>
+                          <a:srcRect/>
+                          <a:stretch>
+                            <a:fillRect/>
+                          </a:stretch>
+                        </pic:blipFill>
+                        <pic:spPr bwMode="auto">
+                          <a:xfrm>
+                            <a:off x="0" y="0"/>
+                            <a:ext cx="6400800" cy="3467100"/>
+                          </a:xfrm>
+                          <a:prstGeom prst="rect">
+                            <a:avLst/>
+                          </a:prstGeom>
+                          <a:noFill/>
+                          <a:ln>
+                            <a:noFill/>
+                          </a:ln>
+                        </pic:spPr>
+                      </pic:pic>
+                    </a:graphicData>
+                  </a:graphic>
+                </wp:inline>
+              </w:drawing>
+            </w:r>
+          </w:p>
         </w:tc>
       </w:tr>
     </w:tbl>
@@ -9887,8 +10618,6 @@
           <w:bottom w:val="single" w:sz="6" w:space="4" w:color="2E75B6"/>
         </w:pBdr>
         <w:spacing w:before="260" w:after="120"/>
-      </w:pPr>
-      <w:r>
         <w:rPr>
           <w:rFonts w:ascii="Arial" w:eastAsia="Arial" w:hAnsi="Arial" w:cs="Arial"/>
           <w:b/>
@@ -9897,6 +10626,57 @@
           <w:sz w:val="28"/>
           <w:szCs w:val="28"/>
         </w:rPr>
+      </w:pPr>
+    </w:p>
+    <w:p>
+      <w:pPr>
+        <w:pBdr>
+          <w:bottom w:val="single" w:sz="6" w:space="4" w:color="2E75B6"/>
+        </w:pBdr>
+        <w:spacing w:before="260" w:after="120"/>
+        <w:rPr>
+          <w:rFonts w:ascii="Arial" w:eastAsia="Arial" w:hAnsi="Arial" w:cs="Arial"/>
+          <w:b/>
+          <w:bCs/>
+          <w:color w:val="1F3864"/>
+          <w:sz w:val="28"/>
+          <w:szCs w:val="28"/>
+        </w:rPr>
+      </w:pPr>
+    </w:p>
+    <w:p>
+      <w:pPr>
+        <w:pBdr>
+          <w:bottom w:val="single" w:sz="6" w:space="4" w:color="2E75B6"/>
+        </w:pBdr>
+        <w:spacing w:before="260" w:after="120"/>
+        <w:rPr>
+          <w:rFonts w:ascii="Arial" w:eastAsia="Arial" w:hAnsi="Arial" w:cs="Arial"/>
+          <w:b/>
+          <w:bCs/>
+          <w:color w:val="1F3864"/>
+          <w:sz w:val="28"/>
+          <w:szCs w:val="28"/>
+        </w:rPr>
+      </w:pPr>
+    </w:p>
+    <w:p>
+      <w:pPr>
+        <w:pBdr>
+          <w:bottom w:val="single" w:sz="6" w:space="4" w:color="2E75B6"/>
+        </w:pBdr>
+        <w:spacing w:before="260" w:after="120"/>
+      </w:pPr>
+      <w:r>
+        <w:rPr>
+          <w:rFonts w:ascii="Arial" w:eastAsia="Arial" w:hAnsi="Arial" w:cs="Arial"/>
+          <w:b/>
+          <w:bCs/>
+          <w:color w:val="1F3864"/>
+          <w:sz w:val="28"/>
+          <w:szCs w:val="28"/>
+        </w:rPr>
+        <w:lastRenderedPageBreak/>
         <w:t>TEAM REFLECTION</w:t>
       </w:r>
     </w:p>
@@ -9930,7 +10710,27 @@
           <w:bCs/>
           <w:color w:val="000000"/>
         </w:rPr>
-        <w:t xml:space="preserve">Member 1  (Name: </w:t>
+        <w:t xml:space="preserve">Member </w:t>
+      </w:r>
+      <w:proofErr w:type="gramStart"/>
+      <w:r>
+        <w:rPr>
+          <w:rFonts w:ascii="Arial" w:eastAsia="Arial" w:hAnsi="Arial" w:cs="Arial"/>
+          <w:b/>
+          <w:bCs/>
+          <w:color w:val="000000"/>
+        </w:rPr>
+        <w:t>1  (</w:t>
+      </w:r>
+      <w:proofErr w:type="gramEnd"/>
+      <w:r>
+        <w:rPr>
+          <w:rFonts w:ascii="Arial" w:eastAsia="Arial" w:hAnsi="Arial" w:cs="Arial"/>
+          <w:b/>
+          <w:bCs/>
+          <w:color w:val="000000"/>
+        </w:rPr>
+        <w:t xml:space="preserve">Name: </w:t>
       </w:r>
       <w:r>
         <w:rPr>
@@ -10034,8 +10834,13 @@
             <w:vAlign w:val="center"/>
           </w:tcPr>
           <w:p>
-            <w:r>
-              <w:t>Overall this assignment deepened my understanding of DevOps practices and the importance of structured branching strategies in team projects.</w:t>
+            <w:proofErr w:type="gramStart"/>
+            <w:r>
+              <w:t>Overall</w:t>
+            </w:r>
+            <w:proofErr w:type="gramEnd"/>
+            <w:r>
+              <w:t xml:space="preserve"> this assignment deepened my understanding of DevOps practices and the importance of structured branching strategies in team projects.</w:t>
             </w:r>
           </w:p>
         </w:tc>
@@ -10058,7 +10863,27 @@
           <w:bCs/>
           <w:color w:val="000000"/>
         </w:rPr>
-        <w:t xml:space="preserve">Member 2  (Name: </w:t>
+        <w:t xml:space="preserve">Member </w:t>
+      </w:r>
+      <w:proofErr w:type="gramStart"/>
+      <w:r>
+        <w:rPr>
+          <w:rFonts w:ascii="Arial" w:eastAsia="Arial" w:hAnsi="Arial" w:cs="Arial"/>
+          <w:b/>
+          <w:bCs/>
+          <w:color w:val="000000"/>
+        </w:rPr>
+        <w:t>2  (</w:t>
+      </w:r>
+      <w:proofErr w:type="gramEnd"/>
+      <w:r>
+        <w:rPr>
+          <w:rFonts w:ascii="Arial" w:eastAsia="Arial" w:hAnsi="Arial" w:cs="Arial"/>
+          <w:b/>
+          <w:bCs/>
+          <w:color w:val="000000"/>
+        </w:rPr>
+        <w:t xml:space="preserve">Name: </w:t>
       </w:r>
       <w:r>
         <w:rPr>
@@ -10186,7 +11011,27 @@
           <w:bCs/>
           <w:color w:val="000000"/>
         </w:rPr>
-        <w:t xml:space="preserve">Member 3  (Name: </w:t>
+        <w:t xml:space="preserve">Member </w:t>
+      </w:r>
+      <w:proofErr w:type="gramStart"/>
+      <w:r>
+        <w:rPr>
+          <w:rFonts w:ascii="Arial" w:eastAsia="Arial" w:hAnsi="Arial" w:cs="Arial"/>
+          <w:b/>
+          <w:bCs/>
+          <w:color w:val="000000"/>
+        </w:rPr>
+        <w:t>3  (</w:t>
+      </w:r>
+      <w:proofErr w:type="gramEnd"/>
+      <w:r>
+        <w:rPr>
+          <w:rFonts w:ascii="Arial" w:eastAsia="Arial" w:hAnsi="Arial" w:cs="Arial"/>
+          <w:b/>
+          <w:bCs/>
+          <w:color w:val="000000"/>
+        </w:rPr>
+        <w:t xml:space="preserve">Name: </w:t>
       </w:r>
       <w:r>
         <w:rPr>
@@ -10265,7 +11110,15 @@
           </w:tcPr>
           <w:p>
             <w:r>
-              <w:t xml:space="preserve">I understood how CI automatically builds a Docker image when a PR targets develop. </w:t>
+              <w:t xml:space="preserve">I understood how CI automatically builds a Docker image when </w:t>
+            </w:r>
+            <w:proofErr w:type="gramStart"/>
+            <w:r>
+              <w:t>a PR targets</w:t>
+            </w:r>
+            <w:proofErr w:type="gramEnd"/>
+            <w:r>
+              <w:t xml:space="preserve"> develop. </w:t>
             </w:r>
           </w:p>
         </w:tc>
@@ -10314,7 +11167,27 @@
           <w:bCs/>
           <w:color w:val="000000"/>
         </w:rPr>
-        <w:t>Member 4  (Name: Muhammad Asfand Yar Haider)</w:t>
+        <w:t xml:space="preserve">Member </w:t>
+      </w:r>
+      <w:proofErr w:type="gramStart"/>
+      <w:r>
+        <w:rPr>
+          <w:rFonts w:ascii="Arial" w:eastAsia="Arial" w:hAnsi="Arial" w:cs="Arial"/>
+          <w:b/>
+          <w:bCs/>
+          <w:color w:val="000000"/>
+        </w:rPr>
+        <w:t>4  (</w:t>
+      </w:r>
+      <w:proofErr w:type="gramEnd"/>
+      <w:r>
+        <w:rPr>
+          <w:rFonts w:ascii="Arial" w:eastAsia="Arial" w:hAnsi="Arial" w:cs="Arial"/>
+          <w:b/>
+          <w:bCs/>
+          <w:color w:val="000000"/>
+        </w:rPr>
+        <w:t>Name: Muhammad Asfand Yar Haider)</w:t>
       </w:r>
     </w:p>
     <w:tbl>
@@ -10444,7 +11317,27 @@
           <w:bCs/>
           <w:color w:val="000000"/>
         </w:rPr>
-        <w:t xml:space="preserve">Member 5  (Name: </w:t>
+        <w:t xml:space="preserve">Member </w:t>
+      </w:r>
+      <w:proofErr w:type="gramStart"/>
+      <w:r>
+        <w:rPr>
+          <w:rFonts w:ascii="Arial" w:eastAsia="Arial" w:hAnsi="Arial" w:cs="Arial"/>
+          <w:b/>
+          <w:bCs/>
+          <w:color w:val="000000"/>
+        </w:rPr>
+        <w:t>5  (</w:t>
+      </w:r>
+      <w:proofErr w:type="gramEnd"/>
+      <w:r>
+        <w:rPr>
+          <w:rFonts w:ascii="Arial" w:eastAsia="Arial" w:hAnsi="Arial" w:cs="Arial"/>
+          <w:b/>
+          <w:bCs/>
+          <w:color w:val="000000"/>
+        </w:rPr>
+        <w:t xml:space="preserve">Name: </w:t>
       </w:r>
       <w:r>
         <w:rPr>
@@ -10495,7 +11388,11 @@
             </w:tcMar>
             <w:vAlign w:val="center"/>
           </w:tcPr>
-          <w:p/>
+          <w:p>
+            <w:r>
+              <w:t>I learnt how a PR-based CI pipeline checks changes before merge.</w:t>
+            </w:r>
+          </w:p>
         </w:tc>
       </w:tr>
       <w:tr>
@@ -10517,7 +11414,11 @@
             </w:tcMar>
             <w:vAlign w:val="center"/>
           </w:tcPr>
-          <w:p/>
+          <w:p>
+            <w:r>
+              <w:t>The challenging part was understanding which work belonged to members versus the Team Lead.</w:t>
+            </w:r>
+          </w:p>
         </w:tc>
       </w:tr>
       <w:tr>
@@ -10549,12 +11450,12 @@
       </w:pPr>
     </w:p>
     <w:sectPr>
-      <w:headerReference w:type="even" r:id="rId7"/>
-      <w:headerReference w:type="default" r:id="rId8"/>
-      <w:footerReference w:type="even" r:id="rId9"/>
-      <w:footerReference w:type="default" r:id="rId10"/>
-      <w:headerReference w:type="first" r:id="rId11"/>
-      <w:footerReference w:type="first" r:id="rId12"/>
+      <w:headerReference w:type="even" r:id="rId13"/>
+      <w:headerReference w:type="default" r:id="rId14"/>
+      <w:footerReference w:type="even" r:id="rId15"/>
+      <w:footerReference w:type="default" r:id="rId16"/>
+      <w:headerReference w:type="first" r:id="rId17"/>
+      <w:footerReference w:type="first" r:id="rId18"/>
       <w:pgSz w:w="12240" w:h="15840"/>
       <w:pgMar w:top="1080" w:right="1080" w:bottom="1080" w:left="1080" w:header="708" w:footer="708" w:gutter="0"/>
       <w:cols w:space="720"/>
@@ -10613,7 +11514,17 @@
         <w:sz w:val="16"/>
         <w:szCs w:val="16"/>
       </w:rPr>
-      <w:t xml:space="preserve">Assignment 04 – CI/CD Pipeline Integration  </w:t>
+      <w:t xml:space="preserve">Assignment 04 – CI/CD Pipeline </w:t>
+    </w:r>
+    <w:proofErr w:type="gramStart"/>
+    <w:r>
+      <w:rPr>
+        <w:rFonts w:ascii="Arial" w:eastAsia="Arial" w:hAnsi="Arial" w:cs="Arial"/>
+        <w:color w:val="555555"/>
+        <w:sz w:val="16"/>
+        <w:szCs w:val="16"/>
+      </w:rPr>
+      <w:t xml:space="preserve">Integration  </w:t>
     </w:r>
     <w:r>
       <w:rPr>
@@ -10623,6 +11534,15 @@
         <w:szCs w:val="16"/>
       </w:rPr>
       <w:tab/>
+    </w:r>
+    <w:proofErr w:type="gramEnd"/>
+    <w:r>
+      <w:rPr>
+        <w:rFonts w:ascii="Arial" w:eastAsia="Arial" w:hAnsi="Arial" w:cs="Arial"/>
+        <w:color w:val="555555"/>
+        <w:sz w:val="16"/>
+        <w:szCs w:val="16"/>
+      </w:rPr>
       <w:t xml:space="preserve"> Page </w:t>
     </w:r>
     <w:r>
@@ -10733,7 +11653,19 @@
         <w:sz w:val="18"/>
         <w:szCs w:val="18"/>
       </w:rPr>
-      <w:t>University of Central Punjab – Faculty of Information Technology</w:t>
+      <w:t xml:space="preserve">University of Central Punjab – Faculty of Information </w:t>
+    </w:r>
+    <w:proofErr w:type="gramStart"/>
+    <w:r>
+      <w:rPr>
+        <w:rFonts w:ascii="Arial" w:eastAsia="Arial" w:hAnsi="Arial" w:cs="Arial"/>
+        <w:b/>
+        <w:bCs/>
+        <w:color w:val="1F3864"/>
+        <w:sz w:val="18"/>
+        <w:szCs w:val="18"/>
+      </w:rPr>
+      <w:t>Technology</w:t>
     </w:r>
     <w:r>
       <w:rPr>
@@ -10742,7 +11674,17 @@
         <w:sz w:val="18"/>
         <w:szCs w:val="18"/>
       </w:rPr>
-      <w:t xml:space="preserve">  |  </w:t>
+      <w:t xml:space="preserve">  |</w:t>
+    </w:r>
+    <w:proofErr w:type="gramEnd"/>
+    <w:r>
+      <w:rPr>
+        <w:rFonts w:ascii="Arial" w:eastAsia="Arial" w:hAnsi="Arial" w:cs="Arial"/>
+        <w:color w:val="ADB9CA"/>
+        <w:sz w:val="18"/>
+        <w:szCs w:val="18"/>
+      </w:rPr>
+      <w:t xml:space="preserve">  </w:t>
     </w:r>
     <w:r>
       <w:rPr>
@@ -11592,6 +12534,7 @@
   <w:style w:type="character" w:default="1" w:styleId="DefaultParagraphFont">
     <w:name w:val="Default Paragraph Font"/>
     <w:uiPriority w:val="1"/>
+    <w:semiHidden/>
     <w:unhideWhenUsed/>
   </w:style>
   <w:style w:type="table" w:default="1" w:styleId="TableNormal">

</xml_diff>

<commit_message>
docs: final assignment document update
</commit_message>
<xml_diff>
--- a/Assignment_04_Spring2026.docx
+++ b/Assignment_04_Spring2026.docx
@@ -348,27 +348,7 @@
           <w:sz w:val="24"/>
           <w:szCs w:val="24"/>
         </w:rPr>
-        <w:t xml:space="preserve"> (can be six members but in that </w:t>
-      </w:r>
-      <w:proofErr w:type="gramStart"/>
-      <w:r>
-        <w:rPr>
-          <w:rFonts w:ascii="Arial" w:eastAsia="Arial" w:hAnsi="Arial" w:cs="Arial"/>
-          <w:color w:val="000000"/>
-          <w:sz w:val="24"/>
-          <w:szCs w:val="24"/>
-        </w:rPr>
-        <w:t>case</w:t>
-      </w:r>
-      <w:proofErr w:type="gramEnd"/>
-      <w:r>
-        <w:rPr>
-          <w:rFonts w:ascii="Arial" w:eastAsia="Arial" w:hAnsi="Arial" w:cs="Arial"/>
-          <w:color w:val="000000"/>
-          <w:sz w:val="24"/>
-          <w:szCs w:val="24"/>
-        </w:rPr>
-        <w:t xml:space="preserve"> TL has to create an additional page for that member and then assign all tasks accordingly)</w:t>
+        <w:t xml:space="preserve"> (can be six members but in that case TL has to create an additional page for that member and then assign all tasks accordingly)</w:t>
       </w:r>
     </w:p>
     <w:p>
@@ -612,9 +592,8 @@
           <w:sz w:val="18"/>
           <w:szCs w:val="18"/>
         </w:rPr>
-        <w:t xml:space="preserve">Table 1: Group </w:t>
-      </w:r>
-      <w:proofErr w:type="gramStart"/>
+        <w:t xml:space="preserve">Table 1: Group Details </w:t>
+      </w:r>
       <w:r>
         <w:rPr>
           <w:rFonts w:ascii="Arial" w:eastAsia="Arial" w:hAnsi="Arial" w:cs="Arial"/>
@@ -624,7 +603,7 @@
           <w:sz w:val="18"/>
           <w:szCs w:val="18"/>
         </w:rPr>
-        <w:t xml:space="preserve">Details </w:t>
+        <w:t>,</w:t>
       </w:r>
       <w:r>
         <w:rPr>
@@ -635,43 +614,7 @@
           <w:sz w:val="18"/>
           <w:szCs w:val="18"/>
         </w:rPr>
-        <w:t>,</w:t>
-      </w:r>
-      <w:proofErr w:type="gramEnd"/>
-      <w:r>
-        <w:rPr>
-          <w:rFonts w:ascii="Arial" w:eastAsia="Arial" w:hAnsi="Arial" w:cs="Arial"/>
-          <w:b/>
-          <w:bCs/>
-          <w:color w:val="444444"/>
-          <w:sz w:val="18"/>
-          <w:szCs w:val="18"/>
-        </w:rPr>
-        <w:t xml:space="preserve"> </w:t>
-      </w:r>
-      <w:proofErr w:type="gramStart"/>
-      <w:r>
-        <w:rPr>
-          <w:rFonts w:ascii="Arial" w:eastAsia="Arial" w:hAnsi="Arial" w:cs="Arial"/>
-          <w:b/>
-          <w:bCs/>
-          <w:color w:val="444444"/>
-          <w:sz w:val="18"/>
-          <w:szCs w:val="18"/>
-        </w:rPr>
-        <w:t>Each</w:t>
-      </w:r>
-      <w:proofErr w:type="gramEnd"/>
-      <w:r>
-        <w:rPr>
-          <w:rFonts w:ascii="Arial" w:eastAsia="Arial" w:hAnsi="Arial" w:cs="Arial"/>
-          <w:b/>
-          <w:bCs/>
-          <w:color w:val="444444"/>
-          <w:sz w:val="18"/>
-          <w:szCs w:val="18"/>
-        </w:rPr>
-        <w:t xml:space="preserve"> student must fill their own row (including Assigned Page) in the versioned copy inside the repo</w:t>
+        <w:t xml:space="preserve"> Each student must fill their own row (including Assigned Page) in the versioned copy inside the repo</w:t>
       </w:r>
     </w:p>
     <w:tbl>
@@ -1003,11 +946,9 @@
             <w:vAlign w:val="center"/>
           </w:tcPr>
           <w:p>
-            <w:proofErr w:type="spellStart"/>
             <w:r>
               <w:t>HaroonAshar</w:t>
             </w:r>
-            <w:proofErr w:type="spellEnd"/>
           </w:p>
         </w:tc>
         <w:tc>
@@ -1430,15 +1371,7 @@
           </w:tcPr>
           <w:p>
             <w:r>
-              <w:t>feature/</w:t>
-            </w:r>
-            <w:proofErr w:type="spellStart"/>
-            <w:r>
-              <w:t>hashaam</w:t>
-            </w:r>
-            <w:proofErr w:type="spellEnd"/>
-            <w:r>
-              <w:t>-dev/task-list</w:t>
+              <w:t>feature/hashaam-dev/task-list</w:t>
             </w:r>
           </w:p>
         </w:tc>
@@ -1872,21 +1805,11 @@
     </w:p>
     <w:p>
       <w:pPr>
-        <w:spacing w:before="60" w:after="120"/>
-        <w:jc w:val="both"/>
-      </w:pPr>
-      <w:r>
-        <w:rPr>
-          <w:rFonts w:ascii="Arial" w:eastAsia="Arial" w:hAnsi="Arial" w:cs="Arial"/>
-          <w:color w:val="555555"/>
-        </w:rPr>
-        <w:t>[Paste Your Render Live URL Here]</w:t>
-      </w:r>
-    </w:p>
-    <w:p>
-      <w:pPr>
         <w:spacing w:after="100"/>
       </w:pPr>
+      <w:r>
+        <w:t>https://taskflow-cicd-stn9.onrender.com/index.html</w:t>
+      </w:r>
     </w:p>
     <w:p>
       <w:pPr>
@@ -1917,39 +1840,7 @@
           <w:rFonts w:ascii="Arial" w:eastAsia="Arial" w:hAnsi="Arial" w:cs="Arial"/>
           <w:color w:val="000000"/>
         </w:rPr>
-        <w:t xml:space="preserve">Your team is the development crew for </w:t>
-      </w:r>
-      <w:proofErr w:type="spellStart"/>
-      <w:r>
-        <w:rPr>
-          <w:rFonts w:ascii="Arial" w:eastAsia="Arial" w:hAnsi="Arial" w:cs="Arial"/>
-          <w:color w:val="000000"/>
-        </w:rPr>
-        <w:t>TaskFlow</w:t>
-      </w:r>
-      <w:proofErr w:type="spellEnd"/>
-      <w:r>
-        <w:rPr>
-          <w:rFonts w:ascii="Arial" w:eastAsia="Arial" w:hAnsi="Arial" w:cs="Arial"/>
-          <w:color w:val="000000"/>
-        </w:rPr>
-        <w:t xml:space="preserve">, a lightweight task-management web application consisting of five HTML pages. The Team Lead sets up the repository, </w:t>
-      </w:r>
-      <w:proofErr w:type="spellStart"/>
-      <w:r>
-        <w:rPr>
-          <w:rFonts w:ascii="Arial" w:eastAsia="Arial" w:hAnsi="Arial" w:cs="Arial"/>
-          <w:color w:val="000000"/>
-        </w:rPr>
-        <w:t>Dockerfile</w:t>
-      </w:r>
-      <w:proofErr w:type="spellEnd"/>
-      <w:r>
-        <w:rPr>
-          <w:rFonts w:ascii="Arial" w:eastAsia="Arial" w:hAnsi="Arial" w:cs="Arial"/>
-          <w:color w:val="000000"/>
-        </w:rPr>
-        <w:t>, shared stylesheet, and the CI/CD pipelines. Each team member is then individually responsible for building one specific page of the application, following the full Git, GitHub, and Docker flow independently.</w:t>
+        <w:t>Your team is the development crew for TaskFlow, a lightweight task-management web application consisting of five HTML pages. The Team Lead sets up the repository, Dockerfile, shared stylesheet, and the CI/CD pipelines. Each team member is then individually responsible for building one specific page of the application, following the full Git, GitHub, and Docker flow independently.</w:t>
       </w:r>
     </w:p>
     <w:p>
@@ -1967,23 +1858,7 @@
           <w:rFonts w:ascii="Arial" w:eastAsia="Arial" w:hAnsi="Arial" w:cs="Arial"/>
           <w:color w:val="000000"/>
         </w:rPr>
-        <w:t xml:space="preserve">The 5 pages of the </w:t>
-      </w:r>
-      <w:proofErr w:type="spellStart"/>
-      <w:r>
-        <w:rPr>
-          <w:rFonts w:ascii="Arial" w:eastAsia="Arial" w:hAnsi="Arial" w:cs="Arial"/>
-          <w:color w:val="000000"/>
-        </w:rPr>
-        <w:t>TaskFlow</w:t>
-      </w:r>
-      <w:proofErr w:type="spellEnd"/>
-      <w:r>
-        <w:rPr>
-          <w:rFonts w:ascii="Arial" w:eastAsia="Arial" w:hAnsi="Arial" w:cs="Arial"/>
-          <w:color w:val="000000"/>
-        </w:rPr>
-        <w:t xml:space="preserve"> application and their assignment are defined in Table 3 below. The Team Lead takes Page 1 (Home / Dashboard) in addition to their setup responsibilities.</w:t>
+        <w:t>The 5 pages of the TaskFlow application and their assignment are defined in Table 3 below. The Team Lead takes Page 1 (Home / Dashboard) in addition to their setup responsibilities.</w:t>
       </w:r>
     </w:p>
     <w:p>
@@ -2005,31 +1880,7 @@
           <w:sz w:val="18"/>
           <w:szCs w:val="18"/>
         </w:rPr>
-        <w:t xml:space="preserve">Table 3: </w:t>
-      </w:r>
-      <w:proofErr w:type="spellStart"/>
-      <w:r>
-        <w:rPr>
-          <w:rFonts w:ascii="Arial" w:eastAsia="Arial" w:hAnsi="Arial" w:cs="Arial"/>
-          <w:b/>
-          <w:bCs/>
-          <w:color w:val="444444"/>
-          <w:sz w:val="18"/>
-          <w:szCs w:val="18"/>
-        </w:rPr>
-        <w:t>TaskFlow</w:t>
-      </w:r>
-      <w:proofErr w:type="spellEnd"/>
-      <w:r>
-        <w:rPr>
-          <w:rFonts w:ascii="Arial" w:eastAsia="Arial" w:hAnsi="Arial" w:cs="Arial"/>
-          <w:b/>
-          <w:bCs/>
-          <w:color w:val="444444"/>
-          <w:sz w:val="18"/>
-          <w:szCs w:val="18"/>
-        </w:rPr>
-        <w:t xml:space="preserve"> Page Assignment</w:t>
+        <w:t>Table 3: TaskFlow Page Assignment</w:t>
       </w:r>
     </w:p>
     <w:tbl>
@@ -2435,17 +2286,7 @@
                 <w:sz w:val="18"/>
                 <w:szCs w:val="18"/>
               </w:rPr>
-              <w:t xml:space="preserve">An HTML form allowing the user to enter a new </w:t>
-            </w:r>
-            <w:proofErr w:type="gramStart"/>
-            <w:r>
-              <w:rPr>
-                <w:rFonts w:ascii="Arial" w:eastAsia="Arial" w:hAnsi="Arial" w:cs="Arial"/>
-                <w:color w:val="000000"/>
-                <w:sz w:val="18"/>
-                <w:szCs w:val="18"/>
-              </w:rPr>
-              <w:t xml:space="preserve">task </w:t>
+              <w:t xml:space="preserve">An HTML form allowing the user to enter a new task </w:t>
             </w:r>
             <w:r>
               <w:rPr>
@@ -2456,7 +2297,6 @@
               </w:rPr>
               <w:t>,</w:t>
             </w:r>
-            <w:proofErr w:type="gramEnd"/>
             <w:r>
               <w:rPr>
                 <w:rFonts w:ascii="Arial" w:eastAsia="Arial" w:hAnsi="Arial" w:cs="Arial"/>
@@ -2843,27 +2683,7 @@
                 <w:sz w:val="18"/>
                 <w:szCs w:val="18"/>
               </w:rPr>
-              <w:t xml:space="preserve">A page describing the </w:t>
-            </w:r>
-            <w:proofErr w:type="spellStart"/>
-            <w:r>
-              <w:rPr>
-                <w:rFonts w:ascii="Arial" w:eastAsia="Arial" w:hAnsi="Arial" w:cs="Arial"/>
-                <w:color w:val="000000"/>
-                <w:sz w:val="18"/>
-                <w:szCs w:val="18"/>
-              </w:rPr>
-              <w:t>TaskFlow</w:t>
-            </w:r>
-            <w:proofErr w:type="spellEnd"/>
-            <w:r>
-              <w:rPr>
-                <w:rFonts w:ascii="Arial" w:eastAsia="Arial" w:hAnsi="Arial" w:cs="Arial"/>
-                <w:color w:val="000000"/>
-                <w:sz w:val="18"/>
-                <w:szCs w:val="18"/>
-              </w:rPr>
-              <w:t xml:space="preserve"> application, its purpose, and a simple usage guide explaining how to navigate and use the app.</w:t>
+              <w:t>A page describing the TaskFlow application, its purpose, and a simple usage guide explaining how to navigate and use the app.</w:t>
             </w:r>
           </w:p>
         </w:tc>
@@ -2917,55 +2737,7 @@
           <w:rFonts w:ascii="Arial" w:eastAsia="Arial" w:hAnsi="Arial" w:cs="Arial"/>
           <w:color w:val="000000"/>
         </w:rPr>
-        <w:t xml:space="preserve"> using the naming convention: feature/&lt;member-</w:t>
-      </w:r>
-      <w:proofErr w:type="spellStart"/>
-      <w:r>
-        <w:rPr>
-          <w:rFonts w:ascii="Arial" w:eastAsia="Arial" w:hAnsi="Arial" w:cs="Arial"/>
-          <w:color w:val="000000"/>
-        </w:rPr>
-        <w:t>github</w:t>
-      </w:r>
-      <w:proofErr w:type="spellEnd"/>
-      <w:r>
-        <w:rPr>
-          <w:rFonts w:ascii="Arial" w:eastAsia="Arial" w:hAnsi="Arial" w:cs="Arial"/>
-          <w:color w:val="000000"/>
-        </w:rPr>
-        <w:t>-username&gt;/&lt;page-name</w:t>
-      </w:r>
-      <w:proofErr w:type="gramStart"/>
-      <w:r>
-        <w:rPr>
-          <w:rFonts w:ascii="Arial" w:eastAsia="Arial" w:hAnsi="Arial" w:cs="Arial"/>
-          <w:color w:val="000000"/>
-        </w:rPr>
-        <w:t>&gt;  (</w:t>
-      </w:r>
-      <w:proofErr w:type="gramEnd"/>
-      <w:r>
-        <w:rPr>
-          <w:rFonts w:ascii="Arial" w:eastAsia="Arial" w:hAnsi="Arial" w:cs="Arial"/>
-          <w:color w:val="000000"/>
-        </w:rPr>
-        <w:t>e.g., feature/</w:t>
-      </w:r>
-      <w:proofErr w:type="spellStart"/>
-      <w:r>
-        <w:rPr>
-          <w:rFonts w:ascii="Arial" w:eastAsia="Arial" w:hAnsi="Arial" w:cs="Arial"/>
-          <w:color w:val="000000"/>
-        </w:rPr>
-        <w:t>ali-hassan</w:t>
-      </w:r>
-      <w:proofErr w:type="spellEnd"/>
-      <w:r>
-        <w:rPr>
-          <w:rFonts w:ascii="Arial" w:eastAsia="Arial" w:hAnsi="Arial" w:cs="Arial"/>
-          <w:color w:val="000000"/>
-        </w:rPr>
-        <w:t>/add-task).</w:t>
+        <w:t xml:space="preserve"> using the naming convention: feature/&lt;member-github-username&gt;/&lt;page-name&gt;  (e.g., feature/ali-hassan/add-task).</w:t>
       </w:r>
     </w:p>
     <w:p>
@@ -3093,23 +2865,7 @@
           <w:rFonts w:ascii="Arial" w:eastAsia="Arial" w:hAnsi="Arial" w:cs="Arial"/>
           <w:color w:val="2E75B6"/>
         </w:rPr>
-        <w:t xml:space="preserve"> → CD deploys to Render → Live </w:t>
-      </w:r>
-      <w:proofErr w:type="spellStart"/>
-      <w:r>
-        <w:rPr>
-          <w:rFonts w:ascii="Arial" w:eastAsia="Arial" w:hAnsi="Arial" w:cs="Arial"/>
-          <w:color w:val="2E75B6"/>
-        </w:rPr>
-        <w:t>TaskFlow</w:t>
-      </w:r>
-      <w:proofErr w:type="spellEnd"/>
-      <w:r>
-        <w:rPr>
-          <w:rFonts w:ascii="Arial" w:eastAsia="Arial" w:hAnsi="Arial" w:cs="Arial"/>
-          <w:color w:val="2E75B6"/>
-        </w:rPr>
-        <w:t xml:space="preserve"> updated with the new page.</w:t>
+        <w:t xml:space="preserve"> → CD deploys to Render → Live TaskFlow updated with the new page.</w:t>
       </w:r>
     </w:p>
     <w:p>
@@ -3163,23 +2919,7 @@
           <w:rFonts w:ascii="Arial" w:eastAsia="Arial" w:hAnsi="Arial" w:cs="Arial"/>
           <w:color w:val="000000"/>
         </w:rPr>
-        <w:t xml:space="preserve">Create a new public GitHub repository named </w:t>
-      </w:r>
-      <w:proofErr w:type="spellStart"/>
-      <w:r>
-        <w:rPr>
-          <w:rFonts w:ascii="Arial" w:eastAsia="Arial" w:hAnsi="Arial" w:cs="Arial"/>
-          <w:color w:val="000000"/>
-        </w:rPr>
-        <w:t>taskflow-cicd</w:t>
-      </w:r>
-      <w:proofErr w:type="spellEnd"/>
-      <w:r>
-        <w:rPr>
-          <w:rFonts w:ascii="Arial" w:eastAsia="Arial" w:hAnsi="Arial" w:cs="Arial"/>
-          <w:color w:val="000000"/>
-        </w:rPr>
-        <w:t xml:space="preserve"> (or a name agreed by the team). Do NOT clone or fork any existing repository.</w:t>
+        <w:t>Create a new public GitHub repository named taskflow-cicd (or a name agreed by the team). Do NOT clone or fork any existing repository.</w:t>
       </w:r>
     </w:p>
     <w:p>
@@ -3464,17 +3204,7 @@
                 <w:sz w:val="18"/>
                 <w:szCs w:val="18"/>
               </w:rPr>
-              <w:t xml:space="preserve">Home / Dashboard </w:t>
-            </w:r>
-            <w:proofErr w:type="gramStart"/>
-            <w:r>
-              <w:rPr>
-                <w:rFonts w:ascii="Arial" w:eastAsia="Arial" w:hAnsi="Arial" w:cs="Arial"/>
-                <w:color w:val="000000"/>
-                <w:sz w:val="18"/>
-                <w:szCs w:val="18"/>
-              </w:rPr>
-              <w:t xml:space="preserve">page </w:t>
+              <w:t xml:space="preserve">Home / Dashboard page </w:t>
             </w:r>
             <w:r>
               <w:rPr>
@@ -3485,7 +3215,6 @@
               </w:rPr>
               <w:t>,</w:t>
             </w:r>
-            <w:proofErr w:type="gramEnd"/>
             <w:r>
               <w:rPr>
                 <w:rFonts w:ascii="Arial" w:eastAsia="Arial" w:hAnsi="Arial" w:cs="Arial"/>
@@ -3557,17 +3286,7 @@
                 <w:sz w:val="18"/>
                 <w:szCs w:val="18"/>
               </w:rPr>
-              <w:t xml:space="preserve">Add Task </w:t>
-            </w:r>
-            <w:proofErr w:type="gramStart"/>
-            <w:r>
-              <w:rPr>
-                <w:rFonts w:ascii="Arial" w:eastAsia="Arial" w:hAnsi="Arial" w:cs="Arial"/>
-                <w:color w:val="000000"/>
-                <w:sz w:val="18"/>
-                <w:szCs w:val="18"/>
-              </w:rPr>
-              <w:t xml:space="preserve">page </w:t>
+              <w:t xml:space="preserve">Add Task page </w:t>
             </w:r>
             <w:r>
               <w:rPr>
@@ -3578,7 +3297,6 @@
               </w:rPr>
               <w:t>,</w:t>
             </w:r>
-            <w:proofErr w:type="gramEnd"/>
             <w:r>
               <w:rPr>
                 <w:rFonts w:ascii="Arial" w:eastAsia="Arial" w:hAnsi="Arial" w:cs="Arial"/>
@@ -3650,17 +3368,7 @@
                 <w:sz w:val="18"/>
                 <w:szCs w:val="18"/>
               </w:rPr>
-              <w:t xml:space="preserve">Task List </w:t>
-            </w:r>
-            <w:proofErr w:type="gramStart"/>
-            <w:r>
-              <w:rPr>
-                <w:rFonts w:ascii="Arial" w:eastAsia="Arial" w:hAnsi="Arial" w:cs="Arial"/>
-                <w:color w:val="000000"/>
-                <w:sz w:val="18"/>
-                <w:szCs w:val="18"/>
-              </w:rPr>
-              <w:t xml:space="preserve">page </w:t>
+              <w:t xml:space="preserve">Task List page </w:t>
             </w:r>
             <w:r>
               <w:rPr>
@@ -3671,7 +3379,6 @@
               </w:rPr>
               <w:t>,</w:t>
             </w:r>
-            <w:proofErr w:type="gramEnd"/>
             <w:r>
               <w:rPr>
                 <w:rFonts w:ascii="Arial" w:eastAsia="Arial" w:hAnsi="Arial" w:cs="Arial"/>
@@ -3743,17 +3450,7 @@
                 <w:sz w:val="18"/>
                 <w:szCs w:val="18"/>
               </w:rPr>
-              <w:t xml:space="preserve">Task Detail </w:t>
-            </w:r>
-            <w:proofErr w:type="gramStart"/>
-            <w:r>
-              <w:rPr>
-                <w:rFonts w:ascii="Arial" w:eastAsia="Arial" w:hAnsi="Arial" w:cs="Arial"/>
-                <w:color w:val="000000"/>
-                <w:sz w:val="18"/>
-                <w:szCs w:val="18"/>
-              </w:rPr>
-              <w:t xml:space="preserve">page </w:t>
+              <w:t xml:space="preserve">Task Detail page </w:t>
             </w:r>
             <w:r>
               <w:rPr>
@@ -3764,7 +3461,6 @@
               </w:rPr>
               <w:t>,</w:t>
             </w:r>
-            <w:proofErr w:type="gramEnd"/>
             <w:r>
               <w:rPr>
                 <w:rFonts w:ascii="Arial" w:eastAsia="Arial" w:hAnsi="Arial" w:cs="Arial"/>
@@ -3836,17 +3532,7 @@
                 <w:sz w:val="18"/>
                 <w:szCs w:val="18"/>
               </w:rPr>
-              <w:t xml:space="preserve">About / Help </w:t>
-            </w:r>
-            <w:proofErr w:type="gramStart"/>
-            <w:r>
-              <w:rPr>
-                <w:rFonts w:ascii="Arial" w:eastAsia="Arial" w:hAnsi="Arial" w:cs="Arial"/>
-                <w:color w:val="000000"/>
-                <w:sz w:val="18"/>
-                <w:szCs w:val="18"/>
-              </w:rPr>
-              <w:t xml:space="preserve">page </w:t>
+              <w:t xml:space="preserve">About / Help page </w:t>
             </w:r>
             <w:r>
               <w:rPr>
@@ -3857,7 +3543,6 @@
               </w:rPr>
               <w:t>,</w:t>
             </w:r>
-            <w:proofErr w:type="gramEnd"/>
             <w:r>
               <w:rPr>
                 <w:rFonts w:ascii="Arial" w:eastAsia="Arial" w:hAnsi="Arial" w:cs="Arial"/>
@@ -3929,17 +3614,7 @@
                 <w:sz w:val="18"/>
                 <w:szCs w:val="18"/>
               </w:rPr>
-              <w:t xml:space="preserve">Shared </w:t>
-            </w:r>
-            <w:proofErr w:type="gramStart"/>
-            <w:r>
-              <w:rPr>
-                <w:rFonts w:ascii="Arial" w:eastAsia="Arial" w:hAnsi="Arial" w:cs="Arial"/>
-                <w:color w:val="000000"/>
-                <w:sz w:val="18"/>
-                <w:szCs w:val="18"/>
-              </w:rPr>
-              <w:t xml:space="preserve">stylesheet </w:t>
+              <w:t xml:space="preserve">Shared stylesheet </w:t>
             </w:r>
             <w:r>
               <w:rPr>
@@ -3950,7 +3625,6 @@
               </w:rPr>
               <w:t>,</w:t>
             </w:r>
-            <w:proofErr w:type="gramEnd"/>
             <w:r>
               <w:rPr>
                 <w:rFonts w:ascii="Arial" w:eastAsia="Arial" w:hAnsi="Arial" w:cs="Arial"/>
@@ -3983,7 +3657,6 @@
             <w:vAlign w:val="center"/>
           </w:tcPr>
           <w:p>
-            <w:proofErr w:type="spellStart"/>
             <w:r>
               <w:rPr>
                 <w:rFonts w:ascii="Arial" w:eastAsia="Arial" w:hAnsi="Arial" w:cs="Arial"/>
@@ -3995,7 +3668,6 @@
               </w:rPr>
               <w:t>Dockerfile</w:t>
             </w:r>
-            <w:proofErr w:type="spellEnd"/>
           </w:p>
         </w:tc>
         <w:tc>
@@ -4017,25 +3689,14 @@
             <w:vAlign w:val="center"/>
           </w:tcPr>
           <w:p>
-            <w:proofErr w:type="spellStart"/>
-            <w:r>
-              <w:rPr>
-                <w:rFonts w:ascii="Arial" w:eastAsia="Arial" w:hAnsi="Arial" w:cs="Arial"/>
-                <w:color w:val="000000"/>
-                <w:sz w:val="18"/>
-                <w:szCs w:val="18"/>
-              </w:rPr>
-              <w:t>Dockerfile</w:t>
-            </w:r>
-            <w:proofErr w:type="spellEnd"/>
-            <w:r>
-              <w:rPr>
-                <w:rFonts w:ascii="Arial" w:eastAsia="Arial" w:hAnsi="Arial" w:cs="Arial"/>
-                <w:color w:val="000000"/>
-                <w:sz w:val="18"/>
-                <w:szCs w:val="18"/>
-              </w:rPr>
-              <w:t xml:space="preserve"> to containerize the application (nginx-based)</w:t>
+            <w:r>
+              <w:rPr>
+                <w:rFonts w:ascii="Arial" w:eastAsia="Arial" w:hAnsi="Arial" w:cs="Arial"/>
+                <w:color w:val="000000"/>
+                <w:sz w:val="18"/>
+                <w:szCs w:val="18"/>
+              </w:rPr>
+              <w:t>Dockerfile to containerize the application (nginx-based)</w:t>
             </w:r>
           </w:p>
         </w:tc>
@@ -4070,9 +3731,70 @@
                 <w:szCs w:val="18"/>
               </w:rPr>
               <w:lastRenderedPageBreak/>
-              <w:t>.</w:t>
-            </w:r>
-            <w:proofErr w:type="spellStart"/>
+              <w:t>.github/workflows/ci.yml</w:t>
+            </w:r>
+          </w:p>
+        </w:tc>
+        <w:tc>
+          <w:tcPr>
+            <w:tcW w:w="6160" w:type="dxa"/>
+            <w:tcBorders>
+              <w:top w:val="single" w:sz="6" w:space="0" w:color="ADB9CA"/>
+              <w:left w:val="single" w:sz="6" w:space="0" w:color="ADB9CA"/>
+              <w:bottom w:val="single" w:sz="6" w:space="0" w:color="ADB9CA"/>
+              <w:right w:val="single" w:sz="6" w:space="0" w:color="ADB9CA"/>
+            </w:tcBorders>
+            <w:shd w:val="clear" w:color="auto" w:fill="FFFFFF"/>
+            <w:tcMar>
+              <w:top w:w="80" w:type="dxa"/>
+              <w:left w:w="140" w:type="dxa"/>
+              <w:bottom w:w="80" w:type="dxa"/>
+              <w:right w:w="140" w:type="dxa"/>
+            </w:tcMar>
+            <w:vAlign w:val="center"/>
+          </w:tcPr>
+          <w:p>
+            <w:r>
+              <w:rPr>
+                <w:rFonts w:ascii="Arial" w:eastAsia="Arial" w:hAnsi="Arial" w:cs="Arial"/>
+                <w:color w:val="000000"/>
+                <w:sz w:val="18"/>
+                <w:szCs w:val="18"/>
+              </w:rPr>
+              <w:t xml:space="preserve">CI workflow – triggered on Pull Request to </w:t>
+            </w:r>
+            <w:r>
+              <w:rPr>
+                <w:rFonts w:ascii="Arial" w:eastAsia="Arial" w:hAnsi="Arial" w:cs="Arial"/>
+                <w:color w:val="000000"/>
+                <w:sz w:val="18"/>
+                <w:szCs w:val="18"/>
+              </w:rPr>
+              <w:t>“develop”</w:t>
+            </w:r>
+          </w:p>
+        </w:tc>
+      </w:tr>
+      <w:tr>
+        <w:tc>
+          <w:tcPr>
+            <w:tcW w:w="3200" w:type="dxa"/>
+            <w:tcBorders>
+              <w:top w:val="single" w:sz="6" w:space="0" w:color="ADB9CA"/>
+              <w:left w:val="single" w:sz="6" w:space="0" w:color="ADB9CA"/>
+              <w:bottom w:val="single" w:sz="6" w:space="0" w:color="ADB9CA"/>
+              <w:right w:val="single" w:sz="6" w:space="0" w:color="ADB9CA"/>
+            </w:tcBorders>
+            <w:shd w:val="clear" w:color="auto" w:fill="E8F0FB"/>
+            <w:tcMar>
+              <w:top w:w="80" w:type="dxa"/>
+              <w:left w:w="140" w:type="dxa"/>
+              <w:bottom w:w="80" w:type="dxa"/>
+              <w:right w:w="140" w:type="dxa"/>
+            </w:tcMar>
+            <w:vAlign w:val="center"/>
+          </w:tcPr>
+          <w:p>
             <w:r>
               <w:rPr>
                 <w:rFonts w:ascii="Arial" w:eastAsia="Arial" w:hAnsi="Arial" w:cs="Arial"/>
@@ -4082,143 +3804,8 @@
                 <w:sz w:val="18"/>
                 <w:szCs w:val="18"/>
               </w:rPr>
-              <w:t>github</w:t>
-            </w:r>
-            <w:proofErr w:type="spellEnd"/>
-            <w:r>
-              <w:rPr>
-                <w:rFonts w:ascii="Arial" w:eastAsia="Arial" w:hAnsi="Arial" w:cs="Arial"/>
-                <w:b/>
-                <w:bCs/>
-                <w:color w:val="000000"/>
-                <w:sz w:val="18"/>
-                <w:szCs w:val="18"/>
-              </w:rPr>
-              <w:t>/workflows/</w:t>
-            </w:r>
-            <w:proofErr w:type="spellStart"/>
-            <w:r>
-              <w:rPr>
-                <w:rFonts w:ascii="Arial" w:eastAsia="Arial" w:hAnsi="Arial" w:cs="Arial"/>
-                <w:b/>
-                <w:bCs/>
-                <w:color w:val="000000"/>
-                <w:sz w:val="18"/>
-                <w:szCs w:val="18"/>
-              </w:rPr>
-              <w:t>ci.yml</w:t>
-            </w:r>
-            <w:proofErr w:type="spellEnd"/>
-          </w:p>
-        </w:tc>
-        <w:tc>
-          <w:tcPr>
-            <w:tcW w:w="6160" w:type="dxa"/>
-            <w:tcBorders>
-              <w:top w:val="single" w:sz="6" w:space="0" w:color="ADB9CA"/>
-              <w:left w:val="single" w:sz="6" w:space="0" w:color="ADB9CA"/>
-              <w:bottom w:val="single" w:sz="6" w:space="0" w:color="ADB9CA"/>
-              <w:right w:val="single" w:sz="6" w:space="0" w:color="ADB9CA"/>
-            </w:tcBorders>
-            <w:shd w:val="clear" w:color="auto" w:fill="FFFFFF"/>
-            <w:tcMar>
-              <w:top w:w="80" w:type="dxa"/>
-              <w:left w:w="140" w:type="dxa"/>
-              <w:bottom w:w="80" w:type="dxa"/>
-              <w:right w:w="140" w:type="dxa"/>
-            </w:tcMar>
-            <w:vAlign w:val="center"/>
-          </w:tcPr>
-          <w:p>
-            <w:r>
-              <w:rPr>
-                <w:rFonts w:ascii="Arial" w:eastAsia="Arial" w:hAnsi="Arial" w:cs="Arial"/>
-                <w:color w:val="000000"/>
-                <w:sz w:val="18"/>
-                <w:szCs w:val="18"/>
-              </w:rPr>
-              <w:t xml:space="preserve">CI workflow – triggered on Pull Request to </w:t>
-            </w:r>
-            <w:r>
-              <w:rPr>
-                <w:rFonts w:ascii="Arial" w:eastAsia="Arial" w:hAnsi="Arial" w:cs="Arial"/>
-                <w:color w:val="000000"/>
-                <w:sz w:val="18"/>
-                <w:szCs w:val="18"/>
-              </w:rPr>
-              <w:t>“develop”</w:t>
-            </w:r>
-          </w:p>
-        </w:tc>
-      </w:tr>
-      <w:tr>
-        <w:tc>
-          <w:tcPr>
-            <w:tcW w:w="3200" w:type="dxa"/>
-            <w:tcBorders>
-              <w:top w:val="single" w:sz="6" w:space="0" w:color="ADB9CA"/>
-              <w:left w:val="single" w:sz="6" w:space="0" w:color="ADB9CA"/>
-              <w:bottom w:val="single" w:sz="6" w:space="0" w:color="ADB9CA"/>
-              <w:right w:val="single" w:sz="6" w:space="0" w:color="ADB9CA"/>
-            </w:tcBorders>
-            <w:shd w:val="clear" w:color="auto" w:fill="E8F0FB"/>
-            <w:tcMar>
-              <w:top w:w="80" w:type="dxa"/>
-              <w:left w:w="140" w:type="dxa"/>
-              <w:bottom w:w="80" w:type="dxa"/>
-              <w:right w:w="140" w:type="dxa"/>
-            </w:tcMar>
-            <w:vAlign w:val="center"/>
-          </w:tcPr>
-          <w:p>
-            <w:r>
-              <w:rPr>
-                <w:rFonts w:ascii="Arial" w:eastAsia="Arial" w:hAnsi="Arial" w:cs="Arial"/>
-                <w:b/>
-                <w:bCs/>
-                <w:color w:val="000000"/>
-                <w:sz w:val="18"/>
-                <w:szCs w:val="18"/>
-              </w:rPr>
-              <w:t>.</w:t>
-            </w:r>
-            <w:proofErr w:type="spellStart"/>
-            <w:r>
-              <w:rPr>
-                <w:rFonts w:ascii="Arial" w:eastAsia="Arial" w:hAnsi="Arial" w:cs="Arial"/>
-                <w:b/>
-                <w:bCs/>
-                <w:color w:val="000000"/>
-                <w:sz w:val="18"/>
-                <w:szCs w:val="18"/>
-              </w:rPr>
-              <w:t>github</w:t>
-            </w:r>
-            <w:proofErr w:type="spellEnd"/>
-            <w:r>
-              <w:rPr>
-                <w:rFonts w:ascii="Arial" w:eastAsia="Arial" w:hAnsi="Arial" w:cs="Arial"/>
-                <w:b/>
-                <w:bCs/>
-                <w:color w:val="000000"/>
-                <w:sz w:val="18"/>
-                <w:szCs w:val="18"/>
-              </w:rPr>
-              <w:t>/workflows/</w:t>
-            </w:r>
-            <w:proofErr w:type="spellStart"/>
-            <w:r>
-              <w:rPr>
-                <w:rFonts w:ascii="Arial" w:eastAsia="Arial" w:hAnsi="Arial" w:cs="Arial"/>
-                <w:b/>
-                <w:bCs/>
-                <w:color w:val="000000"/>
-                <w:sz w:val="18"/>
-                <w:szCs w:val="18"/>
-              </w:rPr>
-              <w:t>cd.yml</w:t>
-            </w:r>
-            <w:proofErr w:type="spellEnd"/>
+              <w:t>.github/workflows/cd.yml</w:t>
+            </w:r>
           </w:p>
         </w:tc>
         <w:tc>
@@ -4360,15 +3947,7 @@
           <w:rFonts w:ascii="Arial" w:eastAsia="Arial" w:hAnsi="Arial" w:cs="Arial"/>
           <w:color w:val="000000"/>
         </w:rPr>
-        <w:t xml:space="preserve">The Team Lead (TL) is responsible for creating all secrets listed below. The TL is the repository admin and the credentials in </w:t>
-      </w:r>
-      <w:proofErr w:type="gramStart"/>
-      <w:r>
-        <w:rPr>
-          <w:rFonts w:ascii="Arial" w:eastAsia="Arial" w:hAnsi="Arial" w:cs="Arial"/>
-          <w:color w:val="000000"/>
-        </w:rPr>
-        <w:t xml:space="preserve">use </w:t>
+        <w:t xml:space="preserve">The Team Lead (TL) is responsible for creating all secrets listed below. The TL is the repository admin and the credentials in use </w:t>
       </w:r>
       <w:r>
         <w:rPr>
@@ -4377,21 +3956,12 @@
         </w:rPr>
         <w:t>,</w:t>
       </w:r>
-      <w:proofErr w:type="gramEnd"/>
-      <w:r>
-        <w:rPr>
-          <w:rFonts w:ascii="Arial" w:eastAsia="Arial" w:hAnsi="Arial" w:cs="Arial"/>
-          <w:color w:val="000000"/>
-        </w:rPr>
-        <w:t xml:space="preserve"> Docker Hub and </w:t>
-      </w:r>
-      <w:proofErr w:type="gramStart"/>
-      <w:r>
-        <w:rPr>
-          <w:rFonts w:ascii="Arial" w:eastAsia="Arial" w:hAnsi="Arial" w:cs="Arial"/>
-          <w:color w:val="000000"/>
-        </w:rPr>
-        <w:t xml:space="preserve">Render </w:t>
+      <w:r>
+        <w:rPr>
+          <w:rFonts w:ascii="Arial" w:eastAsia="Arial" w:hAnsi="Arial" w:cs="Arial"/>
+          <w:color w:val="000000"/>
+        </w:rPr>
+        <w:t xml:space="preserve"> Docker Hub and Render </w:t>
       </w:r>
       <w:r>
         <w:rPr>
@@ -4400,7 +3970,6 @@
         </w:rPr>
         <w:t>,</w:t>
       </w:r>
-      <w:proofErr w:type="gramEnd"/>
       <w:r>
         <w:rPr>
           <w:rFonts w:ascii="Arial" w:eastAsia="Arial" w:hAnsi="Arial" w:cs="Arial"/>
@@ -4817,17 +4386,7 @@
                 <w:sz w:val="18"/>
                 <w:szCs w:val="18"/>
               </w:rPr>
-              <w:t>Team Lead's Docker Hub Personal Access Token (PAT</w:t>
-            </w:r>
-            <w:proofErr w:type="gramStart"/>
-            <w:r>
-              <w:rPr>
-                <w:rFonts w:ascii="Arial" w:eastAsia="Arial" w:hAnsi="Arial" w:cs="Arial"/>
-                <w:color w:val="000000"/>
-                <w:sz w:val="18"/>
-                <w:szCs w:val="18"/>
-              </w:rPr>
-              <w:t xml:space="preserve">) </w:t>
+              <w:t xml:space="preserve">Team Lead's Docker Hub Personal Access Token (PAT) </w:t>
             </w:r>
             <w:r>
               <w:rPr>
@@ -4838,7 +4397,6 @@
               </w:rPr>
               <w:t>,</w:t>
             </w:r>
-            <w:proofErr w:type="gramEnd"/>
             <w:r>
               <w:rPr>
                 <w:rFonts w:ascii="Arial" w:eastAsia="Arial" w:hAnsi="Arial" w:cs="Arial"/>
@@ -5005,114 +4563,22 @@
           <w:sz w:val="28"/>
           <w:szCs w:val="28"/>
         </w:rPr>
-        <w:t xml:space="preserve">CI PIPELINE </w:t>
-      </w:r>
-      <w:proofErr w:type="gramStart"/>
+        <w:t>CI PIPELINE REQUIREMENTS  (.github/workflows/ci.yml)</w:t>
+      </w:r>
+    </w:p>
+    <w:p>
+      <w:pPr>
+        <w:spacing w:before="60" w:after="120"/>
+        <w:jc w:val="both"/>
+      </w:pPr>
       <w:r>
         <w:rPr>
           <w:rFonts w:ascii="Arial" w:eastAsia="Arial" w:hAnsi="Arial" w:cs="Arial"/>
           <w:b/>
           <w:bCs/>
-          <w:color w:val="1F3864"/>
-          <w:sz w:val="28"/>
-          <w:szCs w:val="28"/>
-        </w:rPr>
-        <w:t>REQUIREMENTS  (</w:t>
-      </w:r>
-      <w:proofErr w:type="gramEnd"/>
-      <w:r>
-        <w:rPr>
-          <w:rFonts w:ascii="Arial" w:eastAsia="Arial" w:hAnsi="Arial" w:cs="Arial"/>
-          <w:b/>
-          <w:bCs/>
-          <w:color w:val="1F3864"/>
-          <w:sz w:val="28"/>
-          <w:szCs w:val="28"/>
-        </w:rPr>
-        <w:t>.</w:t>
-      </w:r>
-      <w:proofErr w:type="spellStart"/>
-      <w:r>
-        <w:rPr>
-          <w:rFonts w:ascii="Arial" w:eastAsia="Arial" w:hAnsi="Arial" w:cs="Arial"/>
-          <w:b/>
-          <w:bCs/>
-          <w:color w:val="1F3864"/>
-          <w:sz w:val="28"/>
-          <w:szCs w:val="28"/>
-        </w:rPr>
-        <w:t>github</w:t>
-      </w:r>
-      <w:proofErr w:type="spellEnd"/>
-      <w:r>
-        <w:rPr>
-          <w:rFonts w:ascii="Arial" w:eastAsia="Arial" w:hAnsi="Arial" w:cs="Arial"/>
-          <w:b/>
-          <w:bCs/>
-          <w:color w:val="1F3864"/>
-          <w:sz w:val="28"/>
-          <w:szCs w:val="28"/>
-        </w:rPr>
-        <w:t>/workflows/</w:t>
-      </w:r>
-      <w:proofErr w:type="spellStart"/>
-      <w:r>
-        <w:rPr>
-          <w:rFonts w:ascii="Arial" w:eastAsia="Arial" w:hAnsi="Arial" w:cs="Arial"/>
-          <w:b/>
-          <w:bCs/>
-          <w:color w:val="1F3864"/>
-          <w:sz w:val="28"/>
-          <w:szCs w:val="28"/>
-        </w:rPr>
-        <w:t>ci.yml</w:t>
-      </w:r>
-      <w:proofErr w:type="spellEnd"/>
-      <w:r>
-        <w:rPr>
-          <w:rFonts w:ascii="Arial" w:eastAsia="Arial" w:hAnsi="Arial" w:cs="Arial"/>
-          <w:b/>
-          <w:bCs/>
-          <w:color w:val="1F3864"/>
-          <w:sz w:val="28"/>
-          <w:szCs w:val="28"/>
-        </w:rPr>
-        <w:t>)</w:t>
-      </w:r>
-    </w:p>
-    <w:p>
-      <w:pPr>
-        <w:spacing w:before="60" w:after="120"/>
-        <w:jc w:val="both"/>
-      </w:pPr>
-      <w:r>
-        <w:rPr>
-          <w:rFonts w:ascii="Arial" w:eastAsia="Arial" w:hAnsi="Arial" w:cs="Arial"/>
-          <w:b/>
-          <w:bCs/>
-          <w:color w:val="000000"/>
-        </w:rPr>
-        <w:t xml:space="preserve">Trigger: The CI workflow must be triggered by a </w:t>
-      </w:r>
-      <w:proofErr w:type="spellStart"/>
-      <w:r>
-        <w:rPr>
-          <w:rFonts w:ascii="Arial" w:eastAsia="Arial" w:hAnsi="Arial" w:cs="Arial"/>
-          <w:b/>
-          <w:bCs/>
-          <w:color w:val="000000"/>
-        </w:rPr>
-        <w:t>pull_request</w:t>
-      </w:r>
-      <w:proofErr w:type="spellEnd"/>
-      <w:r>
-        <w:rPr>
-          <w:rFonts w:ascii="Arial" w:eastAsia="Arial" w:hAnsi="Arial" w:cs="Arial"/>
-          <w:b/>
-          <w:bCs/>
-          <w:color w:val="000000"/>
-        </w:rPr>
-        <w:t xml:space="preserve"> event targeting the </w:t>
+          <w:color w:val="000000"/>
+        </w:rPr>
+        <w:t xml:space="preserve">Trigger: The CI workflow must be triggered by a pull_request event targeting the </w:t>
       </w:r>
       <w:r>
         <w:rPr>
@@ -5199,23 +4665,7 @@
           <w:rFonts w:ascii="Arial" w:eastAsia="Arial" w:hAnsi="Arial" w:cs="Arial"/>
           <w:color w:val="000000"/>
         </w:rPr>
-        <w:t xml:space="preserve">Step 3 – Build Image: Build the Docker image from the </w:t>
-      </w:r>
-      <w:proofErr w:type="spellStart"/>
-      <w:r>
-        <w:rPr>
-          <w:rFonts w:ascii="Arial" w:eastAsia="Arial" w:hAnsi="Arial" w:cs="Arial"/>
-          <w:color w:val="000000"/>
-        </w:rPr>
-        <w:t>Dockerfile</w:t>
-      </w:r>
-      <w:proofErr w:type="spellEnd"/>
-      <w:r>
-        <w:rPr>
-          <w:rFonts w:ascii="Arial" w:eastAsia="Arial" w:hAnsi="Arial" w:cs="Arial"/>
-          <w:color w:val="000000"/>
-        </w:rPr>
-        <w:t xml:space="preserve"> in the project root.</w:t>
+        <w:t>Step 3 – Build Image: Build the Docker image from the Dockerfile in the project root.</w:t>
       </w:r>
     </w:p>
     <w:p>
@@ -5232,15 +4682,7 @@
           <w:rFonts w:ascii="Arial" w:eastAsia="Arial" w:hAnsi="Arial" w:cs="Arial"/>
           <w:color w:val="000000"/>
         </w:rPr>
-        <w:t xml:space="preserve">Step 4 – Tag Image: Tag the image using a meaningful </w:t>
-      </w:r>
-      <w:proofErr w:type="gramStart"/>
-      <w:r>
-        <w:rPr>
-          <w:rFonts w:ascii="Arial" w:eastAsia="Arial" w:hAnsi="Arial" w:cs="Arial"/>
-          <w:color w:val="000000"/>
-        </w:rPr>
-        <w:t xml:space="preserve">strategy </w:t>
+        <w:t xml:space="preserve">Step 4 – Tag Image: Tag the image using a meaningful strategy </w:t>
       </w:r>
       <w:r>
         <w:rPr>
@@ -5249,29 +4691,12 @@
         </w:rPr>
         <w:t>,</w:t>
       </w:r>
-      <w:proofErr w:type="gramEnd"/>
-      <w:r>
-        <w:rPr>
-          <w:rFonts w:ascii="Arial" w:eastAsia="Arial" w:hAnsi="Arial" w:cs="Arial"/>
-          <w:color w:val="000000"/>
-        </w:rPr>
-        <w:t xml:space="preserve"> at minimum the 'latest' tag; optionally also tag with the short commit SHA (</w:t>
-      </w:r>
-      <w:proofErr w:type="spellStart"/>
-      <w:r>
-        <w:rPr>
-          <w:rFonts w:ascii="Arial" w:eastAsia="Arial" w:hAnsi="Arial" w:cs="Arial"/>
-          <w:color w:val="000000"/>
-        </w:rPr>
-        <w:t>github.sha</w:t>
-      </w:r>
-      <w:proofErr w:type="spellEnd"/>
-      <w:r>
-        <w:rPr>
-          <w:rFonts w:ascii="Arial" w:eastAsia="Arial" w:hAnsi="Arial" w:cs="Arial"/>
-          <w:color w:val="000000"/>
-        </w:rPr>
-        <w:t>).</w:t>
+      <w:r>
+        <w:rPr>
+          <w:rFonts w:ascii="Arial" w:eastAsia="Arial" w:hAnsi="Arial" w:cs="Arial"/>
+          <w:color w:val="000000"/>
+        </w:rPr>
+        <w:t xml:space="preserve"> at minimum the 'latest' tag; optionally also tag with the short commit SHA (github.sha).</w:t>
       </w:r>
     </w:p>
     <w:p>
@@ -5379,79 +4804,7 @@
           <w:sz w:val="28"/>
           <w:szCs w:val="28"/>
         </w:rPr>
-        <w:t xml:space="preserve">CD PIPELINE </w:t>
-      </w:r>
-      <w:proofErr w:type="gramStart"/>
-      <w:r>
-        <w:rPr>
-          <w:rFonts w:ascii="Arial" w:eastAsia="Arial" w:hAnsi="Arial" w:cs="Arial"/>
-          <w:b/>
-          <w:bCs/>
-          <w:color w:val="1F3864"/>
-          <w:sz w:val="28"/>
-          <w:szCs w:val="28"/>
-        </w:rPr>
-        <w:t>REQUIREMENTS  (</w:t>
-      </w:r>
-      <w:proofErr w:type="gramEnd"/>
-      <w:r>
-        <w:rPr>
-          <w:rFonts w:ascii="Arial" w:eastAsia="Arial" w:hAnsi="Arial" w:cs="Arial"/>
-          <w:b/>
-          <w:bCs/>
-          <w:color w:val="1F3864"/>
-          <w:sz w:val="28"/>
-          <w:szCs w:val="28"/>
-        </w:rPr>
-        <w:t>.</w:t>
-      </w:r>
-      <w:proofErr w:type="spellStart"/>
-      <w:r>
-        <w:rPr>
-          <w:rFonts w:ascii="Arial" w:eastAsia="Arial" w:hAnsi="Arial" w:cs="Arial"/>
-          <w:b/>
-          <w:bCs/>
-          <w:color w:val="1F3864"/>
-          <w:sz w:val="28"/>
-          <w:szCs w:val="28"/>
-        </w:rPr>
-        <w:t>github</w:t>
-      </w:r>
-      <w:proofErr w:type="spellEnd"/>
-      <w:r>
-        <w:rPr>
-          <w:rFonts w:ascii="Arial" w:eastAsia="Arial" w:hAnsi="Arial" w:cs="Arial"/>
-          <w:b/>
-          <w:bCs/>
-          <w:color w:val="1F3864"/>
-          <w:sz w:val="28"/>
-          <w:szCs w:val="28"/>
-        </w:rPr>
-        <w:t>/workflows/</w:t>
-      </w:r>
-      <w:proofErr w:type="spellStart"/>
-      <w:r>
-        <w:rPr>
-          <w:rFonts w:ascii="Arial" w:eastAsia="Arial" w:hAnsi="Arial" w:cs="Arial"/>
-          <w:b/>
-          <w:bCs/>
-          <w:color w:val="1F3864"/>
-          <w:sz w:val="28"/>
-          <w:szCs w:val="28"/>
-        </w:rPr>
-        <w:t>cd.yml</w:t>
-      </w:r>
-      <w:proofErr w:type="spellEnd"/>
-      <w:r>
-        <w:rPr>
-          <w:rFonts w:ascii="Arial" w:eastAsia="Arial" w:hAnsi="Arial" w:cs="Arial"/>
-          <w:b/>
-          <w:bCs/>
-          <w:color w:val="1F3864"/>
-          <w:sz w:val="28"/>
-          <w:szCs w:val="28"/>
-        </w:rPr>
-        <w:t>)</w:t>
+        <w:t>CD PIPELINE REQUIREMENTS  (.github/workflows/cd.yml)</w:t>
       </w:r>
     </w:p>
     <w:p>
@@ -5571,23 +4924,7 @@
           <w:rFonts w:ascii="Arial" w:eastAsia="Arial" w:hAnsi="Arial" w:cs="Arial"/>
           <w:color w:val="000000"/>
         </w:rPr>
-        <w:t xml:space="preserve">Step 3 – Deploy: Send an HTTP POST request to the Render </w:t>
-      </w:r>
-      <w:proofErr w:type="gramStart"/>
-      <w:r>
-        <w:rPr>
-          <w:rFonts w:ascii="Arial" w:eastAsia="Arial" w:hAnsi="Arial" w:cs="Arial"/>
-          <w:color w:val="000000"/>
-        </w:rPr>
-        <w:t>deploy</w:t>
-      </w:r>
-      <w:proofErr w:type="gramEnd"/>
-      <w:r>
-        <w:rPr>
-          <w:rFonts w:ascii="Arial" w:eastAsia="Arial" w:hAnsi="Arial" w:cs="Arial"/>
-          <w:color w:val="000000"/>
-        </w:rPr>
-        <w:t xml:space="preserve"> hook URL using curl:</w:t>
+        <w:t>Step 3 – Deploy: Send an HTTP POST request to the Render deploy hook URL using curl:</w:t>
       </w:r>
     </w:p>
     <w:p>
@@ -5605,61 +4942,7 @@
           <w:sz w:val="19"/>
           <w:szCs w:val="19"/>
         </w:rPr>
-        <w:t>curl -X POST $</w:t>
-      </w:r>
-      <w:proofErr w:type="gramStart"/>
-      <w:r>
-        <w:rPr>
-          <w:rFonts w:ascii="Arial" w:eastAsia="Arial" w:hAnsi="Arial" w:cs="Arial"/>
-          <w:sz w:val="19"/>
-          <w:szCs w:val="19"/>
-        </w:rPr>
-        <w:t xml:space="preserve">{{ </w:t>
-      </w:r>
-      <w:proofErr w:type="spellStart"/>
-      <w:r>
-        <w:rPr>
-          <w:rFonts w:ascii="Arial" w:eastAsia="Arial" w:hAnsi="Arial" w:cs="Arial"/>
-          <w:sz w:val="19"/>
-          <w:szCs w:val="19"/>
-        </w:rPr>
-        <w:t>secrets</w:t>
-      </w:r>
-      <w:proofErr w:type="gramEnd"/>
-      <w:r>
-        <w:rPr>
-          <w:rFonts w:ascii="Arial" w:eastAsia="Arial" w:hAnsi="Arial" w:cs="Arial"/>
-          <w:sz w:val="19"/>
-          <w:szCs w:val="19"/>
-        </w:rPr>
-        <w:t>.RENDER_DEPLOY_HOOK_</w:t>
-      </w:r>
-      <w:proofErr w:type="gramStart"/>
-      <w:r>
-        <w:rPr>
-          <w:rFonts w:ascii="Arial" w:eastAsia="Arial" w:hAnsi="Arial" w:cs="Arial"/>
-          <w:sz w:val="19"/>
-          <w:szCs w:val="19"/>
-        </w:rPr>
-        <w:t>URL</w:t>
-      </w:r>
-      <w:proofErr w:type="spellEnd"/>
-      <w:r>
-        <w:rPr>
-          <w:rFonts w:ascii="Arial" w:eastAsia="Arial" w:hAnsi="Arial" w:cs="Arial"/>
-          <w:sz w:val="19"/>
-          <w:szCs w:val="19"/>
-        </w:rPr>
-        <w:t xml:space="preserve"> }</w:t>
-      </w:r>
-      <w:proofErr w:type="gramEnd"/>
-      <w:r>
-        <w:rPr>
-          <w:rFonts w:ascii="Arial" w:eastAsia="Arial" w:hAnsi="Arial" w:cs="Arial"/>
-          <w:sz w:val="19"/>
-          <w:szCs w:val="19"/>
-        </w:rPr>
-        <w:t>}</w:t>
+        <w:t>curl -X POST ${{ secrets.RENDER_DEPLOY_HOOK_URL }}</w:t>
       </w:r>
     </w:p>
     <w:p>
@@ -5728,15 +5011,7 @@
           <w:rFonts w:ascii="Arial" w:eastAsia="Arial" w:hAnsi="Arial" w:cs="Arial"/>
           <w:color w:val="000000"/>
         </w:rPr>
-        <w:t xml:space="preserve">The job must NOT contain any Docker build or push </w:t>
-      </w:r>
-      <w:proofErr w:type="gramStart"/>
-      <w:r>
-        <w:rPr>
-          <w:rFonts w:ascii="Arial" w:eastAsia="Arial" w:hAnsi="Arial" w:cs="Arial"/>
-          <w:color w:val="000000"/>
-        </w:rPr>
-        <w:t xml:space="preserve">steps </w:t>
+        <w:t xml:space="preserve">The job must NOT contain any Docker build or push steps </w:t>
       </w:r>
       <w:r>
         <w:rPr>
@@ -5745,7 +5020,6 @@
         </w:rPr>
         <w:t>,</w:t>
       </w:r>
-      <w:proofErr w:type="gramEnd"/>
       <w:r>
         <w:rPr>
           <w:rFonts w:ascii="Arial" w:eastAsia="Arial" w:hAnsi="Arial" w:cs="Arial"/>
@@ -5938,7 +5212,6 @@
             <w:vAlign w:val="center"/>
           </w:tcPr>
           <w:p>
-            <w:proofErr w:type="spellStart"/>
             <w:r>
               <w:rPr>
                 <w:rFonts w:ascii="Arial" w:eastAsia="Arial" w:hAnsi="Arial" w:cs="Arial"/>
@@ -5950,7 +5223,6 @@
               </w:rPr>
               <w:t>ci.yml</w:t>
             </w:r>
-            <w:proofErr w:type="spellEnd"/>
           </w:p>
         </w:tc>
         <w:tc>
@@ -5972,25 +5244,14 @@
             <w:vAlign w:val="center"/>
           </w:tcPr>
           <w:p>
-            <w:proofErr w:type="spellStart"/>
-            <w:r>
-              <w:rPr>
-                <w:rFonts w:ascii="Arial" w:eastAsia="Arial" w:hAnsi="Arial" w:cs="Arial"/>
-                <w:color w:val="000000"/>
-                <w:sz w:val="18"/>
-                <w:szCs w:val="18"/>
-              </w:rPr>
-              <w:t>pull_request</w:t>
-            </w:r>
-            <w:proofErr w:type="spellEnd"/>
-            <w:r>
-              <w:rPr>
-                <w:rFonts w:ascii="Arial" w:eastAsia="Arial" w:hAnsi="Arial" w:cs="Arial"/>
-                <w:color w:val="000000"/>
-                <w:sz w:val="18"/>
-                <w:szCs w:val="18"/>
-              </w:rPr>
-              <w:t xml:space="preserve"> event targeting </w:t>
+            <w:r>
+              <w:rPr>
+                <w:rFonts w:ascii="Arial" w:eastAsia="Arial" w:hAnsi="Arial" w:cs="Arial"/>
+                <w:color w:val="000000"/>
+                <w:sz w:val="18"/>
+                <w:szCs w:val="18"/>
+              </w:rPr>
+              <w:t xml:space="preserve">pull_request event targeting </w:t>
             </w:r>
             <w:r>
               <w:rPr>
@@ -6063,7 +5324,6 @@
             <w:vAlign w:val="center"/>
           </w:tcPr>
           <w:p>
-            <w:proofErr w:type="spellStart"/>
             <w:r>
               <w:rPr>
                 <w:rFonts w:ascii="Arial" w:eastAsia="Arial" w:hAnsi="Arial" w:cs="Arial"/>
@@ -6075,7 +5335,6 @@
               </w:rPr>
               <w:t>cd.yml</w:t>
             </w:r>
-            <w:proofErr w:type="spellEnd"/>
           </w:p>
         </w:tc>
         <w:tc>
@@ -6214,23 +5473,7 @@
           <w:rFonts w:ascii="Arial" w:eastAsia="Arial" w:hAnsi="Arial" w:cs="Arial"/>
           <w:color w:val="000000"/>
         </w:rPr>
-        <w:t>Create a new GitHub repository from scratch (</w:t>
-      </w:r>
-      <w:proofErr w:type="spellStart"/>
-      <w:r>
-        <w:rPr>
-          <w:rFonts w:ascii="Arial" w:eastAsia="Arial" w:hAnsi="Arial" w:cs="Arial"/>
-          <w:color w:val="000000"/>
-        </w:rPr>
-        <w:t>taskflow-cicd</w:t>
-      </w:r>
-      <w:proofErr w:type="spellEnd"/>
-      <w:r>
-        <w:rPr>
-          <w:rFonts w:ascii="Arial" w:eastAsia="Arial" w:hAnsi="Arial" w:cs="Arial"/>
-          <w:color w:val="000000"/>
-        </w:rPr>
-        <w:t xml:space="preserve"> or team-agreed name). Do NOT reuse any previous repository.</w:t>
+        <w:t>Create a new GitHub repository from scratch (taskflow-cicd or team-agreed name). Do NOT reuse any previous repository.</w:t>
       </w:r>
     </w:p>
     <w:p>
@@ -6247,15 +5490,7 @@
           <w:rFonts w:ascii="Arial" w:eastAsia="Arial" w:hAnsi="Arial" w:cs="Arial"/>
           <w:color w:val="000000"/>
         </w:rPr>
-        <w:t xml:space="preserve">Team Lead: Set up the initial repository </w:t>
-      </w:r>
-      <w:proofErr w:type="gramStart"/>
-      <w:r>
-        <w:rPr>
-          <w:rFonts w:ascii="Arial" w:eastAsia="Arial" w:hAnsi="Arial" w:cs="Arial"/>
-          <w:color w:val="000000"/>
-        </w:rPr>
-        <w:t xml:space="preserve">structure </w:t>
+        <w:t xml:space="preserve">Team Lead: Set up the initial repository structure </w:t>
       </w:r>
       <w:r>
         <w:rPr>
@@ -6264,7 +5499,6 @@
         </w:rPr>
         <w:t>,</w:t>
       </w:r>
-      <w:proofErr w:type="gramEnd"/>
       <w:r>
         <w:rPr>
           <w:rFonts w:ascii="Arial" w:eastAsia="Arial" w:hAnsi="Arial" w:cs="Arial"/>
@@ -6284,23 +5518,7 @@
           <w:rFonts w:ascii="Arial" w:eastAsia="Arial" w:hAnsi="Arial" w:cs="Arial"/>
           <w:color w:val="000000"/>
         </w:rPr>
-        <w:t xml:space="preserve"> branch, commit the shared style.css, </w:t>
-      </w:r>
-      <w:proofErr w:type="spellStart"/>
-      <w:r>
-        <w:rPr>
-          <w:rFonts w:ascii="Arial" w:eastAsia="Arial" w:hAnsi="Arial" w:cs="Arial"/>
-          <w:color w:val="000000"/>
-        </w:rPr>
-        <w:t>Dockerfile</w:t>
-      </w:r>
-      <w:proofErr w:type="spellEnd"/>
-      <w:r>
-        <w:rPr>
-          <w:rFonts w:ascii="Arial" w:eastAsia="Arial" w:hAnsi="Arial" w:cs="Arial"/>
-          <w:color w:val="000000"/>
-        </w:rPr>
-        <w:t>, and a skeleton index.html (Home / Dashboard page).</w:t>
+        <w:t xml:space="preserve"> branch, commit the shared style.css, Dockerfile, and a skeleton index.html (Home / Dashboard page).</w:t>
       </w:r>
     </w:p>
     <w:p>
@@ -6317,15 +5535,7 @@
           <w:rFonts w:ascii="Arial" w:eastAsia="Arial" w:hAnsi="Arial" w:cs="Arial"/>
           <w:color w:val="000000"/>
         </w:rPr>
-        <w:t xml:space="preserve">Commit the Assignment 04 question paper (.docx) to the root of the repository. Every team member must fill in their </w:t>
-      </w:r>
-      <w:proofErr w:type="gramStart"/>
-      <w:r>
-        <w:rPr>
-          <w:rFonts w:ascii="Arial" w:eastAsia="Arial" w:hAnsi="Arial" w:cs="Arial"/>
-          <w:color w:val="000000"/>
-        </w:rPr>
-        <w:t xml:space="preserve">details </w:t>
+        <w:t xml:space="preserve">Commit the Assignment 04 question paper (.docx) to the root of the repository. Every team member must fill in their details </w:t>
       </w:r>
       <w:r>
         <w:rPr>
@@ -6334,21 +5544,12 @@
         </w:rPr>
         <w:t>,</w:t>
       </w:r>
-      <w:proofErr w:type="gramEnd"/>
-      <w:r>
-        <w:rPr>
-          <w:rFonts w:ascii="Arial" w:eastAsia="Arial" w:hAnsi="Arial" w:cs="Arial"/>
-          <w:color w:val="000000"/>
-        </w:rPr>
-        <w:t xml:space="preserve"> including their Assigned </w:t>
-      </w:r>
-      <w:proofErr w:type="gramStart"/>
-      <w:r>
-        <w:rPr>
-          <w:rFonts w:ascii="Arial" w:eastAsia="Arial" w:hAnsi="Arial" w:cs="Arial"/>
-          <w:color w:val="000000"/>
-        </w:rPr>
-        <w:t xml:space="preserve">Page </w:t>
+      <w:r>
+        <w:rPr>
+          <w:rFonts w:ascii="Arial" w:eastAsia="Arial" w:hAnsi="Arial" w:cs="Arial"/>
+          <w:color w:val="000000"/>
+        </w:rPr>
+        <w:t xml:space="preserve"> including their Assigned Page </w:t>
       </w:r>
       <w:r>
         <w:rPr>
@@ -6357,7 +5558,6 @@
         </w:rPr>
         <w:t>,</w:t>
       </w:r>
-      <w:proofErr w:type="gramEnd"/>
       <w:r>
         <w:rPr>
           <w:rFonts w:ascii="Arial" w:eastAsia="Arial" w:hAnsi="Arial" w:cs="Arial"/>
@@ -6394,15 +5594,7 @@
           <w:rFonts w:ascii="Arial" w:eastAsia="Arial" w:hAnsi="Arial" w:cs="Arial"/>
           <w:color w:val="000000"/>
         </w:rPr>
-        <w:t xml:space="preserve"> and configure all three </w:t>
-      </w:r>
-      <w:proofErr w:type="gramStart"/>
-      <w:r>
-        <w:rPr>
-          <w:rFonts w:ascii="Arial" w:eastAsia="Arial" w:hAnsi="Arial" w:cs="Arial"/>
-          <w:color w:val="000000"/>
-        </w:rPr>
-        <w:t xml:space="preserve">secrets </w:t>
+        <w:t xml:space="preserve"> and configure all three secrets </w:t>
       </w:r>
       <w:r>
         <w:rPr>
@@ -6411,7 +5603,6 @@
         </w:rPr>
         <w:t>,</w:t>
       </w:r>
-      <w:proofErr w:type="gramEnd"/>
       <w:r>
         <w:rPr>
           <w:rFonts w:ascii="Arial" w:eastAsia="Arial" w:hAnsi="Arial" w:cs="Arial"/>
@@ -6479,47 +5670,7 @@
           <w:rFonts w:ascii="Arial" w:eastAsia="Arial" w:hAnsi="Arial" w:cs="Arial"/>
           <w:color w:val="000000"/>
         </w:rPr>
-        <w:t xml:space="preserve">Create the CI workflow at </w:t>
-      </w:r>
-      <w:proofErr w:type="gramStart"/>
-      <w:r>
-        <w:rPr>
-          <w:rFonts w:ascii="Arial" w:eastAsia="Arial" w:hAnsi="Arial" w:cs="Arial"/>
-          <w:color w:val="000000"/>
-        </w:rPr>
-        <w:t>.</w:t>
-      </w:r>
-      <w:proofErr w:type="spellStart"/>
-      <w:r>
-        <w:rPr>
-          <w:rFonts w:ascii="Arial" w:eastAsia="Arial" w:hAnsi="Arial" w:cs="Arial"/>
-          <w:color w:val="000000"/>
-        </w:rPr>
-        <w:t>github</w:t>
-      </w:r>
-      <w:proofErr w:type="spellEnd"/>
-      <w:r>
-        <w:rPr>
-          <w:rFonts w:ascii="Arial" w:eastAsia="Arial" w:hAnsi="Arial" w:cs="Arial"/>
-          <w:color w:val="000000"/>
-        </w:rPr>
-        <w:t>/workflows/</w:t>
-      </w:r>
-      <w:proofErr w:type="spellStart"/>
-      <w:r>
-        <w:rPr>
-          <w:rFonts w:ascii="Arial" w:eastAsia="Arial" w:hAnsi="Arial" w:cs="Arial"/>
-          <w:color w:val="000000"/>
-        </w:rPr>
-        <w:t>ci.yml</w:t>
-      </w:r>
-      <w:proofErr w:type="spellEnd"/>
-      <w:r>
-        <w:rPr>
-          <w:rFonts w:ascii="Arial" w:eastAsia="Arial" w:hAnsi="Arial" w:cs="Arial"/>
-          <w:color w:val="000000"/>
-        </w:rPr>
-        <w:t xml:space="preserve"> </w:t>
+        <w:t xml:space="preserve">Create the CI workflow at .github/workflows/ci.yml </w:t>
       </w:r>
       <w:r>
         <w:rPr>
@@ -6528,29 +5679,12 @@
         </w:rPr>
         <w:t>,</w:t>
       </w:r>
-      <w:proofErr w:type="gramEnd"/>
-      <w:r>
-        <w:rPr>
-          <w:rFonts w:ascii="Arial" w:eastAsia="Arial" w:hAnsi="Arial" w:cs="Arial"/>
-          <w:color w:val="000000"/>
-        </w:rPr>
-        <w:t xml:space="preserve"> triggered on </w:t>
-      </w:r>
-      <w:proofErr w:type="spellStart"/>
-      <w:r>
-        <w:rPr>
-          <w:rFonts w:ascii="Arial" w:eastAsia="Arial" w:hAnsi="Arial" w:cs="Arial"/>
-          <w:color w:val="000000"/>
-        </w:rPr>
-        <w:t>pull_request</w:t>
-      </w:r>
-      <w:proofErr w:type="spellEnd"/>
-      <w:r>
-        <w:rPr>
-          <w:rFonts w:ascii="Arial" w:eastAsia="Arial" w:hAnsi="Arial" w:cs="Arial"/>
-          <w:color w:val="000000"/>
-        </w:rPr>
-        <w:t xml:space="preserve"> targeting </w:t>
+      <w:r>
+        <w:rPr>
+          <w:rFonts w:ascii="Arial" w:eastAsia="Arial" w:hAnsi="Arial" w:cs="Arial"/>
+          <w:color w:val="000000"/>
+        </w:rPr>
+        <w:t xml:space="preserve"> triggered on pull_request targeting </w:t>
       </w:r>
       <w:r>
         <w:rPr>
@@ -6581,47 +5715,7 @@
           <w:rFonts w:ascii="Arial" w:eastAsia="Arial" w:hAnsi="Arial" w:cs="Arial"/>
           <w:color w:val="000000"/>
         </w:rPr>
-        <w:t xml:space="preserve">Create the CD workflow at </w:t>
-      </w:r>
-      <w:proofErr w:type="gramStart"/>
-      <w:r>
-        <w:rPr>
-          <w:rFonts w:ascii="Arial" w:eastAsia="Arial" w:hAnsi="Arial" w:cs="Arial"/>
-          <w:color w:val="000000"/>
-        </w:rPr>
-        <w:t>.</w:t>
-      </w:r>
-      <w:proofErr w:type="spellStart"/>
-      <w:r>
-        <w:rPr>
-          <w:rFonts w:ascii="Arial" w:eastAsia="Arial" w:hAnsi="Arial" w:cs="Arial"/>
-          <w:color w:val="000000"/>
-        </w:rPr>
-        <w:t>github</w:t>
-      </w:r>
-      <w:proofErr w:type="spellEnd"/>
-      <w:r>
-        <w:rPr>
-          <w:rFonts w:ascii="Arial" w:eastAsia="Arial" w:hAnsi="Arial" w:cs="Arial"/>
-          <w:color w:val="000000"/>
-        </w:rPr>
-        <w:t>/workflows/</w:t>
-      </w:r>
-      <w:proofErr w:type="spellStart"/>
-      <w:r>
-        <w:rPr>
-          <w:rFonts w:ascii="Arial" w:eastAsia="Arial" w:hAnsi="Arial" w:cs="Arial"/>
-          <w:color w:val="000000"/>
-        </w:rPr>
-        <w:t>cd.yml</w:t>
-      </w:r>
-      <w:proofErr w:type="spellEnd"/>
-      <w:r>
-        <w:rPr>
-          <w:rFonts w:ascii="Arial" w:eastAsia="Arial" w:hAnsi="Arial" w:cs="Arial"/>
-          <w:color w:val="000000"/>
-        </w:rPr>
-        <w:t xml:space="preserve"> </w:t>
+        <w:t xml:space="preserve">Create the CD workflow at .github/workflows/cd.yml </w:t>
       </w:r>
       <w:r>
         <w:rPr>
@@ -6630,7 +5724,6 @@
         </w:rPr>
         <w:t>,</w:t>
       </w:r>
-      <w:proofErr w:type="gramEnd"/>
       <w:r>
         <w:rPr>
           <w:rFonts w:ascii="Arial" w:eastAsia="Arial" w:hAnsi="Arial" w:cs="Arial"/>
@@ -6686,25 +5779,7 @@
           <w:sz w:val="19"/>
           <w:szCs w:val="19"/>
         </w:rPr>
-        <w:t>Create a feature branch: feature/&lt;</w:t>
-      </w:r>
-      <w:proofErr w:type="spellStart"/>
-      <w:r>
-        <w:rPr>
-          <w:rFonts w:ascii="Arial" w:eastAsia="Arial" w:hAnsi="Arial" w:cs="Arial"/>
-          <w:sz w:val="19"/>
-          <w:szCs w:val="19"/>
-        </w:rPr>
-        <w:t>github</w:t>
-      </w:r>
-      <w:proofErr w:type="spellEnd"/>
-      <w:r>
-        <w:rPr>
-          <w:rFonts w:ascii="Arial" w:eastAsia="Arial" w:hAnsi="Arial" w:cs="Arial"/>
-          <w:sz w:val="19"/>
-          <w:szCs w:val="19"/>
-        </w:rPr>
-        <w:t>-username&gt;/&lt;page-name&gt;</w:t>
+        <w:t>Create a feature branch: feature/&lt;github-username&gt;/&lt;page-name&gt;</w:t>
       </w:r>
     </w:p>
     <w:p>
@@ -6766,16 +5841,15 @@
           <w:sz w:val="19"/>
           <w:szCs w:val="19"/>
         </w:rPr>
-        <w:t>“develop</w:t>
-      </w:r>
-      <w:proofErr w:type="gramStart"/>
+        <w:t>“develop”</w:t>
+      </w:r>
       <w:r>
         <w:rPr>
           <w:rFonts w:ascii="Arial" w:eastAsia="Arial" w:hAnsi="Arial" w:cs="Arial"/>
           <w:sz w:val="19"/>
           <w:szCs w:val="19"/>
         </w:rPr>
-        <w:t>”</w:t>
+        <w:t xml:space="preserve"> </w:t>
       </w:r>
       <w:r>
         <w:rPr>
@@ -6783,17 +5857,8 @@
           <w:sz w:val="19"/>
           <w:szCs w:val="19"/>
         </w:rPr>
-        <w:t xml:space="preserve"> </w:t>
-      </w:r>
-      <w:r>
-        <w:rPr>
-          <w:rFonts w:ascii="Arial" w:eastAsia="Arial" w:hAnsi="Arial" w:cs="Arial"/>
-          <w:sz w:val="19"/>
-          <w:szCs w:val="19"/>
-        </w:rPr>
         <w:t>,</w:t>
       </w:r>
-      <w:proofErr w:type="gramEnd"/>
       <w:r>
         <w:rPr>
           <w:rFonts w:ascii="Arial" w:eastAsia="Arial" w:hAnsi="Arial" w:cs="Arial"/>
@@ -6818,26 +5883,16 @@
           <w:sz w:val="19"/>
           <w:szCs w:val="19"/>
         </w:rPr>
-        <w:t xml:space="preserve">Request a review; after approval the Team Lead merges the </w:t>
-      </w:r>
-      <w:proofErr w:type="gramStart"/>
+        <w:t xml:space="preserve">Request a review; after approval the Team Lead merges the PR </w:t>
+      </w:r>
       <w:r>
         <w:rPr>
           <w:rFonts w:ascii="Arial" w:eastAsia="Arial" w:hAnsi="Arial" w:cs="Arial"/>
           <w:sz w:val="19"/>
           <w:szCs w:val="19"/>
         </w:rPr>
-        <w:t xml:space="preserve">PR </w:t>
-      </w:r>
-      <w:r>
-        <w:rPr>
-          <w:rFonts w:ascii="Arial" w:eastAsia="Arial" w:hAnsi="Arial" w:cs="Arial"/>
-          <w:sz w:val="19"/>
-          <w:szCs w:val="19"/>
-        </w:rPr>
         <w:t>,</w:t>
       </w:r>
-      <w:proofErr w:type="gramEnd"/>
       <w:r>
         <w:rPr>
           <w:rFonts w:ascii="Arial" w:eastAsia="Arial" w:hAnsi="Arial" w:cs="Arial"/>
@@ -6861,39 +5916,7 @@
           <w:rFonts w:ascii="Arial" w:eastAsia="Arial" w:hAnsi="Arial" w:cs="Arial"/>
           <w:color w:val="000000"/>
         </w:rPr>
-        <w:t xml:space="preserve">After </w:t>
-      </w:r>
-      <w:proofErr w:type="gramStart"/>
-      <w:r>
-        <w:rPr>
-          <w:rFonts w:ascii="Arial" w:eastAsia="Arial" w:hAnsi="Arial" w:cs="Arial"/>
-          <w:color w:val="000000"/>
-        </w:rPr>
-        <w:t>all</w:t>
-      </w:r>
-      <w:proofErr w:type="gramEnd"/>
-      <w:r>
-        <w:rPr>
-          <w:rFonts w:ascii="Arial" w:eastAsia="Arial" w:hAnsi="Arial" w:cs="Arial"/>
-          <w:color w:val="000000"/>
-        </w:rPr>
-        <w:t xml:space="preserve"> 5 PRs are merged, verify the live </w:t>
-      </w:r>
-      <w:proofErr w:type="spellStart"/>
-      <w:r>
-        <w:rPr>
-          <w:rFonts w:ascii="Arial" w:eastAsia="Arial" w:hAnsi="Arial" w:cs="Arial"/>
-          <w:color w:val="000000"/>
-        </w:rPr>
-        <w:t>TaskFlow</w:t>
-      </w:r>
-      <w:proofErr w:type="spellEnd"/>
-      <w:r>
-        <w:rPr>
-          <w:rFonts w:ascii="Arial" w:eastAsia="Arial" w:hAnsi="Arial" w:cs="Arial"/>
-          <w:color w:val="000000"/>
-        </w:rPr>
-        <w:t xml:space="preserve"> application on Render contains all five pages and navigation between them works correctly.</w:t>
+        <w:t>After all 5 PRs are merged, verify the live TaskFlow application on Render contains all five pages and navigation between them works correctly.</w:t>
       </w:r>
     </w:p>
     <w:p>
@@ -8172,9 +7195,29 @@
                 <w:sz w:val="18"/>
                 <w:szCs w:val="18"/>
               </w:rPr>
-              <w:t>CI Pipeline – Build &amp; Push Docker Image (</w:t>
-            </w:r>
-            <w:proofErr w:type="spellStart"/>
+              <w:t>CI Pipeline – Build &amp; Push Docker Image (ci.yml)</w:t>
+            </w:r>
+          </w:p>
+        </w:tc>
+        <w:tc>
+          <w:tcPr>
+            <w:tcW w:w="2150" w:type="dxa"/>
+            <w:tcBorders>
+              <w:top w:val="single" w:sz="6" w:space="0" w:color="ADB9CA"/>
+              <w:left w:val="single" w:sz="6" w:space="0" w:color="ADB9CA"/>
+              <w:bottom w:val="single" w:sz="6" w:space="0" w:color="ADB9CA"/>
+              <w:right w:val="single" w:sz="6" w:space="0" w:color="ADB9CA"/>
+            </w:tcBorders>
+            <w:shd w:val="clear" w:color="auto" w:fill="2E75B6"/>
+            <w:tcMar>
+              <w:top w:w="80" w:type="dxa"/>
+              <w:left w:w="140" w:type="dxa"/>
+              <w:bottom w:w="80" w:type="dxa"/>
+              <w:right w:w="140" w:type="dxa"/>
+            </w:tcMar>
+            <w:vAlign w:val="center"/>
+          </w:tcPr>
+          <w:p>
             <w:r>
               <w:rPr>
                 <w:rFonts w:ascii="Arial" w:eastAsia="Arial" w:hAnsi="Arial" w:cs="Arial"/>
@@ -8184,9 +7227,436 @@
                 <w:sz w:val="18"/>
                 <w:szCs w:val="18"/>
               </w:rPr>
-              <w:t>ci.yml</w:t>
-            </w:r>
-            <w:proofErr w:type="spellEnd"/>
+              <w:t>25 Marks</w:t>
+            </w:r>
+          </w:p>
+        </w:tc>
+      </w:tr>
+      <w:tr>
+        <w:tc>
+          <w:tcPr>
+            <w:tcW w:w="700" w:type="dxa"/>
+            <w:tcBorders>
+              <w:top w:val="single" w:sz="6" w:space="0" w:color="ADB9CA"/>
+              <w:left w:val="single" w:sz="6" w:space="0" w:color="ADB9CA"/>
+              <w:bottom w:val="single" w:sz="6" w:space="0" w:color="ADB9CA"/>
+              <w:right w:val="single" w:sz="6" w:space="0" w:color="ADB9CA"/>
+            </w:tcBorders>
+            <w:shd w:val="clear" w:color="auto" w:fill="E8F0FB"/>
+            <w:tcMar>
+              <w:top w:w="80" w:type="dxa"/>
+              <w:left w:w="140" w:type="dxa"/>
+              <w:bottom w:w="80" w:type="dxa"/>
+              <w:right w:w="140" w:type="dxa"/>
+            </w:tcMar>
+            <w:vAlign w:val="center"/>
+          </w:tcPr>
+          <w:p>
+            <w:r>
+              <w:rPr>
+                <w:rFonts w:ascii="Arial" w:eastAsia="Arial" w:hAnsi="Arial" w:cs="Arial"/>
+                <w:b/>
+                <w:bCs/>
+                <w:color w:val="000000"/>
+                <w:sz w:val="18"/>
+                <w:szCs w:val="18"/>
+              </w:rPr>
+              <w:t>9</w:t>
+            </w:r>
+          </w:p>
+        </w:tc>
+        <w:tc>
+          <w:tcPr>
+            <w:tcW w:w="6510" w:type="dxa"/>
+            <w:tcBorders>
+              <w:top w:val="single" w:sz="6" w:space="0" w:color="ADB9CA"/>
+              <w:left w:val="single" w:sz="6" w:space="0" w:color="ADB9CA"/>
+              <w:bottom w:val="single" w:sz="6" w:space="0" w:color="ADB9CA"/>
+              <w:right w:val="single" w:sz="6" w:space="0" w:color="ADB9CA"/>
+            </w:tcBorders>
+            <w:shd w:val="clear" w:color="auto" w:fill="E8F0FB"/>
+            <w:tcMar>
+              <w:top w:w="80" w:type="dxa"/>
+              <w:left w:w="140" w:type="dxa"/>
+              <w:bottom w:w="80" w:type="dxa"/>
+              <w:right w:w="140" w:type="dxa"/>
+            </w:tcMar>
+            <w:vAlign w:val="center"/>
+          </w:tcPr>
+          <w:p>
+            <w:r>
+              <w:rPr>
+                <w:rFonts w:ascii="Arial" w:eastAsia="Arial" w:hAnsi="Arial" w:cs="Arial"/>
+                <w:color w:val="000000"/>
+                <w:sz w:val="18"/>
+                <w:szCs w:val="18"/>
+              </w:rPr>
+              <w:t xml:space="preserve">CI workflow file created at .github/workflows/ci.yml with correct pull_request trigger targeting </w:t>
+            </w:r>
+            <w:r>
+              <w:rPr>
+                <w:rFonts w:ascii="Arial" w:eastAsia="Arial" w:hAnsi="Arial" w:cs="Arial"/>
+                <w:color w:val="000000"/>
+                <w:sz w:val="18"/>
+                <w:szCs w:val="18"/>
+              </w:rPr>
+              <w:t>“develop”</w:t>
+            </w:r>
+          </w:p>
+        </w:tc>
+        <w:tc>
+          <w:tcPr>
+            <w:tcW w:w="2150" w:type="dxa"/>
+            <w:tcBorders>
+              <w:top w:val="single" w:sz="6" w:space="0" w:color="ADB9CA"/>
+              <w:left w:val="single" w:sz="6" w:space="0" w:color="ADB9CA"/>
+              <w:bottom w:val="single" w:sz="6" w:space="0" w:color="ADB9CA"/>
+              <w:right w:val="single" w:sz="6" w:space="0" w:color="ADB9CA"/>
+            </w:tcBorders>
+            <w:shd w:val="clear" w:color="auto" w:fill="E8F0FB"/>
+            <w:tcMar>
+              <w:top w:w="80" w:type="dxa"/>
+              <w:left w:w="140" w:type="dxa"/>
+              <w:bottom w:w="80" w:type="dxa"/>
+              <w:right w:w="140" w:type="dxa"/>
+            </w:tcMar>
+            <w:vAlign w:val="center"/>
+          </w:tcPr>
+          <w:p>
+            <w:r>
+              <w:rPr>
+                <w:rFonts w:ascii="Arial" w:eastAsia="Arial" w:hAnsi="Arial" w:cs="Arial"/>
+                <w:color w:val="000000"/>
+                <w:sz w:val="18"/>
+                <w:szCs w:val="18"/>
+              </w:rPr>
+              <w:t>07</w:t>
+            </w:r>
+          </w:p>
+        </w:tc>
+      </w:tr>
+      <w:tr>
+        <w:tc>
+          <w:tcPr>
+            <w:tcW w:w="700" w:type="dxa"/>
+            <w:tcBorders>
+              <w:top w:val="single" w:sz="6" w:space="0" w:color="ADB9CA"/>
+              <w:left w:val="single" w:sz="6" w:space="0" w:color="ADB9CA"/>
+              <w:bottom w:val="single" w:sz="6" w:space="0" w:color="ADB9CA"/>
+              <w:right w:val="single" w:sz="6" w:space="0" w:color="ADB9CA"/>
+            </w:tcBorders>
+            <w:shd w:val="clear" w:color="auto" w:fill="FFFFFF"/>
+            <w:tcMar>
+              <w:top w:w="80" w:type="dxa"/>
+              <w:left w:w="140" w:type="dxa"/>
+              <w:bottom w:w="80" w:type="dxa"/>
+              <w:right w:w="140" w:type="dxa"/>
+            </w:tcMar>
+            <w:vAlign w:val="center"/>
+          </w:tcPr>
+          <w:p>
+            <w:r>
+              <w:rPr>
+                <w:rFonts w:ascii="Arial" w:eastAsia="Arial" w:hAnsi="Arial" w:cs="Arial"/>
+                <w:b/>
+                <w:bCs/>
+                <w:color w:val="000000"/>
+                <w:sz w:val="18"/>
+                <w:szCs w:val="18"/>
+              </w:rPr>
+              <w:t>10</w:t>
+            </w:r>
+          </w:p>
+        </w:tc>
+        <w:tc>
+          <w:tcPr>
+            <w:tcW w:w="6510" w:type="dxa"/>
+            <w:tcBorders>
+              <w:top w:val="single" w:sz="6" w:space="0" w:color="ADB9CA"/>
+              <w:left w:val="single" w:sz="6" w:space="0" w:color="ADB9CA"/>
+              <w:bottom w:val="single" w:sz="6" w:space="0" w:color="ADB9CA"/>
+              <w:right w:val="single" w:sz="6" w:space="0" w:color="ADB9CA"/>
+            </w:tcBorders>
+            <w:shd w:val="clear" w:color="auto" w:fill="FFFFFF"/>
+            <w:tcMar>
+              <w:top w:w="80" w:type="dxa"/>
+              <w:left w:w="140" w:type="dxa"/>
+              <w:bottom w:w="80" w:type="dxa"/>
+              <w:right w:w="140" w:type="dxa"/>
+            </w:tcMar>
+            <w:vAlign w:val="center"/>
+          </w:tcPr>
+          <w:p>
+            <w:r>
+              <w:rPr>
+                <w:rFonts w:ascii="Arial" w:eastAsia="Arial" w:hAnsi="Arial" w:cs="Arial"/>
+                <w:color w:val="000000"/>
+                <w:sz w:val="18"/>
+                <w:szCs w:val="18"/>
+              </w:rPr>
+              <w:t>Checkout code, login to Docker Hub using Team Lead's repository secrets</w:t>
+            </w:r>
+          </w:p>
+        </w:tc>
+        <w:tc>
+          <w:tcPr>
+            <w:tcW w:w="2150" w:type="dxa"/>
+            <w:tcBorders>
+              <w:top w:val="single" w:sz="6" w:space="0" w:color="ADB9CA"/>
+              <w:left w:val="single" w:sz="6" w:space="0" w:color="ADB9CA"/>
+              <w:bottom w:val="single" w:sz="6" w:space="0" w:color="ADB9CA"/>
+              <w:right w:val="single" w:sz="6" w:space="0" w:color="ADB9CA"/>
+            </w:tcBorders>
+            <w:shd w:val="clear" w:color="auto" w:fill="FFFFFF"/>
+            <w:tcMar>
+              <w:top w:w="80" w:type="dxa"/>
+              <w:left w:w="140" w:type="dxa"/>
+              <w:bottom w:w="80" w:type="dxa"/>
+              <w:right w:w="140" w:type="dxa"/>
+            </w:tcMar>
+            <w:vAlign w:val="center"/>
+          </w:tcPr>
+          <w:p>
+            <w:r>
+              <w:rPr>
+                <w:rFonts w:ascii="Arial" w:eastAsia="Arial" w:hAnsi="Arial" w:cs="Arial"/>
+                <w:color w:val="000000"/>
+                <w:sz w:val="18"/>
+                <w:szCs w:val="18"/>
+              </w:rPr>
+              <w:t>06</w:t>
+            </w:r>
+          </w:p>
+        </w:tc>
+      </w:tr>
+      <w:tr>
+        <w:tc>
+          <w:tcPr>
+            <w:tcW w:w="700" w:type="dxa"/>
+            <w:tcBorders>
+              <w:top w:val="single" w:sz="6" w:space="0" w:color="ADB9CA"/>
+              <w:left w:val="single" w:sz="6" w:space="0" w:color="ADB9CA"/>
+              <w:bottom w:val="single" w:sz="6" w:space="0" w:color="ADB9CA"/>
+              <w:right w:val="single" w:sz="6" w:space="0" w:color="ADB9CA"/>
+            </w:tcBorders>
+            <w:shd w:val="clear" w:color="auto" w:fill="E8F0FB"/>
+            <w:tcMar>
+              <w:top w:w="80" w:type="dxa"/>
+              <w:left w:w="140" w:type="dxa"/>
+              <w:bottom w:w="80" w:type="dxa"/>
+              <w:right w:w="140" w:type="dxa"/>
+            </w:tcMar>
+            <w:vAlign w:val="center"/>
+          </w:tcPr>
+          <w:p>
+            <w:r>
+              <w:rPr>
+                <w:rFonts w:ascii="Arial" w:eastAsia="Arial" w:hAnsi="Arial" w:cs="Arial"/>
+                <w:b/>
+                <w:bCs/>
+                <w:color w:val="000000"/>
+                <w:sz w:val="18"/>
+                <w:szCs w:val="18"/>
+              </w:rPr>
+              <w:t>11</w:t>
+            </w:r>
+          </w:p>
+        </w:tc>
+        <w:tc>
+          <w:tcPr>
+            <w:tcW w:w="6510" w:type="dxa"/>
+            <w:tcBorders>
+              <w:top w:val="single" w:sz="6" w:space="0" w:color="ADB9CA"/>
+              <w:left w:val="single" w:sz="6" w:space="0" w:color="ADB9CA"/>
+              <w:bottom w:val="single" w:sz="6" w:space="0" w:color="ADB9CA"/>
+              <w:right w:val="single" w:sz="6" w:space="0" w:color="ADB9CA"/>
+            </w:tcBorders>
+            <w:shd w:val="clear" w:color="auto" w:fill="E8F0FB"/>
+            <w:tcMar>
+              <w:top w:w="80" w:type="dxa"/>
+              <w:left w:w="140" w:type="dxa"/>
+              <w:bottom w:w="80" w:type="dxa"/>
+              <w:right w:w="140" w:type="dxa"/>
+            </w:tcMar>
+            <w:vAlign w:val="center"/>
+          </w:tcPr>
+          <w:p>
+            <w:r>
+              <w:rPr>
+                <w:rFonts w:ascii="Arial" w:eastAsia="Arial" w:hAnsi="Arial" w:cs="Arial"/>
+                <w:color w:val="000000"/>
+                <w:sz w:val="18"/>
+                <w:szCs w:val="18"/>
+              </w:rPr>
+              <w:t>Build Docker image and tag correctly (latest and/or commit SHA)</w:t>
+            </w:r>
+          </w:p>
+        </w:tc>
+        <w:tc>
+          <w:tcPr>
+            <w:tcW w:w="2150" w:type="dxa"/>
+            <w:tcBorders>
+              <w:top w:val="single" w:sz="6" w:space="0" w:color="ADB9CA"/>
+              <w:left w:val="single" w:sz="6" w:space="0" w:color="ADB9CA"/>
+              <w:bottom w:val="single" w:sz="6" w:space="0" w:color="ADB9CA"/>
+              <w:right w:val="single" w:sz="6" w:space="0" w:color="ADB9CA"/>
+            </w:tcBorders>
+            <w:shd w:val="clear" w:color="auto" w:fill="E8F0FB"/>
+            <w:tcMar>
+              <w:top w:w="80" w:type="dxa"/>
+              <w:left w:w="140" w:type="dxa"/>
+              <w:bottom w:w="80" w:type="dxa"/>
+              <w:right w:w="140" w:type="dxa"/>
+            </w:tcMar>
+            <w:vAlign w:val="center"/>
+          </w:tcPr>
+          <w:p>
+            <w:r>
+              <w:rPr>
+                <w:rFonts w:ascii="Arial" w:eastAsia="Arial" w:hAnsi="Arial" w:cs="Arial"/>
+                <w:color w:val="000000"/>
+                <w:sz w:val="18"/>
+                <w:szCs w:val="18"/>
+              </w:rPr>
+              <w:t>06</w:t>
+            </w:r>
+          </w:p>
+        </w:tc>
+      </w:tr>
+      <w:tr>
+        <w:tc>
+          <w:tcPr>
+            <w:tcW w:w="700" w:type="dxa"/>
+            <w:tcBorders>
+              <w:top w:val="single" w:sz="6" w:space="0" w:color="ADB9CA"/>
+              <w:left w:val="single" w:sz="6" w:space="0" w:color="ADB9CA"/>
+              <w:bottom w:val="single" w:sz="6" w:space="0" w:color="ADB9CA"/>
+              <w:right w:val="single" w:sz="6" w:space="0" w:color="ADB9CA"/>
+            </w:tcBorders>
+            <w:shd w:val="clear" w:color="auto" w:fill="FFFFFF"/>
+            <w:tcMar>
+              <w:top w:w="80" w:type="dxa"/>
+              <w:left w:w="140" w:type="dxa"/>
+              <w:bottom w:w="80" w:type="dxa"/>
+              <w:right w:w="140" w:type="dxa"/>
+            </w:tcMar>
+            <w:vAlign w:val="center"/>
+          </w:tcPr>
+          <w:p>
+            <w:r>
+              <w:rPr>
+                <w:rFonts w:ascii="Arial" w:eastAsia="Arial" w:hAnsi="Arial" w:cs="Arial"/>
+                <w:b/>
+                <w:bCs/>
+                <w:color w:val="000000"/>
+                <w:sz w:val="18"/>
+                <w:szCs w:val="18"/>
+              </w:rPr>
+              <w:t>12</w:t>
+            </w:r>
+          </w:p>
+        </w:tc>
+        <w:tc>
+          <w:tcPr>
+            <w:tcW w:w="6510" w:type="dxa"/>
+            <w:tcBorders>
+              <w:top w:val="single" w:sz="6" w:space="0" w:color="ADB9CA"/>
+              <w:left w:val="single" w:sz="6" w:space="0" w:color="ADB9CA"/>
+              <w:bottom w:val="single" w:sz="6" w:space="0" w:color="ADB9CA"/>
+              <w:right w:val="single" w:sz="6" w:space="0" w:color="ADB9CA"/>
+            </w:tcBorders>
+            <w:shd w:val="clear" w:color="auto" w:fill="FFFFFF"/>
+            <w:tcMar>
+              <w:top w:w="80" w:type="dxa"/>
+              <w:left w:w="140" w:type="dxa"/>
+              <w:bottom w:w="80" w:type="dxa"/>
+              <w:right w:w="140" w:type="dxa"/>
+            </w:tcMar>
+            <w:vAlign w:val="center"/>
+          </w:tcPr>
+          <w:p>
+            <w:r>
+              <w:rPr>
+                <w:rFonts w:ascii="Arial" w:eastAsia="Arial" w:hAnsi="Arial" w:cs="Arial"/>
+                <w:color w:val="000000"/>
+                <w:sz w:val="18"/>
+                <w:szCs w:val="18"/>
+              </w:rPr>
+              <w:t>Push image to Docker Hub successfully; workflow exits on any step failure</w:t>
+            </w:r>
+          </w:p>
+        </w:tc>
+        <w:tc>
+          <w:tcPr>
+            <w:tcW w:w="2150" w:type="dxa"/>
+            <w:tcBorders>
+              <w:top w:val="single" w:sz="6" w:space="0" w:color="ADB9CA"/>
+              <w:left w:val="single" w:sz="6" w:space="0" w:color="ADB9CA"/>
+              <w:bottom w:val="single" w:sz="6" w:space="0" w:color="ADB9CA"/>
+              <w:right w:val="single" w:sz="6" w:space="0" w:color="ADB9CA"/>
+            </w:tcBorders>
+            <w:shd w:val="clear" w:color="auto" w:fill="FFFFFF"/>
+            <w:tcMar>
+              <w:top w:w="80" w:type="dxa"/>
+              <w:left w:w="140" w:type="dxa"/>
+              <w:bottom w:w="80" w:type="dxa"/>
+              <w:right w:w="140" w:type="dxa"/>
+            </w:tcMar>
+            <w:vAlign w:val="center"/>
+          </w:tcPr>
+          <w:p>
+            <w:r>
+              <w:rPr>
+                <w:rFonts w:ascii="Arial" w:eastAsia="Arial" w:hAnsi="Arial" w:cs="Arial"/>
+                <w:color w:val="000000"/>
+                <w:sz w:val="18"/>
+                <w:szCs w:val="18"/>
+              </w:rPr>
+              <w:t>06</w:t>
+            </w:r>
+          </w:p>
+        </w:tc>
+      </w:tr>
+      <w:tr>
+        <w:tc>
+          <w:tcPr>
+            <w:tcW w:w="700" w:type="dxa"/>
+            <w:tcBorders>
+              <w:top w:val="single" w:sz="6" w:space="0" w:color="ADB9CA"/>
+              <w:left w:val="single" w:sz="6" w:space="0" w:color="ADB9CA"/>
+              <w:bottom w:val="single" w:sz="6" w:space="0" w:color="ADB9CA"/>
+              <w:right w:val="single" w:sz="6" w:space="0" w:color="ADB9CA"/>
+            </w:tcBorders>
+            <w:shd w:val="clear" w:color="auto" w:fill="2E75B6"/>
+            <w:tcMar>
+              <w:top w:w="80" w:type="dxa"/>
+              <w:left w:w="140" w:type="dxa"/>
+              <w:bottom w:w="80" w:type="dxa"/>
+              <w:right w:w="140" w:type="dxa"/>
+            </w:tcMar>
+            <w:vAlign w:val="center"/>
+          </w:tcPr>
+          <w:p/>
+        </w:tc>
+        <w:tc>
+          <w:tcPr>
+            <w:tcW w:w="6510" w:type="dxa"/>
+            <w:tcBorders>
+              <w:top w:val="single" w:sz="6" w:space="0" w:color="ADB9CA"/>
+              <w:left w:val="single" w:sz="6" w:space="0" w:color="ADB9CA"/>
+              <w:bottom w:val="single" w:sz="6" w:space="0" w:color="ADB9CA"/>
+              <w:right w:val="single" w:sz="6" w:space="0" w:color="ADB9CA"/>
+            </w:tcBorders>
+            <w:shd w:val="clear" w:color="auto" w:fill="2E75B6"/>
+            <w:tcMar>
+              <w:top w:w="80" w:type="dxa"/>
+              <w:left w:w="140" w:type="dxa"/>
+              <w:bottom w:w="80" w:type="dxa"/>
+              <w:right w:w="140" w:type="dxa"/>
+            </w:tcMar>
+            <w:vAlign w:val="center"/>
+          </w:tcPr>
+          <w:p>
             <w:r>
               <w:rPr>
                 <w:rFonts w:ascii="Arial" w:eastAsia="Arial" w:hAnsi="Arial" w:cs="Arial"/>
@@ -8196,7 +7666,7 @@
                 <w:sz w:val="18"/>
                 <w:szCs w:val="18"/>
               </w:rPr>
-              <w:t>)</w:t>
+              <w:t>CD Pipeline – Automated Deployment to Render (cd.yml)</w:t>
             </w:r>
           </w:p>
         </w:tc>
@@ -8228,7 +7698,7 @@
                 <w:sz w:val="18"/>
                 <w:szCs w:val="18"/>
               </w:rPr>
-              <w:t>25 Marks</w:t>
+              <w:t>20 Marks</w:t>
             </w:r>
           </w:p>
         </w:tc>
@@ -8262,7 +7732,7 @@
                 <w:sz w:val="18"/>
                 <w:szCs w:val="18"/>
               </w:rPr>
-              <w:t>9</w:t>
+              <w:t>13</w:t>
             </w:r>
           </w:p>
         </w:tc>
@@ -8292,602 +7762,7 @@
                 <w:sz w:val="18"/>
                 <w:szCs w:val="18"/>
               </w:rPr>
-              <w:t>CI workflow file created at .</w:t>
-            </w:r>
-            <w:proofErr w:type="spellStart"/>
-            <w:r>
-              <w:rPr>
-                <w:rFonts w:ascii="Arial" w:eastAsia="Arial" w:hAnsi="Arial" w:cs="Arial"/>
-                <w:color w:val="000000"/>
-                <w:sz w:val="18"/>
-                <w:szCs w:val="18"/>
-              </w:rPr>
-              <w:t>github</w:t>
-            </w:r>
-            <w:proofErr w:type="spellEnd"/>
-            <w:r>
-              <w:rPr>
-                <w:rFonts w:ascii="Arial" w:eastAsia="Arial" w:hAnsi="Arial" w:cs="Arial"/>
-                <w:color w:val="000000"/>
-                <w:sz w:val="18"/>
-                <w:szCs w:val="18"/>
-              </w:rPr>
-              <w:t>/workflows/</w:t>
-            </w:r>
-            <w:proofErr w:type="spellStart"/>
-            <w:r>
-              <w:rPr>
-                <w:rFonts w:ascii="Arial" w:eastAsia="Arial" w:hAnsi="Arial" w:cs="Arial"/>
-                <w:color w:val="000000"/>
-                <w:sz w:val="18"/>
-                <w:szCs w:val="18"/>
-              </w:rPr>
-              <w:t>ci.yml</w:t>
-            </w:r>
-            <w:proofErr w:type="spellEnd"/>
-            <w:r>
-              <w:rPr>
-                <w:rFonts w:ascii="Arial" w:eastAsia="Arial" w:hAnsi="Arial" w:cs="Arial"/>
-                <w:color w:val="000000"/>
-                <w:sz w:val="18"/>
-                <w:szCs w:val="18"/>
-              </w:rPr>
-              <w:t xml:space="preserve"> with correct </w:t>
-            </w:r>
-            <w:proofErr w:type="spellStart"/>
-            <w:r>
-              <w:rPr>
-                <w:rFonts w:ascii="Arial" w:eastAsia="Arial" w:hAnsi="Arial" w:cs="Arial"/>
-                <w:color w:val="000000"/>
-                <w:sz w:val="18"/>
-                <w:szCs w:val="18"/>
-              </w:rPr>
-              <w:t>pull_request</w:t>
-            </w:r>
-            <w:proofErr w:type="spellEnd"/>
-            <w:r>
-              <w:rPr>
-                <w:rFonts w:ascii="Arial" w:eastAsia="Arial" w:hAnsi="Arial" w:cs="Arial"/>
-                <w:color w:val="000000"/>
-                <w:sz w:val="18"/>
-                <w:szCs w:val="18"/>
-              </w:rPr>
-              <w:t xml:space="preserve"> trigger targeting </w:t>
-            </w:r>
-            <w:r>
-              <w:rPr>
-                <w:rFonts w:ascii="Arial" w:eastAsia="Arial" w:hAnsi="Arial" w:cs="Arial"/>
-                <w:color w:val="000000"/>
-                <w:sz w:val="18"/>
-                <w:szCs w:val="18"/>
-              </w:rPr>
-              <w:t>“develop”</w:t>
-            </w:r>
-          </w:p>
-        </w:tc>
-        <w:tc>
-          <w:tcPr>
-            <w:tcW w:w="2150" w:type="dxa"/>
-            <w:tcBorders>
-              <w:top w:val="single" w:sz="6" w:space="0" w:color="ADB9CA"/>
-              <w:left w:val="single" w:sz="6" w:space="0" w:color="ADB9CA"/>
-              <w:bottom w:val="single" w:sz="6" w:space="0" w:color="ADB9CA"/>
-              <w:right w:val="single" w:sz="6" w:space="0" w:color="ADB9CA"/>
-            </w:tcBorders>
-            <w:shd w:val="clear" w:color="auto" w:fill="E8F0FB"/>
-            <w:tcMar>
-              <w:top w:w="80" w:type="dxa"/>
-              <w:left w:w="140" w:type="dxa"/>
-              <w:bottom w:w="80" w:type="dxa"/>
-              <w:right w:w="140" w:type="dxa"/>
-            </w:tcMar>
-            <w:vAlign w:val="center"/>
-          </w:tcPr>
-          <w:p>
-            <w:r>
-              <w:rPr>
-                <w:rFonts w:ascii="Arial" w:eastAsia="Arial" w:hAnsi="Arial" w:cs="Arial"/>
-                <w:color w:val="000000"/>
-                <w:sz w:val="18"/>
-                <w:szCs w:val="18"/>
-              </w:rPr>
-              <w:t>07</w:t>
-            </w:r>
-          </w:p>
-        </w:tc>
-      </w:tr>
-      <w:tr>
-        <w:tc>
-          <w:tcPr>
-            <w:tcW w:w="700" w:type="dxa"/>
-            <w:tcBorders>
-              <w:top w:val="single" w:sz="6" w:space="0" w:color="ADB9CA"/>
-              <w:left w:val="single" w:sz="6" w:space="0" w:color="ADB9CA"/>
-              <w:bottom w:val="single" w:sz="6" w:space="0" w:color="ADB9CA"/>
-              <w:right w:val="single" w:sz="6" w:space="0" w:color="ADB9CA"/>
-            </w:tcBorders>
-            <w:shd w:val="clear" w:color="auto" w:fill="FFFFFF"/>
-            <w:tcMar>
-              <w:top w:w="80" w:type="dxa"/>
-              <w:left w:w="140" w:type="dxa"/>
-              <w:bottom w:w="80" w:type="dxa"/>
-              <w:right w:w="140" w:type="dxa"/>
-            </w:tcMar>
-            <w:vAlign w:val="center"/>
-          </w:tcPr>
-          <w:p>
-            <w:r>
-              <w:rPr>
-                <w:rFonts w:ascii="Arial" w:eastAsia="Arial" w:hAnsi="Arial" w:cs="Arial"/>
-                <w:b/>
-                <w:bCs/>
-                <w:color w:val="000000"/>
-                <w:sz w:val="18"/>
-                <w:szCs w:val="18"/>
-              </w:rPr>
-              <w:t>10</w:t>
-            </w:r>
-          </w:p>
-        </w:tc>
-        <w:tc>
-          <w:tcPr>
-            <w:tcW w:w="6510" w:type="dxa"/>
-            <w:tcBorders>
-              <w:top w:val="single" w:sz="6" w:space="0" w:color="ADB9CA"/>
-              <w:left w:val="single" w:sz="6" w:space="0" w:color="ADB9CA"/>
-              <w:bottom w:val="single" w:sz="6" w:space="0" w:color="ADB9CA"/>
-              <w:right w:val="single" w:sz="6" w:space="0" w:color="ADB9CA"/>
-            </w:tcBorders>
-            <w:shd w:val="clear" w:color="auto" w:fill="FFFFFF"/>
-            <w:tcMar>
-              <w:top w:w="80" w:type="dxa"/>
-              <w:left w:w="140" w:type="dxa"/>
-              <w:bottom w:w="80" w:type="dxa"/>
-              <w:right w:w="140" w:type="dxa"/>
-            </w:tcMar>
-            <w:vAlign w:val="center"/>
-          </w:tcPr>
-          <w:p>
-            <w:r>
-              <w:rPr>
-                <w:rFonts w:ascii="Arial" w:eastAsia="Arial" w:hAnsi="Arial" w:cs="Arial"/>
-                <w:color w:val="000000"/>
-                <w:sz w:val="18"/>
-                <w:szCs w:val="18"/>
-              </w:rPr>
-              <w:t>Checkout code, login to Docker Hub using Team Lead's repository secrets</w:t>
-            </w:r>
-          </w:p>
-        </w:tc>
-        <w:tc>
-          <w:tcPr>
-            <w:tcW w:w="2150" w:type="dxa"/>
-            <w:tcBorders>
-              <w:top w:val="single" w:sz="6" w:space="0" w:color="ADB9CA"/>
-              <w:left w:val="single" w:sz="6" w:space="0" w:color="ADB9CA"/>
-              <w:bottom w:val="single" w:sz="6" w:space="0" w:color="ADB9CA"/>
-              <w:right w:val="single" w:sz="6" w:space="0" w:color="ADB9CA"/>
-            </w:tcBorders>
-            <w:shd w:val="clear" w:color="auto" w:fill="FFFFFF"/>
-            <w:tcMar>
-              <w:top w:w="80" w:type="dxa"/>
-              <w:left w:w="140" w:type="dxa"/>
-              <w:bottom w:w="80" w:type="dxa"/>
-              <w:right w:w="140" w:type="dxa"/>
-            </w:tcMar>
-            <w:vAlign w:val="center"/>
-          </w:tcPr>
-          <w:p>
-            <w:r>
-              <w:rPr>
-                <w:rFonts w:ascii="Arial" w:eastAsia="Arial" w:hAnsi="Arial" w:cs="Arial"/>
-                <w:color w:val="000000"/>
-                <w:sz w:val="18"/>
-                <w:szCs w:val="18"/>
-              </w:rPr>
-              <w:t>06</w:t>
-            </w:r>
-          </w:p>
-        </w:tc>
-      </w:tr>
-      <w:tr>
-        <w:tc>
-          <w:tcPr>
-            <w:tcW w:w="700" w:type="dxa"/>
-            <w:tcBorders>
-              <w:top w:val="single" w:sz="6" w:space="0" w:color="ADB9CA"/>
-              <w:left w:val="single" w:sz="6" w:space="0" w:color="ADB9CA"/>
-              <w:bottom w:val="single" w:sz="6" w:space="0" w:color="ADB9CA"/>
-              <w:right w:val="single" w:sz="6" w:space="0" w:color="ADB9CA"/>
-            </w:tcBorders>
-            <w:shd w:val="clear" w:color="auto" w:fill="E8F0FB"/>
-            <w:tcMar>
-              <w:top w:w="80" w:type="dxa"/>
-              <w:left w:w="140" w:type="dxa"/>
-              <w:bottom w:w="80" w:type="dxa"/>
-              <w:right w:w="140" w:type="dxa"/>
-            </w:tcMar>
-            <w:vAlign w:val="center"/>
-          </w:tcPr>
-          <w:p>
-            <w:r>
-              <w:rPr>
-                <w:rFonts w:ascii="Arial" w:eastAsia="Arial" w:hAnsi="Arial" w:cs="Arial"/>
-                <w:b/>
-                <w:bCs/>
-                <w:color w:val="000000"/>
-                <w:sz w:val="18"/>
-                <w:szCs w:val="18"/>
-              </w:rPr>
-              <w:t>11</w:t>
-            </w:r>
-          </w:p>
-        </w:tc>
-        <w:tc>
-          <w:tcPr>
-            <w:tcW w:w="6510" w:type="dxa"/>
-            <w:tcBorders>
-              <w:top w:val="single" w:sz="6" w:space="0" w:color="ADB9CA"/>
-              <w:left w:val="single" w:sz="6" w:space="0" w:color="ADB9CA"/>
-              <w:bottom w:val="single" w:sz="6" w:space="0" w:color="ADB9CA"/>
-              <w:right w:val="single" w:sz="6" w:space="0" w:color="ADB9CA"/>
-            </w:tcBorders>
-            <w:shd w:val="clear" w:color="auto" w:fill="E8F0FB"/>
-            <w:tcMar>
-              <w:top w:w="80" w:type="dxa"/>
-              <w:left w:w="140" w:type="dxa"/>
-              <w:bottom w:w="80" w:type="dxa"/>
-              <w:right w:w="140" w:type="dxa"/>
-            </w:tcMar>
-            <w:vAlign w:val="center"/>
-          </w:tcPr>
-          <w:p>
-            <w:r>
-              <w:rPr>
-                <w:rFonts w:ascii="Arial" w:eastAsia="Arial" w:hAnsi="Arial" w:cs="Arial"/>
-                <w:color w:val="000000"/>
-                <w:sz w:val="18"/>
-                <w:szCs w:val="18"/>
-              </w:rPr>
-              <w:t>Build Docker image and tag correctly (latest and/or commit SHA)</w:t>
-            </w:r>
-          </w:p>
-        </w:tc>
-        <w:tc>
-          <w:tcPr>
-            <w:tcW w:w="2150" w:type="dxa"/>
-            <w:tcBorders>
-              <w:top w:val="single" w:sz="6" w:space="0" w:color="ADB9CA"/>
-              <w:left w:val="single" w:sz="6" w:space="0" w:color="ADB9CA"/>
-              <w:bottom w:val="single" w:sz="6" w:space="0" w:color="ADB9CA"/>
-              <w:right w:val="single" w:sz="6" w:space="0" w:color="ADB9CA"/>
-            </w:tcBorders>
-            <w:shd w:val="clear" w:color="auto" w:fill="E8F0FB"/>
-            <w:tcMar>
-              <w:top w:w="80" w:type="dxa"/>
-              <w:left w:w="140" w:type="dxa"/>
-              <w:bottom w:w="80" w:type="dxa"/>
-              <w:right w:w="140" w:type="dxa"/>
-            </w:tcMar>
-            <w:vAlign w:val="center"/>
-          </w:tcPr>
-          <w:p>
-            <w:r>
-              <w:rPr>
-                <w:rFonts w:ascii="Arial" w:eastAsia="Arial" w:hAnsi="Arial" w:cs="Arial"/>
-                <w:color w:val="000000"/>
-                <w:sz w:val="18"/>
-                <w:szCs w:val="18"/>
-              </w:rPr>
-              <w:t>06</w:t>
-            </w:r>
-          </w:p>
-        </w:tc>
-      </w:tr>
-      <w:tr>
-        <w:tc>
-          <w:tcPr>
-            <w:tcW w:w="700" w:type="dxa"/>
-            <w:tcBorders>
-              <w:top w:val="single" w:sz="6" w:space="0" w:color="ADB9CA"/>
-              <w:left w:val="single" w:sz="6" w:space="0" w:color="ADB9CA"/>
-              <w:bottom w:val="single" w:sz="6" w:space="0" w:color="ADB9CA"/>
-              <w:right w:val="single" w:sz="6" w:space="0" w:color="ADB9CA"/>
-            </w:tcBorders>
-            <w:shd w:val="clear" w:color="auto" w:fill="FFFFFF"/>
-            <w:tcMar>
-              <w:top w:w="80" w:type="dxa"/>
-              <w:left w:w="140" w:type="dxa"/>
-              <w:bottom w:w="80" w:type="dxa"/>
-              <w:right w:w="140" w:type="dxa"/>
-            </w:tcMar>
-            <w:vAlign w:val="center"/>
-          </w:tcPr>
-          <w:p>
-            <w:r>
-              <w:rPr>
-                <w:rFonts w:ascii="Arial" w:eastAsia="Arial" w:hAnsi="Arial" w:cs="Arial"/>
-                <w:b/>
-                <w:bCs/>
-                <w:color w:val="000000"/>
-                <w:sz w:val="18"/>
-                <w:szCs w:val="18"/>
-              </w:rPr>
-              <w:t>12</w:t>
-            </w:r>
-          </w:p>
-        </w:tc>
-        <w:tc>
-          <w:tcPr>
-            <w:tcW w:w="6510" w:type="dxa"/>
-            <w:tcBorders>
-              <w:top w:val="single" w:sz="6" w:space="0" w:color="ADB9CA"/>
-              <w:left w:val="single" w:sz="6" w:space="0" w:color="ADB9CA"/>
-              <w:bottom w:val="single" w:sz="6" w:space="0" w:color="ADB9CA"/>
-              <w:right w:val="single" w:sz="6" w:space="0" w:color="ADB9CA"/>
-            </w:tcBorders>
-            <w:shd w:val="clear" w:color="auto" w:fill="FFFFFF"/>
-            <w:tcMar>
-              <w:top w:w="80" w:type="dxa"/>
-              <w:left w:w="140" w:type="dxa"/>
-              <w:bottom w:w="80" w:type="dxa"/>
-              <w:right w:w="140" w:type="dxa"/>
-            </w:tcMar>
-            <w:vAlign w:val="center"/>
-          </w:tcPr>
-          <w:p>
-            <w:r>
-              <w:rPr>
-                <w:rFonts w:ascii="Arial" w:eastAsia="Arial" w:hAnsi="Arial" w:cs="Arial"/>
-                <w:color w:val="000000"/>
-                <w:sz w:val="18"/>
-                <w:szCs w:val="18"/>
-              </w:rPr>
-              <w:t>Push image to Docker Hub successfully; workflow exits on any step failure</w:t>
-            </w:r>
-          </w:p>
-        </w:tc>
-        <w:tc>
-          <w:tcPr>
-            <w:tcW w:w="2150" w:type="dxa"/>
-            <w:tcBorders>
-              <w:top w:val="single" w:sz="6" w:space="0" w:color="ADB9CA"/>
-              <w:left w:val="single" w:sz="6" w:space="0" w:color="ADB9CA"/>
-              <w:bottom w:val="single" w:sz="6" w:space="0" w:color="ADB9CA"/>
-              <w:right w:val="single" w:sz="6" w:space="0" w:color="ADB9CA"/>
-            </w:tcBorders>
-            <w:shd w:val="clear" w:color="auto" w:fill="FFFFFF"/>
-            <w:tcMar>
-              <w:top w:w="80" w:type="dxa"/>
-              <w:left w:w="140" w:type="dxa"/>
-              <w:bottom w:w="80" w:type="dxa"/>
-              <w:right w:w="140" w:type="dxa"/>
-            </w:tcMar>
-            <w:vAlign w:val="center"/>
-          </w:tcPr>
-          <w:p>
-            <w:r>
-              <w:rPr>
-                <w:rFonts w:ascii="Arial" w:eastAsia="Arial" w:hAnsi="Arial" w:cs="Arial"/>
-                <w:color w:val="000000"/>
-                <w:sz w:val="18"/>
-                <w:szCs w:val="18"/>
-              </w:rPr>
-              <w:t>06</w:t>
-            </w:r>
-          </w:p>
-        </w:tc>
-      </w:tr>
-      <w:tr>
-        <w:tc>
-          <w:tcPr>
-            <w:tcW w:w="700" w:type="dxa"/>
-            <w:tcBorders>
-              <w:top w:val="single" w:sz="6" w:space="0" w:color="ADB9CA"/>
-              <w:left w:val="single" w:sz="6" w:space="0" w:color="ADB9CA"/>
-              <w:bottom w:val="single" w:sz="6" w:space="0" w:color="ADB9CA"/>
-              <w:right w:val="single" w:sz="6" w:space="0" w:color="ADB9CA"/>
-            </w:tcBorders>
-            <w:shd w:val="clear" w:color="auto" w:fill="2E75B6"/>
-            <w:tcMar>
-              <w:top w:w="80" w:type="dxa"/>
-              <w:left w:w="140" w:type="dxa"/>
-              <w:bottom w:w="80" w:type="dxa"/>
-              <w:right w:w="140" w:type="dxa"/>
-            </w:tcMar>
-            <w:vAlign w:val="center"/>
-          </w:tcPr>
-          <w:p/>
-        </w:tc>
-        <w:tc>
-          <w:tcPr>
-            <w:tcW w:w="6510" w:type="dxa"/>
-            <w:tcBorders>
-              <w:top w:val="single" w:sz="6" w:space="0" w:color="ADB9CA"/>
-              <w:left w:val="single" w:sz="6" w:space="0" w:color="ADB9CA"/>
-              <w:bottom w:val="single" w:sz="6" w:space="0" w:color="ADB9CA"/>
-              <w:right w:val="single" w:sz="6" w:space="0" w:color="ADB9CA"/>
-            </w:tcBorders>
-            <w:shd w:val="clear" w:color="auto" w:fill="2E75B6"/>
-            <w:tcMar>
-              <w:top w:w="80" w:type="dxa"/>
-              <w:left w:w="140" w:type="dxa"/>
-              <w:bottom w:w="80" w:type="dxa"/>
-              <w:right w:w="140" w:type="dxa"/>
-            </w:tcMar>
-            <w:vAlign w:val="center"/>
-          </w:tcPr>
-          <w:p>
-            <w:r>
-              <w:rPr>
-                <w:rFonts w:ascii="Arial" w:eastAsia="Arial" w:hAnsi="Arial" w:cs="Arial"/>
-                <w:b/>
-                <w:bCs/>
-                <w:color w:val="FFFFFF"/>
-                <w:sz w:val="18"/>
-                <w:szCs w:val="18"/>
-              </w:rPr>
-              <w:t>CD Pipeline – Automated Deployment to Render (</w:t>
-            </w:r>
-            <w:proofErr w:type="spellStart"/>
-            <w:r>
-              <w:rPr>
-                <w:rFonts w:ascii="Arial" w:eastAsia="Arial" w:hAnsi="Arial" w:cs="Arial"/>
-                <w:b/>
-                <w:bCs/>
-                <w:color w:val="FFFFFF"/>
-                <w:sz w:val="18"/>
-                <w:szCs w:val="18"/>
-              </w:rPr>
-              <w:t>cd.yml</w:t>
-            </w:r>
-            <w:proofErr w:type="spellEnd"/>
-            <w:r>
-              <w:rPr>
-                <w:rFonts w:ascii="Arial" w:eastAsia="Arial" w:hAnsi="Arial" w:cs="Arial"/>
-                <w:b/>
-                <w:bCs/>
-                <w:color w:val="FFFFFF"/>
-                <w:sz w:val="18"/>
-                <w:szCs w:val="18"/>
-              </w:rPr>
-              <w:t>)</w:t>
-            </w:r>
-          </w:p>
-        </w:tc>
-        <w:tc>
-          <w:tcPr>
-            <w:tcW w:w="2150" w:type="dxa"/>
-            <w:tcBorders>
-              <w:top w:val="single" w:sz="6" w:space="0" w:color="ADB9CA"/>
-              <w:left w:val="single" w:sz="6" w:space="0" w:color="ADB9CA"/>
-              <w:bottom w:val="single" w:sz="6" w:space="0" w:color="ADB9CA"/>
-              <w:right w:val="single" w:sz="6" w:space="0" w:color="ADB9CA"/>
-            </w:tcBorders>
-            <w:shd w:val="clear" w:color="auto" w:fill="2E75B6"/>
-            <w:tcMar>
-              <w:top w:w="80" w:type="dxa"/>
-              <w:left w:w="140" w:type="dxa"/>
-              <w:bottom w:w="80" w:type="dxa"/>
-              <w:right w:w="140" w:type="dxa"/>
-            </w:tcMar>
-            <w:vAlign w:val="center"/>
-          </w:tcPr>
-          <w:p>
-            <w:r>
-              <w:rPr>
-                <w:rFonts w:ascii="Arial" w:eastAsia="Arial" w:hAnsi="Arial" w:cs="Arial"/>
-                <w:b/>
-                <w:bCs/>
-                <w:color w:val="FFFFFF"/>
-                <w:sz w:val="18"/>
-                <w:szCs w:val="18"/>
-              </w:rPr>
-              <w:t>20 Marks</w:t>
-            </w:r>
-          </w:p>
-        </w:tc>
-      </w:tr>
-      <w:tr>
-        <w:tc>
-          <w:tcPr>
-            <w:tcW w:w="700" w:type="dxa"/>
-            <w:tcBorders>
-              <w:top w:val="single" w:sz="6" w:space="0" w:color="ADB9CA"/>
-              <w:left w:val="single" w:sz="6" w:space="0" w:color="ADB9CA"/>
-              <w:bottom w:val="single" w:sz="6" w:space="0" w:color="ADB9CA"/>
-              <w:right w:val="single" w:sz="6" w:space="0" w:color="ADB9CA"/>
-            </w:tcBorders>
-            <w:shd w:val="clear" w:color="auto" w:fill="E8F0FB"/>
-            <w:tcMar>
-              <w:top w:w="80" w:type="dxa"/>
-              <w:left w:w="140" w:type="dxa"/>
-              <w:bottom w:w="80" w:type="dxa"/>
-              <w:right w:w="140" w:type="dxa"/>
-            </w:tcMar>
-            <w:vAlign w:val="center"/>
-          </w:tcPr>
-          <w:p>
-            <w:r>
-              <w:rPr>
-                <w:rFonts w:ascii="Arial" w:eastAsia="Arial" w:hAnsi="Arial" w:cs="Arial"/>
-                <w:b/>
-                <w:bCs/>
-                <w:color w:val="000000"/>
-                <w:sz w:val="18"/>
-                <w:szCs w:val="18"/>
-              </w:rPr>
-              <w:t>13</w:t>
-            </w:r>
-          </w:p>
-        </w:tc>
-        <w:tc>
-          <w:tcPr>
-            <w:tcW w:w="6510" w:type="dxa"/>
-            <w:tcBorders>
-              <w:top w:val="single" w:sz="6" w:space="0" w:color="ADB9CA"/>
-              <w:left w:val="single" w:sz="6" w:space="0" w:color="ADB9CA"/>
-              <w:bottom w:val="single" w:sz="6" w:space="0" w:color="ADB9CA"/>
-              <w:right w:val="single" w:sz="6" w:space="0" w:color="ADB9CA"/>
-            </w:tcBorders>
-            <w:shd w:val="clear" w:color="auto" w:fill="E8F0FB"/>
-            <w:tcMar>
-              <w:top w:w="80" w:type="dxa"/>
-              <w:left w:w="140" w:type="dxa"/>
-              <w:bottom w:w="80" w:type="dxa"/>
-              <w:right w:w="140" w:type="dxa"/>
-            </w:tcMar>
-            <w:vAlign w:val="center"/>
-          </w:tcPr>
-          <w:p>
-            <w:r>
-              <w:rPr>
-                <w:rFonts w:ascii="Arial" w:eastAsia="Arial" w:hAnsi="Arial" w:cs="Arial"/>
-                <w:color w:val="000000"/>
-                <w:sz w:val="18"/>
-                <w:szCs w:val="18"/>
-              </w:rPr>
-              <w:t>CD workflow file created at .</w:t>
-            </w:r>
-            <w:proofErr w:type="spellStart"/>
-            <w:r>
-              <w:rPr>
-                <w:rFonts w:ascii="Arial" w:eastAsia="Arial" w:hAnsi="Arial" w:cs="Arial"/>
-                <w:color w:val="000000"/>
-                <w:sz w:val="18"/>
-                <w:szCs w:val="18"/>
-              </w:rPr>
-              <w:t>github</w:t>
-            </w:r>
-            <w:proofErr w:type="spellEnd"/>
-            <w:r>
-              <w:rPr>
-                <w:rFonts w:ascii="Arial" w:eastAsia="Arial" w:hAnsi="Arial" w:cs="Arial"/>
-                <w:color w:val="000000"/>
-                <w:sz w:val="18"/>
-                <w:szCs w:val="18"/>
-              </w:rPr>
-              <w:t>/workflows/</w:t>
-            </w:r>
-            <w:proofErr w:type="spellStart"/>
-            <w:r>
-              <w:rPr>
-                <w:rFonts w:ascii="Arial" w:eastAsia="Arial" w:hAnsi="Arial" w:cs="Arial"/>
-                <w:color w:val="000000"/>
-                <w:sz w:val="18"/>
-                <w:szCs w:val="18"/>
-              </w:rPr>
-              <w:t>cd.yml</w:t>
-            </w:r>
-            <w:proofErr w:type="spellEnd"/>
-            <w:r>
-              <w:rPr>
-                <w:rFonts w:ascii="Arial" w:eastAsia="Arial" w:hAnsi="Arial" w:cs="Arial"/>
-                <w:color w:val="000000"/>
-                <w:sz w:val="18"/>
-                <w:szCs w:val="18"/>
-              </w:rPr>
-              <w:t xml:space="preserve"> with correct push trigger on </w:t>
+              <w:t xml:space="preserve">CD workflow file created at .github/workflows/cd.yml with correct push trigger on </w:t>
             </w:r>
             <w:r>
               <w:rPr>
@@ -9610,15 +8485,7 @@
           <w:rFonts w:ascii="Arial" w:eastAsia="Arial" w:hAnsi="Arial" w:cs="Arial"/>
           <w:color w:val="000000"/>
         </w:rPr>
-        <w:t xml:space="preserve">Screenshot 2: Each member's CI workflow run triggered by their individual </w:t>
-      </w:r>
-      <w:proofErr w:type="gramStart"/>
-      <w:r>
-        <w:rPr>
-          <w:rFonts w:ascii="Arial" w:eastAsia="Arial" w:hAnsi="Arial" w:cs="Arial"/>
-          <w:color w:val="000000"/>
-        </w:rPr>
-        <w:t xml:space="preserve">PR </w:t>
+        <w:t xml:space="preserve">Screenshot 2: Each member's CI workflow run triggered by their individual PR </w:t>
       </w:r>
       <w:r>
         <w:rPr>
@@ -9627,7 +8494,6 @@
         </w:rPr>
         <w:t>,</w:t>
       </w:r>
-      <w:proofErr w:type="gramEnd"/>
       <w:r>
         <w:rPr>
           <w:rFonts w:ascii="Arial" w:eastAsia="Arial" w:hAnsi="Arial" w:cs="Arial"/>
@@ -9674,15 +8540,7 @@
           <w:rFonts w:ascii="Arial" w:eastAsia="Arial" w:hAnsi="Arial" w:cs="Arial"/>
           <w:color w:val="000000"/>
         </w:rPr>
-        <w:t>“develop</w:t>
-      </w:r>
-      <w:proofErr w:type="gramStart"/>
-      <w:r>
-        <w:rPr>
-          <w:rFonts w:ascii="Arial" w:eastAsia="Arial" w:hAnsi="Arial" w:cs="Arial"/>
-          <w:color w:val="000000"/>
-        </w:rPr>
-        <w:t>”</w:t>
+        <w:t>“develop”</w:t>
       </w:r>
       <w:r>
         <w:rPr>
@@ -9698,7 +8556,6 @@
         </w:rPr>
         <w:t>,</w:t>
       </w:r>
-      <w:proofErr w:type="gramEnd"/>
       <w:r>
         <w:rPr>
           <w:rFonts w:ascii="Arial" w:eastAsia="Arial" w:hAnsi="Arial" w:cs="Arial"/>
@@ -9721,23 +8578,7 @@
           <w:rFonts w:ascii="Arial" w:eastAsia="Arial" w:hAnsi="Arial" w:cs="Arial"/>
           <w:color w:val="000000"/>
         </w:rPr>
-        <w:t xml:space="preserve">Screenshot 5: Live </w:t>
-      </w:r>
-      <w:proofErr w:type="spellStart"/>
-      <w:r>
-        <w:rPr>
-          <w:rFonts w:ascii="Arial" w:eastAsia="Arial" w:hAnsi="Arial" w:cs="Arial"/>
-          <w:color w:val="000000"/>
-        </w:rPr>
-        <w:t>TaskFlow</w:t>
-      </w:r>
-      <w:proofErr w:type="spellEnd"/>
-      <w:r>
-        <w:rPr>
-          <w:rFonts w:ascii="Arial" w:eastAsia="Arial" w:hAnsi="Arial" w:cs="Arial"/>
-          <w:color w:val="000000"/>
-        </w:rPr>
-        <w:t xml:space="preserve"> application on Render showing all five pages are accessible.</w:t>
+        <w:t>Screenshot 5: Live TaskFlow application on Render showing all five pages are accessible.</w:t>
       </w:r>
     </w:p>
     <w:p>
@@ -9978,7 +8819,7 @@
                 <w:noProof/>
               </w:rPr>
               <w:drawing>
-                <wp:inline distT="0" distB="0" distL="0" distR="0" wp14:anchorId="587F5B66" wp14:editId="77B02B6C">
+                <wp:inline distT="0" distB="0" distL="0" distR="0" wp14:anchorId="587F5B66" wp14:editId="1A7C80A4">
                   <wp:extent cx="6400800" cy="3467100"/>
                   <wp:effectExtent l="0" t="0" r="0" b="0"/>
                   <wp:docPr id="607527398" name="Picture 1"/>
@@ -10086,7 +8927,7 @@
                 <w:noProof/>
               </w:rPr>
               <w:drawing>
-                <wp:inline distT="0" distB="0" distL="0" distR="0" wp14:anchorId="61246B12" wp14:editId="4E32388C">
+                <wp:inline distT="0" distB="0" distL="0" distR="0" wp14:anchorId="61246B12" wp14:editId="080A9ED8">
                   <wp:extent cx="6400800" cy="3467100"/>
                   <wp:effectExtent l="0" t="0" r="0" b="0"/>
                   <wp:docPr id="285168914" name="Picture 2"/>
@@ -10195,7 +9036,7 @@
                 <w:noProof/>
               </w:rPr>
               <w:drawing>
-                <wp:inline distT="0" distB="0" distL="0" distR="0" wp14:anchorId="18692249" wp14:editId="44AD7A1B">
+                <wp:inline distT="0" distB="0" distL="0" distR="0" wp14:anchorId="18692249" wp14:editId="6ECB4B0A">
                   <wp:extent cx="6400800" cy="3467100"/>
                   <wp:effectExtent l="0" t="0" r="0" b="0"/>
                   <wp:docPr id="2075862516" name="Picture 3"/>
@@ -10314,7 +9155,7 @@
                 <w:noProof/>
               </w:rPr>
               <w:drawing>
-                <wp:inline distT="0" distB="0" distL="0" distR="0" wp14:anchorId="0880EF15" wp14:editId="07AAF609">
+                <wp:inline distT="0" distB="0" distL="0" distR="0" wp14:anchorId="0880EF15" wp14:editId="3996F1E9">
                   <wp:extent cx="6400800" cy="3467100"/>
                   <wp:effectExtent l="0" t="0" r="0" b="0"/>
                   <wp:docPr id="175212615" name="Picture 4"/>
@@ -10395,31 +9236,7 @@
                 <w:szCs w:val="18"/>
               </w:rPr>
               <w:lastRenderedPageBreak/>
-              <w:t xml:space="preserve">Live </w:t>
-            </w:r>
-            <w:proofErr w:type="spellStart"/>
-            <w:r>
-              <w:rPr>
-                <w:rFonts w:ascii="Arial" w:eastAsia="Arial" w:hAnsi="Arial" w:cs="Arial"/>
-                <w:b/>
-                <w:bCs/>
-                <w:color w:val="000000"/>
-                <w:sz w:val="18"/>
-                <w:szCs w:val="18"/>
-              </w:rPr>
-              <w:t>TaskFlow</w:t>
-            </w:r>
-            <w:proofErr w:type="spellEnd"/>
-            <w:r>
-              <w:rPr>
-                <w:rFonts w:ascii="Arial" w:eastAsia="Arial" w:hAnsi="Arial" w:cs="Arial"/>
-                <w:b/>
-                <w:bCs/>
-                <w:color w:val="000000"/>
-                <w:sz w:val="18"/>
-                <w:szCs w:val="18"/>
-              </w:rPr>
-              <w:t xml:space="preserve"> on Render – All 5 Pages Accessible</w:t>
+              <w:t>Live TaskFlow on Render – All 5 Pages Accessible</w:t>
             </w:r>
           </w:p>
         </w:tc>
@@ -10447,7 +9264,7 @@
                 <w:noProof/>
               </w:rPr>
               <w:drawing>
-                <wp:inline distT="0" distB="0" distL="0" distR="0" wp14:anchorId="259E2E1E" wp14:editId="3D29CD04">
+                <wp:inline distT="0" distB="0" distL="0" distR="0" wp14:anchorId="259E2E1E" wp14:editId="745D47C3">
                   <wp:extent cx="6400800" cy="3467100"/>
                   <wp:effectExtent l="0" t="0" r="0" b="0"/>
                   <wp:docPr id="939400828" name="Picture 5"/>
@@ -10555,7 +9372,7 @@
                 <w:noProof/>
               </w:rPr>
               <w:drawing>
-                <wp:inline distT="0" distB="0" distL="0" distR="0" wp14:anchorId="370E1664" wp14:editId="4957822D">
+                <wp:inline distT="0" distB="0" distL="0" distR="0" wp14:anchorId="370E1664" wp14:editId="1861A0AA">
                   <wp:extent cx="6400800" cy="3467100"/>
                   <wp:effectExtent l="0" t="0" r="0" b="0"/>
                   <wp:docPr id="828877718" name="Picture 6"/>
@@ -10710,27 +9527,7 @@
           <w:bCs/>
           <w:color w:val="000000"/>
         </w:rPr>
-        <w:t xml:space="preserve">Member </w:t>
-      </w:r>
-      <w:proofErr w:type="gramStart"/>
-      <w:r>
-        <w:rPr>
-          <w:rFonts w:ascii="Arial" w:eastAsia="Arial" w:hAnsi="Arial" w:cs="Arial"/>
-          <w:b/>
-          <w:bCs/>
-          <w:color w:val="000000"/>
-        </w:rPr>
-        <w:t>1  (</w:t>
-      </w:r>
-      <w:proofErr w:type="gramEnd"/>
-      <w:r>
-        <w:rPr>
-          <w:rFonts w:ascii="Arial" w:eastAsia="Arial" w:hAnsi="Arial" w:cs="Arial"/>
-          <w:b/>
-          <w:bCs/>
-          <w:color w:val="000000"/>
-        </w:rPr>
-        <w:t xml:space="preserve">Name: </w:t>
+        <w:t xml:space="preserve">Member 1  (Name: </w:t>
       </w:r>
       <w:r>
         <w:rPr>
@@ -10834,13 +9631,8 @@
             <w:vAlign w:val="center"/>
           </w:tcPr>
           <w:p>
-            <w:proofErr w:type="gramStart"/>
-            <w:r>
-              <w:t>Overall</w:t>
-            </w:r>
-            <w:proofErr w:type="gramEnd"/>
-            <w:r>
-              <w:t xml:space="preserve"> this assignment deepened my understanding of DevOps practices and the importance of structured branching strategies in team projects.</w:t>
+            <w:r>
+              <w:t>Overall this assignment deepened my understanding of DevOps practices and the importance of structured branching strategies in team projects.</w:t>
             </w:r>
           </w:p>
         </w:tc>
@@ -10863,27 +9655,7 @@
           <w:bCs/>
           <w:color w:val="000000"/>
         </w:rPr>
-        <w:t xml:space="preserve">Member </w:t>
-      </w:r>
-      <w:proofErr w:type="gramStart"/>
-      <w:r>
-        <w:rPr>
-          <w:rFonts w:ascii="Arial" w:eastAsia="Arial" w:hAnsi="Arial" w:cs="Arial"/>
-          <w:b/>
-          <w:bCs/>
-          <w:color w:val="000000"/>
-        </w:rPr>
-        <w:t>2  (</w:t>
-      </w:r>
-      <w:proofErr w:type="gramEnd"/>
-      <w:r>
-        <w:rPr>
-          <w:rFonts w:ascii="Arial" w:eastAsia="Arial" w:hAnsi="Arial" w:cs="Arial"/>
-          <w:b/>
-          <w:bCs/>
-          <w:color w:val="000000"/>
-        </w:rPr>
-        <w:t xml:space="preserve">Name: </w:t>
+        <w:t xml:space="preserve">Member 2  (Name: </w:t>
       </w:r>
       <w:r>
         <w:rPr>
@@ -11011,27 +9783,7 @@
           <w:bCs/>
           <w:color w:val="000000"/>
         </w:rPr>
-        <w:t xml:space="preserve">Member </w:t>
-      </w:r>
-      <w:proofErr w:type="gramStart"/>
-      <w:r>
-        <w:rPr>
-          <w:rFonts w:ascii="Arial" w:eastAsia="Arial" w:hAnsi="Arial" w:cs="Arial"/>
-          <w:b/>
-          <w:bCs/>
-          <w:color w:val="000000"/>
-        </w:rPr>
-        <w:t>3  (</w:t>
-      </w:r>
-      <w:proofErr w:type="gramEnd"/>
-      <w:r>
-        <w:rPr>
-          <w:rFonts w:ascii="Arial" w:eastAsia="Arial" w:hAnsi="Arial" w:cs="Arial"/>
-          <w:b/>
-          <w:bCs/>
-          <w:color w:val="000000"/>
-        </w:rPr>
-        <w:t xml:space="preserve">Name: </w:t>
+        <w:t xml:space="preserve">Member 3  (Name: </w:t>
       </w:r>
       <w:r>
         <w:rPr>
@@ -11110,15 +9862,7 @@
           </w:tcPr>
           <w:p>
             <w:r>
-              <w:t xml:space="preserve">I understood how CI automatically builds a Docker image when </w:t>
-            </w:r>
-            <w:proofErr w:type="gramStart"/>
-            <w:r>
-              <w:t>a PR targets</w:t>
-            </w:r>
-            <w:proofErr w:type="gramEnd"/>
-            <w:r>
-              <w:t xml:space="preserve"> develop. </w:t>
+              <w:t xml:space="preserve">I understood how CI automatically builds a Docker image when a PR targets develop. </w:t>
             </w:r>
           </w:p>
         </w:tc>
@@ -11167,27 +9911,7 @@
           <w:bCs/>
           <w:color w:val="000000"/>
         </w:rPr>
-        <w:t xml:space="preserve">Member </w:t>
-      </w:r>
-      <w:proofErr w:type="gramStart"/>
-      <w:r>
-        <w:rPr>
-          <w:rFonts w:ascii="Arial" w:eastAsia="Arial" w:hAnsi="Arial" w:cs="Arial"/>
-          <w:b/>
-          <w:bCs/>
-          <w:color w:val="000000"/>
-        </w:rPr>
-        <w:t>4  (</w:t>
-      </w:r>
-      <w:proofErr w:type="gramEnd"/>
-      <w:r>
-        <w:rPr>
-          <w:rFonts w:ascii="Arial" w:eastAsia="Arial" w:hAnsi="Arial" w:cs="Arial"/>
-          <w:b/>
-          <w:bCs/>
-          <w:color w:val="000000"/>
-        </w:rPr>
-        <w:t>Name: Muhammad Asfand Yar Haider)</w:t>
+        <w:t>Member 4  (Name: Muhammad Asfand Yar Haider)</w:t>
       </w:r>
     </w:p>
     <w:tbl>
@@ -11257,15 +9981,7 @@
           </w:tcPr>
           <w:p>
             <w:r>
-              <w:t xml:space="preserve">I built the Task Detail page and connected it with the shared </w:t>
-            </w:r>
-            <w:proofErr w:type="spellStart"/>
-            <w:r>
-              <w:t>TaskFlow</w:t>
-            </w:r>
-            <w:proofErr w:type="spellEnd"/>
-            <w:r>
-              <w:t xml:space="preserve"> navigation and stylesheet.</w:t>
+              <w:t>I built the Task Detail page and connected it with the shared TaskFlow navigation and stylesheet.</w:t>
             </w:r>
           </w:p>
         </w:tc>
@@ -11317,27 +10033,7 @@
           <w:bCs/>
           <w:color w:val="000000"/>
         </w:rPr>
-        <w:t xml:space="preserve">Member </w:t>
-      </w:r>
-      <w:proofErr w:type="gramStart"/>
-      <w:r>
-        <w:rPr>
-          <w:rFonts w:ascii="Arial" w:eastAsia="Arial" w:hAnsi="Arial" w:cs="Arial"/>
-          <w:b/>
-          <w:bCs/>
-          <w:color w:val="000000"/>
-        </w:rPr>
-        <w:t>5  (</w:t>
-      </w:r>
-      <w:proofErr w:type="gramEnd"/>
-      <w:r>
-        <w:rPr>
-          <w:rFonts w:ascii="Arial" w:eastAsia="Arial" w:hAnsi="Arial" w:cs="Arial"/>
-          <w:b/>
-          <w:bCs/>
-          <w:color w:val="000000"/>
-        </w:rPr>
-        <w:t xml:space="preserve">Name: </w:t>
+        <w:t xml:space="preserve">Member 5  (Name: </w:t>
       </w:r>
       <w:r>
         <w:rPr>
@@ -11514,17 +10210,7 @@
         <w:sz w:val="16"/>
         <w:szCs w:val="16"/>
       </w:rPr>
-      <w:t xml:space="preserve">Assignment 04 – CI/CD Pipeline </w:t>
-    </w:r>
-    <w:proofErr w:type="gramStart"/>
-    <w:r>
-      <w:rPr>
-        <w:rFonts w:ascii="Arial" w:eastAsia="Arial" w:hAnsi="Arial" w:cs="Arial"/>
-        <w:color w:val="555555"/>
-        <w:sz w:val="16"/>
-        <w:szCs w:val="16"/>
-      </w:rPr>
-      <w:t xml:space="preserve">Integration  </w:t>
+      <w:t xml:space="preserve">Assignment 04 – CI/CD Pipeline Integration  </w:t>
     </w:r>
     <w:r>
       <w:rPr>
@@ -11534,15 +10220,6 @@
         <w:szCs w:val="16"/>
       </w:rPr>
       <w:tab/>
-    </w:r>
-    <w:proofErr w:type="gramEnd"/>
-    <w:r>
-      <w:rPr>
-        <w:rFonts w:ascii="Arial" w:eastAsia="Arial" w:hAnsi="Arial" w:cs="Arial"/>
-        <w:color w:val="555555"/>
-        <w:sz w:val="16"/>
-        <w:szCs w:val="16"/>
-      </w:rPr>
       <w:t xml:space="preserve"> Page </w:t>
     </w:r>
     <w:r>
@@ -11653,19 +10330,7 @@
         <w:sz w:val="18"/>
         <w:szCs w:val="18"/>
       </w:rPr>
-      <w:t xml:space="preserve">University of Central Punjab – Faculty of Information </w:t>
-    </w:r>
-    <w:proofErr w:type="gramStart"/>
-    <w:r>
-      <w:rPr>
-        <w:rFonts w:ascii="Arial" w:eastAsia="Arial" w:hAnsi="Arial" w:cs="Arial"/>
-        <w:b/>
-        <w:bCs/>
-        <w:color w:val="1F3864"/>
-        <w:sz w:val="18"/>
-        <w:szCs w:val="18"/>
-      </w:rPr>
-      <w:t>Technology</w:t>
+      <w:t>University of Central Punjab – Faculty of Information Technology</w:t>
     </w:r>
     <w:r>
       <w:rPr>
@@ -11674,17 +10339,7 @@
         <w:sz w:val="18"/>
         <w:szCs w:val="18"/>
       </w:rPr>
-      <w:t xml:space="preserve">  |</w:t>
-    </w:r>
-    <w:proofErr w:type="gramEnd"/>
-    <w:r>
-      <w:rPr>
-        <w:rFonts w:ascii="Arial" w:eastAsia="Arial" w:hAnsi="Arial" w:cs="Arial"/>
-        <w:color w:val="ADB9CA"/>
-        <w:sz w:val="18"/>
-        <w:szCs w:val="18"/>
-      </w:rPr>
-      <w:t xml:space="preserve">  </w:t>
+      <w:t xml:space="preserve">  |  </w:t>
     </w:r>
     <w:r>
       <w:rPr>

</xml_diff>